<commit_message>
Update framework doc: graph analysis, studies table, maturity matrix, roadmap
Receives the six graph and benchmark sections moved out of Capa semantica 0,
replaces the single maturity scale with a component-by-level matrix, and
rewrites the roadmap: semantic layer bank-wide now, the other components by
domain of use.

Co-Authored-By: Claude Fable 5.1 <noreply@anthropic.com>
Claude-Session: https://claude.ai/code/session_013A7bCLd4PzhQYG95DagcQd
</commit_message>
<xml_diff>
--- a/docs/Semantica_grafos_agentes_banca.docx
+++ b/docs/Semantica_grafos_agentes_banca.docx
@@ -49,6 +49,18 @@
       </w:r>
     </w:p>
     <w:p>
+      <w:pPr/>
+      <w:r>
+        <w:rPr>
+          <w:b/>
+        </w:rPr>
+        <w:t xml:space="preserve">Familia de documentos.</w:t>
+      </w:r>
+      <w:r>
+        <w:t xml:space="preserve"> Este marco encabeza una familia: por debajo, un documento de concepto por componente y un documento de aplicación por entorno o dominio. El primero existe ya: Capa semántica · 0 Concepto, con sus aplicaciones 1 · Teradata y 2 · Elastic. Todo se inscribe en el plan Dato como Producto, cuyo principio «la IA propone, el sistema compila, la persona firma» es el mismo que recorre este documento.</w:t>
+      </w:r>
+    </w:p>
+    <w:p>
       <w:pPr>
         <w:pStyle w:val="Heading2"/>
       </w:pPr>
@@ -134,6 +146,18 @@
       </w:r>
       <w:r>
         <w:t xml:space="preserve"> Es el término más reciente y el menos estable. Lo popularizó a finales de 2025 un ensayo de Foundation Capital que lo define como un registro vivo de trazas de decisión: qué condiciones había, qué excepción se aplicó, quién aprobó, qué precedente se siguió. Los sistemas de registro guardan el resultado de una decisión pero no el porqué, y ese porqué es lo que un agente necesita para decidir igual que lo haría la organización. Una segunda interpretación, más centrada en la actividad, lo describe como la capa que conecta usuarios, documentos, permisos y señales recientes para saber qué es relevante ahora. Gartner lo sitúa en 2026 en lo alto del ciclo de expectativas y predice que más de la mitad de los sistemas de agentes lo usarán en 2028. Responde a "qué importa en esta decisión concreta, y cómo se resolvieron las parecidas". El objeto que gobierna es la traza de decisión, que en banca es evidencia de auditoría.</w:t>
+      </w:r>
+    </w:p>
+    <w:p>
+      <w:pPr/>
+      <w:r>
+        <w:rPr>
+          <w:b/>
+        </w:rPr>
+        <w:t xml:space="preserve">Una advertencia de vocabulario.</w:t>
+      </w:r>
+      <w:r>
+        <w:t xml:space="preserve"> En algunos materiales internos se llama «grafo de contexto» al conjunto de ontología, grafo de conocimiento y almacén vectorial que fundamenta a los agentes. En este documento ese conjunto es la capa de contexto, y «grafo de contexto» se reserva para el registro de trazas de decisión, que es el sentido que usan Foundation Capital, Neo4j y Gartner. La distinción importa porque la capa de contexto se construye con modelos y el grafo de contexto se construye con decisiones.</w:t>
       </w:r>
     </w:p>
     <w:tbl>
@@ -1055,13 +1079,13 @@
         <w:pStyle w:val="Heading2"/>
       </w:pPr>
       <w:r>
-        <w:t xml:space="preserve">Estado del arte en 2026</w:t>
-      </w:r>
-    </w:p>
-    <w:p>
-      <w:pPr/>
-      <w:r>
-        <w:t xml:space="preserve">Cuatro movimientos definen el año: las definiciones se vuelven portables, la evidencia de que el significado mejora la precisión se consolida, las ontologías empiezan a mantenerse solas, y el grafo de contexto pasa de ensayo a categoría de analista.</w:t>
+        <w:t xml:space="preserve">Cifras y relaciones: capa de métricas frente a grafos</w:t>
+      </w:r>
+    </w:p>
+    <w:p>
+      <w:pPr/>
+      <w:r>
+        <w:t xml:space="preserve">Un grafo no sustituye a la capa de métricas para calcular cifras: la complementa como mapa. El grafo dice qué significa cada cosa, cómo se conecta y de dónde viene; la capa de métricas dice cómo se calcula; el almacén ejecuta. Esta sección recoge el análisis que antes estaba en Capa semántica · 0 Concepto, y usa su mismo ejemplo: la tasa de morosidad de ACT_ACTIVO_H, una vista de contratos de activo con un registro por contrato y fecha.</w:t>
       </w:r>
     </w:p>
     <w:p>
@@ -1070,22 +1094,10 @@
         <w:rPr>
           <w:b/>
         </w:rPr>
-        <w:t xml:space="preserve">Portabilidad.</w:t>
-      </w:r>
-      <w:r>
-        <w:t xml:space="preserve"> Open Semantic Interchange nació en septiembre de 2025 impulsado por Snowflake, Salesforce, dbt Labs, BlackRock y RelationalAI, publicó la especificación 1.0 el 27 de enero de 2026 y en junio de 2026 se donó a la Apache Software Foundation. Más de cincuenta organizaciones participan. Es un formato abierto para definir métricas, dimensiones y relaciones una vez y moverlas entre plataformas de BI, datos e IA. A fecha de hoy ningún producto incluye todavía importación y exportación nativa, pero la dirección es clara: las definiciones de un banco dejan de estar atrapadas en una herramienta. Para una entidad que negocia con proveedores de capas semánticas, exigir compatibilidad con este formato es la mejor defensa contra el bloqueo.</w:t>
-      </w:r>
-    </w:p>
-    <w:p>
-      <w:pPr/>
-      <w:r>
-        <w:rPr>
-          <w:b/>
-        </w:rPr>
-        <w:t xml:space="preserve">Evidencia de precisión.</w:t>
-      </w:r>
-      <w:r>
-        <w:t xml:space="preserve"> Los estudios coinciden en que dar al modelo definiciones gobernadas en lugar de esquemas crudos mejora mucho la precisión de la consulta generada. Conviene leerlos sabiendo quién los firma.</w:t>
+        <w:t xml:space="preserve">Tres usos de un grafo cuando hay un almacén detrás.</w:t>
+      </w:r>
+      <w:r>
+        <w:t xml:space="preserve"> En el mercado y en la investigación reciente el grafo aparece de tres formas distintas, y conviene no mezclarlas.</w:t>
       </w:r>
     </w:p>
     <w:tbl>
@@ -1114,7 +1126,7 @@
           <w:p>
             <w:pPr/>
             <w:r>
-              <w:t xml:space="preserve">Estudio</w:t>
+              <w:t xml:space="preserve">Uso</w:t>
             </w:r>
           </w:p>
         </w:tc>
@@ -1126,7 +1138,7 @@
           <w:p>
             <w:pPr/>
             <w:r>
-              <w:t xml:space="preserve">Autor y año</w:t>
+              <w:t xml:space="preserve">Qué hace</w:t>
             </w:r>
           </w:p>
         </w:tc>
@@ -1138,7 +1150,7 @@
           <w:p>
             <w:pPr/>
             <w:r>
-              <w:t xml:space="preserve">Sin capa semántica</w:t>
+              <w:t xml:space="preserve">Ejemplos</w:t>
             </w:r>
           </w:p>
         </w:tc>
@@ -1150,7 +1162,7 @@
           <w:p>
             <w:pPr/>
             <w:r>
-              <w:t xml:space="preserve">Con capa semántica</w:t>
+              <w:t xml:space="preserve">Qué aporta</w:t>
             </w:r>
           </w:p>
         </w:tc>
@@ -1162,12 +1174,34 @@
           <w:p>
             <w:pPr/>
             <w:r>
-              <w:t xml:space="preserve">Cautela</w:t>
+              <w:t xml:space="preserve">Qué no resuelve</w:t>
             </w:r>
           </w:p>
         </w:tc>
       </w:tr>
       <w:tr>
+        <w:tc>
+          <w:tcPr>
+            <w:tcW w:w="1872" w:type="dxa"/>
+          </w:tcPr>
+          <w:p>
+            <w:pPr/>
+            <w:r>
+              <w:t xml:space="preserve">Grafo del esquema para text-to-SQL</w:t>
+            </w:r>
+          </w:p>
+        </w:tc>
+        <w:tc>
+          <w:tcPr>
+            <w:tcW w:w="1872" w:type="dxa"/>
+          </w:tcPr>
+          <w:p>
+            <w:pPr/>
+            <w:r>
+              <w:t xml:space="preserve">Tablas y claves como grafo; un algoritmo de caminos indica al LLM qué tablas unir y por qué ruta</w:t>
+            </w:r>
+          </w:p>
+        </w:tc>
         <w:tc>
           <w:tcPr>
             <w:tcW w:w="1872" w:type="dxa"/>
@@ -1179,57 +1213,1368 @@
                 <w:rPr>
                   <w:rStyle w:val="Hyperlink"/>
                 </w:rPr>
-                <w:t xml:space="preserve">Ontologies to the Rescue</w:t>
+                <w:t xml:space="preserve">QueryWeaver (FalkorDB)</w:t>
               </w:r>
             </w:hyperlink>
-          </w:p>
-        </w:tc>
-        <w:tc>
-          <w:tcPr>
-            <w:tcW w:w="1872" w:type="dxa"/>
-          </w:tcPr>
-          <w:p>
-            <w:pPr/>
-            <w:r>
-              <w:t xml:space="preserve">data.world, 2024</w:t>
-            </w:r>
-          </w:p>
-        </w:tc>
-        <w:tc>
-          <w:tcPr>
-            <w:tcW w:w="1872" w:type="dxa"/>
-          </w:tcPr>
-          <w:p>
-            <w:pPr/>
-            <w:r>
-              <w:t xml:space="preserve">16,7 %</w:t>
-            </w:r>
-          </w:p>
-        </w:tc>
-        <w:tc>
-          <w:tcPr>
-            <w:tcW w:w="1872" w:type="dxa"/>
-          </w:tcPr>
-          <w:p>
-            <w:pPr/>
-            <w:r>
-              <w:t xml:space="preserve">54,2 %</w:t>
-            </w:r>
-          </w:p>
-        </w:tc>
-        <w:tc>
-          <w:tcPr>
-            <w:tcW w:w="1872" w:type="dxa"/>
-          </w:tcPr>
-          <w:p>
-            <w:pPr/>
-            <w:r>
-              <w:t xml:space="preserve">Proveedor de grafos; esquema empresarial complejo</w:t>
+            <w:r>
+              <w:t xml:space="preserve">, SchemaGraphSQL (EACL 2026)</w:t>
+            </w:r>
+          </w:p>
+        </w:tc>
+        <w:tc>
+          <w:tcPr>
+            <w:tcW w:w="1872" w:type="dxa"/>
+          </w:tcPr>
+          <w:p>
+            <w:pPr/>
+            <w:r>
+              <w:t xml:space="preserve">Mejor elección de tablas y joins, sobre todo con tablas puente</w:t>
+            </w:r>
+          </w:p>
+        </w:tc>
+        <w:tc>
+          <w:tcPr>
+            <w:tcW w:w="1872" w:type="dxa"/>
+          </w:tcPr>
+          <w:p>
+            <w:pPr/>
+            <w:r>
+              <w:t xml:space="preserve">El LLM sigue escribiendo el SQL; no sabe que un saldo es una foto</w:t>
             </w:r>
           </w:p>
         </w:tc>
       </w:tr>
       <w:tr>
+        <w:tc>
+          <w:tcPr>
+            <w:tcW w:w="1872" w:type="dxa"/>
+          </w:tcPr>
+          <w:p>
+            <w:pPr/>
+            <w:r>
+              <w:t xml:space="preserve">Grafo virtual con ontología</w:t>
+            </w:r>
+          </w:p>
+        </w:tc>
+        <w:tc>
+          <w:tcPr>
+            <w:tcW w:w="1872" w:type="dxa"/>
+          </w:tcPr>
+          <w:p>
+            <w:pPr/>
+            <w:r>
+              <w:t xml:space="preserve">El LLM consulta conceptos de negocio (SPARQL o SQL sobre la ontología); la consulta se traduce a SQL y la ejecuta el almacén</w:t>
+            </w:r>
+          </w:p>
+        </w:tc>
+        <w:tc>
+          <w:tcPr>
+            <w:tcW w:w="1872" w:type="dxa"/>
+          </w:tcPr>
+          <w:p>
+            <w:pPr/>
+            <w:r>
+              <w:t xml:space="preserve">Stardog, Timbr, data.world</w:t>
+            </w:r>
+          </w:p>
+        </w:tc>
+        <w:tc>
+          <w:tcPr>
+            <w:tcW w:w="1872" w:type="dxa"/>
+          </w:tcPr>
+          <w:p>
+            <w:pPr/>
+            <w:r>
+              <w:t xml:space="preserve">Más acierto: el LLM razona con conceptos y relaciones con nombre</w:t>
+            </w:r>
+          </w:p>
+        </w:tc>
+        <w:tc>
+          <w:tcPr>
+            <w:tcW w:w="1872" w:type="dxa"/>
+          </w:tcPr>
+          <w:p>
+            <w:pPr/>
+            <w:r>
+              <w:t xml:space="preserve">Sigue siendo el LLM escribiendo consultas; acierto alto, pero no garantizado</w:t>
+            </w:r>
+          </w:p>
+        </w:tc>
+      </w:tr>
+      <w:tr>
+        <w:tc>
+          <w:tcPr>
+            <w:tcW w:w="1872" w:type="dxa"/>
+          </w:tcPr>
+          <w:p>
+            <w:pPr/>
+            <w:r>
+              <w:t xml:space="preserve">Grafo como almacén</w:t>
+            </w:r>
+          </w:p>
+        </w:tc>
+        <w:tc>
+          <w:tcPr>
+            <w:tcW w:w="1872" w:type="dxa"/>
+          </w:tcPr>
+          <w:p>
+            <w:pPr/>
+            <w:r>
+              <w:t xml:space="preserve">Las entidades y sus relaciones se cargan en una base de grafos</w:t>
+            </w:r>
+          </w:p>
+        </w:tc>
+        <w:tc>
+          <w:tcPr>
+            <w:tcW w:w="1872" w:type="dxa"/>
+          </w:tcPr>
+          <w:p>
+            <w:pPr/>
+            <w:r>
+              <w:t xml:space="preserve">Neo4j, FalkorDB</w:t>
+            </w:r>
+          </w:p>
+        </w:tc>
+        <w:tc>
+          <w:tcPr>
+            <w:tcW w:w="1872" w:type="dxa"/>
+          </w:tcPr>
+          <w:p>
+            <w:pPr/>
+            <w:r>
+              <w:t xml:space="preserve">Preguntas de relaciones a varios saltos</w:t>
+            </w:r>
+          </w:p>
+        </w:tc>
+        <w:tc>
+          <w:tcPr>
+            <w:tcW w:w="1872" w:type="dxa"/>
+          </w:tcPr>
+          <w:p>
+            <w:pPr/>
+            <w:r>
+              <w:t xml:space="preserve">Agregaciones masivas; exige copiar datos</w:t>
+            </w:r>
+          </w:p>
+        </w:tc>
+      </w:tr>
+    </w:tbl>
+    <w:p>
+      <w:pPr/>
+      <w:r>
+        <w:t xml:space="preserve">El dato más citado viene de data.world, en un benchmark del sector seguros con GPT-4. Escribiendo SQL directamente sobre el esquema, el acierto fue del 16,7 %. A través de un grafo con ontología sobre las mismas tablas, del 54,2 %. Añadiendo una comprobación de la consulta contra la ontología y reparación por el LLM, del 72,55 %, con un 8 % de respuestas «no lo sé» y una tasa de error del 19,44 % (</w:t>
+      </w:r>
+      <w:hyperlink r:id="rId20" w:history="1">
+        <w:r>
+          <w:rPr>
+            <w:rStyle w:val="Hyperlink"/>
+          </w:rPr>
+          <w:t xml:space="preserve">Sequeda y otros, 2023</w:t>
+        </w:r>
+      </w:hyperlink>
+      <w:r>
+        <w:t xml:space="preserve">; </w:t>
+      </w:r>
+      <w:hyperlink r:id="rId21" w:history="1">
+        <w:r>
+          <w:rPr>
+            <w:rStyle w:val="Hyperlink"/>
+          </w:rPr>
+          <w:t xml:space="preserve">Allemang y Sequeda, 2024</w:t>
+        </w:r>
+      </w:hyperlink>
+      <w:r>
+        <w:t xml:space="preserve">).</w:t>
+      </w:r>
+    </w:p>
+    <w:p>
+      <w:pPr/>
+      <w:r>
+        <w:t xml:space="preserve">La lectura: lo que mejora el acierto es la semántica explícita, no el formato de grafo. En ese experimento los datos no salieron de sus tablas y el modelo fue el mismo; lo único que cambió es lo que el LLM tenía delante. Con el esquema en bruto veía nombres técnicos; con la ontología veía conceptos del negocio con nombre, cómo se relacionan y a qué columna corresponde cada uno. Es la misma información que llevan los YAML de la capa semántica: descripciones de negocio, valores válidos, relaciones y la fórmula de cada métrica. El estudio de Cube de 2026 apunta en la misma dirección sin ningún grafo: un documento de definiciones de 4 KB en texto subió el acierto entre 17 y 23 puntos. El formato importa menos que el contenido.</w:t>
+      </w:r>
+    </w:p>
+    <w:p>
+      <w:pPr/>
+      <w:r>
+        <w:t xml:space="preserve">Pero la semántica sola no basta. Aun con la ontología y una comprobación automática de cada consulta, casi una de cada cinco respuestas del benchmark fueron erróneas, y con la misma apariencia que las correctas. La razón es que el LLM seguía escribiendo la consulta, y la comprobación solo revisa su forma, no los filtros, las agregaciones ni las fórmulas, que es donde se cuelan los errores. De ahí salen las dos palancas del diseño: hacer explícita la semántica, que la aportan los YAML y mejora incluso la vía exploratoria, y quitarle al LLM la escritura de la consulta, que la aporta el compilador y elimina el error residual en la vía certificada. Un grafo aporta la primera palanca, pero no la segunda.</w:t>
+      </w:r>
+    </w:p>
+    <w:p>
+      <w:pPr/>
+      <w:r>
+        <w:rPr>
+          <w:b/>
+        </w:rPr>
+        <w:t xml:space="preserve">¿Aporta un grafo virtual con ontología más determinismo? El caso de Stardog.</w:t>
+      </w:r>
+      <w:r>
+        <w:t xml:space="preserve"> Depende de cómo se exponga al agente. El determinismo no lo da la tecnología, tabular o de grafo, sino el encapsulamiento: un vocabulario cerrado y un motor que genera la consulta. Si las métricas se publican en Stardog como consultas almacenadas y parametrizadas, el agente solo elige y rellena parámetros, y el resultado es tan determinista como text-to-metrics. En el otro modo, el habitual en los asistentes conversacionales de grafos, el LLM (o el asistente Voicebox de Stardog) escribe una consulta SPARQL libre, y entonces aporta más acierto, no determinismo. La comprobación contra la ontología es determinista, pero solo revisa la forma: que cada propiedad se use con el tipo de entidad correcto y que el camino entre conceptos exista. No revisa filtros, agregaciones ni fórmulas.</w:t>
+      </w:r>
+    </w:p>
+    <w:p>
+      <w:pPr/>
+      <w:r>
+        <w:t xml:space="preserve">La misma pregunta por un grafo virtual: «¿Cómo está la morosidad de las operaciones refinanciadas frente a las no refinanciadas a cierre de agosto?». La ontología define el concepto FotoContrato con las propiedades fechaDato, esRefinanciado, saldoNormal y saldoDudoso, y un mapeo enlaza cada propiedad con una columna de ACT_ACTIVO_H; los datos no se mueven. El LLM escribe:</w:t>
+      </w:r>
+    </w:p>
+    <w:p>
+      <w:pPr>
+        <w:pStyle w:val="Code"/>
+      </w:pPr>
+      <w:bookmarkStart w:id="1" w:name="bongo_lang_sparql_1"/>
+      <w:bookmarkEnd w:id="1"/>
+      <w:r>
+        <w:t xml:space="preserve">SELECT ?refinanciado ((SUM(?dudoso) / (SUM(?normal) + SUM(?dudoso))) AS ?tasa)</w:t>
+        <w:br/>
+        <w:t xml:space="preserve">WHERE {</w:t>
+        <w:br/>
+        <w:t xml:space="preserve">  ?foto a :FotoContrato ;</w:t>
+        <w:br/>
+        <w:t xml:space="preserve">        :fechaDato "2026-08-31"^^xsd:date ;</w:t>
+        <w:br/>
+        <w:t xml:space="preserve">        :esRefinanciado ?refinanciado ;</w:t>
+        <w:br/>
+        <w:t xml:space="preserve">        :saldoNormal ?normal ;</w:t>
+        <w:br/>
+        <w:t xml:space="preserve">        :saldoDudoso ?dudoso .</w:t>
+        <w:br/>
+        <w:t xml:space="preserve">}</w:t>
+        <w:br/>
+        <w:t xml:space="preserve">GROUP BY ?refinanciado</w:t>
+      </w:r>
+    </w:p>
+    <w:p>
+      <w:pPr/>
+      <w:r>
+        <w:t xml:space="preserve">Las cuatro propiedades pertenecen a FotoContrato: la consulta pasa la comprobación, Stardog la traduce a SQL y Teradata la ejecuta. Dónde falla, con esta misma pregunta:</w:t>
+      </w:r>
+    </w:p>
+    <w:p>
+      <w:pPr>
+        <w:pStyle w:val="ListParagraph"/>
+        <w:numPr>
+          <w:ilvl w:val="0"/>
+          <w:numId w:val="3"/>
+        </w:numPr>
+      </w:pPr>
+      <w:r>
+        <w:rPr>
+          <w:b/>
+        </w:rPr>
+        <w:t xml:space="preserve">Valores nulos que desaparecen.</w:t>
+      </w:r>
+      <w:r>
+        <w:t xml:space="preserve"> En un grafo virtual una columna nula no genera dato. Los contratos con saldo dudoso nulo no casan con el patrón y salen del cálculo con su saldo normal incluido: el denominador se queda corto sin aviso. Evitarlo exige que el LLM escriba OPTIONAL y COALESCE, y la comprobación no lo exige. Por eso la definición de la métrica en el YAML aplica COALESCE a cada sumando.</w:t>
+      </w:r>
+    </w:p>
+    <w:p>
+      <w:pPr>
+        <w:pStyle w:val="ListParagraph"/>
+        <w:numPr>
+          <w:ilvl w:val="0"/>
+          <w:numId w:val="3"/>
+        </w:numPr>
+      </w:pPr>
+      <w:r>
+        <w:rPr>
+          <w:b/>
+        </w:rPr>
+        <w:t xml:space="preserve">La fecha olvidada.</w:t>
+      </w:r>
+      <w:r>
+        <w:t xml:space="preserve"> Si el LLM omite la línea de fechaDato, la consulta sigue siendo válida para la ontología y suma todas las fotos. La ontología no sabe que un saldo es una foto.</w:t>
+      </w:r>
+    </w:p>
+    <w:p>
+      <w:pPr>
+        <w:pStyle w:val="ListParagraph"/>
+        <w:numPr>
+          <w:ilvl w:val="0"/>
+          <w:numId w:val="3"/>
+        </w:numPr>
+      </w:pPr>
+      <w:r>
+        <w:rPr>
+          <w:b/>
+        </w:rPr>
+        <w:t xml:space="preserve">La fórmula improvisada.</w:t>
+      </w:r>
+      <w:r>
+        <w:t xml:space="preserve"> Si el LLM calcula la tasa de otra forma, la ontología no lo detecta: no contiene la fórmula oficial.</w:t>
+      </w:r>
+    </w:p>
+    <w:p>
+      <w:pPr>
+        <w:pStyle w:val="ListParagraph"/>
+        <w:numPr>
+          <w:ilvl w:val="0"/>
+          <w:numId w:val="3"/>
+        </w:numPr>
+      </w:pPr>
+      <w:r>
+        <w:rPr>
+          <w:b/>
+        </w:rPr>
+        <w:t xml:space="preserve">«¿Y por oficina?»</w:t>
+      </w:r>
+      <w:r>
+        <w:t xml:space="preserve"> Si la ontología tiene el camino contrato → oficina, la consulta se acepta y se ejecuta. No existe la noción de dimensión permitida para esta métrica: la cifra sale, pero nadie la ha certificado.</w:t>
+      </w:r>
+    </w:p>
+    <w:p>
+      <w:pPr/>
+      <w:r>
+        <w:t xml:space="preserve">Otros límites: SPARQL 1.1 no tiene funciones de ventana (variación frente al mes anterior), el rendimiento depende de que la traducción a SQL sea buena, y el equipo tendría que mantener una ontología en RDF/OWL y consultas SPARQL, lenguajes que hoy no usa. El compilador de métricas va más lejos porque el LLM no escribe la consulta: la fórmula, la fecha obligatoria y las dimensiones permitidas las impone el YAML. Quedan dos riesgos, que el LLM pida una métrica, un filtro o una fecha que no corresponden a la pregunta, y que la métrica esté mal definida; este último se corrige una vez para todos.</w:t>
+      </w:r>
+    </w:p>
+    <w:p>
+      <w:pPr/>
+      <w:r>
+        <w:rPr>
+          <w:b/>
+        </w:rPr>
+        <w:t xml:space="preserve">Text-to-SQL con grafos: FalkorDB.</w:t>
+      </w:r>
+      <w:r>
+        <w:t xml:space="preserve"> La propuesta de </w:t>
+      </w:r>
+      <w:hyperlink r:id="rId19" w:history="1">
+        <w:r>
+          <w:rPr>
+            <w:rStyle w:val="Hyperlink"/>
+          </w:rPr>
+          <w:t xml:space="preserve">FalkorDB (QueryWeaver)</w:t>
+        </w:r>
+      </w:hyperlink>
+      <w:r>
+        <w:t xml:space="preserve"> guarda el esquema de la base de datos como grafo: tablas, columnas y claves como nodos y relaciones. Cuando llega una pregunta, recorre ese grafo para encontrar las tablas intermedias entre las entidades mencionadas, incluidas las tablas puente con nombres genéricos que una búsqueda semántica pasaría por alto. Después el LLM escribe el SQL con esa ruta delante y un agente de corrección repara los errores. Es el mismo principio que SchemaGraphSQL, que con caminos sobre las claves foráneas obtiene resultados punteros en los benchmarks BIRD y Spider 2.0. Qué aporta: acierta mejor los joins en esquemas grandes. Qué no aporta: el LLM sigue escribiendo el SQL, así que las fotos sumadas, el doble conteo y las fórmulas improvisadas siguen siendo posibles. Para datamarts de tablas anchas con pocos joins, como los de SIC_NEG, hoy aporta poco; mañana, cuando una métrica necesite cruzar productos, el grafo de rutas de unión puede alimentar al compilador, que seguirá siendo quien escriba el SQL.</w:t>
+      </w:r>
+    </w:p>
+    <w:p>
+      <w:pPr/>
+      <w:r>
+        <w:rPr>
+          <w:b/>
+        </w:rPr>
+        <w:t xml:space="preserve">Dónde gana cada uno.</w:t>
+      </w:r>
+      <w:r>
+        <w:t xml:space="preserve"> Las cuatro primeras son preguntas de cifras: las resuelve mejor SQL con métricas, y en algunas el grafo no es una opción real. Las cuatro últimas son preguntas de relaciones y significado: ahí gana el grafo.</w:t>
+      </w:r>
+    </w:p>
+    <w:tbl>
+      <w:tblPr>
+        <w:tblStyle w:val="TableGrid"/>
+        <w:tblW w:w="0" w:type="auto"/>
+        <w:tblLayout w:type="fixed"/>
+        <w:tblLook w:val="04A0" w:firstRow="1" w:lastRow="0" w:firstColumn="0" w:lastColumn="0" w:noHBand="0" w:noVBand="1"/>
+      </w:tblPr>
+      <w:tblGrid>
+        <w:gridCol w:w="3120"/>
+        <w:gridCol w:w="3120"/>
+        <w:gridCol w:w="3120"/>
+      </w:tblGrid>
+      <w:tr>
+        <w:trPr>
+          <w:tblHeader/>
+        </w:trPr>
+        <w:tc>
+          <w:tcPr>
+            <w:tcW w:w="3120" w:type="dxa"/>
+            <w:shd w:val="clear" w:color="auto" w:fill="F2F2F2"/>
+          </w:tcPr>
+          <w:p>
+            <w:pPr/>
+            <w:r>
+              <w:t xml:space="preserve">Pregunta</w:t>
+            </w:r>
+          </w:p>
+        </w:tc>
+        <w:tc>
+          <w:tcPr>
+            <w:tcW w:w="3120" w:type="dxa"/>
+            <w:shd w:val="clear" w:color="auto" w:fill="F2F2F2"/>
+          </w:tcPr>
+          <w:p>
+            <w:pPr/>
+            <w:r>
+              <w:t xml:space="preserve">Con SQL y métricas</w:t>
+            </w:r>
+          </w:p>
+        </w:tc>
+        <w:tc>
+          <w:tcPr>
+            <w:tcW w:w="3120" w:type="dxa"/>
+            <w:shd w:val="clear" w:color="auto" w:fill="F2F2F2"/>
+          </w:tcPr>
+          <w:p>
+            <w:pPr/>
+            <w:r>
+              <w:t xml:space="preserve">Con grafo</w:t>
+            </w:r>
+          </w:p>
+        </w:tc>
+      </w:tr>
+      <w:tr>
+        <w:tc>
+          <w:tcPr>
+            <w:tcW w:w="3120" w:type="dxa"/>
+          </w:tcPr>
+          <w:p>
+            <w:pPr/>
+            <w:r>
+              <w:t xml:space="preserve">Tasa de morosidad por refinanciado a 31 de agosto</w:t>
+            </w:r>
+          </w:p>
+        </w:tc>
+        <w:tc>
+          <w:tcPr>
+            <w:tcW w:w="3120" w:type="dxa"/>
+          </w:tcPr>
+          <w:p>
+            <w:pPr/>
+            <w:r>
+              <w:t xml:space="preserve">Natural: una agregación sobre una foto</w:t>
+            </w:r>
+          </w:p>
+        </w:tc>
+        <w:tc>
+          <w:tcPr>
+            <w:tcW w:w="3120" w:type="dxa"/>
+          </w:tcPr>
+          <w:p>
+            <w:pPr/>
+            <w:r>
+              <w:t xml:space="preserve">Posible, pero copiando datos (grafo nativo) o con los riesgos anteriores (grafo virtual)</w:t>
+            </w:r>
+          </w:p>
+        </w:tc>
+      </w:tr>
+      <w:tr>
+        <w:tc>
+          <w:tcPr>
+            <w:tcW w:w="3120" w:type="dxa"/>
+          </w:tcPr>
+          <w:p>
+            <w:pPr/>
+            <w:r>
+              <w:t xml:space="preserve">Saldo medio diario de la cartera en agosto, por segmento</w:t>
+            </w:r>
+          </w:p>
+        </w:tc>
+        <w:tc>
+          <w:tcPr>
+            <w:tcW w:w="3120" w:type="dxa"/>
+          </w:tcPr>
+          <w:p>
+            <w:pPr/>
+            <w:r>
+              <w:t xml:space="preserve">Natural: el almacén recorre 31 fotos de millones de contratos en paralelo</w:t>
+            </w:r>
+          </w:p>
+        </w:tc>
+        <w:tc>
+          <w:tcPr>
+            <w:tcW w:w="3120" w:type="dxa"/>
+          </w:tcPr>
+          <w:p>
+            <w:pPr/>
+            <w:r>
+              <w:t xml:space="preserve">Poco adecuado en un grafo nativo: cada contrato en cada día tendría que ser un nodo</w:t>
+            </w:r>
+          </w:p>
+        </w:tc>
+      </w:tr>
+      <w:tr>
+        <w:tc>
+          <w:tcPr>
+            <w:tcW w:w="3120" w:type="dxa"/>
+          </w:tcPr>
+          <w:p>
+            <w:pPr/>
+            <w:r>
+              <w:t xml:space="preserve">Tasa de morosidad de cada uno de los últimos 12 meses, con la del mes anterior al lado</w:t>
+            </w:r>
+          </w:p>
+        </w:tc>
+        <w:tc>
+          <w:tcPr>
+            <w:tcW w:w="3120" w:type="dxa"/>
+          </w:tcPr>
+          <w:p>
+            <w:pPr/>
+            <w:r>
+              <w:t xml:space="preserve">Natural con funciones de ventana (LAG), que el compilador tendrá que generar</w:t>
+            </w:r>
+          </w:p>
+        </w:tc>
+        <w:tc>
+          <w:tcPr>
+            <w:tcW w:w="3120" w:type="dxa"/>
+          </w:tcPr>
+          <w:p>
+            <w:pPr/>
+            <w:r>
+              <w:t xml:space="preserve">SPARQL 1.1 y Cypher no tienen funciones de ventana: hay que emularlas, de forma frágil y lenta</w:t>
+            </w:r>
+          </w:p>
+        </w:tc>
+      </w:tr>
+      <w:tr>
+        <w:tc>
+          <w:tcPr>
+            <w:tcW w:w="3120" w:type="dxa"/>
+          </w:tcPr>
+          <w:p>
+            <w:pPr/>
+            <w:r>
+              <w:t xml:space="preserve">Saldo dudoso a 31 de diciembre que cuadre con el estado regulatorio</w:t>
+            </w:r>
+          </w:p>
+        </w:tc>
+        <w:tc>
+          <w:tcPr>
+            <w:tcW w:w="3120" w:type="dxa"/>
+          </w:tcPr>
+          <w:p>
+            <w:pPr/>
+            <w:r>
+              <w:t xml:space="preserve">Se recupera del producto certificado, en el mismo almacén</w:t>
+            </w:r>
+          </w:p>
+        </w:tc>
+        <w:tc>
+          <w:tcPr>
+            <w:tcW w:w="3120" w:type="dxa"/>
+          </w:tcPr>
+          <w:p>
+            <w:pPr/>
+            <w:r>
+              <w:t xml:space="preserve">Una copia en un grafo es otra versión del dato, sin conciliar: no sirve como cifra oficial</w:t>
+            </w:r>
+          </w:p>
+        </w:tc>
+      </w:tr>
+      <w:tr>
+        <w:tc>
+          <w:tcPr>
+            <w:tcW w:w="3120" w:type="dxa"/>
+          </w:tcPr>
+          <w:p>
+            <w:pPr/>
+            <w:r>
+              <w:t xml:space="preserve">Riesgo total de un cliente sumando cotitulares, avalistas y grupo económico</w:t>
+            </w:r>
+          </w:p>
+        </w:tc>
+        <w:tc>
+          <w:tcPr>
+            <w:tcW w:w="3120" w:type="dxa"/>
+          </w:tcPr>
+          <w:p>
+            <w:pPr/>
+            <w:r>
+              <w:t xml:space="preserve">Joins recursivos, difíciles de escribir y mantener</w:t>
+            </w:r>
+          </w:p>
+        </w:tc>
+        <w:tc>
+          <w:tcPr>
+            <w:tcW w:w="3120" w:type="dxa"/>
+          </w:tcPr>
+          <w:p>
+            <w:pPr/>
+            <w:r>
+              <w:t xml:space="preserve">Natural: recorrer relaciones a varios saltos</w:t>
+            </w:r>
+          </w:p>
+        </w:tc>
+      </w:tr>
+      <w:tr>
+        <w:tc>
+          <w:tcPr>
+            <w:tcW w:w="3120" w:type="dxa"/>
+          </w:tcPr>
+          <w:p>
+            <w:pPr/>
+            <w:r>
+              <w:t xml:space="preserve">De qué programas COBOL sale IMP_SALDO_DUDOSO</w:t>
+            </w:r>
+          </w:p>
+        </w:tc>
+        <w:tc>
+          <w:tcPr>
+            <w:tcW w:w="3120" w:type="dxa"/>
+          </w:tcPr>
+          <w:p>
+            <w:pPr/>
+            <w:r>
+              <w:t xml:space="preserve">No está en las tablas</w:t>
+            </w:r>
+          </w:p>
+        </w:tc>
+        <w:tc>
+          <w:tcPr>
+            <w:tcW w:w="3120" w:type="dxa"/>
+          </w:tcPr>
+          <w:p>
+            <w:pPr/>
+            <w:r>
+              <w:t xml:space="preserve">Es el grafo técnico de linaje de Rosetta y UNICON2</w:t>
+            </w:r>
+          </w:p>
+        </w:tc>
+      </w:tr>
+      <w:tr>
+        <w:tc>
+          <w:tcPr>
+            <w:tcW w:w="3120" w:type="dxa"/>
+          </w:tcPr>
+          <w:p>
+            <w:pPr/>
+            <w:r>
+              <w:t xml:space="preserve">Dónde está «morosidad», qué métrica es la oficial y quién responde de ella</w:t>
+            </w:r>
+          </w:p>
+        </w:tc>
+        <w:tc>
+          <w:tcPr>
+            <w:tcW w:w="3120" w:type="dxa"/>
+          </w:tcPr>
+          <w:p>
+            <w:pPr/>
+            <w:r>
+              <w:t xml:space="preserve">No es una consulta de datos</w:t>
+            </w:r>
+          </w:p>
+        </w:tc>
+        <w:tc>
+          <w:tcPr>
+            <w:tcW w:w="3120" w:type="dxa"/>
+          </w:tcPr>
+          <w:p>
+            <w:pPr/>
+            <w:r>
+              <w:t xml:space="preserve">Navegar conceptos, productos, métricas y dueños</w:t>
+            </w:r>
+          </w:p>
+        </w:tc>
+      </w:tr>
+      <w:tr>
+        <w:tc>
+          <w:tcPr>
+            <w:tcW w:w="3120" w:type="dxa"/>
+          </w:tcPr>
+          <w:p>
+            <w:pPr/>
+            <w:r>
+              <w:t xml:space="preserve">Qué tablas hay que unir para cruzar clientes de fondos con su riesgo de activo</w:t>
+            </w:r>
+          </w:p>
+        </w:tc>
+        <w:tc>
+          <w:tcPr>
+            <w:tcW w:w="3120" w:type="dxa"/>
+          </w:tcPr>
+          <w:p>
+            <w:pPr/>
+            <w:r>
+              <w:t xml:space="preserve">El LLM tiene que adivinar la ruta</w:t>
+            </w:r>
+          </w:p>
+        </w:tc>
+        <w:tc>
+          <w:tcPr>
+            <w:tcW w:w="3120" w:type="dxa"/>
+          </w:tcPr>
+          <w:p>
+            <w:pPr/>
+            <w:r>
+              <w:t xml:space="preserve">Un algoritmo de caminos sobre el esquema la encuentra</w:t>
+            </w:r>
+          </w:p>
+        </w:tc>
+      </w:tr>
+    </w:tbl>
+    <w:p>
+      <w:pPr/>
+      <w:r>
+        <w:t xml:space="preserve">Un matiz: con un grafo virtual las preguntas de volumen son posibles porque se traducen a SQL y las ejecuta el almacén. Pero entonces quien calcula es el almacén, y el grafo es solo otra forma de pedírselo.</w:t>
+      </w:r>
+    </w:p>
+    <w:p>
+      <w:pPr/>
+      <w:r>
+        <w:rPr>
+          <w:b/>
+        </w:rPr>
+        <w:t xml:space="preserve">El reparto que proponemos como evolución.</w:t>
+      </w:r>
+      <w:r>
+        <w:t xml:space="preserve"> El agente pregunta al grafo qué significa algo y qué métrica lo responde; pide la cifra a la capa de métricas; el almacén la calcula.</w:t>
+      </w:r>
+    </w:p>
+    <w:p>
+      <w:pPr/>
+      <w:r>
+        <w:drawing>
+          <wp:inline distT="0" distB="0" distL="0" distR="0">
+            <wp:extent cx="5486400" cy="3012621"/>
+            <wp:docPr id="2" name="image2" descr="reparto entre grafo, capa de métricas y almacén · el grafo responde qué, la capa cuánto"/>
+            <a:graphic xmlns:a="http://schemas.openxmlformats.org/drawingml/2006/main">
+              <a:graphicData uri="http://schemas.openxmlformats.org/drawingml/2006/picture">
+                <pic:pic xmlns:pic="http://schemas.openxmlformats.org/drawingml/2006/picture">
+                  <pic:nvPicPr>
+                    <pic:cNvPr id="2" name="image2" descr="reparto entre grafo, capa de métricas y almacén · el grafo responde qué, la capa cuánto"/>
+                    <pic:cNvPicPr/>
+                  </pic:nvPicPr>
+                  <pic:blipFill>
+                    <a:blip r:embed="rId22"/>
+                    <a:stretch>
+                      <a:fillRect/>
+                    </a:stretch>
+                  </pic:blipFill>
+                  <pic:spPr>
+                    <a:xfrm>
+                      <a:off x="0" y="0"/>
+                      <a:ext cx="5486400" cy="3012621"/>
+                    </a:xfrm>
+                    <a:prstGeom prst="rect">
+                      <a:avLst/>
+                    </a:prstGeom>
+                  </pic:spPr>
+                </pic:pic>
+              </a:graphicData>
+            </a:graphic>
+          </wp:inline>
+        </w:drawing>
+      </w:r>
+    </w:p>
+    <w:p>
+      <w:pPr/>
+      <w:r>
+        <w:t xml:space="preserve">reparto entre grafo, capa de métricas y almacén · el grafo responde qué, la capa cuánto</w:t>
+      </w:r>
+    </w:p>
+    <w:p>
+      <w:pPr>
+        <w:pStyle w:val="ListParagraph"/>
+        <w:numPr>
+          <w:ilvl w:val="0"/>
+          <w:numId w:val="4"/>
+        </w:numPr>
+      </w:pPr>
+      <w:r>
+        <w:rPr>
+          <w:b/>
+        </w:rPr>
+        <w:t xml:space="preserve">Para las cifras:</w:t>
+      </w:r>
+      <w:r>
+        <w:t xml:space="preserve"> el compilador de métricas sobre el almacén. La fiabilidad de una cifra depende de quién escribe la consulta, no de cómo se modelan los datos. Si las métricas se publican en un grafo como consultas almacenadas con parámetros, es el mismo principio con otro motor; por eso Stardog y Timbr siguen entre los candidatos a motor de destino, con los mismos criterios que los demás: que funcione sobre Teradata, que trate bien las fotos y que evite el doble conteo al unir tablas de distinta granularidad.</w:t>
+      </w:r>
+    </w:p>
+    <w:p>
+      <w:pPr>
+        <w:pStyle w:val="ListParagraph"/>
+        <w:numPr>
+          <w:ilvl w:val="0"/>
+          <w:numId w:val="4"/>
+        </w:numPr>
+      </w:pPr>
+      <w:r>
+        <w:rPr>
+          <w:b/>
+        </w:rPr>
+        <w:t xml:space="preserve">Para el agente:</w:t>
+      </w:r>
+      <w:r>
+        <w:t xml:space="preserve"> un grafo con conceptos, productos, métricas, dueños, linaje de Rosetta y rutas de unión entre productos. Se carga en buena parte desde los mismos YAML, así que no hay dos definiciones que mantener. Sirve de respaldo a list_metrics y describe_metric y ayuda a elegir la métrica ante preguntas ambiguas.</w:t>
+      </w:r>
+    </w:p>
+    <w:p>
+      <w:pPr>
+        <w:pStyle w:val="ListParagraph"/>
+        <w:numPr>
+          <w:ilvl w:val="0"/>
+          <w:numId w:val="4"/>
+        </w:numPr>
+      </w:pPr>
+      <w:r>
+        <w:rPr>
+          <w:b/>
+        </w:rPr>
+        <w:t xml:space="preserve">Para preguntas de relaciones</w:t>
+      </w:r>
+      <w:r>
+        <w:t xml:space="preserve"> (vinculación, concentración, fraude): un grafo de entidades con un subconjunto de datos, solo cuando haya un caso de uso que lo justifique.</w:t>
+      </w:r>
+    </w:p>
+    <w:p>
+      <w:pPr/>
+      <w:r>
+        <w:t xml:space="preserve">Es la misma dirección que toma Apache Ossie con su capa de ontología en borrador, conceptos de negocio que apuntan a los campos del modelo semántico, y coincide con el reparto que describen proveedores como Timbr: capa semántica para métricas gobernadas, ontología y grafo para conceptos y relaciones.</w:t>
+      </w:r>
+    </w:p>
+    <w:p>
+      <w:pPr>
+        <w:pStyle w:val="Heading2"/>
+      </w:pPr>
+      <w:r>
+        <w:t xml:space="preserve">Estado del arte en 2026</w:t>
+      </w:r>
+    </w:p>
+    <w:p>
+      <w:pPr/>
+      <w:r>
+        <w:t xml:space="preserve">Cuatro movimientos definen el año: las definiciones se vuelven portables, la evidencia de que el significado mejora la precisión se consolida, las ontologías empiezan a mantenerse solas, y el grafo de contexto pasa de ensayo a categoría de analista.</w:t>
+      </w:r>
+    </w:p>
+    <w:p>
+      <w:pPr/>
+      <w:r>
+        <w:rPr>
+          <w:b/>
+        </w:rPr>
+        <w:t xml:space="preserve">Portabilidad.</w:t>
+      </w:r>
+      <w:r>
+        <w:t xml:space="preserve"> Open Semantic Interchange nació en septiembre de 2025 impulsado por Snowflake, Salesforce, dbt Labs, BlackRock y RelationalAI, publicó la especificación 1.0 el 27 de enero de 2026 y en junio de 2026 se donó a la Apache Software Foundation. Más de cincuenta organizaciones participan. Es un formato abierto para definir métricas, dimensiones y relaciones una vez y moverlas entre plataformas de BI, datos e IA. A fecha de hoy ningún producto incluye todavía importación y exportación nativa, pero la dirección es clara: las definiciones de un banco dejan de estar atrapadas en una herramienta. Para una entidad que negocia con proveedores de capas semánticas, exigir compatibilidad con este formato es la mejor defensa contra el bloqueo.</w:t>
+      </w:r>
+    </w:p>
+    <w:p>
+      <w:pPr/>
+      <w:r>
+        <w:rPr>
+          <w:b/>
+        </w:rPr>
+        <w:t xml:space="preserve">Evidencia de precisión.</w:t>
+      </w:r>
+      <w:r>
+        <w:t xml:space="preserve"> Los estudios coinciden en que dar al modelo definiciones gobernadas en lugar de esquemas crudos mejora mucho la precisión de la consulta generada. Conviene leerlos sabiendo quién los firma.</w:t>
+      </w:r>
+    </w:p>
+    <w:p>
+      <w:pPr/>
+      <w:r>
+        <w:t xml:space="preserve">Cuatro enfoques comparados: LLM sobre tablas (el LLM escribe SQL viendo solo el esquema), contexto semántico (el LLM escribe SQL con las definiciones de negocio delante), grafo con ontología (el LLM consulta conceptos en SPARQL y un grafo virtual traduce a SQL) y text-to-metrics (el LLM elige métrica, dimensiones, filtros y fecha, y un motor compila el SQL).</w:t>
+      </w:r>
+    </w:p>
+    <w:tbl>
+      <w:tblPr>
+        <w:tblStyle w:val="TableGrid"/>
+        <w:tblW w:w="0" w:type="auto"/>
+        <w:tblLayout w:type="fixed"/>
+        <w:tblLook w:val="04A0" w:firstRow="1" w:lastRow="0" w:firstColumn="0" w:lastColumn="0" w:noHBand="0" w:noVBand="1"/>
+      </w:tblPr>
+      <w:tblGrid>
+        <w:gridCol w:w="1872"/>
+        <w:gridCol w:w="1872"/>
+        <w:gridCol w:w="1872"/>
+        <w:gridCol w:w="1872"/>
+        <w:gridCol w:w="1872"/>
+      </w:tblGrid>
+      <w:tr>
+        <w:trPr>
+          <w:tblHeader/>
+        </w:trPr>
+        <w:tc>
+          <w:tcPr>
+            <w:tcW w:w="1872" w:type="dxa"/>
+            <w:shd w:val="clear" w:color="auto" w:fill="F2F2F2"/>
+          </w:tcPr>
+          <w:p>
+            <w:pPr/>
+            <w:r>
+              <w:t xml:space="preserve">Enfoque</w:t>
+            </w:r>
+          </w:p>
+        </w:tc>
+        <w:tc>
+          <w:tcPr>
+            <w:tcW w:w="1872" w:type="dxa"/>
+            <w:shd w:val="clear" w:color="auto" w:fill="F2F2F2"/>
+          </w:tcPr>
+          <w:p>
+            <w:pPr/>
+            <w:r>
+              <w:t xml:space="preserve">Estudio y año</w:t>
+            </w:r>
+          </w:p>
+        </w:tc>
+        <w:tc>
+          <w:tcPr>
+            <w:tcW w:w="1872" w:type="dxa"/>
+            <w:shd w:val="clear" w:color="auto" w:fill="F2F2F2"/>
+          </w:tcPr>
+          <w:p>
+            <w:pPr/>
+            <w:r>
+              <w:t xml:space="preserve">Banco de pruebas</w:t>
+            </w:r>
+          </w:p>
+        </w:tc>
+        <w:tc>
+          <w:tcPr>
+            <w:tcW w:w="1872" w:type="dxa"/>
+            <w:shd w:val="clear" w:color="auto" w:fill="F2F2F2"/>
+          </w:tcPr>
+          <w:p>
+            <w:pPr/>
+            <w:r>
+              <w:t xml:space="preserve">Modelo</w:t>
+            </w:r>
+          </w:p>
+        </w:tc>
+        <w:tc>
+          <w:tcPr>
+            <w:tcW w:w="1872" w:type="dxa"/>
+            <w:shd w:val="clear" w:color="auto" w:fill="F2F2F2"/>
+          </w:tcPr>
+          <w:p>
+            <w:pPr/>
+            <w:r>
+              <w:t xml:space="preserve">Acierto</w:t>
+            </w:r>
+          </w:p>
+        </w:tc>
+      </w:tr>
+      <w:tr>
+        <w:tc>
+          <w:tcPr>
+            <w:tcW w:w="1872" w:type="dxa"/>
+          </w:tcPr>
+          <w:p>
+            <w:pPr/>
+            <w:r>
+              <w:t xml:space="preserve">LLM sobre tablas</w:t>
+            </w:r>
+          </w:p>
+        </w:tc>
+        <w:tc>
+          <w:tcPr>
+            <w:tcW w:w="1872" w:type="dxa"/>
+          </w:tcPr>
+          <w:p>
+            <w:pPr/>
+            <w:hyperlink r:id="rId23" w:history="1">
+              <w:r>
+                <w:rPr>
+                  <w:rStyle w:val="Hyperlink"/>
+                </w:rPr>
+                <w:t xml:space="preserve">dbt Labs, 2026</w:t>
+              </w:r>
+            </w:hyperlink>
+          </w:p>
+        </w:tc>
+        <w:tc>
+          <w:tcPr>
+            <w:tcW w:w="1872" w:type="dxa"/>
+          </w:tcPr>
+          <w:p>
+            <w:pPr/>
+            <w:r>
+              <w:t xml:space="preserve">Seguros ACME (data.world), 11 preguntas × 20 ejecuciones</w:t>
+            </w:r>
+          </w:p>
+        </w:tc>
+        <w:tc>
+          <w:tcPr>
+            <w:tcW w:w="1872" w:type="dxa"/>
+          </w:tcPr>
+          <w:p>
+            <w:pPr/>
+            <w:r>
+              <w:t xml:space="preserve">Claude Sonnet 4.6 / GPT-5.3 Codex</w:t>
+            </w:r>
+          </w:p>
+        </w:tc>
+        <w:tc>
+          <w:tcPr>
+            <w:tcW w:w="1872" w:type="dxa"/>
+          </w:tcPr>
+          <w:p>
+            <w:pPr/>
+            <w:r>
+              <w:t xml:space="preserve">64,5 % / 64,5 %</w:t>
+            </w:r>
+          </w:p>
+        </w:tc>
+      </w:tr>
+      <w:tr>
+        <w:tc>
+          <w:tcPr>
+            <w:tcW w:w="1872" w:type="dxa"/>
+          </w:tcPr>
+          <w:p>
+            <w:pPr/>
+            <w:r>
+              <w:t xml:space="preserve">LLM sobre tablas</w:t>
+            </w:r>
+          </w:p>
+        </w:tc>
+        <w:tc>
+          <w:tcPr>
+            <w:tcW w:w="1872" w:type="dxa"/>
+          </w:tcPr>
+          <w:p>
+            <w:pPr/>
+            <w:r>
+              <w:t xml:space="preserve">dbt Labs, 2026</w:t>
+            </w:r>
+          </w:p>
+        </w:tc>
+        <w:tc>
+          <w:tcPr>
+            <w:tcW w:w="1872" w:type="dxa"/>
+          </w:tcPr>
+          <w:p>
+            <w:pPr/>
+            <w:r>
+              <w:t xml:space="preserve">El mismo, con 3 tablas preparadas añadidas</w:t>
+            </w:r>
+          </w:p>
+        </w:tc>
+        <w:tc>
+          <w:tcPr>
+            <w:tcW w:w="1872" w:type="dxa"/>
+          </w:tcPr>
+          <w:p>
+            <w:pPr/>
+            <w:r>
+              <w:t xml:space="preserve">Claude Sonnet 4.6 / GPT-5.3 Codex</w:t>
+            </w:r>
+          </w:p>
+        </w:tc>
+        <w:tc>
+          <w:tcPr>
+            <w:tcW w:w="1872" w:type="dxa"/>
+          </w:tcPr>
+          <w:p>
+            <w:pPr/>
+            <w:r>
+              <w:t xml:space="preserve">90,0 % / 84,1 %</w:t>
+            </w:r>
+          </w:p>
+        </w:tc>
+      </w:tr>
+      <w:tr>
+        <w:tc>
+          <w:tcPr>
+            <w:tcW w:w="1872" w:type="dxa"/>
+          </w:tcPr>
+          <w:p>
+            <w:pPr/>
+            <w:r>
+              <w:t xml:space="preserve">LLM sobre tablas</w:t>
+            </w:r>
+          </w:p>
+        </w:tc>
+        <w:tc>
+          <w:tcPr>
+            <w:tcW w:w="1872" w:type="dxa"/>
+          </w:tcPr>
+          <w:p>
+            <w:pPr/>
+            <w:hyperlink r:id="rId24" w:history="1">
+              <w:r>
+                <w:rPr>
+                  <w:rStyle w:val="Hyperlink"/>
+                </w:rPr>
+                <w:t xml:space="preserve">Cube, 2026</w:t>
+              </w:r>
+            </w:hyperlink>
+          </w:p>
+        </w:tc>
+        <w:tc>
+          <w:tcPr>
+            <w:tcW w:w="1872" w:type="dxa"/>
+          </w:tcPr>
+          <w:p>
+            <w:pPr/>
+            <w:r>
+              <w:t xml:space="preserve">Comercio minorista (Contoso), 99 preguntas</w:t>
+            </w:r>
+          </w:p>
+        </w:tc>
+        <w:tc>
+          <w:tcPr>
+            <w:tcW w:w="1872" w:type="dxa"/>
+          </w:tcPr>
+          <w:p>
+            <w:pPr/>
+            <w:r>
+              <w:t xml:space="preserve">Claude Opus 4.7 / Sonnet 4.6 / GPT-5.4</w:t>
+            </w:r>
+          </w:p>
+        </w:tc>
+        <w:tc>
+          <w:tcPr>
+            <w:tcW w:w="1872" w:type="dxa"/>
+          </w:tcPr>
+          <w:p>
+            <w:pPr/>
+            <w:r>
+              <w:t xml:space="preserve">50,5 % / 46,5 % / 45,5 %</w:t>
+            </w:r>
+          </w:p>
+        </w:tc>
+      </w:tr>
+      <w:tr>
+        <w:tc>
+          <w:tcPr>
+            <w:tcW w:w="1872" w:type="dxa"/>
+          </w:tcPr>
+          <w:p>
+            <w:pPr/>
+            <w:r>
+              <w:t xml:space="preserve">LLM sobre tablas, con pistas por pregunta</w:t>
+            </w:r>
+          </w:p>
+        </w:tc>
+        <w:tc>
+          <w:tcPr>
+            <w:tcW w:w="1872" w:type="dxa"/>
+          </w:tcPr>
+          <w:p>
+            <w:pPr/>
+            <w:hyperlink r:id="rId25" w:history="1">
+              <w:r>
+                <w:rPr>
+                  <w:rStyle w:val="Hyperlink"/>
+                </w:rPr>
+                <w:t xml:space="preserve">BIRD: Gemini-SQL2, junio 2026</w:t>
+              </w:r>
+            </w:hyperlink>
+          </w:p>
+        </w:tc>
+        <w:tc>
+          <w:tcPr>
+            <w:tcW w:w="1872" w:type="dxa"/>
+          </w:tcPr>
+          <w:p>
+            <w:pPr/>
+            <w:r>
+              <w:t xml:space="preserve">Académico: 12.751 preguntas, 95 bases de datos, 37 dominios</w:t>
+            </w:r>
+          </w:p>
+        </w:tc>
+        <w:tc>
+          <w:tcPr>
+            <w:tcW w:w="1872" w:type="dxa"/>
+          </w:tcPr>
+          <w:p>
+            <w:pPr/>
+            <w:r>
+              <w:t xml:space="preserve">Gemini 3.1 Pro, mejor modelo único</w:t>
+            </w:r>
+          </w:p>
+        </w:tc>
+        <w:tc>
+          <w:tcPr>
+            <w:tcW w:w="1872" w:type="dxa"/>
+          </w:tcPr>
+          <w:p>
+            <w:pPr/>
+            <w:r>
+              <w:t xml:space="preserve">80,04 % (personas: 92,96 %)</w:t>
+            </w:r>
+          </w:p>
+        </w:tc>
+      </w:tr>
+      <w:tr>
+        <w:tc>
+          <w:tcPr>
+            <w:tcW w:w="1872" w:type="dxa"/>
+          </w:tcPr>
+          <w:p>
+            <w:pPr/>
+            <w:r>
+              <w:t xml:space="preserve">LLM sobre tablas</w:t>
+            </w:r>
+          </w:p>
+        </w:tc>
+        <w:tc>
+          <w:tcPr>
+            <w:tcW w:w="1872" w:type="dxa"/>
+          </w:tcPr>
+          <w:p>
+            <w:pPr/>
+            <w:hyperlink r:id="rId26" w:history="1">
+              <w:r>
+                <w:rPr>
+                  <w:rStyle w:val="Hyperlink"/>
+                </w:rPr>
+                <w:t xml:space="preserve">Spider 2.0, ICLR 2025</w:t>
+              </w:r>
+            </w:hyperlink>
+          </w:p>
+        </w:tc>
+        <w:tc>
+          <w:tcPr>
+            <w:tcW w:w="1872" w:type="dxa"/>
+          </w:tcPr>
+          <w:p>
+            <w:pPr/>
+            <w:r>
+              <w:t xml:space="preserve">Flujos empresariales reales en BigQuery, Snowflake y dbt; unas 800 columnas por base</w:t>
+            </w:r>
+          </w:p>
+        </w:tc>
+        <w:tc>
+          <w:tcPr>
+            <w:tcW w:w="1872" w:type="dxa"/>
+          </w:tcPr>
+          <w:p>
+            <w:pPr/>
+            <w:r>
+              <w:t xml:space="preserve">o1-preview / Claude 3.5 Sonnet / GPT-4o</w:t>
+            </w:r>
+          </w:p>
+        </w:tc>
+        <w:tc>
+          <w:tcPr>
+            <w:tcW w:w="1872" w:type="dxa"/>
+          </w:tcPr>
+          <w:p>
+            <w:pPr/>
+            <w:r>
+              <w:t xml:space="preserve">21,4 % / 14,9 % / 12,3 %</w:t>
+            </w:r>
+          </w:p>
+        </w:tc>
+      </w:tr>
+      <w:tr>
+        <w:tc>
+          <w:tcPr>
+            <w:tcW w:w="1872" w:type="dxa"/>
+          </w:tcPr>
+          <w:p>
+            <w:pPr/>
+            <w:r>
+              <w:t xml:space="preserve">Contexto semántico</w:t>
+            </w:r>
+          </w:p>
+        </w:tc>
+        <w:tc>
+          <w:tcPr>
+            <w:tcW w:w="1872" w:type="dxa"/>
+          </w:tcPr>
+          <w:p>
+            <w:pPr/>
+            <w:r>
+              <w:t xml:space="preserve">Cube, 2026</w:t>
+            </w:r>
+          </w:p>
+        </w:tc>
+        <w:tc>
+          <w:tcPr>
+            <w:tcW w:w="1872" w:type="dxa"/>
+          </w:tcPr>
+          <w:p>
+            <w:pPr/>
+            <w:r>
+              <w:t xml:space="preserve">Contoso, con un documento semántico de 4 KB</w:t>
+            </w:r>
+          </w:p>
+        </w:tc>
+        <w:tc>
+          <w:tcPr>
+            <w:tcW w:w="1872" w:type="dxa"/>
+          </w:tcPr>
+          <w:p>
+            <w:pPr/>
+            <w:r>
+              <w:t xml:space="preserve">Claude Opus 4.7 / Sonnet 4.6 / GPT-5.4</w:t>
+            </w:r>
+          </w:p>
+        </w:tc>
+        <w:tc>
+          <w:tcPr>
+            <w:tcW w:w="1872" w:type="dxa"/>
+          </w:tcPr>
+          <w:p>
+            <w:pPr/>
+            <w:r>
+              <w:t xml:space="preserve">67,7 % / 68,7 % / 68,7 %</w:t>
+            </w:r>
+          </w:p>
+        </w:tc>
+      </w:tr>
+      <w:tr>
+        <w:tc>
+          <w:tcPr>
+            <w:tcW w:w="1872" w:type="dxa"/>
+          </w:tcPr>
+          <w:p>
+            <w:pPr/>
+            <w:r>
+              <w:t xml:space="preserve">Contexto semántico</w:t>
+            </w:r>
+          </w:p>
+        </w:tc>
+        <w:tc>
+          <w:tcPr>
+            <w:tcW w:w="1872" w:type="dxa"/>
+          </w:tcPr>
+          <w:p>
+            <w:pPr/>
+            <w:hyperlink r:id="rId27" w:history="1">
+              <w:r>
+                <w:rPr>
+                  <w:rStyle w:val="Hyperlink"/>
+                </w:rPr>
+                <w:t xml:space="preserve">Snowflake, 2024</w:t>
+              </w:r>
+            </w:hyperlink>
+          </w:p>
+        </w:tc>
+        <w:tc>
+          <w:tcPr>
+            <w:tcW w:w="1872" w:type="dxa"/>
+          </w:tcPr>
+          <w:p>
+            <w:pPr/>
+            <w:r>
+              <w:t xml:space="preserve">Interno, 150 preguntas; mide coincidencia de columnas, no ejecución</w:t>
+            </w:r>
+          </w:p>
+        </w:tc>
+        <w:tc>
+          <w:tcPr>
+            <w:tcW w:w="1872" w:type="dxa"/>
+          </w:tcPr>
+          <w:p>
+            <w:pPr/>
+            <w:r>
+              <w:t xml:space="preserve">Cortex Analyst frente a GPT-4o sobre tablas</w:t>
+            </w:r>
+          </w:p>
+        </w:tc>
+        <w:tc>
+          <w:tcPr>
+            <w:tcW w:w="1872" w:type="dxa"/>
+          </w:tcPr>
+          <w:p>
+            <w:pPr/>
+            <w:r>
+              <w:t xml:space="preserve">Más del 90 % frente a 51 %</w:t>
+            </w:r>
+          </w:p>
+        </w:tc>
+      </w:tr>
+      <w:tr>
+        <w:tc>
+          <w:tcPr>
+            <w:tcW w:w="1872" w:type="dxa"/>
+          </w:tcPr>
+          <w:p>
+            <w:pPr/>
+            <w:r>
+              <w:t xml:space="preserve">Grafo con ontología</w:t>
+            </w:r>
+          </w:p>
+        </w:tc>
         <w:tc>
           <w:tcPr>
             <w:tcW w:w="1872" w:type="dxa"/>
@@ -1241,7 +2586,7 @@
                 <w:rPr>
                   <w:rStyle w:val="Hyperlink"/>
                 </w:rPr>
-                <w:t xml:space="preserve">Semantic Layer vs. Text-to-SQL</w:t>
+                <w:t xml:space="preserve">data.world, 2023</w:t>
               </w:r>
             </w:hyperlink>
           </w:p>
@@ -1253,45 +2598,45 @@
           <w:p>
             <w:pPr/>
             <w:r>
-              <w:t xml:space="preserve">dbt Labs, 2026</w:t>
-            </w:r>
-          </w:p>
-        </w:tc>
-        <w:tc>
-          <w:tcPr>
-            <w:tcW w:w="1872" w:type="dxa"/>
-          </w:tcPr>
-          <w:p>
-            <w:pPr/>
-            <w:r>
-              <w:t xml:space="preserve">84,1 % a 90,0 %</w:t>
-            </w:r>
-          </w:p>
-        </w:tc>
-        <w:tc>
-          <w:tcPr>
-            <w:tcW w:w="1872" w:type="dxa"/>
-          </w:tcPr>
-          <w:p>
-            <w:pPr/>
-            <w:r>
-              <w:t xml:space="preserve">98,2 % a 100 %</w:t>
-            </w:r>
-          </w:p>
-        </w:tc>
-        <w:tc>
-          <w:tcPr>
-            <w:tcW w:w="1872" w:type="dxa"/>
-          </w:tcPr>
-          <w:p>
-            <w:pPr/>
-            <w:r>
-              <w:t xml:space="preserve">Proveedor de capa semántica; esquema sencillo</w:t>
+              <w:t xml:space="preserve">Seguros ACME</w:t>
+            </w:r>
+          </w:p>
+        </w:tc>
+        <w:tc>
+          <w:tcPr>
+            <w:tcW w:w="1872" w:type="dxa"/>
+          </w:tcPr>
+          <w:p>
+            <w:pPr/>
+            <w:r>
+              <w:t xml:space="preserve">GPT-4</w:t>
+            </w:r>
+          </w:p>
+        </w:tc>
+        <w:tc>
+          <w:tcPr>
+            <w:tcW w:w="1872" w:type="dxa"/>
+          </w:tcPr>
+          <w:p>
+            <w:pPr/>
+            <w:r>
+              <w:t xml:space="preserve">54,2 % (sobre tablas: 16,7 %)</w:t>
             </w:r>
           </w:p>
         </w:tc>
       </w:tr>
       <w:tr>
+        <w:tc>
+          <w:tcPr>
+            <w:tcW w:w="1872" w:type="dxa"/>
+          </w:tcPr>
+          <w:p>
+            <w:pPr/>
+            <w:r>
+              <w:t xml:space="preserve">Grafo con ontología</w:t>
+            </w:r>
+          </w:p>
+        </w:tc>
         <w:tc>
           <w:tcPr>
             <w:tcW w:w="1872" w:type="dxa"/>
@@ -1303,7 +2648,7 @@
                 <w:rPr>
                   <w:rStyle w:val="Hyperlink"/>
                 </w:rPr>
-                <w:t xml:space="preserve">Paired Benchmark of Accuracy and Hallucination</w:t>
+                <w:t xml:space="preserve">data.world, 2024</w:t>
               </w:r>
             </w:hyperlink>
           </w:p>
@@ -1315,40 +2660,262 @@
           <w:p>
             <w:pPr/>
             <w:r>
-              <w:t xml:space="preserve">Académico, abril 2026</w:t>
-            </w:r>
-          </w:p>
-        </w:tc>
-        <w:tc>
-          <w:tcPr>
-            <w:tcW w:w="1872" w:type="dxa"/>
-          </w:tcPr>
-          <w:p>
-            <w:pPr/>
-            <w:r>
-              <w:t xml:space="preserve">Ver estudio</w:t>
-            </w:r>
-          </w:p>
-        </w:tc>
-        <w:tc>
-          <w:tcPr>
-            <w:tcW w:w="1872" w:type="dxa"/>
-          </w:tcPr>
-          <w:p>
-            <w:pPr/>
-            <w:r>
-              <w:t xml:space="preserve">Ver estudio</w:t>
-            </w:r>
-          </w:p>
-        </w:tc>
-        <w:tc>
-          <w:tcPr>
-            <w:tcW w:w="1872" w:type="dxa"/>
-          </w:tcPr>
-          <w:p>
-            <w:pPr/>
-            <w:r>
-              <w:t xml:space="preserve">Tres modelos frontera; mide alucinación, no solo acierto</w:t>
+              <w:t xml:space="preserve">El mismo, con comprobación contra la ontología y reparación</w:t>
+            </w:r>
+          </w:p>
+        </w:tc>
+        <w:tc>
+          <w:tcPr>
+            <w:tcW w:w="1872" w:type="dxa"/>
+          </w:tcPr>
+          <w:p>
+            <w:pPr/>
+            <w:r>
+              <w:t xml:space="preserve">GPT-4</w:t>
+            </w:r>
+          </w:p>
+        </w:tc>
+        <w:tc>
+          <w:tcPr>
+            <w:tcW w:w="1872" w:type="dxa"/>
+          </w:tcPr>
+          <w:p>
+            <w:pPr/>
+            <w:r>
+              <w:t xml:space="preserve">72,55 % (8 % «no lo sé», 19 % de error)</w:t>
+            </w:r>
+          </w:p>
+        </w:tc>
+      </w:tr>
+      <w:tr>
+        <w:tc>
+          <w:tcPr>
+            <w:tcW w:w="1872" w:type="dxa"/>
+          </w:tcPr>
+          <w:p>
+            <w:pPr/>
+            <w:r>
+              <w:t xml:space="preserve">Text-to-metrics</w:t>
+            </w:r>
+          </w:p>
+        </w:tc>
+        <w:tc>
+          <w:tcPr>
+            <w:tcW w:w="1872" w:type="dxa"/>
+          </w:tcPr>
+          <w:p>
+            <w:pPr/>
+            <w:r>
+              <w:t xml:space="preserve">dbt Labs, 2026</w:t>
+            </w:r>
+          </w:p>
+        </w:tc>
+        <w:tc>
+          <w:tcPr>
+            <w:tcW w:w="1872" w:type="dxa"/>
+          </w:tcPr>
+          <w:p>
+            <w:pPr/>
+            <w:r>
+              <w:t xml:space="preserve">Seguros ACME, solo las preguntas que el modelo cubre</w:t>
+            </w:r>
+          </w:p>
+        </w:tc>
+        <w:tc>
+          <w:tcPr>
+            <w:tcW w:w="1872" w:type="dxa"/>
+          </w:tcPr>
+          <w:p>
+            <w:pPr/>
+            <w:r>
+              <w:t xml:space="preserve">Claude Sonnet 4.6 / GPT-5.3 Codex</w:t>
+            </w:r>
+          </w:p>
+        </w:tc>
+        <w:tc>
+          <w:tcPr>
+            <w:tcW w:w="1872" w:type="dxa"/>
+          </w:tcPr>
+          <w:p>
+            <w:pPr/>
+            <w:r>
+              <w:t xml:space="preserve">100 % / 100 %</w:t>
+            </w:r>
+          </w:p>
+        </w:tc>
+      </w:tr>
+      <w:tr>
+        <w:tc>
+          <w:tcPr>
+            <w:tcW w:w="1872" w:type="dxa"/>
+          </w:tcPr>
+          <w:p>
+            <w:pPr/>
+            <w:r>
+              <w:t xml:space="preserve">Text-to-metrics</w:t>
+            </w:r>
+          </w:p>
+        </w:tc>
+        <w:tc>
+          <w:tcPr>
+            <w:tcW w:w="1872" w:type="dxa"/>
+          </w:tcPr>
+          <w:p>
+            <w:pPr/>
+            <w:r>
+              <w:t xml:space="preserve">dbt Labs, 2026</w:t>
+            </w:r>
+          </w:p>
+        </w:tc>
+        <w:tc>
+          <w:tcPr>
+            <w:tcW w:w="1872" w:type="dxa"/>
+          </w:tcPr>
+          <w:p>
+            <w:pPr/>
+            <w:r>
+              <w:t xml:space="preserve">El mismo, todas las preguntas (las no cubiertas se contestan «no puedo»)</w:t>
+            </w:r>
+          </w:p>
+        </w:tc>
+        <w:tc>
+          <w:tcPr>
+            <w:tcW w:w="1872" w:type="dxa"/>
+          </w:tcPr>
+          <w:p>
+            <w:pPr/>
+            <w:r>
+              <w:t xml:space="preserve">Claude Sonnet 4.6 / GPT-5.3 Codex</w:t>
+            </w:r>
+          </w:p>
+        </w:tc>
+        <w:tc>
+          <w:tcPr>
+            <w:tcW w:w="1872" w:type="dxa"/>
+          </w:tcPr>
+          <w:p>
+            <w:pPr/>
+            <w:r>
+              <w:t xml:space="preserve">72,7 % / 72,7 %</w:t>
+            </w:r>
+          </w:p>
+        </w:tc>
+      </w:tr>
+      <w:tr>
+        <w:tc>
+          <w:tcPr>
+            <w:tcW w:w="1872" w:type="dxa"/>
+          </w:tcPr>
+          <w:p>
+            <w:pPr/>
+            <w:r>
+              <w:t xml:space="preserve">Text-to-metrics</w:t>
+            </w:r>
+          </w:p>
+        </w:tc>
+        <w:tc>
+          <w:tcPr>
+            <w:tcW w:w="1872" w:type="dxa"/>
+          </w:tcPr>
+          <w:p>
+            <w:pPr/>
+            <w:r>
+              <w:t xml:space="preserve">dbt Labs, 2026</w:t>
+            </w:r>
+          </w:p>
+        </w:tc>
+        <w:tc>
+          <w:tcPr>
+            <w:tcW w:w="1872" w:type="dxa"/>
+          </w:tcPr>
+          <w:p>
+            <w:pPr/>
+            <w:r>
+              <w:t xml:space="preserve">El mismo, tras ampliar la cobertura con 3 tablas preparadas</w:t>
+            </w:r>
+          </w:p>
+        </w:tc>
+        <w:tc>
+          <w:tcPr>
+            <w:tcW w:w="1872" w:type="dxa"/>
+          </w:tcPr>
+          <w:p>
+            <w:pPr/>
+            <w:r>
+              <w:t xml:space="preserve">Claude Sonnet 4.6 / GPT-5.3 Codex</w:t>
+            </w:r>
+          </w:p>
+        </w:tc>
+        <w:tc>
+          <w:tcPr>
+            <w:tcW w:w="1872" w:type="dxa"/>
+          </w:tcPr>
+          <w:p>
+            <w:pPr/>
+            <w:r>
+              <w:t xml:space="preserve">98,2 % / 100 %</w:t>
+            </w:r>
+          </w:p>
+        </w:tc>
+      </w:tr>
+      <w:tr>
+        <w:tc>
+          <w:tcPr>
+            <w:tcW w:w="1872" w:type="dxa"/>
+          </w:tcPr>
+          <w:p>
+            <w:pPr/>
+            <w:r>
+              <w:t xml:space="preserve">Text-to-metrics (variante)</w:t>
+            </w:r>
+          </w:p>
+        </w:tc>
+        <w:tc>
+          <w:tcPr>
+            <w:tcW w:w="1872" w:type="dxa"/>
+          </w:tcPr>
+          <w:p>
+            <w:pPr/>
+            <w:hyperlink r:id="rId28" w:history="1">
+              <w:r>
+                <w:rPr>
+                  <w:rStyle w:val="Hyperlink"/>
+                </w:rPr>
+                <w:t xml:space="preserve">AtScale, agosto 2024</w:t>
+              </w:r>
+            </w:hyperlink>
+          </w:p>
+        </w:tc>
+        <w:tc>
+          <w:tcPr>
+            <w:tcW w:w="1872" w:type="dxa"/>
+          </w:tcPr>
+          <w:p>
+            <w:pPr/>
+            <w:r>
+              <w:t xml:space="preserve">TPC-DS, 40 preguntas; el LLM escribe SQL contra el modelo semántico y el motor resuelve joins y agregaciones</w:t>
+            </w:r>
+          </w:p>
+        </w:tc>
+        <w:tc>
+          <w:tcPr>
+            <w:tcW w:w="1872" w:type="dxa"/>
+          </w:tcPr>
+          <w:p>
+            <w:pPr/>
+            <w:r>
+              <w:t xml:space="preserve">Gemini 1.5 Pro</w:t>
+            </w:r>
+          </w:p>
+        </w:tc>
+        <w:tc>
+          <w:tcPr>
+            <w:tcW w:w="1872" w:type="dxa"/>
+          </w:tcPr>
+          <w:p>
+            <w:pPr/>
+            <w:r>
+              <w:t xml:space="preserve">92,5 % (sin capa: 20 %)</w:t>
             </w:r>
           </w:p>
         </w:tc>
@@ -1357,9 +2924,21 @@
     <w:p>
       <w:pPr/>
       <w:r>
+        <w:t xml:space="preserve">Los porcentajes no son comparables entre bancos de pruebas distintos: la comparación válida es dentro de cada estudio. Y no hay un estudio de 2026 que mida el enfoque de grafo con modelos actuales; sus cifras son de GPT-4. Lo que se lee dentro de cada estudio: en dbt, el SQL con LLM sobre tablas ya acierta un 64,5 % con los modelos de hoy (en 2023 era un 32,7 % en esa misma prueba) y text-to-metrics llega al 100 % en lo que cubre, por generación determinista y no por perfección del LLM. En Cube, dar las definiciones como contexto sube el acierto entre 17 y 23 puntos, pero el LLM sigue escribiendo el SQL y se queda en torno al 68 %. En data.world, el grafo triplica el acierto del SQL sobre tablas y la comprobación contra la ontología lo lleva al 72,55 %, con uno de cada cinco erróneo.</w:t>
+      </w:r>
+    </w:p>
+    <w:p>
+      <w:pPr/>
+      <w:r>
+        <w:t xml:space="preserve">Para un banco la cifra que importa no es el acierto sino cuántas respuestas son erróneas y parecen buenas. Text-to-metrics elimina dentro de su alcance los errores de aritmética y de SQL, y lo que no puede responder lo convierte en «no puedo». Quedan dos errores que sí pueden parecer buenos: que el LLM elija mal la métrica, el filtro o la fecha, y que la métrica esté mal definida; se atacan con el juego de pruebas y con la firma del dueño. Cautelas: casi todos los estudios los firman proveedores con producto propio (dbt, Cube, Snowflake, data.world, AtScale) y las muestras son pequeñas; sirven como indicio de dirección, no como cifras para comprometer. La medición que conviene presentar es la propia, con las preguntas reales del banco en tres condiciones (SQL sobre tablas, SQL con los YAML como contexto y text-to-metrics), contando por separado aciertos, errores y «no puedo».</w:t>
+      </w:r>
+    </w:p>
+    <w:p>
+      <w:pPr/>
+      <w:r>
         <w:t xml:space="preserve">Más relevante que las cifras es el patrón arquitectónico que emerge de los trabajos de 2026: el modelo de lenguaje planifica y una capa determinista compila. "</w:t>
       </w:r>
-      <w:hyperlink r:id="rId22" w:history="1">
+      <w:hyperlink r:id="rId29" w:history="1">
         <w:r>
           <w:rPr>
             <w:rStyle w:val="Hyperlink"/>
@@ -1370,7 +2949,7 @@
       <w:r>
         <w:t xml:space="preserve">" y "</w:t>
       </w:r>
-      <w:hyperlink r:id="rId23" w:history="1">
+      <w:hyperlink r:id="rId30" w:history="1">
         <w:r>
           <w:rPr>
             <w:rStyle w:val="Hyperlink"/>
@@ -1393,7 +2972,7 @@
       <w:r>
         <w:t xml:space="preserve"> </w:t>
       </w:r>
-      <w:hyperlink r:id="rId24" w:history="1">
+      <w:hyperlink r:id="rId31" w:history="1">
         <w:r>
           <w:rPr>
             <w:rStyle w:val="Hyperlink"/>
@@ -1404,7 +2983,7 @@
       <w:r>
         <w:t xml:space="preserve">, publicado en septiembre de 2026, construye la ontología con un agente y la hace evolucionar a partir de las trayectorias de ejecución: diagnostica el fallo, lo atribuye a un concepto, propone un parche tipado y lo acepta solo si una evaluación pareada confirma la mejora. Expone la ontología versionada a los agentes a través de MCP. Otro trabajo de 2026 (</w:t>
       </w:r>
-      <w:hyperlink r:id="rId25" w:history="1">
+      <w:hyperlink r:id="rId32" w:history="1">
         <w:r>
           <w:rPr>
             <w:rStyle w:val="Hyperlink"/>
@@ -1445,6 +3024,12 @@
     <w:p>
       <w:pPr/>
       <w:r>
+        <w:t xml:space="preserve">En Dato como Producto este escenario tiene nombre propio. UNICON2 es la plataforma que lee el código y los procesos del banco y convierte el conocimiento implícito en catálogo, diccionario y linaje, y en su hoja de ruta figuran la capa semántica y la ontología corporativa como salidas siguientes. El mundo de Jupy es UNICON2 cerrando el ciclo: no levanta el conocimiento una vez, sino que lo mantiene.</w:t>
+      </w:r>
+    </w:p>
+    <w:p>
+      <w:pPr/>
+      <w:r>
         <w:rPr>
           <w:b/>
         </w:rPr>
@@ -1472,16 +3057,16 @@
         <w:drawing>
           <wp:inline distT="0" distB="0" distL="0" distR="0">
             <wp:extent cx="5486400" cy="2939142"/>
-            <wp:docPr id="2" name="image2" descr="ciclo de mantenimiento del significado · 7 pasos, 1 decisión humana"/>
+            <wp:docPr id="3" name="image3" descr="ciclo de mantenimiento del significado · 7 pasos, 1 decisión humana"/>
             <a:graphic xmlns:a="http://schemas.openxmlformats.org/drawingml/2006/main">
               <a:graphicData uri="http://schemas.openxmlformats.org/drawingml/2006/picture">
                 <pic:pic xmlns:pic="http://schemas.openxmlformats.org/drawingml/2006/picture">
                   <pic:nvPicPr>
-                    <pic:cNvPr id="2" name="image2" descr="ciclo de mantenimiento del significado · 7 pasos, 1 decisión humana"/>
+                    <pic:cNvPr id="3" name="image3" descr="ciclo de mantenimiento del significado · 7 pasos, 1 decisión humana"/>
                     <pic:cNvPicPr/>
                   </pic:nvPicPr>
                   <pic:blipFill>
-                    <a:blip r:embed="rId26"/>
+                    <a:blip r:embed="rId33"/>
                     <a:stretch>
                       <a:fillRect/>
                     </a:stretch>
@@ -1573,7 +3158,7 @@
     <w:p>
       <w:pPr/>
       <w:r>
-        <w:t xml:space="preserve">La mayoría de las entidades europeas están entre el nivel 1 y el 2. El mundo de Jupy es el nivel 4. Cada salto tiene una condición de entrada que no es tecnológica.</w:t>
+        <w:t xml:space="preserve">Los cuatro componentes tienen grados de desarrollo distintos, y por eso una escala única engaña. La matriz sitúa cada componente por separado; el nivel 4 de cada fila es el mundo de Jupy. La última columna dice dónde está el banco en octubre de 2026.</w:t>
       </w:r>
     </w:p>
     <w:tbl>
@@ -1584,11 +3169,13 @@
         <w:tblLook w:val="04A0" w:firstRow="1" w:lastRow="0" w:firstColumn="0" w:lastColumn="0" w:noHBand="0" w:noVBand="1"/>
       </w:tblPr>
       <w:tblGrid>
-        <w:gridCol w:w="1872"/>
-        <w:gridCol w:w="1872"/>
-        <w:gridCol w:w="1872"/>
-        <w:gridCol w:w="1872"/>
-        <w:gridCol w:w="1872"/>
+        <w:gridCol w:w="1337"/>
+        <w:gridCol w:w="1337"/>
+        <w:gridCol w:w="1337"/>
+        <w:gridCol w:w="1337"/>
+        <w:gridCol w:w="1337"/>
+        <w:gridCol w:w="1337"/>
+        <w:gridCol w:w="1337"/>
       </w:tblGrid>
       <w:tr>
         <w:trPr>
@@ -1596,61 +3183,85 @@
         </w:trPr>
         <w:tc>
           <w:tcPr>
-            <w:tcW w:w="1872" w:type="dxa"/>
+            <w:tcW w:w="1337" w:type="dxa"/>
             <w:shd w:val="clear" w:color="auto" w:fill="F2F2F2"/>
           </w:tcPr>
           <w:p>
             <w:pPr/>
             <w:r>
-              <w:t xml:space="preserve">Nivel</w:t>
-            </w:r>
-          </w:p>
-        </w:tc>
-        <w:tc>
-          <w:tcPr>
-            <w:tcW w:w="1872" w:type="dxa"/>
+              <w:t xml:space="preserve">Componente</w:t>
+            </w:r>
+          </w:p>
+        </w:tc>
+        <w:tc>
+          <w:tcPr>
+            <w:tcW w:w="1337" w:type="dxa"/>
             <w:shd w:val="clear" w:color="auto" w:fill="F2F2F2"/>
           </w:tcPr>
           <w:p>
             <w:pPr/>
             <w:r>
-              <w:t xml:space="preserve">Cómo se ve</w:t>
-            </w:r>
-          </w:p>
-        </w:tc>
-        <w:tc>
-          <w:tcPr>
-            <w:tcW w:w="1872" w:type="dxa"/>
+              <w:t xml:space="preserve">Nivel 0</w:t>
+            </w:r>
+          </w:p>
+        </w:tc>
+        <w:tc>
+          <w:tcPr>
+            <w:tcW w:w="1337" w:type="dxa"/>
             <w:shd w:val="clear" w:color="auto" w:fill="F2F2F2"/>
           </w:tcPr>
           <w:p>
             <w:pPr/>
             <w:r>
-              <w:t xml:space="preserve">Qué tiene</w:t>
-            </w:r>
-          </w:p>
-        </w:tc>
-        <w:tc>
-          <w:tcPr>
-            <w:tcW w:w="1872" w:type="dxa"/>
+              <w:t xml:space="preserve">Nivel 1</w:t>
+            </w:r>
+          </w:p>
+        </w:tc>
+        <w:tc>
+          <w:tcPr>
+            <w:tcW w:w="1337" w:type="dxa"/>
             <w:shd w:val="clear" w:color="auto" w:fill="F2F2F2"/>
           </w:tcPr>
           <w:p>
             <w:pPr/>
             <w:r>
-              <w:t xml:space="preserve">Qué falta</w:t>
-            </w:r>
-          </w:p>
-        </w:tc>
-        <w:tc>
-          <w:tcPr>
-            <w:tcW w:w="1872" w:type="dxa"/>
+              <w:t xml:space="preserve">Nivel 2</w:t>
+            </w:r>
+          </w:p>
+        </w:tc>
+        <w:tc>
+          <w:tcPr>
+            <w:tcW w:w="1337" w:type="dxa"/>
             <w:shd w:val="clear" w:color="auto" w:fill="F2F2F2"/>
           </w:tcPr>
           <w:p>
             <w:pPr/>
             <w:r>
-              <w:t xml:space="preserve">Condición para subir</w:t>
+              <w:t xml:space="preserve">Nivel 3</w:t>
+            </w:r>
+          </w:p>
+        </w:tc>
+        <w:tc>
+          <w:tcPr>
+            <w:tcW w:w="1337" w:type="dxa"/>
+            <w:shd w:val="clear" w:color="auto" w:fill="F2F2F2"/>
+          </w:tcPr>
+          <w:p>
+            <w:pPr/>
+            <w:r>
+              <w:t xml:space="preserve">Nivel 4</w:t>
+            </w:r>
+          </w:p>
+        </w:tc>
+        <w:tc>
+          <w:tcPr>
+            <w:tcW w:w="1337" w:type="dxa"/>
+            <w:shd w:val="clear" w:color="auto" w:fill="F2F2F2"/>
+          </w:tcPr>
+          <w:p>
+            <w:pPr/>
+            <w:r>
+              <w:t xml:space="preserve">Dónde está el banco</w:t>
             </w:r>
           </w:p>
         </w:tc>
@@ -1658,56 +3269,78 @@
       <w:tr>
         <w:tc>
           <w:tcPr>
-            <w:tcW w:w="1872" w:type="dxa"/>
-          </w:tcPr>
-          <w:p>
-            <w:pPr/>
-            <w:r>
-              <w:t xml:space="preserve">0. Tribal</w:t>
-            </w:r>
-          </w:p>
-        </w:tc>
-        <w:tc>
-          <w:tcPr>
-            <w:tcW w:w="1872" w:type="dxa"/>
-          </w:tcPr>
-          <w:p>
-            <w:pPr/>
-            <w:r>
-              <w:t xml:space="preserve">Las definiciones viven en SQL de informes y en personas concretas</w:t>
-            </w:r>
-          </w:p>
-        </w:tc>
-        <w:tc>
-          <w:tcPr>
-            <w:tcW w:w="1872" w:type="dxa"/>
-          </w:tcPr>
-          <w:p>
-            <w:pPr/>
-            <w:r>
-              <w:t xml:space="preserve">Diccionario de datos documental para BCBS 239</w:t>
-            </w:r>
-          </w:p>
-        </w:tc>
-        <w:tc>
-          <w:tcPr>
-            <w:tcW w:w="1872" w:type="dxa"/>
-          </w:tcPr>
-          <w:p>
-            <w:pPr/>
-            <w:r>
-              <w:t xml:space="preserve">Nada ejecutable; dos informes del mismo dato no cuadran</w:t>
-            </w:r>
-          </w:p>
-        </w:tc>
-        <w:tc>
-          <w:tcPr>
-            <w:tcW w:w="1872" w:type="dxa"/>
-          </w:tcPr>
-          <w:p>
-            <w:pPr/>
-            <w:r>
-              <w:t xml:space="preserve">Inventario de elementos críticos de datos con propietario nombrado</w:t>
+            <w:tcW w:w="1337" w:type="dxa"/>
+          </w:tcPr>
+          <w:p>
+            <w:pPr/>
+            <w:r>
+              <w:t xml:space="preserve">Capa semántica</w:t>
+            </w:r>
+          </w:p>
+        </w:tc>
+        <w:tc>
+          <w:tcPr>
+            <w:tcW w:w="1337" w:type="dxa"/>
+          </w:tcPr>
+          <w:p>
+            <w:pPr/>
+            <w:r>
+              <w:t xml:space="preserve">Definiciones en informes y en personas</w:t>
+            </w:r>
+          </w:p>
+        </w:tc>
+        <w:tc>
+          <w:tcPr>
+            <w:tcW w:w="1337" w:type="dxa"/>
+          </w:tcPr>
+          <w:p>
+            <w:pPr/>
+            <w:r>
+              <w:t xml:space="preserve">Métricas aprobadas en la plataforma de datos, consultables por BI</w:t>
+            </w:r>
+          </w:p>
+        </w:tc>
+        <w:tc>
+          <w:tcPr>
+            <w:tcW w:w="1337" w:type="dxa"/>
+          </w:tcPr>
+          <w:p>
+            <w:pPr/>
+            <w:r>
+              <w:t xml:space="preserve">YAML en formato abierto con temporalidad, dimensiones y valores; agentes por text-to-SQL con el YAML como contexto</w:t>
+            </w:r>
+          </w:p>
+        </w:tc>
+        <w:tc>
+          <w:tcPr>
+            <w:tcW w:w="1337" w:type="dxa"/>
+          </w:tcPr>
+          <w:p>
+            <w:pPr/>
+            <w:r>
+              <w:t xml:space="preserve">Text-to-metrics: compilador determinista, vía certificada y vía exploratoria separadas</w:t>
+            </w:r>
+          </w:p>
+        </w:tc>
+        <w:tc>
+          <w:tcPr>
+            <w:tcW w:w="1337" w:type="dxa"/>
+          </w:tcPr>
+          <w:p>
+            <w:pPr/>
+            <w:r>
+              <w:t xml:space="preserve">Fachada multiplataforma, repositorio único y propuestas automáticas de cambio con aprobación del propietario</w:t>
+            </w:r>
+          </w:p>
+        </w:tc>
+        <w:tc>
+          <w:tcPr>
+            <w:tcW w:w="1337" w:type="dxa"/>
+          </w:tcPr>
+          <w:p>
+            <w:pPr/>
+            <w:r>
+              <w:t xml:space="preserve">Entre 2 y 3: etapa 1 probada en Teradata, YAML industrializados al 80–90 %, etapa 2 en PoC</w:t>
             </w:r>
           </w:p>
         </w:tc>
@@ -1715,56 +3348,78 @@
       <w:tr>
         <w:tc>
           <w:tcPr>
-            <w:tcW w:w="1872" w:type="dxa"/>
-          </w:tcPr>
-          <w:p>
-            <w:pPr/>
-            <w:r>
-              <w:t xml:space="preserve">1. Definido</w:t>
-            </w:r>
-          </w:p>
-        </w:tc>
-        <w:tc>
-          <w:tcPr>
-            <w:tcW w:w="1872" w:type="dxa"/>
-          </w:tcPr>
-          <w:p>
-            <w:pPr/>
-            <w:r>
-              <w:t xml:space="preserve">Capa semántica o de métricas en la plataforma de datos para los indicadores de riesgo y finanzas</w:t>
-            </w:r>
-          </w:p>
-        </w:tc>
-        <w:tc>
-          <w:tcPr>
-            <w:tcW w:w="1872" w:type="dxa"/>
-          </w:tcPr>
-          <w:p>
-            <w:pPr/>
-            <w:r>
-              <w:t xml:space="preserve">Métricas aprobadas, consultables por BI y por agentes con permisos heredados</w:t>
-            </w:r>
-          </w:p>
-        </w:tc>
-        <w:tc>
-          <w:tcPr>
-            <w:tcW w:w="1872" w:type="dxa"/>
-          </w:tcPr>
-          <w:p>
-            <w:pPr/>
-            <w:r>
-              <w:t xml:space="preserve">Conceptos y relaciones; los documentos siguen fuera</w:t>
-            </w:r>
-          </w:p>
-        </w:tc>
-        <w:tc>
-          <w:tcPr>
-            <w:tcW w:w="1872" w:type="dxa"/>
-          </w:tcPr>
-          <w:p>
-            <w:pPr/>
-            <w:r>
-              <w:t xml:space="preserve">Modelo conceptual del dominio crítico, alineado a FIBO y a la taxonomía de grupo</w:t>
+            <w:tcW w:w="1337" w:type="dxa"/>
+          </w:tcPr>
+          <w:p>
+            <w:pPr/>
+            <w:r>
+              <w:t xml:space="preserve">Ontología</w:t>
+            </w:r>
+          </w:p>
+        </w:tc>
+        <w:tc>
+          <w:tcPr>
+            <w:tcW w:w="1337" w:type="dxa"/>
+          </w:tcPr>
+          <w:p>
+            <w:pPr/>
+            <w:r>
+              <w:t xml:space="preserve">Ninguna</w:t>
+            </w:r>
+          </w:p>
+        </w:tc>
+        <w:tc>
+          <w:tcPr>
+            <w:tcW w:w="1337" w:type="dxa"/>
+          </w:tcPr>
+          <w:p>
+            <w:pPr/>
+            <w:r>
+              <w:t xml:space="preserve">Conceptos y relaciones implícitos en los YAML (entidades de negocio, relaciones, dominios semánticos)</w:t>
+            </w:r>
+          </w:p>
+        </w:tc>
+        <w:tc>
+          <w:tcPr>
+            <w:tcW w:w="1337" w:type="dxa"/>
+          </w:tcPr>
+          <w:p>
+            <w:pPr/>
+            <w:r>
+              <w:t xml:space="preserve">Ontología explícita y versionada para un dominio, alineada a FIBO y a la taxonomía de grupo</w:t>
+            </w:r>
+          </w:p>
+        </w:tc>
+        <w:tc>
+          <w:tcPr>
+            <w:tcW w:w="1337" w:type="dxa"/>
+          </w:tcPr>
+          <w:p>
+            <w:pPr/>
+            <w:r>
+              <w:t xml:space="preserve">Reglas de inferencia gobernadas como modelos; documentos extraídos a sus conceptos</w:t>
+            </w:r>
+          </w:p>
+        </w:tc>
+        <w:tc>
+          <w:tcPr>
+            <w:tcW w:w="1337" w:type="dxa"/>
+          </w:tcPr>
+          <w:p>
+            <w:pPr/>
+            <w:r>
+              <w:t xml:space="preserve">Agentes proponen cambios desde código, logs y documentos; propietarios aprueban</w:t>
+            </w:r>
+          </w:p>
+        </w:tc>
+        <w:tc>
+          <w:tcPr>
+            <w:tcW w:w="1337" w:type="dxa"/>
+          </w:tcPr>
+          <w:p>
+            <w:pPr/>
+            <w:r>
+              <w:t xml:space="preserve">1: la semilla está en los YAML y en el diccionario de BCBS 239; UNICON2 prevé la ontología corporativa como salida</w:t>
             </w:r>
           </w:p>
         </w:tc>
@@ -1772,56 +3427,78 @@
       <w:tr>
         <w:tc>
           <w:tcPr>
-            <w:tcW w:w="1872" w:type="dxa"/>
-          </w:tcPr>
-          <w:p>
-            <w:pPr/>
-            <w:r>
-              <w:t xml:space="preserve">2. Modelado</w:t>
-            </w:r>
-          </w:p>
-        </w:tc>
-        <w:tc>
-          <w:tcPr>
-            <w:tcW w:w="1872" w:type="dxa"/>
-          </w:tcPr>
-          <w:p>
-            <w:pPr/>
-            <w:r>
-              <w:t xml:space="preserve">Ontología explícita y versionada; grafo de conocimiento para uno o dos dominios (sanciones, grupos económicos)</w:t>
-            </w:r>
-          </w:p>
-        </w:tc>
-        <w:tc>
-          <w:tcPr>
-            <w:tcW w:w="1872" w:type="dxa"/>
-          </w:tcPr>
-          <w:p>
-            <w:pPr/>
-            <w:r>
-              <w:t xml:space="preserve">Razonamiento sobre jerarquías; resolución de entidades; linaje a nivel de campo</w:t>
-            </w:r>
-          </w:p>
-        </w:tc>
-        <w:tc>
-          <w:tcPr>
-            <w:tcW w:w="1872" w:type="dxa"/>
-          </w:tcPr>
-          <w:p>
-            <w:pPr/>
-            <w:r>
-              <w:t xml:space="preserve">Documentos sin extraer a la ontología; mantenimiento manual</w:t>
-            </w:r>
-          </w:p>
-        </w:tc>
-        <w:tc>
-          <w:tcPr>
-            <w:tcW w:w="1872" w:type="dxa"/>
-          </w:tcPr>
-          <w:p>
-            <w:pPr/>
-            <w:r>
-              <w:t xml:space="preserve">Pipelines de extracción bajo riesgo de modelo y procedencia al fragmento</w:t>
+            <w:tcW w:w="1337" w:type="dxa"/>
+          </w:tcPr>
+          <w:p>
+            <w:pPr/>
+            <w:r>
+              <w:t xml:space="preserve">Grafo de conocimiento</w:t>
+            </w:r>
+          </w:p>
+        </w:tc>
+        <w:tc>
+          <w:tcPr>
+            <w:tcW w:w="1337" w:type="dxa"/>
+          </w:tcPr>
+          <w:p>
+            <w:pPr/>
+            <w:r>
+              <w:t xml:space="preserve">Ninguno</w:t>
+            </w:r>
+          </w:p>
+        </w:tc>
+        <w:tc>
+          <w:tcPr>
+            <w:tcW w:w="1337" w:type="dxa"/>
+          </w:tcPr>
+          <w:p>
+            <w:pPr/>
+            <w:r>
+              <w:t xml:space="preserve">Grafo técnico de linaje (Rosetta y UNICON2 en Neo4j)</w:t>
+            </w:r>
+          </w:p>
+        </w:tc>
+        <w:tc>
+          <w:tcPr>
+            <w:tcW w:w="1337" w:type="dxa"/>
+          </w:tcPr>
+          <w:p>
+            <w:pPr/>
+            <w:r>
+              <w:t xml:space="preserve">Catálogo métrica → producto → dueño cargado desde los YAML; rutas de unión entre productos</w:t>
+            </w:r>
+          </w:p>
+        </w:tc>
+        <w:tc>
+          <w:tcPr>
+            <w:tcW w:w="1337" w:type="dxa"/>
+          </w:tcPr>
+          <w:p>
+            <w:pPr/>
+            <w:r>
+              <w:t xml:space="preserve">Grafo de entidades de negocio con procedencia para un dominio (grupos económicos, sanciones, demandas)</w:t>
+            </w:r>
+          </w:p>
+        </w:tc>
+        <w:tc>
+          <w:tcPr>
+            <w:tcW w:w="1337" w:type="dxa"/>
+          </w:tcPr>
+          <w:p>
+            <w:pPr/>
+            <w:r>
+              <w:t xml:space="preserve">Documentos y tablas conciliados en el grafo con procedencia al fragmento</w:t>
+            </w:r>
+          </w:p>
+        </w:tc>
+        <w:tc>
+          <w:tcPr>
+            <w:tcW w:w="1337" w:type="dxa"/>
+          </w:tcPr>
+          <w:p>
+            <w:pPr/>
+            <w:r>
+              <w:t xml:space="preserve">1: linaje de host en curso; el nivel 2 sale casi gratis del catálogo de la fachada</w:t>
             </w:r>
           </w:p>
         </w:tc>
@@ -1829,113 +3506,78 @@
       <w:tr>
         <w:tc>
           <w:tcPr>
-            <w:tcW w:w="1872" w:type="dxa"/>
-          </w:tcPr>
-          <w:p>
-            <w:pPr/>
-            <w:r>
-              <w:t xml:space="preserve">3. Unificado</w:t>
-            </w:r>
-          </w:p>
-        </w:tc>
-        <w:tc>
-          <w:tcPr>
-            <w:tcW w:w="1872" w:type="dxa"/>
-          </w:tcPr>
-          <w:p>
-            <w:pPr/>
-            <w:r>
-              <w:t xml:space="preserve">Documentos y tablas conciliados en el grafo; agentes que consultan vía compilación determinista</w:t>
-            </w:r>
-          </w:p>
-        </w:tc>
-        <w:tc>
-          <w:tcPr>
-            <w:tcW w:w="1872" w:type="dxa"/>
-          </w:tcPr>
-          <w:p>
-            <w:pPr/>
-            <w:r>
-              <w:t xml:space="preserve">Trazas de decisión capturadas; reporting ad hoc en horas</w:t>
-            </w:r>
-          </w:p>
-        </w:tc>
-        <w:tc>
-          <w:tcPr>
-            <w:tcW w:w="1872" w:type="dxa"/>
-          </w:tcPr>
-          <w:p>
-            <w:pPr/>
-            <w:r>
-              <w:t xml:space="preserve">La ontología sigue cambiando por proyectos, no por uso</w:t>
-            </w:r>
-          </w:p>
-        </w:tc>
-        <w:tc>
-          <w:tcPr>
-            <w:tcW w:w="1872" w:type="dxa"/>
-          </w:tcPr>
-          <w:p>
-            <w:pPr/>
-            <w:r>
-              <w:t xml:space="preserve">Ontología como código con propuestas automáticas y aprobación por propietario</w:t>
-            </w:r>
-          </w:p>
-        </w:tc>
-      </w:tr>
-      <w:tr>
-        <w:tc>
-          <w:tcPr>
-            <w:tcW w:w="1872" w:type="dxa"/>
-          </w:tcPr>
-          <w:p>
-            <w:pPr/>
-            <w:r>
-              <w:t xml:space="preserve">4. Vivo (mundo de Jupy)</w:t>
-            </w:r>
-          </w:p>
-        </w:tc>
-        <w:tc>
-          <w:tcPr>
-            <w:tcW w:w="1872" w:type="dxa"/>
-          </w:tcPr>
-          <w:p>
-            <w:pPr/>
-            <w:r>
-              <w:t xml:space="preserve">Agentes proponen cambios semánticos desde código, logs y documentos; personas aprueban; cada decisión es un precedente</w:t>
-            </w:r>
-          </w:p>
-        </w:tc>
-        <w:tc>
-          <w:tcPr>
-            <w:tcW w:w="1872" w:type="dxa"/>
-          </w:tcPr>
-          <w:p>
-            <w:pPr/>
-            <w:r>
-              <w:t xml:space="preserve">Significado al ritmo del negocio; inspección como consulta; portabilidad entre plataformas</w:t>
-            </w:r>
-          </w:p>
-        </w:tc>
-        <w:tc>
-          <w:tcPr>
-            <w:tcW w:w="1872" w:type="dxa"/>
-          </w:tcPr>
-          <w:p>
-            <w:pPr/>
-            <w:r>
-              <w:t xml:space="preserve">Nada estructural; el riesgo pasa a ser de calidad de las propuestas y de bucle de retroalimentación</w:t>
-            </w:r>
-          </w:p>
-        </w:tc>
-        <w:tc>
-          <w:tcPr>
-            <w:tcW w:w="1872" w:type="dxa"/>
-          </w:tcPr>
-          <w:p>
-            <w:pPr/>
-            <w:r>
-              <w:t xml:space="preserve">No aplica</w:t>
+            <w:tcW w:w="1337" w:type="dxa"/>
+          </w:tcPr>
+          <w:p>
+            <w:pPr/>
+            <w:r>
+              <w:t xml:space="preserve">Grafo de contexto</w:t>
+            </w:r>
+          </w:p>
+        </w:tc>
+        <w:tc>
+          <w:tcPr>
+            <w:tcW w:w="1337" w:type="dxa"/>
+          </w:tcPr>
+          <w:p>
+            <w:pPr/>
+            <w:r>
+              <w:t xml:space="preserve">Logs sin estructura</w:t>
+            </w:r>
+          </w:p>
+        </w:tc>
+        <w:tc>
+          <w:tcPr>
+            <w:tcW w:w="1337" w:type="dxa"/>
+          </w:tcPr>
+          <w:p>
+            <w:pPr/>
+            <w:r>
+              <w:t xml:space="preserve">Registro inmutable de cada petición certificada: petición, SQL, versión, usuario y fecha</w:t>
+            </w:r>
+          </w:p>
+        </w:tc>
+        <w:tc>
+          <w:tcPr>
+            <w:tcW w:w="1337" w:type="dxa"/>
+          </w:tcPr>
+          <w:p>
+            <w:pPr/>
+            <w:r>
+              <w:t xml:space="preserve">Trazas de decisión de un proceso con agentes, consultables</w:t>
+            </w:r>
+          </w:p>
+        </w:tc>
+        <w:tc>
+          <w:tcPr>
+            <w:tcW w:w="1337" w:type="dxa"/>
+          </w:tcPr>
+          <w:p>
+            <w:pPr/>
+            <w:r>
+              <w:t xml:space="preserve">Precedentes reutilizados por los agentes; registro de eventos del Reglamento de IA</w:t>
+            </w:r>
+          </w:p>
+        </w:tc>
+        <w:tc>
+          <w:tcPr>
+            <w:tcW w:w="1337" w:type="dxa"/>
+          </w:tcPr>
+          <w:p>
+            <w:pPr/>
+            <w:r>
+              <w:t xml:space="preserve">Cada decisión es un precedente; la inspección es una consulta</w:t>
+            </w:r>
+          </w:p>
+        </w:tc>
+        <w:tc>
+          <w:tcPr>
+            <w:tcW w:w="1337" w:type="dxa"/>
+          </w:tcPr>
+          <w:p>
+            <w:pPr/>
+            <w:r>
+              <w:t xml:space="preserve">0, con el nivel 1 ya incluido en el diseño de la etapa 2</w:t>
             </w:r>
           </w:p>
         </w:tc>
@@ -1960,7 +3602,7 @@
         <w:pStyle w:val="ListParagraph"/>
         <w:numPr>
           <w:ilvl w:val="0"/>
-          <w:numId w:val="3"/>
+          <w:numId w:val="5"/>
         </w:numPr>
       </w:pPr>
       <w:r>
@@ -1978,7 +3620,7 @@
         <w:pStyle w:val="ListParagraph"/>
         <w:numPr>
           <w:ilvl w:val="0"/>
-          <w:numId w:val="3"/>
+          <w:numId w:val="5"/>
         </w:numPr>
       </w:pPr>
       <w:r>
@@ -1996,7 +3638,7 @@
         <w:pStyle w:val="ListParagraph"/>
         <w:numPr>
           <w:ilvl w:val="0"/>
-          <w:numId w:val="3"/>
+          <w:numId w:val="5"/>
         </w:numPr>
       </w:pPr>
       <w:r>
@@ -2014,7 +3656,7 @@
         <w:pStyle w:val="ListParagraph"/>
         <w:numPr>
           <w:ilvl w:val="0"/>
-          <w:numId w:val="3"/>
+          <w:numId w:val="5"/>
         </w:numPr>
       </w:pPr>
       <w:r>
@@ -2032,7 +3674,7 @@
         <w:pStyle w:val="ListParagraph"/>
         <w:numPr>
           <w:ilvl w:val="0"/>
-          <w:numId w:val="3"/>
+          <w:numId w:val="5"/>
         </w:numPr>
       </w:pPr>
       <w:r>
@@ -2050,7 +3692,7 @@
         <w:pStyle w:val="ListParagraph"/>
         <w:numPr>
           <w:ilvl w:val="0"/>
-          <w:numId w:val="3"/>
+          <w:numId w:val="5"/>
         </w:numPr>
       </w:pPr>
       <w:r>
@@ -2068,7 +3710,7 @@
         <w:pStyle w:val="ListParagraph"/>
         <w:numPr>
           <w:ilvl w:val="0"/>
-          <w:numId w:val="3"/>
+          <w:numId w:val="5"/>
         </w:numPr>
       </w:pPr>
       <w:r>
@@ -2098,169 +3740,157 @@
     <w:p>
       <w:pPr/>
       <w:r>
-        <w:t xml:space="preserve">El orden importa: cada paso crea la condición del siguiente y produce evidencia regulatoria por sí mismo, de modo que el programa se justifica aunque se detenga a mitad.</w:t>
-      </w:r>
-    </w:p>
-    <w:p>
-      <w:pPr>
-        <w:pStyle w:val="ListParagraph"/>
-        <w:numPr>
-          <w:ilvl w:val="0"/>
-          <w:numId w:val="4"/>
+        <w:t xml:space="preserve">Dos reglas ordenan el camino. La capa semántica avanza en transversal y ahora, porque el entorno informacional ya está gobernado y los YAML existen: es el componente 1 de Dato como Producto y no espera a los demás. Los otros tres componentes avanzan por dominio de uso, allí donde haya agentes haciendo tareas que exijan relaciones, documentos o precedentes. Las líneas van separadas pero coordinadas por una costura: los campos del YAML y del registro de peticiones que alimentarán a la ontología, al grafo y al contexto se deciden ahora, para que la capa semántica no se rehaga.</w:t>
+      </w:r>
+    </w:p>
+    <w:p>
+      <w:pPr>
+        <w:pStyle w:val="ListParagraph"/>
+        <w:numPr>
+          <w:ilvl w:val="0"/>
+          <w:numId w:val="6"/>
         </w:numPr>
       </w:pPr>
       <w:r>
         <w:rPr>
           <w:b/>
         </w:rPr>
-        <w:t xml:space="preserve">Partir del inventario de BCBS 239.</w:t>
-      </w:r>
-      <w:r>
-        <w:t xml:space="preserve"> Los elementos críticos de datos, sus propietarios y el diccionario que ya existen para el supervisor son la semilla de la ontología. No modelar nada que no esté en ese inventario en la primera fase.</w:t>
-      </w:r>
-    </w:p>
-    <w:p>
-      <w:pPr>
-        <w:pStyle w:val="ListParagraph"/>
-        <w:numPr>
-          <w:ilvl w:val="0"/>
-          <w:numId w:val="4"/>
+        <w:t xml:space="preserve">Capa semántica, transversal y ahora.</w:t>
+      </w:r>
+      <w:r>
+        <w:t xml:space="preserve"> Extender la etapa 1 (text-to-SQL con el YAML como contexto) a más vistas de Teradata y probar la etapa 2 (text-to-metrics con compilador determinista) sobre ese entorno; diseñar la etapa 3 (fachada multiplataforma y repositorio único) para no rehacer nada. El detalle está en Capa semántica · 0 Concepto y en sus aplicaciones 1 · Teradata y 2 · Elastic.</w:t>
+      </w:r>
+    </w:p>
+    <w:p>
+      <w:pPr>
+        <w:pStyle w:val="ListParagraph"/>
+        <w:numPr>
+          <w:ilvl w:val="0"/>
+          <w:numId w:val="6"/>
         </w:numPr>
       </w:pPr>
       <w:r>
         <w:rPr>
           <w:b/>
         </w:rPr>
-        <w:t xml:space="preserve">Publicar las métricas de riesgo y finanzas en la capa semántica de la plataforma de datos</w:t>
-      </w:r>
-      <w:r>
-        <w:t xml:space="preserve">, en un formato exportable a Open Semantic Interchange. Exigir esa compatibilidad en cualquier contrato con proveedores.</w:t>
-      </w:r>
-    </w:p>
-    <w:p>
-      <w:pPr>
-        <w:pStyle w:val="ListParagraph"/>
-        <w:numPr>
-          <w:ilvl w:val="0"/>
-          <w:numId w:val="4"/>
+        <w:t xml:space="preserve">Definiciones portables.</w:t>
+      </w:r>
+      <w:r>
+        <w:t xml:space="preserve"> Apache Ossie desde el día 1 con la extensión del banco, y compatibilidad con ese formato exigida en cualquier contrato con proveedores de capas semánticas.</w:t>
+      </w:r>
+    </w:p>
+    <w:p>
+      <w:pPr>
+        <w:pStyle w:val="ListParagraph"/>
+        <w:numPr>
+          <w:ilvl w:val="0"/>
+          <w:numId w:val="6"/>
         </w:numPr>
       </w:pPr>
       <w:r>
         <w:rPr>
           <w:b/>
         </w:rPr>
-        <w:t xml:space="preserve">Escribir la ontología del dominio crítico como código</w:t>
-      </w:r>
-      <w:r>
-        <w:t xml:space="preserve"> en un repositorio con propietario por concepto, fecha de efectividad por versión y la definición regulatoria como regla explícita. Alinear a FIBO y a la taxonomía de grupo sin adoptar FIBO entero.</w:t>
-      </w:r>
-    </w:p>
-    <w:p>
-      <w:pPr>
-        <w:pStyle w:val="ListParagraph"/>
-        <w:numPr>
-          <w:ilvl w:val="0"/>
-          <w:numId w:val="4"/>
+        <w:t xml:space="preserve">La costura.</w:t>
+      </w:r>
+      <w:r>
+        <w:t xml:space="preserve"> Fijar en el YAML y en el registro de peticiones los campos que alimentarán a los otros componentes: entidades y relaciones de negocio para la ontología; dueño, versión y rutas de unión para el grafo; identificador de correlación y versión del producto en cada petición para el contexto.</w:t>
+      </w:r>
+    </w:p>
+    <w:p>
+      <w:pPr>
+        <w:pStyle w:val="ListParagraph"/>
+        <w:numPr>
+          <w:ilvl w:val="0"/>
+          <w:numId w:val="6"/>
         </w:numPr>
       </w:pPr>
       <w:r>
         <w:rPr>
           <w:b/>
         </w:rPr>
-        <w:t xml:space="preserve">Lanzar los agentes de lectura en modo solo propuesta.</w:t>
-      </w:r>
-      <w:r>
-        <w:t xml:space="preserve"> Que recorran código, modelos de datos y logs y abran propuestas de cambio con evidencia. Durante seis meses nadie fusiona nada automáticamente: se mide la calidad de las propuestas.</w:t>
-      </w:r>
-    </w:p>
-    <w:p>
-      <w:pPr>
-        <w:pStyle w:val="ListParagraph"/>
-        <w:numPr>
-          <w:ilvl w:val="0"/>
-          <w:numId w:val="4"/>
+        <w:t xml:space="preserve">Ontología y grafo por dominio, empezando por uno documental.</w:t>
+      </w:r>
+      <w:r>
+        <w:t xml:space="preserve"> El candidato es la aplicación de demandas judiciales de la iniciativa 2 de Dato como Producto: documentos, no tablas. Modelar solo los conceptos del inventario de BCBS 239 que toque, con FIBO como referencia; extraer un tipo de documento con procedencia al fragmento; tratar los pipelines de extracción como modelos bajo gobernanza.</w:t>
+      </w:r>
+    </w:p>
+    <w:p>
+      <w:pPr>
+        <w:pStyle w:val="ListParagraph"/>
+        <w:numPr>
+          <w:ilvl w:val="0"/>
+          <w:numId w:val="6"/>
         </w:numPr>
       </w:pPr>
       <w:r>
         <w:rPr>
           <w:b/>
         </w:rPr>
-        <w:t xml:space="preserve">Adoptar la compilación determinista para todo acceso de agentes a datos estructurados.</w:t>
-      </w:r>
-      <w:r>
-        <w:t xml:space="preserve"> El modelo elige conceptos y métricas aprobadas; un compilador produce el SQL. Prohibir el SQL generado directamente por el modelo en producción.</w:t>
-      </w:r>
-    </w:p>
-    <w:p>
-      <w:pPr>
-        <w:pStyle w:val="ListParagraph"/>
-        <w:numPr>
-          <w:ilvl w:val="0"/>
-          <w:numId w:val="4"/>
+        <w:t xml:space="preserve">Grafo de contexto en un proceso con agentes.</w:t>
+      </w:r>
+      <w:r>
+        <w:t xml:space="preserve"> Capturar las trazas de decisión (excepciones, derivaciones a cumplimiento) con los campos del registro de eventos del Reglamento de IA, y probar que un requerimiento del supervisor sobre ese proceso se responde con una consulta. IRRBB, en analítica avanzada, es el otro candidato.</w:t>
+      </w:r>
+    </w:p>
+    <w:p>
+      <w:pPr>
+        <w:pStyle w:val="ListParagraph"/>
+        <w:numPr>
+          <w:ilvl w:val="0"/>
+          <w:numId w:val="6"/>
         </w:numPr>
       </w:pPr>
       <w:r>
         <w:rPr>
           <w:b/>
         </w:rPr>
-        <w:t xml:space="preserve">Extraer un tipo de documento a la ontología</w:t>
-      </w:r>
-      <w:r>
-        <w:t xml:space="preserve"> (contratos de préstamo o expedientes KYC) con procedencia al fragmento, bajo riesgo de modelo, y conciliarlo con el registro estructurado. Medir la tasa de discrepancias: es el primer resultado tangible para auditoría interna.</w:t>
-      </w:r>
-    </w:p>
-    <w:p>
-      <w:pPr>
-        <w:pStyle w:val="ListParagraph"/>
-        <w:numPr>
-          <w:ilvl w:val="0"/>
-          <w:numId w:val="4"/>
+        <w:t xml:space="preserve">Compilar, no generar.</w:t>
+      </w:r>
+      <w:r>
+        <w:t xml:space="preserve"> En todo acceso de agentes a datos estructurados el modelo elige piezas aprobadas y un compilador produce la consulta. Prohibir en producción el SQL generado directamente por el modelo para cifras certificadas.</w:t>
+      </w:r>
+    </w:p>
+    <w:p>
+      <w:pPr>
+        <w:pStyle w:val="ListParagraph"/>
+        <w:numPr>
+          <w:ilvl w:val="0"/>
+          <w:numId w:val="6"/>
         </w:numPr>
       </w:pPr>
       <w:r>
         <w:rPr>
           <w:b/>
         </w:rPr>
-        <w:t xml:space="preserve">Capturar las trazas de decisión de un proceso</w:t>
-      </w:r>
-      <w:r>
-        <w:t xml:space="preserve"> (excepciones de precio, derivaciones a cumplimiento) como grafo de contexto, con los campos que exige el registro de eventos del Reglamento de IA. Probar que un requerimiento del supervisor sobre ese proceso se responde con una consulta.</w:t>
-      </w:r>
-    </w:p>
-    <w:p>
-      <w:pPr>
-        <w:pStyle w:val="ListParagraph"/>
-        <w:numPr>
-          <w:ilvl w:val="0"/>
-          <w:numId w:val="4"/>
+        <w:t xml:space="preserve">Banco de pruebas propio</w:t>
+      </w:r>
+      <w:r>
+        <w:t xml:space="preserve"> antes de creer las cifras de ningún proveedor: las mismas preguntas reales con y sin capa semántica, con el juego de pruebas que sale del log, contando aciertos, errores y «no puedo».</w:t>
+      </w:r>
+    </w:p>
+    <w:p>
+      <w:pPr>
+        <w:pStyle w:val="ListParagraph"/>
+        <w:numPr>
+          <w:ilvl w:val="0"/>
+          <w:numId w:val="6"/>
         </w:numPr>
       </w:pPr>
       <w:r>
         <w:rPr>
           <w:b/>
         </w:rPr>
-        <w:t xml:space="preserve">Montar un banco de pruebas pareado con datos propios</w:t>
-      </w:r>
-      <w:r>
-        <w:t xml:space="preserve"> antes de creer las cifras de ningún proveedor: las mismas preguntas con y sin capa semántica, midiendo acierto y alucinación.</w:t>
-      </w:r>
-    </w:p>
-    <w:p>
-      <w:pPr>
-        <w:pStyle w:val="ListParagraph"/>
-        <w:numPr>
-          <w:ilvl w:val="0"/>
-          <w:numId w:val="4"/>
-        </w:numPr>
-      </w:pPr>
-      <w:r>
-        <w:rPr>
-          <w:b/>
-        </w:rPr>
-        <w:t xml:space="preserve">Abrir la fusión asistida</w:t>
-      </w:r>
-      <w:r>
-        <w:t xml:space="preserve"> solo cuando la calidad de las propuestas y la autoridad del propietario de concepto estén demostradas. Es el paso al nivel 4 y el último, no el primero.</w:t>
+        <w:t xml:space="preserve">Agentes de lectura en modo solo propuesta</w:t>
+      </w:r>
+      <w:r>
+        <w:t xml:space="preserve"> sobre código, logs y documentos, seis meses midiendo la calidad de las propuestas; abrir la fusión asistida solo cuando el propietario de concepto tenga autoridad demostrada. Es el paso al nivel 4 y el último.</w:t>
+      </w:r>
+    </w:p>
+    <w:p>
+      <w:pPr/>
+      <w:r>
+        <w:t xml:space="preserve">Avanzar en cada línea por separado pero coordinadamente tiene sentido porque cada componente tiene su propio ritmo y su propio dominio de arranque, y lo único que los une es la costura del punto 3.</w:t>
       </w:r>
     </w:p>
     <w:p>
@@ -2291,7 +3921,7 @@
         <w:pStyle w:val="ListParagraph"/>
         <w:numPr>
           <w:ilvl w:val="0"/>
-          <w:numId w:val="5"/>
+          <w:numId w:val="7"/>
         </w:numPr>
       </w:pPr>
       <w:hyperlink r:id="rId8" w:history="1">
@@ -2308,7 +3938,7 @@
         <w:pStyle w:val="ListParagraph"/>
         <w:numPr>
           <w:ilvl w:val="0"/>
-          <w:numId w:val="5"/>
+          <w:numId w:val="7"/>
         </w:numPr>
       </w:pPr>
       <w:hyperlink r:id="rId9" w:history="1">
@@ -2325,10 +3955,10 @@
         <w:pStyle w:val="ListParagraph"/>
         <w:numPr>
           <w:ilvl w:val="0"/>
-          <w:numId w:val="5"/>
-        </w:numPr>
-      </w:pPr>
-      <w:hyperlink r:id="rId27" w:history="1">
+          <w:numId w:val="7"/>
+        </w:numPr>
+      </w:pPr>
+      <w:hyperlink r:id="rId34" w:history="1">
         <w:r>
           <w:rPr>
             <w:rStyle w:val="Hyperlink"/>
@@ -2342,7 +3972,7 @@
         <w:pStyle w:val="ListParagraph"/>
         <w:numPr>
           <w:ilvl w:val="0"/>
-          <w:numId w:val="5"/>
+          <w:numId w:val="7"/>
         </w:numPr>
       </w:pPr>
       <w:hyperlink r:id="rId10" w:history="1">
@@ -2359,7 +3989,7 @@
         <w:pStyle w:val="ListParagraph"/>
         <w:numPr>
           <w:ilvl w:val="0"/>
-          <w:numId w:val="5"/>
+          <w:numId w:val="7"/>
         </w:numPr>
       </w:pPr>
       <w:hyperlink r:id="rId11" w:history="1">
@@ -2376,7 +4006,7 @@
         <w:pStyle w:val="ListParagraph"/>
         <w:numPr>
           <w:ilvl w:val="0"/>
-          <w:numId w:val="5"/>
+          <w:numId w:val="7"/>
         </w:numPr>
       </w:pPr>
       <w:hyperlink r:id="rId13" w:history="1">
@@ -2393,7 +4023,7 @@
         <w:pStyle w:val="ListParagraph"/>
         <w:numPr>
           <w:ilvl w:val="0"/>
-          <w:numId w:val="5"/>
+          <w:numId w:val="7"/>
         </w:numPr>
       </w:pPr>
       <w:hyperlink r:id="rId12" w:history="1">
@@ -2419,10 +4049,10 @@
         <w:pStyle w:val="ListParagraph"/>
         <w:numPr>
           <w:ilvl w:val="0"/>
-          <w:numId w:val="6"/>
-        </w:numPr>
-      </w:pPr>
-      <w:hyperlink r:id="rId28" w:history="1">
+          <w:numId w:val="8"/>
+        </w:numPr>
+      </w:pPr>
+      <w:hyperlink r:id="rId35" w:history="1">
         <w:r>
           <w:rPr>
             <w:rStyle w:val="Hyperlink"/>
@@ -2436,10 +4066,10 @@
         <w:pStyle w:val="ListParagraph"/>
         <w:numPr>
           <w:ilvl w:val="0"/>
-          <w:numId w:val="6"/>
-        </w:numPr>
-      </w:pPr>
-      <w:hyperlink r:id="rId29" w:history="1">
+          <w:numId w:val="8"/>
+        </w:numPr>
+      </w:pPr>
+      <w:hyperlink r:id="rId36" w:history="1">
         <w:r>
           <w:rPr>
             <w:rStyle w:val="Hyperlink"/>
@@ -2453,7 +4083,7 @@
         <w:pStyle w:val="ListParagraph"/>
         <w:numPr>
           <w:ilvl w:val="0"/>
-          <w:numId w:val="6"/>
+          <w:numId w:val="8"/>
         </w:numPr>
       </w:pPr>
       <w:hyperlink r:id="rId5" w:history="1">
@@ -2470,7 +4100,7 @@
         <w:pStyle w:val="ListParagraph"/>
         <w:numPr>
           <w:ilvl w:val="0"/>
-          <w:numId w:val="6"/>
+          <w:numId w:val="8"/>
         </w:numPr>
       </w:pPr>
       <w:hyperlink r:id="rId6" w:history="1">
@@ -2487,10 +4117,10 @@
         <w:pStyle w:val="ListParagraph"/>
         <w:numPr>
           <w:ilvl w:val="0"/>
-          <w:numId w:val="6"/>
-        </w:numPr>
-      </w:pPr>
-      <w:hyperlink r:id="rId30" w:history="1">
+          <w:numId w:val="8"/>
+        </w:numPr>
+      </w:pPr>
+      <w:hyperlink r:id="rId37" w:history="1">
         <w:r>
           <w:rPr>
             <w:rStyle w:val="Hyperlink"/>
@@ -2504,10 +4134,10 @@
         <w:pStyle w:val="ListParagraph"/>
         <w:numPr>
           <w:ilvl w:val="0"/>
-          <w:numId w:val="6"/>
-        </w:numPr>
-      </w:pPr>
-      <w:hyperlink r:id="rId31" w:history="1">
+          <w:numId w:val="8"/>
+        </w:numPr>
+      </w:pPr>
+      <w:hyperlink r:id="rId38" w:history="1">
         <w:r>
           <w:rPr>
             <w:rStyle w:val="Hyperlink"/>
@@ -2521,7 +4151,7 @@
         <w:pStyle w:val="ListParagraph"/>
         <w:numPr>
           <w:ilvl w:val="0"/>
-          <w:numId w:val="6"/>
+          <w:numId w:val="8"/>
         </w:numPr>
       </w:pPr>
       <w:hyperlink r:id="rId4" w:history="1">
@@ -2547,7 +4177,7 @@
         <w:pStyle w:val="ListParagraph"/>
         <w:numPr>
           <w:ilvl w:val="0"/>
-          <w:numId w:val="7"/>
+          <w:numId w:val="9"/>
         </w:numPr>
       </w:pPr>
       <w:hyperlink r:id="rId3" w:history="1">
@@ -2564,10 +4194,10 @@
         <w:pStyle w:val="ListParagraph"/>
         <w:numPr>
           <w:ilvl w:val="0"/>
-          <w:numId w:val="7"/>
-        </w:numPr>
-      </w:pPr>
-      <w:hyperlink r:id="rId32" w:history="1">
+          <w:numId w:val="9"/>
+        </w:numPr>
+      </w:pPr>
+      <w:hyperlink r:id="rId39" w:history="1">
         <w:r>
           <w:rPr>
             <w:rStyle w:val="Hyperlink"/>
@@ -2581,10 +4211,10 @@
         <w:pStyle w:val="ListParagraph"/>
         <w:numPr>
           <w:ilvl w:val="0"/>
-          <w:numId w:val="7"/>
-        </w:numPr>
-      </w:pPr>
-      <w:hyperlink r:id="rId33" w:history="1">
+          <w:numId w:val="9"/>
+        </w:numPr>
+      </w:pPr>
+      <w:hyperlink r:id="rId40" w:history="1">
         <w:r>
           <w:rPr>
             <w:rStyle w:val="Hyperlink"/>
@@ -2598,10 +4228,10 @@
         <w:pStyle w:val="ListParagraph"/>
         <w:numPr>
           <w:ilvl w:val="0"/>
-          <w:numId w:val="7"/>
-        </w:numPr>
-      </w:pPr>
-      <w:hyperlink r:id="rId34" w:history="1">
+          <w:numId w:val="9"/>
+        </w:numPr>
+      </w:pPr>
+      <w:hyperlink r:id="rId41" w:history="1">
         <w:r>
           <w:rPr>
             <w:rStyle w:val="Hyperlink"/>
@@ -2615,10 +4245,10 @@
         <w:pStyle w:val="ListParagraph"/>
         <w:numPr>
           <w:ilvl w:val="0"/>
-          <w:numId w:val="7"/>
-        </w:numPr>
-      </w:pPr>
-      <w:hyperlink r:id="rId35" w:history="1">
+          <w:numId w:val="9"/>
+        </w:numPr>
+      </w:pPr>
+      <w:hyperlink r:id="rId42" w:history="1">
         <w:r>
           <w:rPr>
             <w:rStyle w:val="Hyperlink"/>
@@ -2641,10 +4271,10 @@
         <w:pStyle w:val="ListParagraph"/>
         <w:numPr>
           <w:ilvl w:val="0"/>
-          <w:numId w:val="8"/>
-        </w:numPr>
-      </w:pPr>
-      <w:hyperlink r:id="rId20" w:history="1">
+          <w:numId w:val="10"/>
+        </w:numPr>
+      </w:pPr>
+      <w:hyperlink r:id="rId23" w:history="1">
         <w:r>
           <w:rPr>
             <w:rStyle w:val="Hyperlink"/>
@@ -2658,10 +4288,10 @@
         <w:pStyle w:val="ListParagraph"/>
         <w:numPr>
           <w:ilvl w:val="0"/>
-          <w:numId w:val="8"/>
-        </w:numPr>
-      </w:pPr>
-      <w:hyperlink r:id="rId21" w:history="1">
+          <w:numId w:val="10"/>
+        </w:numPr>
+      </w:pPr>
+      <w:hyperlink r:id="rId43" w:history="1">
         <w:r>
           <w:rPr>
             <w:rStyle w:val="Hyperlink"/>
@@ -2675,10 +4305,10 @@
         <w:pStyle w:val="ListParagraph"/>
         <w:numPr>
           <w:ilvl w:val="0"/>
-          <w:numId w:val="8"/>
-        </w:numPr>
-      </w:pPr>
-      <w:hyperlink r:id="rId19" w:history="1">
+          <w:numId w:val="10"/>
+        </w:numPr>
+      </w:pPr>
+      <w:hyperlink r:id="rId44" w:history="1">
         <w:r>
           <w:rPr>
             <w:rStyle w:val="Hyperlink"/>
@@ -2692,10 +4322,10 @@
         <w:pStyle w:val="ListParagraph"/>
         <w:numPr>
           <w:ilvl w:val="0"/>
-          <w:numId w:val="8"/>
-        </w:numPr>
-      </w:pPr>
-      <w:hyperlink r:id="rId22" w:history="1">
+          <w:numId w:val="10"/>
+        </w:numPr>
+      </w:pPr>
+      <w:hyperlink r:id="rId29" w:history="1">
         <w:r>
           <w:rPr>
             <w:rStyle w:val="Hyperlink"/>
@@ -2709,10 +4339,10 @@
         <w:pStyle w:val="ListParagraph"/>
         <w:numPr>
           <w:ilvl w:val="0"/>
-          <w:numId w:val="8"/>
-        </w:numPr>
-      </w:pPr>
-      <w:hyperlink r:id="rId23" w:history="1">
+          <w:numId w:val="10"/>
+        </w:numPr>
+      </w:pPr>
+      <w:hyperlink r:id="rId30" w:history="1">
         <w:r>
           <w:rPr>
             <w:rStyle w:val="Hyperlink"/>
@@ -2726,10 +4356,10 @@
         <w:pStyle w:val="ListParagraph"/>
         <w:numPr>
           <w:ilvl w:val="0"/>
-          <w:numId w:val="8"/>
-        </w:numPr>
-      </w:pPr>
-      <w:hyperlink r:id="rId24" w:history="1">
+          <w:numId w:val="10"/>
+        </w:numPr>
+      </w:pPr>
+      <w:hyperlink r:id="rId31" w:history="1">
         <w:r>
           <w:rPr>
             <w:rStyle w:val="Hyperlink"/>
@@ -2743,10 +4373,10 @@
         <w:pStyle w:val="ListParagraph"/>
         <w:numPr>
           <w:ilvl w:val="0"/>
-          <w:numId w:val="8"/>
-        </w:numPr>
-      </w:pPr>
-      <w:hyperlink r:id="rId25" w:history="1">
+          <w:numId w:val="10"/>
+        </w:numPr>
+      </w:pPr>
+      <w:hyperlink r:id="rId32" w:history="1">
         <w:r>
           <w:rPr>
             <w:rStyle w:val="Hyperlink"/>
@@ -2760,7 +4390,7 @@
         <w:pStyle w:val="ListParagraph"/>
         <w:numPr>
           <w:ilvl w:val="0"/>
-          <w:numId w:val="8"/>
+          <w:numId w:val="10"/>
         </w:numPr>
       </w:pPr>
       <w:hyperlink r:id="rId14" w:history="1">
@@ -2777,7 +4407,7 @@
         <w:pStyle w:val="ListParagraph"/>
         <w:numPr>
           <w:ilvl w:val="0"/>
-          <w:numId w:val="8"/>
+          <w:numId w:val="10"/>
         </w:numPr>
       </w:pPr>
       <w:hyperlink r:id="rId15" w:history="1">
@@ -2794,7 +4424,7 @@
         <w:pStyle w:val="ListParagraph"/>
         <w:numPr>
           <w:ilvl w:val="0"/>
-          <w:numId w:val="8"/>
+          <w:numId w:val="10"/>
         </w:numPr>
       </w:pPr>
       <w:hyperlink r:id="rId16" w:history="1">
@@ -2811,7 +4441,7 @@
         <w:pStyle w:val="ListParagraph"/>
         <w:numPr>
           <w:ilvl w:val="0"/>
-          <w:numId w:val="8"/>
+          <w:numId w:val="10"/>
         </w:numPr>
       </w:pPr>
       <w:hyperlink r:id="rId17" w:history="1">
@@ -2828,10 +4458,10 @@
         <w:pStyle w:val="ListParagraph"/>
         <w:numPr>
           <w:ilvl w:val="0"/>
-          <w:numId w:val="8"/>
-        </w:numPr>
-      </w:pPr>
-      <w:hyperlink r:id="rId36" w:history="1">
+          <w:numId w:val="10"/>
+        </w:numPr>
+      </w:pPr>
+      <w:hyperlink r:id="rId45" w:history="1">
         <w:r>
           <w:rPr>
             <w:rStyle w:val="Hyperlink"/>
@@ -2845,7 +4475,7 @@
         <w:pStyle w:val="ListParagraph"/>
         <w:numPr>
           <w:ilvl w:val="0"/>
-          <w:numId w:val="8"/>
+          <w:numId w:val="10"/>
         </w:numPr>
       </w:pPr>
       <w:hyperlink r:id="rId18" w:history="1">
@@ -2854,6 +4484,134 @@
             <w:rStyle w:val="Hyperlink"/>
           </w:rPr>
           <w:t xml:space="preserve">The Semantic Illusion, arXiv 2512.15068</w:t>
+        </w:r>
+      </w:hyperlink>
+    </w:p>
+    <w:p>
+      <w:pPr/>
+      <w:r>
+        <w:rPr>
+          <w:b/>
+        </w:rPr>
+        <w:t xml:space="preserve">Estudios de acierto y grafos (procedentes de Capa semántica · 0 Concepto)</w:t>
+      </w:r>
+    </w:p>
+    <w:p>
+      <w:pPr>
+        <w:pStyle w:val="ListParagraph"/>
+        <w:numPr>
+          <w:ilvl w:val="0"/>
+          <w:numId w:val="11"/>
+        </w:numPr>
+      </w:pPr>
+      <w:hyperlink r:id="rId46" w:history="1">
+        <w:r>
+          <w:rPr>
+            <w:rStyle w:val="Hyperlink"/>
+          </w:rPr>
+          <w:t xml:space="preserve">Semantic layer as the data interface, dbt Labs, 2023</w:t>
+        </w:r>
+      </w:hyperlink>
+    </w:p>
+    <w:p>
+      <w:pPr>
+        <w:pStyle w:val="ListParagraph"/>
+        <w:numPr>
+          <w:ilvl w:val="0"/>
+          <w:numId w:val="11"/>
+        </w:numPr>
+      </w:pPr>
+      <w:hyperlink r:id="rId20" w:history="1">
+        <w:r>
+          <w:rPr>
+            <w:rStyle w:val="Hyperlink"/>
+          </w:rPr>
+          <w:t xml:space="preserve">A Benchmark to Understand the Role of Knowledge Graphs on LLM Accuracy, data.world, 2023 (arXiv 2311.07509)</w:t>
+        </w:r>
+      </w:hyperlink>
+    </w:p>
+    <w:p>
+      <w:pPr>
+        <w:pStyle w:val="ListParagraph"/>
+        <w:numPr>
+          <w:ilvl w:val="0"/>
+          <w:numId w:val="11"/>
+        </w:numPr>
+      </w:pPr>
+      <w:hyperlink r:id="rId27" w:history="1">
+        <w:r>
+          <w:rPr>
+            <w:rStyle w:val="Hyperlink"/>
+          </w:rPr>
+          <w:t xml:space="preserve">Cortex Analyst text-to-SQL accuracy, Snowflake, 2024</w:t>
+        </w:r>
+      </w:hyperlink>
+    </w:p>
+    <w:p>
+      <w:pPr>
+        <w:pStyle w:val="ListParagraph"/>
+        <w:numPr>
+          <w:ilvl w:val="0"/>
+          <w:numId w:val="11"/>
+        </w:numPr>
+      </w:pPr>
+      <w:hyperlink r:id="rId28" w:history="1">
+        <w:r>
+          <w:rPr>
+            <w:rStyle w:val="Hyperlink"/>
+          </w:rPr>
+          <w:t xml:space="preserve">AtScale claims text-to-SQL breakthrough with semantic layer, 2024</w:t>
+        </w:r>
+      </w:hyperlink>
+    </w:p>
+    <w:p>
+      <w:pPr>
+        <w:pStyle w:val="ListParagraph"/>
+        <w:numPr>
+          <w:ilvl w:val="0"/>
+          <w:numId w:val="11"/>
+        </w:numPr>
+      </w:pPr>
+      <w:hyperlink r:id="rId26" w:history="1">
+        <w:r>
+          <w:rPr>
+            <w:rStyle w:val="Hyperlink"/>
+          </w:rPr>
+          <w:t xml:space="preserve">Spider 2.0, ICLR 2025 (arXiv 2411.07763)</w:t>
+        </w:r>
+      </w:hyperlink>
+    </w:p>
+    <w:p>
+      <w:pPr>
+        <w:pStyle w:val="ListParagraph"/>
+        <w:numPr>
+          <w:ilvl w:val="0"/>
+          <w:numId w:val="11"/>
+        </w:numPr>
+      </w:pPr>
+      <w:hyperlink r:id="rId25" w:history="1">
+        <w:r>
+          <w:rPr>
+            <w:rStyle w:val="Hyperlink"/>
+          </w:rPr>
+          <w:t xml:space="preserve">Gemini-SQL2 on BIRD, junio 2026</w:t>
+        </w:r>
+      </w:hyperlink>
+    </w:p>
+    <w:p>
+      <w:pPr>
+        <w:pStyle w:val="ListParagraph"/>
+        <w:numPr>
+          <w:ilvl w:val="0"/>
+          <w:numId w:val="11"/>
+        </w:numPr>
+      </w:pPr>
+      <w:hyperlink r:id="rId19" w:history="1">
+        <w:r>
+          <w:rPr>
+            <w:rStyle w:val="Hyperlink"/>
+          </w:rPr>
+          <w:t xml:space="preserve">Text-to-SQL with knowledge graphs (QueryWeaver), FalkorDB</w:t>
         </w:r>
       </w:hyperlink>
     </w:p>
@@ -3048,21 +4806,30 @@
     <w:abstractNumId w:val="0"/>
   </w:num>
   <w:num w:numId="4">
+    <w:abstractNumId w:val="0"/>
+  </w:num>
+  <w:num w:numId="5">
+    <w:abstractNumId w:val="0"/>
+  </w:num>
+  <w:num w:numId="6">
     <w:abstractNumId w:val="1"/>
     <w:lvlOverride w:ilvl="0">
       <w:startOverride w:val="1"/>
     </w:lvlOverride>
   </w:num>
-  <w:num w:numId="5">
-    <w:abstractNumId w:val="0"/>
-  </w:num>
-  <w:num w:numId="6">
-    <w:abstractNumId w:val="0"/>
-  </w:num>
   <w:num w:numId="7">
     <w:abstractNumId w:val="0"/>
   </w:num>
   <w:num w:numId="8">
+    <w:abstractNumId w:val="0"/>
+  </w:num>
+  <w:num w:numId="9">
+    <w:abstractNumId w:val="0"/>
+  </w:num>
+  <w:num w:numId="10">
+    <w:abstractNumId w:val="0"/>
+  </w:num>
+  <w:num w:numId="11">
     <w:abstractNumId w:val="0"/>
   </w:num>
 </w:numbering>

</xml_diff>

<commit_message>
Framework doc: ontology wording, context-layer definition, consequences paragraph
Co-Authored-By: Claude Fable 5.1 <noreply@anthropic.com>
Claude-Session: https://claude.ai/code/session_013A7bCLd4PzhQYG95DagcQd
</commit_message>
<xml_diff>
--- a/docs/Semantica_grafos_agentes_banca.docx
+++ b/docs/Semantica_grafos_agentes_banca.docx
@@ -97,7 +97,7 @@
     <w:p>
       <w:pPr/>
       <w:r>
-        <w:t xml:space="preserve">Los cuatro términos describen funciones distintas sobre los mismos datos, y en la práctica se combinan. Los proveedores los usan de forma inconsistente, y dos de ellos, grafo de contexto y capa semántica basada en ontología, todavía no tienen una definición consolidada. Aquí se describe cada uno por la pregunta que responde y por el objeto que gobierna.</w:t>
+        <w:t xml:space="preserve">Los cuatro términos describen funciones distintas sobre los mismos datos, y en la práctica se combinan. Los proveedores los usan de forma inconsistente, y dos de ellos, grafo de contexto y capa semántica basada en ontología, todavía no tienen una definición consolidada. Aquí se describe cada uno por lo que fija y por el objeto que gobierna.</w:t>
       </w:r>
     </w:p>
     <w:p>
@@ -121,7 +121,7 @@
         <w:t xml:space="preserve">Ontología.</w:t>
       </w:r>
       <w:r>
-        <w:t xml:space="preserve"> Define los conceptos de un dominio, sus relaciones, restricciones y reglas de inferencia. Responde a "qué es un cliente, cómo se relaciona con un contrato, una cuenta y un grupo económico, y qué se puede deducir de ello". Tiene dos sentidos que conviene separar. El formal, heredado de la web semántica, se expresa en estándares como RDF y OWL y permite que una máquina razone: si un contrato principal rige a los secundarios, el riesgo del secundario hereda condiciones del principal aunque nadie lo haya escrito en una tabla. El laxo, habitual en software empresarial, es simplemente un modelo conceptual explícito del negocio. En banca existe una ontología de referencia, FIBO, mantenida por el EDM Council, que cubre instrumentos, entidades, contratos y roles. Es extensa y de adopción parcial: funciona mejor como vocabulario al que alinear que como ontología de implementación. El objeto que gobierna es el concepto y la regla, y toda regla que infiere una clasificación, como "cliente de alto riesgo", es una decisión automatizada sujeta a los mismos controles que un modelo.</w:t>
+        <w:t xml:space="preserve"> Es el modelo que fija qué es cada concepto del negocio y cómo se relaciona con los demás: qué es un cliente, en qué se diferencia de un titular o de una cuenta, cómo se vincula a un contrato y a un grupo económico, y qué reglas valen entre ellos. No responde preguntas en tiempo de ejecución: a ella acuden las piezas que sí responden, la capa semántica cuando compila una métrica, el grafo cuando recorre relaciones y el agente cuando lee la ficha de una métrica. Por eso recoge la definición del concepto, mientras que la definición de cómo se calcula una métrica vive en la capa semántica. El término tiene dos sentidos. El formal viene de la web semántica, la iniciativa del W3C de principios de los 2000 que creó RDF, OWL y SPARQL para que las máquinas leyeran contenido: en ese sentido una ontología es una especificación con clases, propiedades y axiomas sobre la que un motor deduce hechos nuevos, como que un contrato secundario hereda condiciones del principal aunque nadie lo haya escrito en una tabla. El laxo, habitual en software empresarial, es un modelo conceptual explícito del negocio, con dueño y versión, en el formato que se tenga. Para el banco, hoy, el sentido que importa es el laxo, y ya existe en forma embrionaria en los YAML de la capa semántica: entidades de negocio, relaciones, conceptos y reglas. El formal solo importará si algún día se quiere que una máquina infiera, y ese es justo el caso que en banca se convierte en decisión gobernada. FIBO, la ontología de referencia del sector mantenida por el EDM Council, es extensa y de adopción parcial: sirve como vocabulario al que alinear nombres, no como ontología a implementar.</w:t>
       </w:r>
     </w:p>
     <w:p>
@@ -154,10 +154,10 @@
         <w:rPr>
           <w:b/>
         </w:rPr>
-        <w:t xml:space="preserve">Una advertencia de vocabulario.</w:t>
-      </w:r>
-      <w:r>
-        <w:t xml:space="preserve"> En algunos materiales internos se llama «grafo de contexto» al conjunto de ontología, grafo de conocimiento y almacén vectorial que fundamenta a los agentes. En este documento ese conjunto es la capa de contexto, y «grafo de contexto» se reserva para el registro de trazas de decisión, que es el sentido que usan Foundation Capital, Neo4j y Gartner. La distinción importa porque la capa de contexto se construye con modelos y el grafo de contexto se construye con decisiones.</w:t>
+        <w:t xml:space="preserve">Dos términos parecidos que conviene distinguir.</w:t>
+      </w:r>
+      <w:r>
+        <w:t xml:space="preserve"> La capa de contexto es el conjunto de piezas que fundamenta a los agentes: capa semántica, ontología, grafo de conocimiento y, si lo hay, almacén vectorial. El grafo de contexto es una de esas piezas, la que registra las trazas de decisión. Es el sentido que usan Foundation Capital, Neo4j y Gartner, y el que se usa aquí.</w:t>
       </w:r>
     </w:p>
     <w:tbl>
@@ -198,7 +198,7 @@
           <w:p>
             <w:pPr/>
             <w:r>
-              <w:t xml:space="preserve">Pregunta que responde</w:t>
+              <w:t xml:space="preserve">Qué fija</w:t>
             </w:r>
           </w:p>
         </w:tc>
@@ -924,7 +924,7 @@
     <w:p>
       <w:pPr/>
       <w:r>
-        <w:t xml:space="preserve">Dos consecuencias prácticas. La primera es que un banco no parte de cero: el inventario de elementos críticos de datos de BCBS 239, el diccionario de datos y la taxonomía de grupo que pide el BCE son la semilla de la ontología. La segunda es que la inferencia no es gratis. Cuando la ontología deduce que un cliente es de alto riesgo, está tomando una decisión que el Reglamento de IA y la gestión de riesgo de modelo obligan a explicar, versionar y supervisar. El beneficio técnico de razonar sobre reglas implícitas trae consigo la obligación de hacerlas explícitas.</w:t>
+        <w:t xml:space="preserve">Dos consecuencias prácticas. La primera es que un banco no parte de cero: el inventario de elementos críticos de datos de BCBS 239, el diccionario de datos y la taxonomía de grupo que pide el BCE son la semilla de la capa semántica. Esa capa lleva dentro una ontología informal, las entidades, relaciones y reglas que declaran sus YAML, que más adelante se puede formalizar si hace falta. La segunda afecta a las reglas de inferencia. Si una regla de la ontología clasifica a un cliente como de alto riesgo sin que nadie lo haya escrito en una tabla, esa clasificación es una decisión automatizada: el Reglamento de IA y la gestión de riesgo de modelo exigen poder explicarla, saber qué versión de la regla la produjo y tener a alguien que la supervise. Por eso una regla de inferencia se trata como un modelo más, con su validación y su propietario, antes de activarla.</w:t>
       </w:r>
     </w:p>
     <w:p>

</xml_diff>

<commit_message>
Framework doc: rewrite structured/unstructured patterns around the three question types
Co-Authored-By: Claude Fable 5.1 <noreply@anthropic.com>
Claude-Session: https://claude.ai/code/session_013A7bCLd4PzhQYG95DagcQd
</commit_message>
<xml_diff>
--- a/docs/Semantica_grafos_agentes_banca.docx
+++ b/docs/Semantica_grafos_agentes_banca.docx
@@ -950,128 +950,61 @@
     <w:p>
       <w:pPr/>
       <w:r>
-        <w:t xml:space="preserve">Tres patrones de arquitectura han madurado en 2025 y 2026:</w:t>
-      </w:r>
-    </w:p>
-    <w:p>
-      <w:pPr>
-        <w:pStyle w:val="ListParagraph"/>
-        <w:numPr>
-          <w:ilvl w:val="0"/>
-          <w:numId w:val="2"/>
-        </w:numPr>
-      </w:pPr>
-      <w:r>
-        <w:rPr>
-          <w:b/>
-        </w:rPr>
-        <w:t xml:space="preserve">Estructurar y después consultar.</w:t>
-      </w:r>
-      <w:r>
-        <w:t xml:space="preserve"> Extraer de los documentos las entidades y atributos que define la ontología, cargarlos en tablas o en el grafo con procedencia, y consultar de forma determinista. Es el patrón que describe "</w:t>
-      </w:r>
-      <w:hyperlink r:id="rId14" w:history="1">
-        <w:r>
-          <w:rPr>
-            <w:rStyle w:val="Hyperlink"/>
-          </w:rPr>
-          <w:t xml:space="preserve">Structure then Query</w:t>
-        </w:r>
-      </w:hyperlink>
-      <w:r>
-        <w:t xml:space="preserve">" y el que implementa Palantir con AIP Document Intelligence, disponible desde febrero de 2026 con una hoja de ruta para poblar objetos de la ontología directamente desde documentos. Funciona cuando las preguntas son analíticas: cuántos contratos tienen cláusula de vencimiento anticipado, qué exposición total hay bajo garantías de un mismo garante.</w:t>
-      </w:r>
-    </w:p>
-    <w:p>
-      <w:pPr>
-        <w:pStyle w:val="ListParagraph"/>
-        <w:numPr>
-          <w:ilvl w:val="0"/>
-          <w:numId w:val="2"/>
-        </w:numPr>
-      </w:pPr>
-      <w:r>
-        <w:rPr>
-          <w:b/>
-        </w:rPr>
-        <w:t xml:space="preserve">Recuperación híbrida.</w:t>
-      </w:r>
-      <w:r>
-        <w:t xml:space="preserve"> Grafo para entidades y relaciones, vectores para el texto, y la capa semántica aportando los permisos que hereda cada fragmento. Es la evolución de GraphRAG, publicado por Microsoft en 2024. Un trabajo de abril de 2026 sobre el Code of Federal Regulations (</w:t>
-      </w:r>
-      <w:hyperlink r:id="rId15" w:history="1">
-        <w:r>
-          <w:rPr>
-            <w:rStyle w:val="Hyperlink"/>
-          </w:rPr>
-          <w:t xml:space="preserve">Knowledge Graph RAG: Agentic Crawling</w:t>
-        </w:r>
-      </w:hyperlink>
-      <w:r>
-        <w:t xml:space="preserve">) reporta un 70 % de mejora sobre recuperación vectorial pura en consultas regulatorias con referencias cruzadas y normas derogadas. Funciona cuando las preguntas son de lectura: qué dice la política vigente sobre este caso.</w:t>
-      </w:r>
-    </w:p>
-    <w:p>
-      <w:pPr>
-        <w:pStyle w:val="ListParagraph"/>
-        <w:numPr>
-          <w:ilvl w:val="0"/>
-          <w:numId w:val="2"/>
-        </w:numPr>
-      </w:pPr>
-      <w:r>
-        <w:rPr>
-          <w:b/>
-        </w:rPr>
-        <w:t xml:space="preserve">Grafos de cumplimiento.</w:t>
-      </w:r>
-      <w:r>
-        <w:t xml:space="preserve"> Convertir la norma en un grafo de obligaciones y alinearlo con el grafo de contexto de la operación, de modo que el agente compruebe cada decisión contra las reglas aplicables. Lo describen </w:t>
-      </w:r>
-      <w:hyperlink r:id="rId16" w:history="1">
-        <w:r>
-          <w:rPr>
-            <w:rStyle w:val="Hyperlink"/>
-          </w:rPr>
-          <w:t xml:space="preserve">GraphCompliance</w:t>
-        </w:r>
-      </w:hyperlink>
-      <w:r>
-        <w:t xml:space="preserve"> y un trabajo sobre </w:t>
-      </w:r>
-      <w:hyperlink r:id="rId17" w:history="1">
-        <w:r>
-          <w:rPr>
-            <w:rStyle w:val="Hyperlink"/>
-          </w:rPr>
-          <w:t xml:space="preserve">grafos regulatorios para monitorización de transacciones</w:t>
-        </w:r>
-      </w:hyperlink>
-      <w:r>
-        <w:t xml:space="preserve"> que genera explicaciones de cumplimiento en tiempo real.</w:t>
-      </w:r>
-    </w:p>
-    <w:p>
-      <w:pPr/>
-      <w:r>
-        <w:t xml:space="preserve">Los tres patrones tienen un riesgo común que el discurso comercial suele omitir: todo hecho extraído de un documento por un modelo es un dato derivado por un modelo. Puede estar mal. Necesita una medida de confianza, una versión, validación humana por muestreo y encaje en el marco de riesgo de modelo. Un segundo riesgo es la privacidad: un embedding puede filtrar datos personales aunque la tabla de origen esté enmascarada, y los logs de consulta contienen nombres y DNI. El enmascarado debe aplicarse en el momento en que el contexto llega al modelo, no solo en la fuente. Un tercer riesgo es la resolución de entidades: el firmante del contrato escaneado y el titular del core son la misma persona solo si alguien lo ha establecido, y ese vínculo es también una decisión con margen de error.</w:t>
-      </w:r>
-    </w:p>
-    <w:p>
-      <w:pPr/>
-      <w:r>
-        <w:t xml:space="preserve">Sobre los vectores conviene ser claros. Son motores de coincidencia difusa, excelentes para encontrar el párrafo que habla de algo y malos para encontrar el dato exacto. Un trabajo de diciembre de 2025 (</w:t>
-      </w:r>
-      <w:hyperlink r:id="rId18" w:history="1">
-        <w:r>
-          <w:rPr>
-            <w:rStyle w:val="Hyperlink"/>
-          </w:rPr>
-          <w:t xml:space="preserve">The Semantic Illusion</w:t>
-        </w:r>
-      </w:hyperlink>
-      <w:r>
-        <w:t xml:space="preserve">) demuestra límites formales de la detección de alucinaciones basada solo en similitud de embeddings. En un dominio donde la cifra tiene que ser exacta, el vector localiza y la estructura responde.</w:t>
+        <w:rPr>
+          <w:b/>
+        </w:rPr>
+        <w:t xml:space="preserve">Por qué hacen falta tres formas de combinarlos.</w:t>
+      </w:r>
+      <w:r>
+        <w:t xml:space="preserve"> Un agente del banco recibe tres tipos de pregunta sobre documentos, y cada tipo exige una forma distinta de juntar lo estructurado con lo no estructurado. Confundirlas es la causa más frecuente de que un piloto con documentos funcione en la demostración y falle en producción.</w:t>
+      </w:r>
+    </w:p>
+    <w:p>
+      <w:pPr/>
+      <w:r>
+        <w:rPr>
+          <w:b/>
+        </w:rPr>
+        <w:t xml:space="preserve">Preguntas que piden una cifra que solo está en documentos.</w:t>
+      </w:r>
+      <w:r>
+        <w:t xml:space="preserve"> «¿Cuántos contratos tienen cláusula de vencimiento anticipado?», «¿qué exposición total hay bajo garantías de un mismo garante?». No se responden leyendo: hay que contar o sumar sobre cientos de contratos. La forma de hacerlo es extraer primero y consultar después. Un modelo lee cada documento y rellena los atributos que la ontología define para ese tipo de documento; cada hecho se guarda en una tabla o en el grafo con un enlace al fragmento del que salió; y la cifra la calcula el compilador de métricas por la vía certificada, igual que si el dato viniera del core. Lo que gana el banco: el hecho extraído pasa a ser un dato más, con linaje hasta el documento, y la cifra sale por la misma vía determinista que cualquier otra. Eso es lo que BCBS 239 y la guía del BCE piden para un dato de riesgo, aunque su origen sea un PDF. Palantir lo vende como producto desde febrero de 2026 con AIP Document Intelligence, y la literatura lo llama «Structure then Query».</w:t>
+      </w:r>
+    </w:p>
+    <w:p>
+      <w:pPr/>
+      <w:r>
+        <w:rPr>
+          <w:b/>
+        </w:rPr>
+        <w:t xml:space="preserve">Preguntas que piden leer el documento correcto.</w:t>
+      </w:r>
+      <w:r>
+        <w:t xml:space="preserve"> «¿Qué dice la política vigente sobre este caso?», «¿qué cláusula aplica a este contrato?». Aquí no hay cifra: hay que encontrar el párrafo adecuado. La búsqueda por vectores lo hace bien cuando la pregunta y el párrafo se parecen, y mal en tres situaciones habituales en banca: cuando la norma remite a otra, cuando hay varias versiones y solo una está en vigor, y cuando el usuario no tiene permiso para ver parte de los documentos. La forma de hacerlo es combinar: el grafo decide qué documentos son los relevantes (los de esta entidad, en la versión vigente a esa fecha, los que este usuario puede ver) y el vector localiza el párrafo dentro de ellos. Lo que gana el banco: la respuesta cita un documento concreto en su versión vigente y respeta los permisos, que es lo que exige el Reglamento de IA para poder reconstruir qué información tenía el sistema al responder. Un trabajo de abril de 2026 sobre el Code of Federal Regulations mide una mejora del 70 % sobre la búsqueda vectorial sola precisamente en preguntas con referencias cruzadas y normas derogadas. Los vectores, en resumen, son motores de coincidencia difusa: localizan el párrafo que habla de algo, pero no dan el dato exacto; el vector localiza y la estructura responde.</w:t>
+      </w:r>
+    </w:p>
+    <w:p>
+      <w:pPr/>
+      <w:r>
+        <w:rPr>
+          <w:b/>
+        </w:rPr>
+        <w:t xml:space="preserve">Preguntas que piden comprobar una decisión contra la norma.</w:t>
+      </w:r>
+      <w:r>
+        <w:t xml:space="preserve"> «¿Esta operación cumple la política de blanqueo?», «¿esta excepción de precio está dentro de lo autorizado?». Ni cifra ni lectura: una comprobación. La forma de hacerlo es convertir la norma en una lista estructurada de obligaciones y condiciones, y contrastar contra ella los datos de la operación. La salida no es solo sí o no, sino la explicación: qué regla se aplicó y con qué datos. Lo que gana el banco: la explicación de cumplimiento que el supervisor pide en monitorización de transacciones se genera en el momento, y la traza de la decisión queda registrada en el grafo de contexto. Lo describen los trabajos GraphCompliance y el de grafos regulatorios para monitorización de transacciones.</w:t>
+      </w:r>
+    </w:p>
+    <w:p>
+      <w:pPr/>
+      <w:r>
+        <w:rPr>
+          <w:b/>
+        </w:rPr>
+        <w:t xml:space="preserve">Lo que tienen en común y lo que hay que vigilar.</w:t>
+      </w:r>
+      <w:r>
+        <w:t xml:space="preserve"> En los tres casos un modelo produce datos: atributos extraídos, documentos seleccionados, reglas aplicadas. Un dato producido por un modelo puede estar mal, y en banca eso tiene tres consecuencias prácticas. Primera, cada hecho extraído lleva una medida de confianza y la versión del modelo que lo produjo, se valida por muestreo, y el pipeline de extracción entra en el marco de riesgo de modelo como cualquier otro modelo. Segunda, el vínculo entre el documento y el registro estructurado, que el firmante del contrato escaneado sea el titular del core, es también una decisión con margen de error y necesita su propia validación. Tercera, los embeddings y los logs de consulta contienen datos personales aunque la tabla de origen esté enmascarada: el enmascarado se aplica en el momento en que el contexto llega al modelo, no solo en la fuente.</w:t>
       </w:r>
     </w:p>
     <w:p>
@@ -1208,7 +1141,7 @@
           </w:tcPr>
           <w:p>
             <w:pPr/>
-            <w:hyperlink r:id="rId19" w:history="1">
+            <w:hyperlink r:id="rId14" w:history="1">
               <w:r>
                 <w:rPr>
                   <w:rStyle w:val="Hyperlink"/>
@@ -1364,7 +1297,7 @@
       <w:r>
         <w:t xml:space="preserve">El dato más citado viene de data.world, en un benchmark del sector seguros con GPT-4. Escribiendo SQL directamente sobre el esquema, el acierto fue del 16,7 %. A través de un grafo con ontología sobre las mismas tablas, del 54,2 %. Añadiendo una comprobación de la consulta contra la ontología y reparación por el LLM, del 72,55 %, con un 8 % de respuestas «no lo sé» y una tasa de error del 19,44 % (</w:t>
       </w:r>
-      <w:hyperlink r:id="rId20" w:history="1">
+      <w:hyperlink r:id="rId15" w:history="1">
         <w:r>
           <w:rPr>
             <w:rStyle w:val="Hyperlink"/>
@@ -1375,7 +1308,7 @@
       <w:r>
         <w:t xml:space="preserve">; </w:t>
       </w:r>
-      <w:hyperlink r:id="rId21" w:history="1">
+      <w:hyperlink r:id="rId16" w:history="1">
         <w:r>
           <w:rPr>
             <w:rStyle w:val="Hyperlink"/>
@@ -1454,7 +1387,7 @@
         <w:pStyle w:val="ListParagraph"/>
         <w:numPr>
           <w:ilvl w:val="0"/>
-          <w:numId w:val="3"/>
+          <w:numId w:val="2"/>
         </w:numPr>
       </w:pPr>
       <w:r>
@@ -1472,7 +1405,7 @@
         <w:pStyle w:val="ListParagraph"/>
         <w:numPr>
           <w:ilvl w:val="0"/>
-          <w:numId w:val="3"/>
+          <w:numId w:val="2"/>
         </w:numPr>
       </w:pPr>
       <w:r>
@@ -1490,7 +1423,7 @@
         <w:pStyle w:val="ListParagraph"/>
         <w:numPr>
           <w:ilvl w:val="0"/>
-          <w:numId w:val="3"/>
+          <w:numId w:val="2"/>
         </w:numPr>
       </w:pPr>
       <w:r>
@@ -1508,7 +1441,7 @@
         <w:pStyle w:val="ListParagraph"/>
         <w:numPr>
           <w:ilvl w:val="0"/>
-          <w:numId w:val="3"/>
+          <w:numId w:val="2"/>
         </w:numPr>
       </w:pPr>
       <w:r>
@@ -1538,7 +1471,7 @@
       <w:r>
         <w:t xml:space="preserve"> La propuesta de </w:t>
       </w:r>
-      <w:hyperlink r:id="rId19" w:history="1">
+      <w:hyperlink r:id="rId14" w:history="1">
         <w:r>
           <w:rPr>
             <w:rStyle w:val="Hyperlink"/>
@@ -1929,7 +1862,7 @@
                     <pic:cNvPicPr/>
                   </pic:nvPicPr>
                   <pic:blipFill>
-                    <a:blip r:embed="rId22"/>
+                    <a:blip r:embed="rId17"/>
                     <a:stretch>
                       <a:fillRect/>
                     </a:stretch>
@@ -1961,7 +1894,7 @@
         <w:pStyle w:val="ListParagraph"/>
         <w:numPr>
           <w:ilvl w:val="0"/>
-          <w:numId w:val="4"/>
+          <w:numId w:val="3"/>
         </w:numPr>
       </w:pPr>
       <w:r>
@@ -1979,7 +1912,7 @@
         <w:pStyle w:val="ListParagraph"/>
         <w:numPr>
           <w:ilvl w:val="0"/>
-          <w:numId w:val="4"/>
+          <w:numId w:val="3"/>
         </w:numPr>
       </w:pPr>
       <w:r>
@@ -1997,7 +1930,7 @@
         <w:pStyle w:val="ListParagraph"/>
         <w:numPr>
           <w:ilvl w:val="0"/>
-          <w:numId w:val="4"/>
+          <w:numId w:val="3"/>
         </w:numPr>
       </w:pPr>
       <w:r>
@@ -2157,7 +2090,7 @@
           </w:tcPr>
           <w:p>
             <w:pPr/>
-            <w:hyperlink r:id="rId23" w:history="1">
+            <w:hyperlink r:id="rId18" w:history="1">
               <w:r>
                 <w:rPr>
                   <w:rStyle w:val="Hyperlink"/>
@@ -2276,7 +2209,7 @@
           </w:tcPr>
           <w:p>
             <w:pPr/>
-            <w:hyperlink r:id="rId24" w:history="1">
+            <w:hyperlink r:id="rId19" w:history="1">
               <w:r>
                 <w:rPr>
                   <w:rStyle w:val="Hyperlink"/>
@@ -2338,7 +2271,7 @@
           </w:tcPr>
           <w:p>
             <w:pPr/>
-            <w:hyperlink r:id="rId25" w:history="1">
+            <w:hyperlink r:id="rId20" w:history="1">
               <w:r>
                 <w:rPr>
                   <w:rStyle w:val="Hyperlink"/>
@@ -2400,7 +2333,7 @@
           </w:tcPr>
           <w:p>
             <w:pPr/>
-            <w:hyperlink r:id="rId26" w:history="1">
+            <w:hyperlink r:id="rId21" w:history="1">
               <w:r>
                 <w:rPr>
                   <w:rStyle w:val="Hyperlink"/>
@@ -2519,7 +2452,7 @@
           </w:tcPr>
           <w:p>
             <w:pPr/>
-            <w:hyperlink r:id="rId27" w:history="1">
+            <w:hyperlink r:id="rId22" w:history="1">
               <w:r>
                 <w:rPr>
                   <w:rStyle w:val="Hyperlink"/>
@@ -2581,7 +2514,7 @@
           </w:tcPr>
           <w:p>
             <w:pPr/>
-            <w:hyperlink r:id="rId20" w:history="1">
+            <w:hyperlink r:id="rId15" w:history="1">
               <w:r>
                 <w:rPr>
                   <w:rStyle w:val="Hyperlink"/>
@@ -2643,7 +2576,7 @@
           </w:tcPr>
           <w:p>
             <w:pPr/>
-            <w:hyperlink r:id="rId21" w:history="1">
+            <w:hyperlink r:id="rId16" w:history="1">
               <w:r>
                 <w:rPr>
                   <w:rStyle w:val="Hyperlink"/>
@@ -2876,7 +2809,7 @@
           </w:tcPr>
           <w:p>
             <w:pPr/>
-            <w:hyperlink r:id="rId28" w:history="1">
+            <w:hyperlink r:id="rId23" w:history="1">
               <w:r>
                 <w:rPr>
                   <w:rStyle w:val="Hyperlink"/>
@@ -2938,7 +2871,7 @@
       <w:r>
         <w:t xml:space="preserve">Más relevante que las cifras es el patrón arquitectónico que emerge de los trabajos de 2026: el modelo de lenguaje planifica y una capa determinista compila. "</w:t>
       </w:r>
-      <w:hyperlink r:id="rId29" w:history="1">
+      <w:hyperlink r:id="rId24" w:history="1">
         <w:r>
           <w:rPr>
             <w:rStyle w:val="Hyperlink"/>
@@ -2949,7 +2882,7 @@
       <w:r>
         <w:t xml:space="preserve">" y "</w:t>
       </w:r>
-      <w:hyperlink r:id="rId30" w:history="1">
+      <w:hyperlink r:id="rId25" w:history="1">
         <w:r>
           <w:rPr>
             <w:rStyle w:val="Hyperlink"/>
@@ -2972,7 +2905,7 @@
       <w:r>
         <w:t xml:space="preserve"> </w:t>
       </w:r>
-      <w:hyperlink r:id="rId31" w:history="1">
+      <w:hyperlink r:id="rId26" w:history="1">
         <w:r>
           <w:rPr>
             <w:rStyle w:val="Hyperlink"/>
@@ -2983,7 +2916,7 @@
       <w:r>
         <w:t xml:space="preserve">, publicado en septiembre de 2026, construye la ontología con un agente y la hace evolucionar a partir de las trayectorias de ejecución: diagnostica el fallo, lo atribuye a un concepto, propone un parche tipado y lo acepta solo si una evaluación pareada confirma la mejora. Expone la ontología versionada a los agentes a través de MCP. Otro trabajo de 2026 (</w:t>
       </w:r>
-      <w:hyperlink r:id="rId32" w:history="1">
+      <w:hyperlink r:id="rId27" w:history="1">
         <w:r>
           <w:rPr>
             <w:rStyle w:val="Hyperlink"/>
@@ -3066,7 +2999,7 @@
                     <pic:cNvPicPr/>
                   </pic:nvPicPr>
                   <pic:blipFill>
-                    <a:blip r:embed="rId33"/>
+                    <a:blip r:embed="rId28"/>
                     <a:stretch>
                       <a:fillRect/>
                     </a:stretch>
@@ -3602,6 +3535,152 @@
         <w:pStyle w:val="ListParagraph"/>
         <w:numPr>
           <w:ilvl w:val="0"/>
+          <w:numId w:val="4"/>
+        </w:numPr>
+      </w:pPr>
+      <w:r>
+        <w:rPr>
+          <w:b/>
+        </w:rPr>
+        <w:t xml:space="preserve">Lo descriptivo no es lo normativo.</w:t>
+      </w:r>
+      <w:r>
+        <w:t xml:space="preserve"> Minar código y logs dice cómo la organización calcula las cosas de hecho, no cómo debe calcularlas. La definición de impago viene del artículo 178 del CRR, no de la consulta más frecuente. Si la implementación mayoritaria es la incorrecta, una ontología que evoluciona por uso consolida el error con autoridad. Por eso la propuesta es automática y la aprobación humana.</w:t>
+      </w:r>
+    </w:p>
+    <w:p>
+      <w:pPr>
+        <w:pStyle w:val="ListParagraph"/>
+        <w:numPr>
+          <w:ilvl w:val="0"/>
+          <w:numId w:val="4"/>
+        </w:numPr>
+      </w:pPr>
+      <w:r>
+        <w:rPr>
+          <w:b/>
+        </w:rPr>
+        <w:t xml:space="preserve">El código guarda la implementación, no el porqué.</w:t>
+      </w:r>
+      <w:r>
+        <w:t xml:space="preserve"> Un umbral de 90 días aparece en código; la razón está en una circular o un correo. Sin enlazar la regla con su fuente documental la ontología es correcta pero no explicable.</w:t>
+      </w:r>
+    </w:p>
+    <w:p>
+      <w:pPr>
+        <w:pStyle w:val="ListParagraph"/>
+        <w:numPr>
+          <w:ilvl w:val="0"/>
+          <w:numId w:val="4"/>
+        </w:numPr>
+      </w:pPr>
+      <w:r>
+        <w:rPr>
+          <w:b/>
+        </w:rPr>
+        <w:t xml:space="preserve">Un cambio semántico es un cambio en todos los informes aguas abajo.</w:t>
+      </w:r>
+      <w:r>
+        <w:t xml:space="preserve"> Sin fecha de efectividad, análisis de impacto y versionado, un cambio de definición altera el reporting regulatorio del trimestre sin que nadie lo haya decidido.</w:t>
+      </w:r>
+    </w:p>
+    <w:p>
+      <w:pPr>
+        <w:pStyle w:val="ListParagraph"/>
+        <w:numPr>
+          <w:ilvl w:val="0"/>
+          <w:numId w:val="4"/>
+        </w:numPr>
+      </w:pPr>
+      <w:r>
+        <w:rPr>
+          <w:b/>
+        </w:rPr>
+        <w:t xml:space="preserve">La ontología derivada por un modelo es salida de un modelo.</w:t>
+      </w:r>
+      <w:r>
+        <w:t xml:space="preserve"> Puede inventar relaciones plausibles. Entra en gestión de riesgo de modelo, con validación independiente, igual que un scoring.</w:t>
+      </w:r>
+    </w:p>
+    <w:p>
+      <w:pPr>
+        <w:pStyle w:val="ListParagraph"/>
+        <w:numPr>
+          <w:ilvl w:val="0"/>
+          <w:numId w:val="4"/>
+        </w:numPr>
+      </w:pPr>
+      <w:r>
+        <w:rPr>
+          <w:b/>
+        </w:rPr>
+        <w:t xml:space="preserve">Bucle de retroalimentación.</w:t>
+      </w:r>
+      <w:r>
+        <w:t xml:space="preserve"> Si los agentes generan la mayoría de las consultas, el sistema aprende de sí mismo. Hay que distinguir en los logs el uso humano del uso de agentes y ponderar en consecuencia.</w:t>
+      </w:r>
+    </w:p>
+    <w:p>
+      <w:pPr>
+        <w:pStyle w:val="ListParagraph"/>
+        <w:numPr>
+          <w:ilvl w:val="0"/>
+          <w:numId w:val="4"/>
+        </w:numPr>
+      </w:pPr>
+      <w:r>
+        <w:rPr>
+          <w:b/>
+        </w:rPr>
+        <w:t xml:space="preserve">Privacidad en logs y embeddings.</w:t>
+      </w:r>
+      <w:r>
+        <w:t xml:space="preserve"> Los logs de consulta contienen nombres y documentos de identidad; los embeddings pueden reconstruir texto. Ambos son datos personales bajo RGPD y necesitan enmascarado y retención definida.</w:t>
+      </w:r>
+    </w:p>
+    <w:p>
+      <w:pPr>
+        <w:pStyle w:val="ListParagraph"/>
+        <w:numPr>
+          <w:ilvl w:val="0"/>
+          <w:numId w:val="4"/>
+        </w:numPr>
+      </w:pPr>
+      <w:r>
+        <w:rPr>
+          <w:b/>
+        </w:rPr>
+        <w:t xml:space="preserve">Bloqueo de proveedor y límites técnicos.</w:t>
+      </w:r>
+      <w:r>
+        <w:t xml:space="preserve"> Una ontología en formato propietario es un activo cautivo. Un grafo virtual sobre SQL sirve para métricas y joins pero no para análisis de redes. FIBO es extenso y su adopción parcial. El grafo de contexto no tiene estándar y cada proveedor lo define a su conveniencia.</w:t>
+      </w:r>
+    </w:p>
+    <w:p>
+      <w:pPr/>
+      <w:r>
+        <w:t xml:space="preserve">A estos se añade un límite organizativo: el propietario de concepto solo funciona si tiene autoridad real para rechazar un cambio que un área de negocio quiere. Sin esa autoridad, el ciclo de aprobación se convierte en un trámite y la ontología vuelve a divergir, ahora más rápido.</w:t>
+      </w:r>
+    </w:p>
+    <w:p>
+      <w:pPr>
+        <w:pStyle w:val="Heading2"/>
+      </w:pPr>
+      <w:r>
+        <w:t xml:space="preserve">Hoja de ruta para una entidad financiera</w:t>
+      </w:r>
+    </w:p>
+    <w:p>
+      <w:pPr/>
+      <w:r>
+        <w:t xml:space="preserve">Dos reglas ordenan el camino. La capa semántica avanza en transversal y ahora, porque el entorno informacional ya está gobernado y los YAML existen: es el componente 1 de Dato como Producto y no espera a los demás. Los otros tres componentes avanzan por dominio de uso, allí donde haya agentes haciendo tareas que exijan relaciones, documentos o precedentes. Las líneas van separadas pero coordinadas por una costura: los campos del YAML y del registro de peticiones que alimentarán a la ontología, al grafo y al contexto se deciden ahora, para que la capa semántica no se rehaga.</w:t>
+      </w:r>
+    </w:p>
+    <w:p>
+      <w:pPr>
+        <w:pStyle w:val="ListParagraph"/>
+        <w:numPr>
+          <w:ilvl w:val="0"/>
           <w:numId w:val="5"/>
         </w:numPr>
       </w:pPr>
@@ -3609,10 +3688,10 @@
         <w:rPr>
           <w:b/>
         </w:rPr>
-        <w:t xml:space="preserve">Lo descriptivo no es lo normativo.</w:t>
-      </w:r>
-      <w:r>
-        <w:t xml:space="preserve"> Minar código y logs dice cómo la organización calcula las cosas de hecho, no cómo debe calcularlas. La definición de impago viene del artículo 178 del CRR, no de la consulta más frecuente. Si la implementación mayoritaria es la incorrecta, una ontología que evoluciona por uso consolida el error con autoridad. Por eso la propuesta es automática y la aprobación humana.</w:t>
+        <w:t xml:space="preserve">Capa semántica, transversal y ahora.</w:t>
+      </w:r>
+      <w:r>
+        <w:t xml:space="preserve"> Extender la etapa 1 (text-to-SQL con el YAML como contexto) a más vistas de Teradata y probar la etapa 2 (text-to-metrics con compilador determinista) sobre ese entorno; diseñar la etapa 3 (fachada multiplataforma y repositorio único) para no rehacer nada. El detalle está en Capa semántica · 0 Concepto y en sus aplicaciones 1 · Teradata y 2 · Elastic.</w:t>
       </w:r>
     </w:p>
     <w:p>
@@ -3627,10 +3706,10 @@
         <w:rPr>
           <w:b/>
         </w:rPr>
-        <w:t xml:space="preserve">El código guarda la implementación, no el porqué.</w:t>
-      </w:r>
-      <w:r>
-        <w:t xml:space="preserve"> Un umbral de 90 días aparece en código; la razón está en una circular o un correo. Sin enlazar la regla con su fuente documental la ontología es correcta pero no explicable.</w:t>
+        <w:t xml:space="preserve">Definiciones portables.</w:t>
+      </w:r>
+      <w:r>
+        <w:t xml:space="preserve"> Apache Ossie desde el día 1 con la extensión del banco, y compatibilidad con ese formato exigida en cualquier contrato con proveedores de capas semánticas.</w:t>
       </w:r>
     </w:p>
     <w:p>
@@ -3645,10 +3724,10 @@
         <w:rPr>
           <w:b/>
         </w:rPr>
-        <w:t xml:space="preserve">Un cambio semántico es un cambio en todos los informes aguas abajo.</w:t>
-      </w:r>
-      <w:r>
-        <w:t xml:space="preserve"> Sin fecha de efectividad, análisis de impacto y versionado, un cambio de definición altera el reporting regulatorio del trimestre sin que nadie lo haya decidido.</w:t>
+        <w:t xml:space="preserve">La costura.</w:t>
+      </w:r>
+      <w:r>
+        <w:t xml:space="preserve"> Fijar en el YAML y en el registro de peticiones los campos que alimentarán a los otros componentes: entidades y relaciones de negocio para la ontología; dueño, versión y rutas de unión para el grafo; identificador de correlación y versión del producto en cada petición para el contexto.</w:t>
       </w:r>
     </w:p>
     <w:p>
@@ -3663,10 +3742,10 @@
         <w:rPr>
           <w:b/>
         </w:rPr>
-        <w:t xml:space="preserve">La ontología derivada por un modelo es salida de un modelo.</w:t>
-      </w:r>
-      <w:r>
-        <w:t xml:space="preserve"> Puede inventar relaciones plausibles. Entra en gestión de riesgo de modelo, con validación independiente, igual que un scoring.</w:t>
+        <w:t xml:space="preserve">Ontología y grafo por dominio, empezando por uno documental.</w:t>
+      </w:r>
+      <w:r>
+        <w:t xml:space="preserve"> El candidato es la aplicación de demandas judiciales de la iniciativa 2 de Dato como Producto: documentos, no tablas. Modelar solo los conceptos del inventario de BCBS 239 que toque, con FIBO como referencia; extraer un tipo de documento con procedencia al fragmento; tratar los pipelines de extracción como modelos bajo gobernanza.</w:t>
       </w:r>
     </w:p>
     <w:p>
@@ -3681,10 +3760,10 @@
         <w:rPr>
           <w:b/>
         </w:rPr>
-        <w:t xml:space="preserve">Bucle de retroalimentación.</w:t>
-      </w:r>
-      <w:r>
-        <w:t xml:space="preserve"> Si los agentes generan la mayoría de las consultas, el sistema aprende de sí mismo. Hay que distinguir en los logs el uso humano del uso de agentes y ponderar en consecuencia.</w:t>
+        <w:t xml:space="preserve">Grafo de contexto en un proceso con agentes.</w:t>
+      </w:r>
+      <w:r>
+        <w:t xml:space="preserve"> Capturar las trazas de decisión (excepciones, derivaciones a cumplimiento) con los campos del registro de eventos del Reglamento de IA, y probar que un requerimiento del supervisor sobre ese proceso se responde con una consulta. IRRBB, en analítica avanzada, es el otro candidato.</w:t>
       </w:r>
     </w:p>
     <w:p>
@@ -3699,10 +3778,10 @@
         <w:rPr>
           <w:b/>
         </w:rPr>
-        <w:t xml:space="preserve">Privacidad en logs y embeddings.</w:t>
-      </w:r>
-      <w:r>
-        <w:t xml:space="preserve"> Los logs de consulta contienen nombres y documentos de identidad; los embeddings pueden reconstruir texto. Ambos son datos personales bajo RGPD y necesitan enmascarado y retención definida.</w:t>
+        <w:t xml:space="preserve">Compilar, no generar.</w:t>
+      </w:r>
+      <w:r>
+        <w:t xml:space="preserve"> En todo acceso de agentes a datos estructurados el modelo elige piezas aprobadas y un compilador produce la consulta. Prohibir en producción el SQL generado directamente por el modelo para cifras certificadas.</w:t>
       </w:r>
     </w:p>
     <w:p>
@@ -3717,16 +3796,34 @@
         <w:rPr>
           <w:b/>
         </w:rPr>
-        <w:t xml:space="preserve">Bloqueo de proveedor y límites técnicos.</w:t>
-      </w:r>
-      <w:r>
-        <w:t xml:space="preserve"> Una ontología en formato propietario es un activo cautivo. Un grafo virtual sobre SQL sirve para métricas y joins pero no para análisis de redes. FIBO es extenso y su adopción parcial. El grafo de contexto no tiene estándar y cada proveedor lo define a su conveniencia.</w:t>
-      </w:r>
-    </w:p>
-    <w:p>
-      <w:pPr/>
-      <w:r>
-        <w:t xml:space="preserve">A estos se añade un límite organizativo: el propietario de concepto solo funciona si tiene autoridad real para rechazar un cambio que un área de negocio quiere. Sin esa autoridad, el ciclo de aprobación se convierte en un trámite y la ontología vuelve a divergir, ahora más rápido.</w:t>
+        <w:t xml:space="preserve">Banco de pruebas propio</w:t>
+      </w:r>
+      <w:r>
+        <w:t xml:space="preserve"> antes de creer las cifras de ningún proveedor: las mismas preguntas reales con y sin capa semántica, con el juego de pruebas que sale del log, contando aciertos, errores y «no puedo».</w:t>
+      </w:r>
+    </w:p>
+    <w:p>
+      <w:pPr>
+        <w:pStyle w:val="ListParagraph"/>
+        <w:numPr>
+          <w:ilvl w:val="0"/>
+          <w:numId w:val="5"/>
+        </w:numPr>
+      </w:pPr>
+      <w:r>
+        <w:rPr>
+          <w:b/>
+        </w:rPr>
+        <w:t xml:space="preserve">Agentes de lectura en modo solo propuesta</w:t>
+      </w:r>
+      <w:r>
+        <w:t xml:space="preserve"> sobre código, logs y documentos, seis meses midiendo la calidad de las propuestas; abrir la fusión asistida solo cuando el propietario de concepto tenga autoridad demostrada. Es el paso al nivel 4 y el último.</w:t>
+      </w:r>
+    </w:p>
+    <w:p>
+      <w:pPr/>
+      <w:r>
+        <w:t xml:space="preserve">Avanzar en cada línea por separado pero coordinadamente tiene sentido porque cada componente tiene su propio ritmo y su propio dominio de arranque, y lo único que los une es la costura del punto 3.</w:t>
       </w:r>
     </w:p>
     <w:p>
@@ -3734,13 +3831,22 @@
         <w:pStyle w:val="Heading2"/>
       </w:pPr>
       <w:r>
-        <w:t xml:space="preserve">Hoja de ruta para una entidad financiera</w:t>
-      </w:r>
-    </w:p>
-    <w:p>
-      <w:pPr/>
-      <w:r>
-        <w:t xml:space="preserve">Dos reglas ordenan el camino. La capa semántica avanza en transversal y ahora, porque el entorno informacional ya está gobernado y los YAML existen: es el componente 1 de Dato como Producto y no espera a los demás. Los otros tres componentes avanzan por dominio de uso, allí donde haya agentes haciendo tareas que exijan relaciones, documentos o precedentes. Las líneas van separadas pero coordinadas por una costura: los campos del YAML y del registro de peticiones que alimentarán a la ontología, al grafo y al contexto se deciden ahora, para que la capa semántica no se rehaga.</w:t>
+        <w:t xml:space="preserve">Fuentes</w:t>
+      </w:r>
+    </w:p>
+    <w:p>
+      <w:pPr/>
+      <w:r>
+        <w:t xml:space="preserve">El punto de partida fue el artículo comparativo de Timbr, que este documento sustituye. Las páginas de arXiv, BIS, Neo4j, dbt y Foundation Capital no se pudieron abrir directamente desde el entorno de trabajo; sus datos proceden de resúmenes de búsqueda y fuentes secundarias, y conviene verificarlos antes de citarlos en un documento oficial.</w:t>
+      </w:r>
+    </w:p>
+    <w:p>
+      <w:pPr/>
+      <w:r>
+        <w:rPr>
+          <w:b/>
+        </w:rPr>
+        <w:t xml:space="preserve">Regulación</w:t>
       </w:r>
     </w:p>
     <w:p>
@@ -3749,179 +3855,6 @@
         <w:numPr>
           <w:ilvl w:val="0"/>
           <w:numId w:val="6"/>
-        </w:numPr>
-      </w:pPr>
-      <w:r>
-        <w:rPr>
-          <w:b/>
-        </w:rPr>
-        <w:t xml:space="preserve">Capa semántica, transversal y ahora.</w:t>
-      </w:r>
-      <w:r>
-        <w:t xml:space="preserve"> Extender la etapa 1 (text-to-SQL con el YAML como contexto) a más vistas de Teradata y probar la etapa 2 (text-to-metrics con compilador determinista) sobre ese entorno; diseñar la etapa 3 (fachada multiplataforma y repositorio único) para no rehacer nada. El detalle está en Capa semántica · 0 Concepto y en sus aplicaciones 1 · Teradata y 2 · Elastic.</w:t>
-      </w:r>
-    </w:p>
-    <w:p>
-      <w:pPr>
-        <w:pStyle w:val="ListParagraph"/>
-        <w:numPr>
-          <w:ilvl w:val="0"/>
-          <w:numId w:val="6"/>
-        </w:numPr>
-      </w:pPr>
-      <w:r>
-        <w:rPr>
-          <w:b/>
-        </w:rPr>
-        <w:t xml:space="preserve">Definiciones portables.</w:t>
-      </w:r>
-      <w:r>
-        <w:t xml:space="preserve"> Apache Ossie desde el día 1 con la extensión del banco, y compatibilidad con ese formato exigida en cualquier contrato con proveedores de capas semánticas.</w:t>
-      </w:r>
-    </w:p>
-    <w:p>
-      <w:pPr>
-        <w:pStyle w:val="ListParagraph"/>
-        <w:numPr>
-          <w:ilvl w:val="0"/>
-          <w:numId w:val="6"/>
-        </w:numPr>
-      </w:pPr>
-      <w:r>
-        <w:rPr>
-          <w:b/>
-        </w:rPr>
-        <w:t xml:space="preserve">La costura.</w:t>
-      </w:r>
-      <w:r>
-        <w:t xml:space="preserve"> Fijar en el YAML y en el registro de peticiones los campos que alimentarán a los otros componentes: entidades y relaciones de negocio para la ontología; dueño, versión y rutas de unión para el grafo; identificador de correlación y versión del producto en cada petición para el contexto.</w:t>
-      </w:r>
-    </w:p>
-    <w:p>
-      <w:pPr>
-        <w:pStyle w:val="ListParagraph"/>
-        <w:numPr>
-          <w:ilvl w:val="0"/>
-          <w:numId w:val="6"/>
-        </w:numPr>
-      </w:pPr>
-      <w:r>
-        <w:rPr>
-          <w:b/>
-        </w:rPr>
-        <w:t xml:space="preserve">Ontología y grafo por dominio, empezando por uno documental.</w:t>
-      </w:r>
-      <w:r>
-        <w:t xml:space="preserve"> El candidato es la aplicación de demandas judiciales de la iniciativa 2 de Dato como Producto: documentos, no tablas. Modelar solo los conceptos del inventario de BCBS 239 que toque, con FIBO como referencia; extraer un tipo de documento con procedencia al fragmento; tratar los pipelines de extracción como modelos bajo gobernanza.</w:t>
-      </w:r>
-    </w:p>
-    <w:p>
-      <w:pPr>
-        <w:pStyle w:val="ListParagraph"/>
-        <w:numPr>
-          <w:ilvl w:val="0"/>
-          <w:numId w:val="6"/>
-        </w:numPr>
-      </w:pPr>
-      <w:r>
-        <w:rPr>
-          <w:b/>
-        </w:rPr>
-        <w:t xml:space="preserve">Grafo de contexto en un proceso con agentes.</w:t>
-      </w:r>
-      <w:r>
-        <w:t xml:space="preserve"> Capturar las trazas de decisión (excepciones, derivaciones a cumplimiento) con los campos del registro de eventos del Reglamento de IA, y probar que un requerimiento del supervisor sobre ese proceso se responde con una consulta. IRRBB, en analítica avanzada, es el otro candidato.</w:t>
-      </w:r>
-    </w:p>
-    <w:p>
-      <w:pPr>
-        <w:pStyle w:val="ListParagraph"/>
-        <w:numPr>
-          <w:ilvl w:val="0"/>
-          <w:numId w:val="6"/>
-        </w:numPr>
-      </w:pPr>
-      <w:r>
-        <w:rPr>
-          <w:b/>
-        </w:rPr>
-        <w:t xml:space="preserve">Compilar, no generar.</w:t>
-      </w:r>
-      <w:r>
-        <w:t xml:space="preserve"> En todo acceso de agentes a datos estructurados el modelo elige piezas aprobadas y un compilador produce la consulta. Prohibir en producción el SQL generado directamente por el modelo para cifras certificadas.</w:t>
-      </w:r>
-    </w:p>
-    <w:p>
-      <w:pPr>
-        <w:pStyle w:val="ListParagraph"/>
-        <w:numPr>
-          <w:ilvl w:val="0"/>
-          <w:numId w:val="6"/>
-        </w:numPr>
-      </w:pPr>
-      <w:r>
-        <w:rPr>
-          <w:b/>
-        </w:rPr>
-        <w:t xml:space="preserve">Banco de pruebas propio</w:t>
-      </w:r>
-      <w:r>
-        <w:t xml:space="preserve"> antes de creer las cifras de ningún proveedor: las mismas preguntas reales con y sin capa semántica, con el juego de pruebas que sale del log, contando aciertos, errores y «no puedo».</w:t>
-      </w:r>
-    </w:p>
-    <w:p>
-      <w:pPr>
-        <w:pStyle w:val="ListParagraph"/>
-        <w:numPr>
-          <w:ilvl w:val="0"/>
-          <w:numId w:val="6"/>
-        </w:numPr>
-      </w:pPr>
-      <w:r>
-        <w:rPr>
-          <w:b/>
-        </w:rPr>
-        <w:t xml:space="preserve">Agentes de lectura en modo solo propuesta</w:t>
-      </w:r>
-      <w:r>
-        <w:t xml:space="preserve"> sobre código, logs y documentos, seis meses midiendo la calidad de las propuestas; abrir la fusión asistida solo cuando el propietario de concepto tenga autoridad demostrada. Es el paso al nivel 4 y el último.</w:t>
-      </w:r>
-    </w:p>
-    <w:p>
-      <w:pPr/>
-      <w:r>
-        <w:t xml:space="preserve">Avanzar en cada línea por separado pero coordinadamente tiene sentido porque cada componente tiene su propio ritmo y su propio dominio de arranque, y lo único que los une es la costura del punto 3.</w:t>
-      </w:r>
-    </w:p>
-    <w:p>
-      <w:pPr>
-        <w:pStyle w:val="Heading2"/>
-      </w:pPr>
-      <w:r>
-        <w:t xml:space="preserve">Fuentes</w:t>
-      </w:r>
-    </w:p>
-    <w:p>
-      <w:pPr/>
-      <w:r>
-        <w:t xml:space="preserve">El punto de partida fue el artículo comparativo de Timbr, que este documento sustituye. Las páginas de arXiv, BIS, Neo4j, dbt y Foundation Capital no se pudieron abrir directamente desde el entorno de trabajo; sus datos proceden de resúmenes de búsqueda y fuentes secundarias, y conviene verificarlos antes de citarlos en un documento oficial.</w:t>
-      </w:r>
-    </w:p>
-    <w:p>
-      <w:pPr/>
-      <w:r>
-        <w:rPr>
-          <w:b/>
-        </w:rPr>
-        <w:t xml:space="preserve">Regulación</w:t>
-      </w:r>
-    </w:p>
-    <w:p>
-      <w:pPr>
-        <w:pStyle w:val="ListParagraph"/>
-        <w:numPr>
-          <w:ilvl w:val="0"/>
-          <w:numId w:val="7"/>
         </w:numPr>
       </w:pPr>
       <w:hyperlink r:id="rId8" w:history="1">
@@ -3938,7 +3871,7 @@
         <w:pStyle w:val="ListParagraph"/>
         <w:numPr>
           <w:ilvl w:val="0"/>
-          <w:numId w:val="7"/>
+          <w:numId w:val="6"/>
         </w:numPr>
       </w:pPr>
       <w:hyperlink r:id="rId9" w:history="1">
@@ -3955,10 +3888,10 @@
         <w:pStyle w:val="ListParagraph"/>
         <w:numPr>
           <w:ilvl w:val="0"/>
-          <w:numId w:val="7"/>
-        </w:numPr>
-      </w:pPr>
-      <w:hyperlink r:id="rId34" w:history="1">
+          <w:numId w:val="6"/>
+        </w:numPr>
+      </w:pPr>
+      <w:hyperlink r:id="rId29" w:history="1">
         <w:r>
           <w:rPr>
             <w:rStyle w:val="Hyperlink"/>
@@ -3972,7 +3905,7 @@
         <w:pStyle w:val="ListParagraph"/>
         <w:numPr>
           <w:ilvl w:val="0"/>
-          <w:numId w:val="7"/>
+          <w:numId w:val="6"/>
         </w:numPr>
       </w:pPr>
       <w:hyperlink r:id="rId10" w:history="1">
@@ -3989,7 +3922,7 @@
         <w:pStyle w:val="ListParagraph"/>
         <w:numPr>
           <w:ilvl w:val="0"/>
-          <w:numId w:val="7"/>
+          <w:numId w:val="6"/>
         </w:numPr>
       </w:pPr>
       <w:hyperlink r:id="rId11" w:history="1">
@@ -4006,7 +3939,7 @@
         <w:pStyle w:val="ListParagraph"/>
         <w:numPr>
           <w:ilvl w:val="0"/>
-          <w:numId w:val="7"/>
+          <w:numId w:val="6"/>
         </w:numPr>
       </w:pPr>
       <w:hyperlink r:id="rId13" w:history="1">
@@ -4023,7 +3956,7 @@
         <w:pStyle w:val="ListParagraph"/>
         <w:numPr>
           <w:ilvl w:val="0"/>
-          <w:numId w:val="7"/>
+          <w:numId w:val="6"/>
         </w:numPr>
       </w:pPr>
       <w:hyperlink r:id="rId12" w:history="1">
@@ -4049,10 +3982,10 @@
         <w:pStyle w:val="ListParagraph"/>
         <w:numPr>
           <w:ilvl w:val="0"/>
-          <w:numId w:val="8"/>
-        </w:numPr>
-      </w:pPr>
-      <w:hyperlink r:id="rId35" w:history="1">
+          <w:numId w:val="7"/>
+        </w:numPr>
+      </w:pPr>
+      <w:hyperlink r:id="rId30" w:history="1">
         <w:r>
           <w:rPr>
             <w:rStyle w:val="Hyperlink"/>
@@ -4066,10 +3999,10 @@
         <w:pStyle w:val="ListParagraph"/>
         <w:numPr>
           <w:ilvl w:val="0"/>
-          <w:numId w:val="8"/>
-        </w:numPr>
-      </w:pPr>
-      <w:hyperlink r:id="rId36" w:history="1">
+          <w:numId w:val="7"/>
+        </w:numPr>
+      </w:pPr>
+      <w:hyperlink r:id="rId31" w:history="1">
         <w:r>
           <w:rPr>
             <w:rStyle w:val="Hyperlink"/>
@@ -4083,7 +4016,7 @@
         <w:pStyle w:val="ListParagraph"/>
         <w:numPr>
           <w:ilvl w:val="0"/>
-          <w:numId w:val="8"/>
+          <w:numId w:val="7"/>
         </w:numPr>
       </w:pPr>
       <w:hyperlink r:id="rId5" w:history="1">
@@ -4100,7 +4033,7 @@
         <w:pStyle w:val="ListParagraph"/>
         <w:numPr>
           <w:ilvl w:val="0"/>
-          <w:numId w:val="8"/>
+          <w:numId w:val="7"/>
         </w:numPr>
       </w:pPr>
       <w:hyperlink r:id="rId6" w:history="1">
@@ -4117,10 +4050,10 @@
         <w:pStyle w:val="ListParagraph"/>
         <w:numPr>
           <w:ilvl w:val="0"/>
-          <w:numId w:val="8"/>
-        </w:numPr>
-      </w:pPr>
-      <w:hyperlink r:id="rId37" w:history="1">
+          <w:numId w:val="7"/>
+        </w:numPr>
+      </w:pPr>
+      <w:hyperlink r:id="rId32" w:history="1">
         <w:r>
           <w:rPr>
             <w:rStyle w:val="Hyperlink"/>
@@ -4134,10 +4067,10 @@
         <w:pStyle w:val="ListParagraph"/>
         <w:numPr>
           <w:ilvl w:val="0"/>
-          <w:numId w:val="8"/>
-        </w:numPr>
-      </w:pPr>
-      <w:hyperlink r:id="rId38" w:history="1">
+          <w:numId w:val="7"/>
+        </w:numPr>
+      </w:pPr>
+      <w:hyperlink r:id="rId33" w:history="1">
         <w:r>
           <w:rPr>
             <w:rStyle w:val="Hyperlink"/>
@@ -4151,7 +4084,7 @@
         <w:pStyle w:val="ListParagraph"/>
         <w:numPr>
           <w:ilvl w:val="0"/>
-          <w:numId w:val="8"/>
+          <w:numId w:val="7"/>
         </w:numPr>
       </w:pPr>
       <w:hyperlink r:id="rId4" w:history="1">
@@ -4177,7 +4110,7 @@
         <w:pStyle w:val="ListParagraph"/>
         <w:numPr>
           <w:ilvl w:val="0"/>
-          <w:numId w:val="9"/>
+          <w:numId w:val="8"/>
         </w:numPr>
       </w:pPr>
       <w:hyperlink r:id="rId3" w:history="1">
@@ -4194,10 +4127,10 @@
         <w:pStyle w:val="ListParagraph"/>
         <w:numPr>
           <w:ilvl w:val="0"/>
-          <w:numId w:val="9"/>
-        </w:numPr>
-      </w:pPr>
-      <w:hyperlink r:id="rId39" w:history="1">
+          <w:numId w:val="8"/>
+        </w:numPr>
+      </w:pPr>
+      <w:hyperlink r:id="rId34" w:history="1">
         <w:r>
           <w:rPr>
             <w:rStyle w:val="Hyperlink"/>
@@ -4211,10 +4144,10 @@
         <w:pStyle w:val="ListParagraph"/>
         <w:numPr>
           <w:ilvl w:val="0"/>
-          <w:numId w:val="9"/>
-        </w:numPr>
-      </w:pPr>
-      <w:hyperlink r:id="rId40" w:history="1">
+          <w:numId w:val="8"/>
+        </w:numPr>
+      </w:pPr>
+      <w:hyperlink r:id="rId35" w:history="1">
         <w:r>
           <w:rPr>
             <w:rStyle w:val="Hyperlink"/>
@@ -4228,10 +4161,10 @@
         <w:pStyle w:val="ListParagraph"/>
         <w:numPr>
           <w:ilvl w:val="0"/>
-          <w:numId w:val="9"/>
-        </w:numPr>
-      </w:pPr>
-      <w:hyperlink r:id="rId41" w:history="1">
+          <w:numId w:val="8"/>
+        </w:numPr>
+      </w:pPr>
+      <w:hyperlink r:id="rId36" w:history="1">
         <w:r>
           <w:rPr>
             <w:rStyle w:val="Hyperlink"/>
@@ -4245,10 +4178,10 @@
         <w:pStyle w:val="ListParagraph"/>
         <w:numPr>
           <w:ilvl w:val="0"/>
-          <w:numId w:val="9"/>
-        </w:numPr>
-      </w:pPr>
-      <w:hyperlink r:id="rId42" w:history="1">
+          <w:numId w:val="8"/>
+        </w:numPr>
+      </w:pPr>
+      <w:hyperlink r:id="rId37" w:history="1">
         <w:r>
           <w:rPr>
             <w:rStyle w:val="Hyperlink"/>
@@ -4271,10 +4204,10 @@
         <w:pStyle w:val="ListParagraph"/>
         <w:numPr>
           <w:ilvl w:val="0"/>
-          <w:numId w:val="10"/>
-        </w:numPr>
-      </w:pPr>
-      <w:hyperlink r:id="rId23" w:history="1">
+          <w:numId w:val="9"/>
+        </w:numPr>
+      </w:pPr>
+      <w:hyperlink r:id="rId18" w:history="1">
         <w:r>
           <w:rPr>
             <w:rStyle w:val="Hyperlink"/>
@@ -4288,10 +4221,10 @@
         <w:pStyle w:val="ListParagraph"/>
         <w:numPr>
           <w:ilvl w:val="0"/>
-          <w:numId w:val="10"/>
-        </w:numPr>
-      </w:pPr>
-      <w:hyperlink r:id="rId43" w:history="1">
+          <w:numId w:val="9"/>
+        </w:numPr>
+      </w:pPr>
+      <w:hyperlink r:id="rId38" w:history="1">
         <w:r>
           <w:rPr>
             <w:rStyle w:val="Hyperlink"/>
@@ -4305,10 +4238,10 @@
         <w:pStyle w:val="ListParagraph"/>
         <w:numPr>
           <w:ilvl w:val="0"/>
-          <w:numId w:val="10"/>
-        </w:numPr>
-      </w:pPr>
-      <w:hyperlink r:id="rId44" w:history="1">
+          <w:numId w:val="9"/>
+        </w:numPr>
+      </w:pPr>
+      <w:hyperlink r:id="rId39" w:history="1">
         <w:r>
           <w:rPr>
             <w:rStyle w:val="Hyperlink"/>
@@ -4322,10 +4255,10 @@
         <w:pStyle w:val="ListParagraph"/>
         <w:numPr>
           <w:ilvl w:val="0"/>
-          <w:numId w:val="10"/>
-        </w:numPr>
-      </w:pPr>
-      <w:hyperlink r:id="rId29" w:history="1">
+          <w:numId w:val="9"/>
+        </w:numPr>
+      </w:pPr>
+      <w:hyperlink r:id="rId24" w:history="1">
         <w:r>
           <w:rPr>
             <w:rStyle w:val="Hyperlink"/>
@@ -4339,10 +4272,10 @@
         <w:pStyle w:val="ListParagraph"/>
         <w:numPr>
           <w:ilvl w:val="0"/>
-          <w:numId w:val="10"/>
-        </w:numPr>
-      </w:pPr>
-      <w:hyperlink r:id="rId30" w:history="1">
+          <w:numId w:val="9"/>
+        </w:numPr>
+      </w:pPr>
+      <w:hyperlink r:id="rId25" w:history="1">
         <w:r>
           <w:rPr>
             <w:rStyle w:val="Hyperlink"/>
@@ -4356,10 +4289,10 @@
         <w:pStyle w:val="ListParagraph"/>
         <w:numPr>
           <w:ilvl w:val="0"/>
-          <w:numId w:val="10"/>
-        </w:numPr>
-      </w:pPr>
-      <w:hyperlink r:id="rId31" w:history="1">
+          <w:numId w:val="9"/>
+        </w:numPr>
+      </w:pPr>
+      <w:hyperlink r:id="rId26" w:history="1">
         <w:r>
           <w:rPr>
             <w:rStyle w:val="Hyperlink"/>
@@ -4373,10 +4306,10 @@
         <w:pStyle w:val="ListParagraph"/>
         <w:numPr>
           <w:ilvl w:val="0"/>
-          <w:numId w:val="10"/>
-        </w:numPr>
-      </w:pPr>
-      <w:hyperlink r:id="rId32" w:history="1">
+          <w:numId w:val="9"/>
+        </w:numPr>
+      </w:pPr>
+      <w:hyperlink r:id="rId27" w:history="1">
         <w:r>
           <w:rPr>
             <w:rStyle w:val="Hyperlink"/>
@@ -4390,10 +4323,10 @@
         <w:pStyle w:val="ListParagraph"/>
         <w:numPr>
           <w:ilvl w:val="0"/>
-          <w:numId w:val="10"/>
-        </w:numPr>
-      </w:pPr>
-      <w:hyperlink r:id="rId14" w:history="1">
+          <w:numId w:val="9"/>
+        </w:numPr>
+      </w:pPr>
+      <w:hyperlink r:id="rId40" w:history="1">
         <w:r>
           <w:rPr>
             <w:rStyle w:val="Hyperlink"/>
@@ -4407,10 +4340,10 @@
         <w:pStyle w:val="ListParagraph"/>
         <w:numPr>
           <w:ilvl w:val="0"/>
-          <w:numId w:val="10"/>
-        </w:numPr>
-      </w:pPr>
-      <w:hyperlink r:id="rId15" w:history="1">
+          <w:numId w:val="9"/>
+        </w:numPr>
+      </w:pPr>
+      <w:hyperlink r:id="rId41" w:history="1">
         <w:r>
           <w:rPr>
             <w:rStyle w:val="Hyperlink"/>
@@ -4424,10 +4357,10 @@
         <w:pStyle w:val="ListParagraph"/>
         <w:numPr>
           <w:ilvl w:val="0"/>
-          <w:numId w:val="10"/>
-        </w:numPr>
-      </w:pPr>
-      <w:hyperlink r:id="rId16" w:history="1">
+          <w:numId w:val="9"/>
+        </w:numPr>
+      </w:pPr>
+      <w:hyperlink r:id="rId42" w:history="1">
         <w:r>
           <w:rPr>
             <w:rStyle w:val="Hyperlink"/>
@@ -4441,10 +4374,10 @@
         <w:pStyle w:val="ListParagraph"/>
         <w:numPr>
           <w:ilvl w:val="0"/>
-          <w:numId w:val="10"/>
-        </w:numPr>
-      </w:pPr>
-      <w:hyperlink r:id="rId17" w:history="1">
+          <w:numId w:val="9"/>
+        </w:numPr>
+      </w:pPr>
+      <w:hyperlink r:id="rId43" w:history="1">
         <w:r>
           <w:rPr>
             <w:rStyle w:val="Hyperlink"/>
@@ -4458,10 +4391,10 @@
         <w:pStyle w:val="ListParagraph"/>
         <w:numPr>
           <w:ilvl w:val="0"/>
-          <w:numId w:val="10"/>
-        </w:numPr>
-      </w:pPr>
-      <w:hyperlink r:id="rId45" w:history="1">
+          <w:numId w:val="9"/>
+        </w:numPr>
+      </w:pPr>
+      <w:hyperlink r:id="rId44" w:history="1">
         <w:r>
           <w:rPr>
             <w:rStyle w:val="Hyperlink"/>
@@ -4475,10 +4408,10 @@
         <w:pStyle w:val="ListParagraph"/>
         <w:numPr>
           <w:ilvl w:val="0"/>
-          <w:numId w:val="10"/>
-        </w:numPr>
-      </w:pPr>
-      <w:hyperlink r:id="rId18" w:history="1">
+          <w:numId w:val="9"/>
+        </w:numPr>
+      </w:pPr>
+      <w:hyperlink r:id="rId45" w:history="1">
         <w:r>
           <w:rPr>
             <w:rStyle w:val="Hyperlink"/>
@@ -4501,7 +4434,7 @@
         <w:pStyle w:val="ListParagraph"/>
         <w:numPr>
           <w:ilvl w:val="0"/>
-          <w:numId w:val="11"/>
+          <w:numId w:val="10"/>
         </w:numPr>
       </w:pPr>
       <w:hyperlink r:id="rId46" w:history="1">
@@ -4518,10 +4451,10 @@
         <w:pStyle w:val="ListParagraph"/>
         <w:numPr>
           <w:ilvl w:val="0"/>
-          <w:numId w:val="11"/>
-        </w:numPr>
-      </w:pPr>
-      <w:hyperlink r:id="rId20" w:history="1">
+          <w:numId w:val="10"/>
+        </w:numPr>
+      </w:pPr>
+      <w:hyperlink r:id="rId15" w:history="1">
         <w:r>
           <w:rPr>
             <w:rStyle w:val="Hyperlink"/>
@@ -4535,10 +4468,10 @@
         <w:pStyle w:val="ListParagraph"/>
         <w:numPr>
           <w:ilvl w:val="0"/>
-          <w:numId w:val="11"/>
-        </w:numPr>
-      </w:pPr>
-      <w:hyperlink r:id="rId27" w:history="1">
+          <w:numId w:val="10"/>
+        </w:numPr>
+      </w:pPr>
+      <w:hyperlink r:id="rId22" w:history="1">
         <w:r>
           <w:rPr>
             <w:rStyle w:val="Hyperlink"/>
@@ -4552,10 +4485,10 @@
         <w:pStyle w:val="ListParagraph"/>
         <w:numPr>
           <w:ilvl w:val="0"/>
-          <w:numId w:val="11"/>
-        </w:numPr>
-      </w:pPr>
-      <w:hyperlink r:id="rId28" w:history="1">
+          <w:numId w:val="10"/>
+        </w:numPr>
+      </w:pPr>
+      <w:hyperlink r:id="rId23" w:history="1">
         <w:r>
           <w:rPr>
             <w:rStyle w:val="Hyperlink"/>
@@ -4569,10 +4502,10 @@
         <w:pStyle w:val="ListParagraph"/>
         <w:numPr>
           <w:ilvl w:val="0"/>
-          <w:numId w:val="11"/>
-        </w:numPr>
-      </w:pPr>
-      <w:hyperlink r:id="rId26" w:history="1">
+          <w:numId w:val="10"/>
+        </w:numPr>
+      </w:pPr>
+      <w:hyperlink r:id="rId21" w:history="1">
         <w:r>
           <w:rPr>
             <w:rStyle w:val="Hyperlink"/>
@@ -4586,10 +4519,10 @@
         <w:pStyle w:val="ListParagraph"/>
         <w:numPr>
           <w:ilvl w:val="0"/>
-          <w:numId w:val="11"/>
-        </w:numPr>
-      </w:pPr>
-      <w:hyperlink r:id="rId25" w:history="1">
+          <w:numId w:val="10"/>
+        </w:numPr>
+      </w:pPr>
+      <w:hyperlink r:id="rId20" w:history="1">
         <w:r>
           <w:rPr>
             <w:rStyle w:val="Hyperlink"/>
@@ -4603,10 +4536,10 @@
         <w:pStyle w:val="ListParagraph"/>
         <w:numPr>
           <w:ilvl w:val="0"/>
-          <w:numId w:val="11"/>
-        </w:numPr>
-      </w:pPr>
-      <w:hyperlink r:id="rId19" w:history="1">
+          <w:numId w:val="10"/>
+        </w:numPr>
+      </w:pPr>
+      <w:hyperlink r:id="rId14" w:history="1">
         <w:r>
           <w:rPr>
             <w:rStyle w:val="Hyperlink"/>
@@ -4797,10 +4730,7 @@
     <w:abstractNumId w:val="0"/>
   </w:num>
   <w:num w:numId="2">
-    <w:abstractNumId w:val="1"/>
-    <w:lvlOverride w:ilvl="0">
-      <w:startOverride w:val="1"/>
-    </w:lvlOverride>
+    <w:abstractNumId w:val="0"/>
   </w:num>
   <w:num w:numId="3">
     <w:abstractNumId w:val="0"/>
@@ -4809,13 +4739,13 @@
     <w:abstractNumId w:val="0"/>
   </w:num>
   <w:num w:numId="5">
-    <w:abstractNumId w:val="0"/>
-  </w:num>
-  <w:num w:numId="6">
     <w:abstractNumId w:val="1"/>
     <w:lvlOverride w:ilvl="0">
       <w:startOverride w:val="1"/>
     </w:lvlOverride>
+  </w:num>
+  <w:num w:numId="6">
+    <w:abstractNumId w:val="0"/>
   </w:num>
   <w:num w:numId="7">
     <w:abstractNumId w:val="0"/>
@@ -4827,9 +4757,6 @@
     <w:abstractNumId w:val="0"/>
   </w:num>
   <w:num w:numId="10">
-    <w:abstractNumId w:val="0"/>
-  </w:num>
-  <w:num w:numId="11">
     <w:abstractNumId w:val="0"/>
   </w:num>
 </w:numbering>

</xml_diff>

<commit_message>
Framework doc: rewrite concept and state-of-the-art passages to explain relevance for the bank
Co-Authored-By: Claude Fable 5.1 <noreply@anthropic.com>
Claude-Session: https://claude.ai/code/session_013A7bCLd4PzhQYG95DagcQd
</commit_message>
<xml_diff>
--- a/docs/Semantica_grafos_agentes_banca.docx
+++ b/docs/Semantica_grafos_agentes_banca.docx
@@ -13,7 +13,7 @@
     <w:p>
       <w:pPr/>
       <w:r>
-        <w:t xml:space="preserve">Oct 3, 2026</w:t>
+        <w:t xml:space="preserve">Oct 4, 2026</w:t>
       </w:r>
       <w:r>
         <w:t xml:space="preserve"> · </w:t>
@@ -109,7 +109,7 @@
         <w:t xml:space="preserve">Capa semántica.</w:t>
       </w:r>
       <w:r>
-        <w:t xml:space="preserve"> Traduce las estructuras técnicas a definiciones de negocio reutilizables: métricas, dimensiones, jerarquías, joins aprobados y lógica de acceso. Responde a "qué significa margen de intereses y cómo se calcula". Nace en el mundo del BI y hoy la ofrecen de forma nativa las plataformas de datos: Snowflake Semantic Views con SQL estándar desde marzo de 2026 y Databricks Metric Views en Unity Catalog desde abril de 2026. Una capa de métricas es un subconjunto centrado solo en los indicadores y sus fórmulas. El objeto que gobierna es la definición: quién la aprueba, desde cuándo vale, qué informes la usan.</w:t>
+        <w:t xml:space="preserve"> Traduce las estructuras técnicas a definiciones de negocio reutilizables: métricas, dimensiones, jerarquías, joins aprobados y lógica de acceso. Responde a "qué significa margen de intereses y cómo se calcula", y es la pieza que un agente usa para pedir una cifra sin escribir SQL. Nace en el mundo del BI, donde cada herramienta tenía la suya. Hoy las plataformas de datos la incorporan de serie (Snowflake y Databricks la publicaron en 2026), lo que resuelve el problema para quien vive en una sola plataforma y lo agrava para quien tiene varias, porque cada una entiende solo sus propias definiciones. Por eso Dato como Producto la define como un activo propio del banco, escrito en un formato abierto y fuera de cualquier herramienta. Una capa de métricas es un subconjunto centrado solo en los indicadores y sus fórmulas. El objeto que gobierna es la definición: quién la aprueba, desde cuándo vale, qué informes la usan.</w:t>
       </w:r>
     </w:p>
     <w:p>
@@ -133,7 +133,7 @@
         <w:t xml:space="preserve">Grafo de conocimiento.</w:t>
       </w:r>
       <w:r>
-        <w:t xml:space="preserve"> Es la ontología instanciada con datos reales: entidades concretas conectadas por relaciones que se pueden recorrer. Responde a "qué entidades están relacionadas con este cliente y por qué caminos". Es la estructura natural para preguntas de varios saltos: concentración de riesgo a través de grupos económicos, redes de blanqueo, cadenas de garantías. Puede materializarse en una base de datos de grafos (RDF con SPARQL, o grafos de propiedades con Cypher) o virtualizarse sobre SQL, compilando los recorridos a consultas sobre las tablas existentes. La virtualización evita mover datos y hereda el control de acceso del almacén, pero no ofrece algoritmos de grafo como detección de comunidades o centralidad, que requieren un motor dedicado. El objeto que gobierna es la entidad resuelta: que el cliente 4711 del core, el 88-A del CRM y el firmante del contrato escaneado sean la misma persona.</w:t>
+        <w:t xml:space="preserve"> Es la ontología instanciada con datos reales: entidades concretas conectadas por relaciones que se pueden recorrer. Responde a "qué entidades están relacionadas con este cliente y por qué caminos". Es la estructura natural para preguntas de varios saltos, las que en SQL exigen encadenar joins que nadie quiere escribir: concentración de riesgo a través de grupos económicos, redes de blanqueo, cadenas de garantías. Puede materializarse en una base de datos de grafos o virtualizarse sobre SQL, compilando los recorridos a consultas sobre las tablas existentes. La virtualización evita mover datos y hereda el control de acceso del almacén, y basta para navegar conceptos y métricas; pero no ofrece los algoritmos de grafo que detectan grupos de entidades muy conectadas entre sí o las entidades por las que pasan más relaciones, que son los que hacen falta para blanqueo y concentraciones ocultas, y eso exige un motor de grafos dedicado. El objeto que gobierna es la entidad resuelta: que el cliente 4711 del core, el 88-A del CRM y el firmante del contrato escaneado sean la misma persona.</w:t>
       </w:r>
     </w:p>
     <w:p>
@@ -145,7 +145,7 @@
         <w:t xml:space="preserve">Grafo de contexto.</w:t>
       </w:r>
       <w:r>
-        <w:t xml:space="preserve"> Es el término más reciente y el menos estable. Lo popularizó a finales de 2025 un ensayo de Foundation Capital que lo define como un registro vivo de trazas de decisión: qué condiciones había, qué excepción se aplicó, quién aprobó, qué precedente se siguió. Los sistemas de registro guardan el resultado de una decisión pero no el porqué, y ese porqué es lo que un agente necesita para decidir igual que lo haría la organización. Una segunda interpretación, más centrada en la actividad, lo describe como la capa que conecta usuarios, documentos, permisos y señales recientes para saber qué es relevante ahora. Gartner lo sitúa en 2026 en lo alto del ciclo de expectativas y predice que más de la mitad de los sistemas de agentes lo usarán en 2028. Responde a "qué importa en esta decisión concreta, y cómo se resolvieron las parecidas". El objeto que gobierna es la traza de decisión, que en banca es evidencia de auditoría.</w:t>
+        <w:t xml:space="preserve"> Es el registro de por qué se tomó cada decisión: qué datos había, qué regla se aplicó, qué excepción se concedió, quién aprobó y qué precedente se siguió. Los sistemas del banco guardan el resultado de una decisión, la operación aprobada o el caso derivado, pero no el porqué; y ese porqué es lo que un agente necesita para decidir igual que lo haría la organización, y lo que un supervisor pide cuando pregunta por una decisión concreta. Responde a "qué importa en esta decisión y cómo se resolvieron las parecidas". El objeto que gobierna es la traza de decisión, que en banca es evidencia de auditoría: el registro de eventos del Reglamento de IA y la explicación de una decisión al afectado salen de aquí. Es el término más reciente y el menos estable: lo acuñó un ensayo de Foundation Capital a finales de 2025 y Gartner lo colocó en 2026 en lo alto de su ciclo de expectativas, lo que significa que hay más discurso que despliegues. La consecuencia práctica es no comprar un producto que lleve ese nombre, sino empezar a guardar las trazas con estructura, que es lo que ya hace el registro de peticiones de la vía certificada.</w:t>
       </w:r>
     </w:p>
     <w:p>
@@ -1960,19 +1960,19 @@
     <w:p>
       <w:pPr/>
       <w:r>
-        <w:t xml:space="preserve">Cuatro movimientos definen el año: las definiciones se vuelven portables, la evidencia de que el significado mejora la precisión se consolida, las ontologías empiezan a mantenerse solas, y el grafo de contexto pasa de ensayo a categoría de analista.</w:t>
-      </w:r>
-    </w:p>
-    <w:p>
-      <w:pPr/>
-      <w:r>
-        <w:rPr>
-          <w:b/>
-        </w:rPr>
-        <w:t xml:space="preserve">Portabilidad.</w:t>
-      </w:r>
-      <w:r>
-        <w:t xml:space="preserve"> Open Semantic Interchange nació en septiembre de 2025 impulsado por Snowflake, Salesforce, dbt Labs, BlackRock y RelationalAI, publicó la especificación 1.0 el 27 de enero de 2026 y en junio de 2026 se donó a la Apache Software Foundation. Más de cincuenta organizaciones participan. Es un formato abierto para definir métricas, dimensiones y relaciones una vez y moverlas entre plataformas de BI, datos e IA. A fecha de hoy ningún producto incluye todavía importación y exportación nativa, pero la dirección es clara: las definiciones de un banco dejan de estar atrapadas en una herramienta. Para una entidad que negocia con proveedores de capas semánticas, exigir compatibilidad con este formato es la mejor defensa contra el bloqueo.</w:t>
+        <w:t xml:space="preserve">De lo que se ha movido en 2025 y 2026 hay cuatro cosas que cambian decisiones del banco: un formato abierto para las definiciones, que permite no depender del proveedor; la evidencia sobre qué enfoque acierta, que respalda text-to-metrics; los primeros sistemas en los que la ontología se mantiene sola, que hacen creíble la foto final; y el grafo de contexto, que conviene conocer para no comprarlo antes de tiempo.</w:t>
+      </w:r>
+    </w:p>
+    <w:p>
+      <w:pPr/>
+      <w:r>
+        <w:rPr>
+          <w:b/>
+        </w:rPr>
+        <w:t xml:space="preserve">Un formato abierto para las definiciones.</w:t>
+      </w:r>
+      <w:r>
+        <w:t xml:space="preserve"> El problema que resuelve: cada herramienta de BI y cada plataforma de datos guarda las definiciones de métricas en su propio formato, así que cambiar de herramienta es reescribirlas, y tener dos herramientas es tener dos versiones de cada métrica. Open Semantic Interchange es un formato abierto para escribir métricas, dimensiones y relaciones una sola vez y que cualquier plataforma las lea. Lo impulsaron Snowflake, Salesforce, dbt Labs, BlackRock y RelationalAI en septiembre de 2025, la especificación 1.0 salió en enero de 2026 y en junio de 2026 pasó a la Apache Software Foundation con el nombre de Apache Ossie, con más de cincuenta organizaciones detrás. Todavía ningún producto lo importa y exporta de forma nativa, así que de momento es una promesa. Pero es la única promesa de independencia que existe, y por eso el banco escribe sus YAML en Ossie desde el primer día y debe exigir compatibilidad con ese formato a cualquier proveedor de capa semántica.</w:t>
       </w:r>
     </w:p>
     <w:p>
@@ -2869,9 +2869,20 @@
     <w:p>
       <w:pPr/>
       <w:r>
-        <w:t xml:space="preserve">Más relevante que las cifras es el patrón arquitectónico que emerge de los trabajos de 2026: el modelo de lenguaje planifica y una capa determinista compila. "</w:t>
+        <w:t xml:space="preserve">Más relevante que las cifras es lo que varios trabajos de 2026 muestran sobre dónde está la fiabilidad. Dos ejemplos. En uno, un modelo pequeño, de siete mil millones de parámetros, al que se le imponen las reglas del negocio acierta más que un modelo cuatro veces mayor sin ellas (</w:t>
       </w:r>
       <w:hyperlink r:id="rId24" w:history="1">
+        <w:r>
+          <w:rPr>
+            <w:rStyle w:val="Hyperlink"/>
+          </w:rPr>
+          <w:t xml:space="preserve">Business Truth, not SQL Accuracy</w:t>
+        </w:r>
+      </w:hyperlink>
+      <w:r>
+        <w:t xml:space="preserve">). En otro, el modelo solo elige entre opciones permitidas y un compilador determinista escribe la consulta (</w:t>
+      </w:r>
+      <w:hyperlink r:id="rId25" w:history="1">
         <w:r>
           <w:rPr>
             <w:rStyle w:val="Hyperlink"/>
@@ -2880,18 +2891,7 @@
         </w:r>
       </w:hyperlink>
       <w:r>
-        <w:t xml:space="preserve">" y "</w:t>
-      </w:r>
-      <w:hyperlink r:id="rId25" w:history="1">
-        <w:r>
-          <w:rPr>
-            <w:rStyle w:val="Hyperlink"/>
-          </w:rPr>
-          <w:t xml:space="preserve">Business Truth, not SQL Accuracy</w:t>
-        </w:r>
-      </w:hyperlink>
-      <w:r>
-        <w:t xml:space="preserve">", donde un modelo de 7.000 millones de parámetros con reglas supera a uno de 32.000 millones sin ellas, apuntan a lo mismo. El modelo nunca escribe la consulta final; elige conceptos y métricas aprobadas y un compilador produce el SQL. Para un entorno regulado es el único patrón defendible, porque la consulta que se ejecuta es siempre una que alguien ha aprobado.</w:t>
+        <w:t xml:space="preserve">). La lectura para el banco es la misma en los dos: la fiabilidad viene de las reglas y del compilador, no del tamaño del modelo, así que la inversión va al YAML y a la vía certificada, no a modelos más grandes. Es exactamente el diseño de text-to-metrics, y para un entorno regulado es el único defendible, porque la consulta que se ejecuta es siempre una que alguien ha aprobado.</w:t>
       </w:r>
     </w:p>
     <w:p>
@@ -2903,7 +2903,7 @@
         <w:t xml:space="preserve">Ontologías que se mantienen solas.</w:t>
       </w:r>
       <w:r>
-        <w:t xml:space="preserve"> </w:t>
+        <w:t xml:space="preserve"> El problema que resuelve: una ontología hecha a mano se queda vieja porque nadie tiene tiempo de actualizarla cada vez que cambia un proceso. En septiembre de 2026 se publicó </w:t>
       </w:r>
       <w:hyperlink r:id="rId26" w:history="1">
         <w:r>
@@ -2914,7 +2914,7 @@
         </w:r>
       </w:hyperlink>
       <w:r>
-        <w:t xml:space="preserve">, publicado en septiembre de 2026, construye la ontología con un agente y la hace evolucionar a partir de las trayectorias de ejecución: diagnostica el fallo, lo atribuye a un concepto, propone un parche tipado y lo acepta solo si una evaluación pareada confirma la mejora. Expone la ontología versionada a los agentes a través de MCP. Otro trabajo de 2026 (</w:t>
+        <w:t xml:space="preserve">, un sistema en el que un agente construye la ontología leyendo las fuentes y después la corrige a partir de sus propios fallos: cuando una consulta sale mal, localiza qué concepto faltaba o estaba mal definido, propone el cambio y solo lo incorpora si una prueba demuestra que las consultas mejoran. Otro trabajo del mismo año (</w:t>
       </w:r>
       <w:hyperlink r:id="rId27" w:history="1">
         <w:r>
@@ -2925,7 +2925,7 @@
         </w:r>
       </w:hyperlink>
       <w:r>
-        <w:t xml:space="preserve">) arranca la capa semántica directamente de las consultas ejecutadas. Es la respuesta al problema que las ontologías tradicionales nunca resolvieron: se congelaban porque cambiarlas a mano era inviable.</w:t>
+        <w:t xml:space="preserve">) arranca la capa semántica directamente de las consultas que ya se ejecutan, que es lo mismo que el proceso de construir el YAML desde el log de Teradata descrito en Capa semántica · 0 Concepto. Para el banco son dos cosas: la prueba de que el ciclo «los agentes proponen, las personas aprueban» de la foto final ya se está construyendo fuera, y la advertencia de que en esos sistemas quien acepta el cambio es una prueba automática, mientras que en banca tiene que ser un propietario.</w:t>
       </w:r>
     </w:p>
     <w:p>
@@ -2937,7 +2937,7 @@
         <w:t xml:space="preserve">Grafos de contexto.</w:t>
       </w:r>
       <w:r>
-        <w:t xml:space="preserve"> El ensayo de Foundation Capital de finales de 2025 alcanzó unos cinco millones de lecturas. Neo4j lo reformuló como grafo de conocimiento más trazas de decisión, validez temporal y gobernanza; Arize lo conecta con las trazas de observabilidad de agentes. Gartner lo colocó en 2026 en la cresta del ciclo de expectativas junto con la ingeniería de contexto y MCP, y estima que el 60 % de los proyectos basados solo en MCP fracasarán en 2028 por falta de fundamento semántico. Son predicciones, no despliegues. Lo que sí existe es la idea de que las trazas de los agentes son un activo, no un log, y que un banco que las captura con estructura tiene la evidencia de auditoría hecha.</w:t>
+        <w:t xml:space="preserve"> El concepto nació en un ensayo de Foundation Capital a finales de 2025 y en un año ha pasado a los analistas: Gartner lo sitúa en 2026 en lo alto de su ciclo de expectativas, es decir, donde el discurso va por delante de los despliegues. Lo que sí tiene valor para el banco es la idea de fondo: las trazas de lo que hacen los agentes no son un log que se borra, sino un activo que se guarda con estructura, porque son la evidencia de auditoría que el Reglamento de IA y BCBS 239 piden. El banco ya tiene la primera pieza en el diseño de la vía certificada, el registro inmutable de cada petición con su SQL, su versión y su usuario; el resto se construye por proceso, no se compra.</w:t>
       </w:r>
     </w:p>
     <w:p>
@@ -3837,7 +3837,7 @@
     <w:p>
       <w:pPr/>
       <w:r>
-        <w:t xml:space="preserve">El punto de partida fue el artículo comparativo de Timbr, que este documento sustituye. Las páginas de arXiv, BIS, Neo4j, dbt y Foundation Capital no se pudieron abrir directamente desde el entorno de trabajo; sus datos proceden de resúmenes de búsqueda y fuentes secundarias, y conviene verificarlos antes de citarlos en un documento oficial.</w:t>
+        <w:t xml:space="preserve">Este documento sustituye al artículo comparativo de Timbr que sirvió de punto de partida. Las cifras de los estudios externos proceden de los propios estudios cuando se pudo acceder a ellos y, en los demás casos, de resúmenes y fuentes secundarias; conviene verificarlas antes de citarlas en un documento oficial.</w:t>
       </w:r>
     </w:p>
     <w:p>
@@ -4258,7 +4258,7 @@
           <w:numId w:val="9"/>
         </w:numPr>
       </w:pPr>
-      <w:hyperlink r:id="rId24" w:history="1">
+      <w:hyperlink r:id="rId25" w:history="1">
         <w:r>
           <w:rPr>
             <w:rStyle w:val="Hyperlink"/>
@@ -4275,7 +4275,7 @@
           <w:numId w:val="9"/>
         </w:numPr>
       </w:pPr>
-      <w:hyperlink r:id="rId25" w:history="1">
+      <w:hyperlink r:id="rId24" w:history="1">
         <w:r>
           <w:rPr>
             <w:rStyle w:val="Hyperlink"/>

</xml_diff>

<commit_message>
Set Spanish as default proofing language; byline reads Documento de trabajo
Co-Authored-By: Claude Fable 5.1 <noreply@anthropic.com>
Claude-Session: https://claude.ai/code/session_013A7bCLd4PzhQYG95DagcQd
</commit_message>
<xml_diff>
--- a/docs/Semantica_grafos_agentes_banca.docx
+++ b/docs/Semantica_grafos_agentes_banca.docx
@@ -16,10 +16,7 @@
         <w:t xml:space="preserve">Oct 4, 2026</w:t>
       </w:r>
       <w:r>
-        <w:t xml:space="preserve"> · </w:t>
-      </w:r>
-      <w:r>
-        <w:t xml:space="preserve">@Agustin</w:t>
+        <w:t xml:space="preserve"> · Documento de trabajo</w:t>
       </w:r>
     </w:p>
     <w:p>
@@ -4770,7 +4767,7 @@
         <w:rFonts w:ascii="Calibri" w:hAnsi="Calibri" w:eastAsia="Calibri" w:cs="Calibri"/>
         <w:sz w:val="22"/>
         <w:szCs w:val="22"/>
-        <w:lang w:val="en-US"/>
+        <w:lang w:val="es-ES" w:eastAsia="es-ES" w:bidi="ar-SA"/>
       </w:rPr>
     </w:rPrDefault>
     <w:pPrDefault>

</xml_diff>

<commit_message>
Framework doc: document-family sentence and rewritten Por qué ahora
Co-Authored-By: Claude Fable 5.1 <noreply@anthropic.com>
Claude-Session: https://claude.ai/code/session_013A7bCLd4PzhQYG95DagcQd
</commit_message>
<xml_diff>
--- a/docs/Semantica_grafos_agentes_banca.docx
+++ b/docs/Semantica_grafos_agentes_banca.docx
@@ -48,13 +48,7 @@
     <w:p>
       <w:pPr/>
       <w:r>
-        <w:rPr>
-          <w:b/>
-        </w:rPr>
-        <w:t xml:space="preserve">Familia de documentos.</w:t>
-      </w:r>
-      <w:r>
-        <w:t xml:space="preserve"> Este marco encabeza una familia: por debajo, un documento de concepto por componente y un documento de aplicación por entorno o dominio. El primero existe ya: Capa semántica · 0 Concepto, con sus aplicaciones 1 · Teradata y 2 · Elastic. Todo se inscribe en el plan Dato como Producto, cuyo principio «la IA propone, el sistema compila, la persona firma» es el mismo que recorre este documento.</w:t>
+        <w:t xml:space="preserve">De los cuatro conceptos, el primero, la capa semántica, es el que el banco está construyendo ya, y su desarrollo está en un documento aparte: Capa semántica · 0 Concepto, con un documento de aplicación por entorno. Este marco se queda en lo que los cuatro son, por qué se necesitan juntos y adónde llevan.</w:t>
       </w:r>
     </w:p>
     <w:p>
@@ -68,13 +62,19 @@
     <w:p>
       <w:pPr/>
       <w:r>
-        <w:t xml:space="preserve">Tres cosas coinciden en 2026 y hacen que el significado de los datos deje de ser un tema de BI para convertirse en un tema de riesgo. Primero, los agentes de IA ya consultan datos y actúan sin que un analista revise cada paso. Un analista que obtiene un resultado raro investiga; un agente sigue razonando sobre una base errónea y produce respuestas que parecen autorizadas. Segundo, el calendario regulatorio: las obligaciones del Reglamento de IA para sistemas de alto riesgo entran en vigor el 2 de agosto de 2026, DORA aplica desde enero de 2025, y el Comité de Basilea señaló en enero de 2026 el linaje y la trazabilidad como las áreas donde los bancos siguen sin cumplir BCBS 239 doce años después de su publicación. Tercero, la mayor parte de la información crítica de un banco no está en tablas sino en documentos: expedientes de crédito, contratos marco, políticas internas, actas de comité, correos. Los agentes leen todo eso, y lo que leen necesita el mismo gobierno que lo que consultan en SQL.</w:t>
-      </w:r>
-    </w:p>
-    <w:p>
-      <w:pPr/>
-      <w:r>
-        <w:t xml:space="preserve">El problema de fondo es simple de enunciar. Un banco tiene cientos de definiciones de negocio repartidas entre código, informes, hojas de cálculo y cabezas de personas. "Cliente activo", "exposición", "mora", "grupo económico" se calculan de forma distinta según quién lo haga. Mientras los consumidores eran personas, la discrepancia se detectaba tarde pero se detectaba. Con agentes que generan miles de consultas al día, la discrepancia se propaga a la velocidad de la máquina. El Comité de Basilea lo dijo en su boletín de enero de 2026: la IA hace la gestión de datos más importante, no menos.</w:t>
+        <w:t xml:space="preserve">Tres cosas convergen en 2026. Primera, los agentes de IA ya consultan datos y actúan sin que una persona revise cada paso. Segunda, el calendario regulatorio: las obligaciones del Reglamento de IA para sistemas de alto riesgo entran en vigor el 2 de agosto de 2026, DORA aplica desde enero de 2025, y el Comité de Basilea señaló en enero de 2026 el linaje y la trazabilidad como las áreas donde los bancos siguen sin cumplir BCBS 239 doce años después de su publicación. Tercera, la mayor parte de la información crítica de un banco no está en tablas sino en documentos, expedientes de crédito, contratos marco, políticas internas, actas de comité, correos, y los agentes los leen.</w:t>
+      </w:r>
+    </w:p>
+    <w:p>
+      <w:pPr/>
+      <w:r>
+        <w:t xml:space="preserve">Lo que pasa cuando convergen es esto. Hasta ahora, una definición ambigua o un dato mal calculado se detectaban porque alguien miraba el resultado y le extrañaba; tarde y con esfuerzo, pero se detectaban. Un agente no se extraña: sigue razonando sobre una base errónea y produce una respuesta que parece autorizada, y nadie la revisa, porque ahorrar esa revisión era el motivo de poner un agente. Al mismo tiempo, el supervisor empieza a pedir la explicación de cada decisión justo cuando hay menos personas en el circuito. Y los documentos, que nunca tuvieron el gobierno que tenían las tablas, entran en ese mismo circuito. La conclusión es que el significado de los datos tiene que estar explícito y gobernado antes de que el agente lo use, porque ya no habrá quien lo compruebe después.</w:t>
+      </w:r>
+    </w:p>
+    <w:p>
+      <w:pPr/>
+      <w:r>
+        <w:t xml:space="preserve">El problema de fondo es simple de enunciar. Un banco tiene cientos de definiciones de negocio repartidas entre código, informes, hojas de cálculo y cabezas de personas. "Cliente activo", "exposición", "mora", "grupo económico" se calculan de forma distinta según quién lo haga, y con agentes que generan miles de consultas al día cada discrepancia se repite a la velocidad de la máquina. El Comité de Basilea lo dijo en su boletín de enero de 2026: la IA hace la gestión de datos más importante, no menos.</w:t>
       </w:r>
     </w:p>
     <w:p>

</xml_diff>

<commit_message>
Framework doc: explain why four concepts; ontology with lax sense first; owner-and-version wording
Co-Authored-By: Claude Fable 5.1 <noreply@anthropic.com>
Claude-Session: https://claude.ai/code/session_013A7bCLd4PzhQYG95DagcQd
</commit_message>
<xml_diff>
--- a/docs/Semantica_grafos_agentes_banca.docx
+++ b/docs/Semantica_grafos_agentes_banca.docx
@@ -94,7 +94,7 @@
     <w:p>
       <w:pPr/>
       <w:r>
-        <w:t xml:space="preserve">Los cuatro términos describen funciones distintas sobre los mismos datos, y en la práctica se combinan. Los proveedores los usan de forma inconsistente, y dos de ellos, grafo de contexto y capa semántica basada en ontología, todavía no tienen una definición consolidada. Aquí se describe cada uno por lo que fija y por el objeto que gobierna.</w:t>
+        <w:t xml:space="preserve">Por qué cuatro y no uno. En el entorno gobernado el banco tiene desde hace años una fuente de la verdad estructurada: tablas con definición, dueño y versión. Lo que está apareciendo ahora, y no existía, es una fuente de la verdad para lo no estructurado. Había muchos documentos oficiales, pero saber cuál era la versión vigente de una política exigía preguntar a su dueño, y ningún documento se escribía para que un programa lo entendiera. Esa base para trabajar con documentos se está creando ahora. Un agente tiene que apoyarse en las dos fuentes a la vez, y para eso hacen falta cuatro cosas distintas: una forma de pedir una cifra con definiciones aprobadas (la capa semántica); un acuerdo sobre qué significa cada concepto que valga igual para una tabla y para un documento (la ontología); los datos de las dos fuentes conectados como entidades, un cliente, un contrato, una garantía, con relaciones entre ellas (el grafo de conocimiento); y el registro de qué decidió el agente y por qué (el grafo de contexto). Los proveedores usan estos cuatro términos de forma inconsistente, y dos de ellos, grafo de contexto y capa semántica basada en ontología, todavía no tienen una definición consolidada. Aquí se describe cada uno por lo que fija y por la cosa concreta que debe tener un dueño, una versión y un historial.</w:t>
       </w:r>
     </w:p>
     <w:p>
@@ -106,7 +106,7 @@
         <w:t xml:space="preserve">Capa semántica.</w:t>
       </w:r>
       <w:r>
-        <w:t xml:space="preserve"> Traduce las estructuras técnicas a definiciones de negocio reutilizables: métricas, dimensiones, jerarquías, joins aprobados y lógica de acceso. Responde a "qué significa margen de intereses y cómo se calcula", y es la pieza que un agente usa para pedir una cifra sin escribir SQL. Nace en el mundo del BI, donde cada herramienta tenía la suya. Hoy las plataformas de datos la incorporan de serie (Snowflake y Databricks la publicaron en 2026), lo que resuelve el problema para quien vive en una sola plataforma y lo agrava para quien tiene varias, porque cada una entiende solo sus propias definiciones. Por eso Dato como Producto la define como un activo propio del banco, escrito en un formato abierto y fuera de cualquier herramienta. Una capa de métricas es un subconjunto centrado solo en los indicadores y sus fórmulas. El objeto que gobierna es la definición: quién la aprueba, desde cuándo vale, qué informes la usan.</w:t>
+        <w:t xml:space="preserve"> Traduce las estructuras técnicas a definiciones de negocio reutilizables: métricas, dimensiones, jerarquías, joins aprobados y lógica de acceso. Responde a "qué significa margen de intereses y cómo se calcula", y es la pieza que un agente usa para pedir una cifra sin escribir SQL. Nace en el mundo del BI, donde cada herramienta tenía la suya. Hoy las plataformas de datos la incorporan de serie (Snowflake y Databricks la publicaron en 2026), lo que resuelve el problema para quien vive en una sola plataforma y lo agrava para quien tiene varias, porque cada una entiende solo sus propias definiciones. Por eso Dato como Producto la define como un activo propio del banco, escrito en un formato abierto y fuera de cualquier herramienta. Una capa de métricas es un subconjunto centrado solo en los indicadores y sus fórmulas. Lo que debe tener dueño y versión es la definición: quién la aprueba, desde cuándo vale, qué informes la usan.</w:t>
       </w:r>
     </w:p>
     <w:p>
@@ -118,7 +118,7 @@
         <w:t xml:space="preserve">Ontología.</w:t>
       </w:r>
       <w:r>
-        <w:t xml:space="preserve"> Es el modelo que fija qué es cada concepto del negocio y cómo se relaciona con los demás: qué es un cliente, en qué se diferencia de un titular o de una cuenta, cómo se vincula a un contrato y a un grupo económico, y qué reglas valen entre ellos. No responde preguntas en tiempo de ejecución: a ella acuden las piezas que sí responden, la capa semántica cuando compila una métrica, el grafo cuando recorre relaciones y el agente cuando lee la ficha de una métrica. Por eso recoge la definición del concepto, mientras que la definición de cómo se calcula una métrica vive en la capa semántica. El término tiene dos sentidos. El formal viene de la web semántica, la iniciativa del W3C de principios de los 2000 que creó RDF, OWL y SPARQL para que las máquinas leyeran contenido: en ese sentido una ontología es una especificación con clases, propiedades y axiomas sobre la que un motor deduce hechos nuevos, como que un contrato secundario hereda condiciones del principal aunque nadie lo haya escrito en una tabla. El laxo, habitual en software empresarial, es un modelo conceptual explícito del negocio, con dueño y versión, en el formato que se tenga. Para el banco, hoy, el sentido que importa es el laxo, y ya existe en forma embrionaria en los YAML de la capa semántica: entidades de negocio, relaciones, conceptos y reglas. El formal solo importará si algún día se quiere que una máquina infiera, y ese es justo el caso que en banca se convierte en decisión gobernada. FIBO, la ontología de referencia del sector mantenida por el EDM Council, es extensa y de adopción parcial: sirve como vocabulario al que alinear nombres, no como ontología a implementar.</w:t>
+        <w:t xml:space="preserve"> Es el modelo que fija qué es cada concepto del negocio y cómo se relaciona con los demás: qué es un cliente, en qué se diferencia de un titular o de una cuenta, cómo se vincula a un contrato y a un grupo económico, y qué reglas valen entre ellos. No responde preguntas en tiempo de ejecución: a ella acuden las piezas que sí responden, la capa semántica cuando compila una métrica, el grafo cuando recorre relaciones y el agente cuando lee la ficha de una métrica. Recoge la definición del concepto; la de cómo se calcula una métrica vive en la capa semántica. El término tiene dos sentidos. Uno formal, ligado a una tecnología de los años 2000, la web semántica, en la que la ontología se escribe en un lenguaje propio para que un programa deduzca hechos nuevos a partir de las reglas. Y otro laxo, que es el que se usa normalmente hoy: un modelo conceptual explícito del negocio, con sus entidades, relaciones y reglas, con dueño y versión, escrito en el formato que se tenga. Es este segundo el que se usa en este documento. Y conviene ver que una ontología así está implícita en cualquier entorno de datos gobernado: un diccionario de datos con entidades, claves y relaciones es ya una ontología sin nombre. Por eso la capa semántica del banco la lleva dentro, en sus YAML (entidades de negocio, relaciones, conceptos, valores válidos y reglas), y hacerla explícita es ordenar lo que ya hay, no empezar de cero. El sentido formal solo importa si algún día se quiere que una máquina infiera clasificaciones por sí sola, y ese caso en banca es una decisión automatizada que hay que gobernar como un modelo. FIBO, la ontología de referencia del sector mantenida por el EDM Council, sirve como vocabulario al que alinear nombres, no como ontología a implementar.</w:t>
       </w:r>
     </w:p>
     <w:p>
@@ -130,7 +130,7 @@
         <w:t xml:space="preserve">Grafo de conocimiento.</w:t>
       </w:r>
       <w:r>
-        <w:t xml:space="preserve"> Es la ontología instanciada con datos reales: entidades concretas conectadas por relaciones que se pueden recorrer. Responde a "qué entidades están relacionadas con este cliente y por qué caminos". Es la estructura natural para preguntas de varios saltos, las que en SQL exigen encadenar joins que nadie quiere escribir: concentración de riesgo a través de grupos económicos, redes de blanqueo, cadenas de garantías. Puede materializarse en una base de datos de grafos o virtualizarse sobre SQL, compilando los recorridos a consultas sobre las tablas existentes. La virtualización evita mover datos y hereda el control de acceso del almacén, y basta para navegar conceptos y métricas; pero no ofrece los algoritmos de grafo que detectan grupos de entidades muy conectadas entre sí o las entidades por las que pasan más relaciones, que son los que hacen falta para blanqueo y concentraciones ocultas, y eso exige un motor de grafos dedicado. El objeto que gobierna es la entidad resuelta: que el cliente 4711 del core, el 88-A del CRM y el firmante del contrato escaneado sean la misma persona.</w:t>
+        <w:t xml:space="preserve"> Es la ontología instanciada con datos reales: entidades concretas conectadas por relaciones que se pueden recorrer. Responde a "qué entidades están relacionadas con este cliente y por qué caminos". Es la estructura natural para preguntas de varios saltos, las que en SQL exigen encadenar joins que nadie quiere escribir: concentración de riesgo a través de grupos económicos, redes de blanqueo, cadenas de garantías. Puede materializarse en una base de datos de grafos o virtualizarse sobre SQL, compilando los recorridos a consultas sobre las tablas existentes. La virtualización evita mover datos y hereda el control de acceso del almacén, y basta para navegar conceptos y métricas; pero no ofrece los algoritmos de grafo que detectan grupos de entidades muy conectadas entre sí o las entidades por las que pasan más relaciones, que son los que hacen falta para blanqueo y concentraciones ocultas, y eso exige un motor de grafos dedicado. Lo que debe tener dueño y versión es la entidad resuelta: que el cliente 4711 del core, el 88-A del CRM y el firmante del contrato escaneado sean la misma persona.</w:t>
       </w:r>
     </w:p>
     <w:p>
@@ -142,7 +142,7 @@
         <w:t xml:space="preserve">Grafo de contexto.</w:t>
       </w:r>
       <w:r>
-        <w:t xml:space="preserve"> Es el registro de por qué se tomó cada decisión: qué datos había, qué regla se aplicó, qué excepción se concedió, quién aprobó y qué precedente se siguió. Los sistemas del banco guardan el resultado de una decisión, la operación aprobada o el caso derivado, pero no el porqué; y ese porqué es lo que un agente necesita para decidir igual que lo haría la organización, y lo que un supervisor pide cuando pregunta por una decisión concreta. Responde a "qué importa en esta decisión y cómo se resolvieron las parecidas". El objeto que gobierna es la traza de decisión, que en banca es evidencia de auditoría: el registro de eventos del Reglamento de IA y la explicación de una decisión al afectado salen de aquí. Es el término más reciente y el menos estable: lo acuñó un ensayo de Foundation Capital a finales de 2025 y Gartner lo colocó en 2026 en lo alto de su ciclo de expectativas, lo que significa que hay más discurso que despliegues. La consecuencia práctica es no comprar un producto que lleve ese nombre, sino empezar a guardar las trazas con estructura, que es lo que ya hace el registro de peticiones de la vía certificada.</w:t>
+        <w:t xml:space="preserve"> Es el registro de por qué se tomó cada decisión: qué datos había, qué regla se aplicó, qué excepción se concedió, quién aprobó y qué precedente se siguió. Los sistemas del banco guardan el resultado de una decisión, la operación aprobada o el caso derivado, pero no el porqué; y ese porqué es lo que un agente necesita para decidir igual que lo haría la organización, y lo que un supervisor pide cuando pregunta por una decisión concreta. Responde a "qué importa en esta decisión y cómo se resolvieron las parecidas". Lo que debe tener dueño y versión es la traza de decisión, que en banca es evidencia de auditoría: el registro de eventos del Reglamento de IA y la explicación de una decisión al afectado salen de aquí. Es el término más reciente y el menos estable: lo acuñó un ensayo de Foundation Capital a finales de 2025 y Gartner lo colocó en 2026 en lo alto de su ciclo de expectativas, lo que significa que hay más discurso que despliegues. La consecuencia práctica es no comprar un producto que lleve ese nombre, sino empezar a guardar las trazas con estructura, que es lo que ya hace el registro de peticiones de la vía certificada.</w:t>
       </w:r>
     </w:p>
     <w:p>
@@ -207,7 +207,7 @@
           <w:p>
             <w:pPr/>
             <w:r>
-              <w:t xml:space="preserve">Objeto gobernado</w:t>
+              <w:t xml:space="preserve">Qué debe tener dueño y versión</w:t>
             </w:r>
           </w:p>
         </w:tc>

</xml_diff>

<commit_message>
Framework doc: plainer knowledge-graph paragraph, procedure-manual example, drop context-layer note
Co-Authored-By: Claude Fable 5.1 <noreply@anthropic.com>
Claude-Session: https://claude.ai/code/session_013A7bCLd4PzhQYG95DagcQd
</commit_message>
<xml_diff>
--- a/docs/Semantica_grafos_agentes_banca.docx
+++ b/docs/Semantica_grafos_agentes_banca.docx
@@ -130,7 +130,7 @@
         <w:t xml:space="preserve">Grafo de conocimiento.</w:t>
       </w:r>
       <w:r>
-        <w:t xml:space="preserve"> Es la ontología instanciada con datos reales: entidades concretas conectadas por relaciones que se pueden recorrer. Responde a "qué entidades están relacionadas con este cliente y por qué caminos". Es la estructura natural para preguntas de varios saltos, las que en SQL exigen encadenar joins que nadie quiere escribir: concentración de riesgo a través de grupos económicos, redes de blanqueo, cadenas de garantías. Puede materializarse en una base de datos de grafos o virtualizarse sobre SQL, compilando los recorridos a consultas sobre las tablas existentes. La virtualización evita mover datos y hereda el control de acceso del almacén, y basta para navegar conceptos y métricas; pero no ofrece los algoritmos de grafo que detectan grupos de entidades muy conectadas entre sí o las entidades por las que pasan más relaciones, que son los que hacen falta para blanqueo y concentraciones ocultas, y eso exige un motor de grafos dedicado. Lo que debe tener dueño y versión es la entidad resuelta: que el cliente 4711 del core, el 88-A del CRM y el firmante del contrato escaneado sean la misma persona.</w:t>
+        <w:t xml:space="preserve"> Es la ontología instanciada con datos reales: entidades concretas, un cliente, un contrato, una garantía, conectadas por relaciones que se pueden recorrer. Responde a "qué entidades están relacionadas con este cliente y por qué caminos". Es la estructura natural para preguntas de varios saltos, las que en SQL exigen encadenar joins que nadie quiere escribir: concentración de riesgo a través de grupos económicos, redes de blanqueo, cadenas de garantías. Hay dos formas de tenerlo. La primera es dibujar el grafo sobre las tablas que ya existen, sin copiar nada: los datos se quedan donde están, los permisos son los del almacén, y basta para navegar conceptos, productos y métricas y para unir una tabla con otra por la relación correcta. La segunda es copiar las entidades y sus relaciones a una base de datos de grafos. Hace falta cuando la pregunta no es sobre un cliente sino sobre la forma de la red: qué clientes están unidos entre sí por avalistas o cuentas compartidas aunque nadie los haya declarado grupo, o qué sociedad aparece en medio de muchas operaciones sin ser titular de ninguna. Eso es lo que necesitan blanqueo y las concentraciones ocultas, y no se puede calcular sobre tablas. Lo que debe tener dueño y versión es la entidad resuelta: que el cliente 4711 del core, el 88-A del CRM y el firmante del contrato escaneado sean la misma persona.</w:t>
       </w:r>
     </w:p>
     <w:p>
@@ -143,18 +143,6 @@
       </w:r>
       <w:r>
         <w:t xml:space="preserve"> Es el registro de por qué se tomó cada decisión: qué datos había, qué regla se aplicó, qué excepción se concedió, quién aprobó y qué precedente se siguió. Los sistemas del banco guardan el resultado de una decisión, la operación aprobada o el caso derivado, pero no el porqué; y ese porqué es lo que un agente necesita para decidir igual que lo haría la organización, y lo que un supervisor pide cuando pregunta por una decisión concreta. Responde a "qué importa en esta decisión y cómo se resolvieron las parecidas". Lo que debe tener dueño y versión es la traza de decisión, que en banca es evidencia de auditoría: el registro de eventos del Reglamento de IA y la explicación de una decisión al afectado salen de aquí. Es el término más reciente y el menos estable: lo acuñó un ensayo de Foundation Capital a finales de 2025 y Gartner lo colocó en 2026 en lo alto de su ciclo de expectativas, lo que significa que hay más discurso que despliegues. La consecuencia práctica es no comprar un producto que lleve ese nombre, sino empezar a guardar las trazas con estructura, que es lo que ya hace el registro de peticiones de la vía certificada.</w:t>
-      </w:r>
-    </w:p>
-    <w:p>
-      <w:pPr/>
-      <w:r>
-        <w:rPr>
-          <w:b/>
-        </w:rPr>
-        <w:t xml:space="preserve">Dos términos parecidos que conviene distinguir.</w:t>
-      </w:r>
-      <w:r>
-        <w:t xml:space="preserve"> La capa de contexto es el conjunto de piezas que fundamenta a los agentes: capa semántica, ontología, grafo de conocimiento y, si lo hay, almacén vectorial. El grafo de contexto es una de esas piezas, la que registra las trazas de decisión. Es el sentido que usan Foundation Capital, Neo4j y Gartner, y el que se usa aquí.</w:t>
       </w:r>
     </w:p>
     <w:tbl>
@@ -503,7 +491,7 @@
     <w:p>
       <w:pPr/>
       <w:r>
-        <w:t xml:space="preserve">La relación entre ellos no es una pila. La ontología es el modelo; la capa semántica y el grafo de conocimiento son dos vistas de ese modelo, una orientada a métricas y otra a entidades; el grafo de contexto añade tiempo y decisión sobre cualquiera de las dos. Un banco puede tener una capa semántica madura sin ontología formal, o un grafo de conocimiento para sanciones sin capa semántica para finanzas. Lo que no puede tener es un agente fiable sin que las cuatro funciones existan de alguna forma.</w:t>
+        <w:t xml:space="preserve">La relación entre ellos no es una pila. La ontología es el modelo; la capa semántica y el grafo de conocimiento son dos vistas de ese modelo, una orientada a métricas y otra a entidades; el grafo de contexto añade tiempo y decisión sobre cualquiera de las dos. Por eso pueden existir por separado. Un banco puede tener una capa semántica madura sin haber escrito nunca una ontología. Y puede tener un grafo de conocimiento donde no hay capa semántica porque no hay datos que consultar: por ejemplo, el construido a partir de los manuales de procedimiento, que describen procesos (quién autoriza qué, en qué orden, con qué excepciones) de los que no existe ninguna tabla explotable. Lo que no puede tener es un agente fiable sin que las cuatro funciones existan de alguna forma.</w:t>
       </w:r>
     </w:p>
     <w:p>
@@ -3406,7 +3394,7 @@
           <w:p>
             <w:pPr/>
             <w:r>
-              <w:t xml:space="preserve">Grafo de entidades de negocio con procedencia para un dominio (grupos económicos, sanciones, demandas)</w:t>
+              <w:t xml:space="preserve">Grafo de entidades de negocio con procedencia para un dominio (grupos económicos, listas de sancionados, demandas judiciales)</w:t>
             </w:r>
           </w:p>
         </w:tc>

</xml_diff>

<commit_message>
Framework doc: drop the hypothetical inference-rule consequence
Co-Authored-By: Claude Fable 5.1 <noreply@anthropic.com>
Claude-Session: https://claude.ai/code/session_013A7bCLd4PzhQYG95DagcQd
</commit_message>
<xml_diff>
--- a/docs/Semantica_grafos_agentes_banca.docx
+++ b/docs/Semantica_grafos_agentes_banca.docx
@@ -118,7 +118,7 @@
         <w:t xml:space="preserve">Ontología.</w:t>
       </w:r>
       <w:r>
-        <w:t xml:space="preserve"> Es el modelo que fija qué es cada concepto del negocio y cómo se relaciona con los demás: qué es un cliente, en qué se diferencia de un titular o de una cuenta, cómo se vincula a un contrato y a un grupo económico, y qué reglas valen entre ellos. No responde preguntas en tiempo de ejecución: a ella acuden las piezas que sí responden, la capa semántica cuando compila una métrica, el grafo cuando recorre relaciones y el agente cuando lee la ficha de una métrica. Recoge la definición del concepto; la de cómo se calcula una métrica vive en la capa semántica. El término tiene dos sentidos. Uno formal, ligado a una tecnología de los años 2000, la web semántica, en la que la ontología se escribe en un lenguaje propio para que un programa deduzca hechos nuevos a partir de las reglas. Y otro laxo, que es el que se usa normalmente hoy: un modelo conceptual explícito del negocio, con sus entidades, relaciones y reglas, con dueño y versión, escrito en el formato que se tenga. Es este segundo el que se usa en este documento. Y conviene ver que una ontología así está implícita en cualquier entorno de datos gobernado: un diccionario de datos con entidades, claves y relaciones es ya una ontología sin nombre. Por eso la capa semántica del banco la lleva dentro, en sus YAML (entidades de negocio, relaciones, conceptos, valores válidos y reglas), y hacerla explícita es ordenar lo que ya hay, no empezar de cero. El sentido formal solo importa si algún día se quiere que una máquina infiera clasificaciones por sí sola, y ese caso en banca es una decisión automatizada que hay que gobernar como un modelo. FIBO, la ontología de referencia del sector mantenida por el EDM Council, sirve como vocabulario al que alinear nombres, no como ontología a implementar.</w:t>
+        <w:t xml:space="preserve"> Es el modelo que fija qué es cada concepto del negocio y cómo se relaciona con los demás: qué es un cliente, en qué se diferencia de un titular o de una cuenta, cómo se vincula a un contrato y a un grupo económico, y qué reglas valen entre ellos. No responde preguntas en tiempo de ejecución: a ella acuden las piezas que sí responden, la capa semántica cuando compila una métrica, el grafo cuando recorre relaciones y el agente cuando lee la ficha de una métrica. Recoge la definición del concepto; la de cómo se calcula una métrica vive en la capa semántica. El término tiene dos sentidos. Uno formal, ligado a una tecnología de los años 2000, la web semántica, en la que la ontología se escribe en un lenguaje propio para que un programa deduzca hechos nuevos a partir de las reglas. Y otro laxo, que es el que se usa normalmente hoy: un modelo conceptual explícito del negocio, con sus entidades, relaciones y reglas, con dueño y versión, escrito en el formato que se tenga. Es este segundo el que se usa en este documento. Y conviene ver que una ontología así está implícita en cualquier entorno de datos gobernado: un diccionario de datos con entidades, claves y relaciones es ya una ontología sin nombre. Por eso la capa semántica del banco la lleva dentro, en sus YAML (entidades de negocio, relaciones, conceptos, valores válidos y reglas), y hacerla explícita es ordenar lo que ya hay, no empezar de cero. El sentido formal queda fuera de este documento. FIBO, la ontología de referencia del sector mantenida por el EDM Council, sirve como vocabulario al que alinear nombres, no como ontología a implementar.</w:t>
       </w:r>
     </w:p>
     <w:p>
@@ -733,7 +733,7 @@
           <w:p>
             <w:pPr/>
             <w:r>
-              <w:t xml:space="preserve">Grafo de contexto (traza de decisión con fecha), grafo de conocimiento bitemporal (qué se sabía cuándo), ontología (reglas de inferencia explícitas y versionadas)</w:t>
+              <w:t xml:space="preserve">Grafo de contexto (traza de decisión con fecha) y grafo de conocimiento con fechas de validez (qué se sabía cuándo)</w:t>
             </w:r>
           </w:p>
         </w:tc>
@@ -900,7 +900,7 @@
           <w:p>
             <w:pPr/>
             <w:r>
-              <w:t xml:space="preserve">Toda regla de inferencia ontológica y todo pipeline de extracción de documentos es un modelo: necesita el mismo tratamiento</w:t>
+              <w:t xml:space="preserve">Todo pipeline que extrae datos de documentos con un modelo es un modelo más: necesita el mismo tratamiento</w:t>
             </w:r>
           </w:p>
         </w:tc>
@@ -909,7 +909,7 @@
     <w:p>
       <w:pPr/>
       <w:r>
-        <w:t xml:space="preserve">Dos consecuencias prácticas. La primera es que un banco no parte de cero: el inventario de elementos críticos de datos de BCBS 239, el diccionario de datos y la taxonomía de grupo que pide el BCE son la semilla de la capa semántica. Esa capa lleva dentro una ontología informal, las entidades, relaciones y reglas que declaran sus YAML, que más adelante se puede formalizar si hace falta. La segunda afecta a las reglas de inferencia. Si una regla de la ontología clasifica a un cliente como de alto riesgo sin que nadie lo haya escrito en una tabla, esa clasificación es una decisión automatizada: el Reglamento de IA y la gestión de riesgo de modelo exigen poder explicarla, saber qué versión de la regla la produjo y tener a alguien que la supervise. Por eso una regla de inferencia se trata como un modelo más, con su validación y su propietario, antes de activarla.</w:t>
+        <w:t xml:space="preserve">Una consecuencia práctica: un banco no parte de cero. El inventario de elementos críticos de datos de BCBS 239, el diccionario de datos y la taxonomía de grupo que pide el BCE son la semilla de la capa semántica, y esa capa lleva dentro una ontología informal, las entidades, relaciones y reglas que declaran sus YAML, que más adelante se puede formalizar si hace falta.</w:t>
       </w:r>
     </w:p>
     <w:p>
@@ -3062,7 +3062,7 @@
         <w:t xml:space="preserve">La organización que resulta.</w:t>
       </w:r>
       <w:r>
-        <w:t xml:space="preserve"> Cambian tres cosas. Los roles: aparece el propietario de concepto como figura de negocio con autoridad real, el equipo de datos pasa de construir informes a gobernar un repositorio de significado, y riesgo de modelo extiende su alcance a las reglas de inferencia y a los pipelines de extracción. Los procesos: el cambio semántico se gestiona como el cambio de software, con propuesta, revisión, pruebas de impacto y despliegue con fecha. La relación con el supervisor: de demostrar control con documentos a demostrarlo con el sistema. Es una organización que aprende de sus propias decisiones porque las guarda con estructura, y que puede cambiar de proveedor de plataforma sin perder su significado porque lo tiene en un formato que no pertenece a nadie.</w:t>
+        <w:t xml:space="preserve"> Cambian tres cosas. Los roles: aparece el propietario de concepto como figura de negocio con autoridad real, el equipo de datos pasa de construir informes a gobernar un repositorio de significado, y riesgo de modelo extiende su alcance a los pipelines de extracción de documentos. Los procesos: el cambio semántico se gestiona como el cambio de software, con propuesta, revisión, pruebas de impacto y despliegue con fecha. La relación con el supervisor: de demostrar control con documentos a demostrarlo con el sistema. Es una organización que aprende de sus propias decisiones porque las guarda con estructura, y que puede cambiar de proveedor de plataforma sin perder su significado porque lo tiene en un formato que no pertenece a nadie.</w:t>
       </w:r>
     </w:p>
     <w:p>
@@ -3315,7 +3315,7 @@
           <w:p>
             <w:pPr/>
             <w:r>
-              <w:t xml:space="preserve">Reglas de inferencia gobernadas como modelos; documentos extraídos a sus conceptos</w:t>
+              <w:t xml:space="preserve">Documentos extraídos a los conceptos de la ontología, con procedencia</w:t>
             </w:r>
           </w:p>
         </w:tc>

</xml_diff>

<commit_message>
Framework doc: reorganise the middle into two paths (structured, documents) and the bridge between them
Co-Authored-By: Claude Fable 5.1 <noreply@anthropic.com>
Claude-Session: https://claude.ai/code/session_013A7bCLd4PzhQYG95DagcQd
</commit_message>
<xml_diff>
--- a/docs/Semantica_grafos_agentes_banca.docx
+++ b/docs/Semantica_grafos_agentes_banca.docx
@@ -917,87 +917,27 @@
         <w:pStyle w:val="Heading2"/>
       </w:pPr>
       <w:r>
-        <w:t xml:space="preserve">Dato estructurado y no estructurado</w:t>
-      </w:r>
-    </w:p>
-    <w:p>
-      <w:pPr/>
-      <w:r>
-        <w:t xml:space="preserve">La ontología es el contrato entre las dos familias de datos. Un contrato de préstamo en PDF y el registro del préstamo en el core bancario son dos manifestaciones del mismo concepto, "contrato de préstamo", con los mismos atributos: importe, tipo, vencimiento, garantías, firmantes. Si el concepto está definido una vez, el documento se puede extraer a esa estructura y conciliar con el registro. Si no lo está, el documento se queda en un índice vectorial que devuelve fragmentos parecidos a la pregunta, sin saber a qué cliente, contrato o cuenta pertenecen.</w:t>
-      </w:r>
-    </w:p>
-    <w:p>
-      <w:pPr/>
-      <w:r>
-        <w:t xml:space="preserve">El punto de encuentro es el grafo de conocimiento con procedencia. Cada hecho del grafo lleva dos enlaces hacia atrás: a la tabla y campo del sistema origen si viene de datos estructurados, o al documento, página y fragmento si viene de extracción. Esa procedencia es exactamente el linaje a nivel de campo que BCBS 239 pide y que el Comité de Basilea sigue echando en falta en 2026. Y es lo que permite responder a un supervisor "de dónde sale este dato" con un enlace en lugar de con una reconstrucción.</w:t>
-      </w:r>
-    </w:p>
-    <w:p>
-      <w:pPr/>
-      <w:r>
-        <w:rPr>
-          <w:b/>
-        </w:rPr>
-        <w:t xml:space="preserve">Por qué hacen falta tres formas de combinarlos.</w:t>
-      </w:r>
-      <w:r>
-        <w:t xml:space="preserve"> Un agente del banco recibe tres tipos de pregunta sobre documentos, y cada tipo exige una forma distinta de juntar lo estructurado con lo no estructurado. Confundirlas es la causa más frecuente de que un piloto con documentos funcione en la demostración y falle en producción.</w:t>
-      </w:r>
-    </w:p>
-    <w:p>
-      <w:pPr/>
-      <w:r>
-        <w:rPr>
-          <w:b/>
-        </w:rPr>
-        <w:t xml:space="preserve">Preguntas que piden una cifra que solo está en documentos.</w:t>
-      </w:r>
-      <w:r>
-        <w:t xml:space="preserve"> «¿Cuántos contratos tienen cláusula de vencimiento anticipado?», «¿qué exposición total hay bajo garantías de un mismo garante?». No se responden leyendo: hay que contar o sumar sobre cientos de contratos. La forma de hacerlo es extraer primero y consultar después. Un modelo lee cada documento y rellena los atributos que la ontología define para ese tipo de documento; cada hecho se guarda en una tabla o en el grafo con un enlace al fragmento del que salió; y la cifra la calcula el compilador de métricas por la vía certificada, igual que si el dato viniera del core. Lo que gana el banco: el hecho extraído pasa a ser un dato más, con linaje hasta el documento, y la cifra sale por la misma vía determinista que cualquier otra. Eso es lo que BCBS 239 y la guía del BCE piden para un dato de riesgo, aunque su origen sea un PDF. Palantir lo vende como producto desde febrero de 2026 con AIP Document Intelligence, y la literatura lo llama «Structure then Query».</w:t>
-      </w:r>
-    </w:p>
-    <w:p>
-      <w:pPr/>
-      <w:r>
-        <w:rPr>
-          <w:b/>
-        </w:rPr>
-        <w:t xml:space="preserve">Preguntas que piden leer el documento correcto.</w:t>
-      </w:r>
-      <w:r>
-        <w:t xml:space="preserve"> «¿Qué dice la política vigente sobre este caso?», «¿qué cláusula aplica a este contrato?». Aquí no hay cifra: hay que encontrar el párrafo adecuado. La búsqueda por vectores lo hace bien cuando la pregunta y el párrafo se parecen, y mal en tres situaciones habituales en banca: cuando la norma remite a otra, cuando hay varias versiones y solo una está en vigor, y cuando el usuario no tiene permiso para ver parte de los documentos. La forma de hacerlo es combinar: el grafo decide qué documentos son los relevantes (los de esta entidad, en la versión vigente a esa fecha, los que este usuario puede ver) y el vector localiza el párrafo dentro de ellos. Lo que gana el banco: la respuesta cita un documento concreto en su versión vigente y respeta los permisos, que es lo que exige el Reglamento de IA para poder reconstruir qué información tenía el sistema al responder. Un trabajo de abril de 2026 sobre el Code of Federal Regulations mide una mejora del 70 % sobre la búsqueda vectorial sola precisamente en preguntas con referencias cruzadas y normas derogadas. Los vectores, en resumen, son motores de coincidencia difusa: localizan el párrafo que habla de algo, pero no dan el dato exacto; el vector localiza y la estructura responde.</w:t>
-      </w:r>
-    </w:p>
-    <w:p>
-      <w:pPr/>
-      <w:r>
-        <w:rPr>
-          <w:b/>
-        </w:rPr>
-        <w:t xml:space="preserve">Preguntas que piden comprobar una decisión contra la norma.</w:t>
-      </w:r>
-      <w:r>
-        <w:t xml:space="preserve"> «¿Esta operación cumple la política de blanqueo?», «¿esta excepción de precio está dentro de lo autorizado?». Ni cifra ni lectura: una comprobación. La forma de hacerlo es convertir la norma en una lista estructurada de obligaciones y condiciones, y contrastar contra ella los datos de la operación. La salida no es solo sí o no, sino la explicación: qué regla se aplicó y con qué datos. Lo que gana el banco: la explicación de cumplimiento que el supervisor pide en monitorización de transacciones se genera en el momento, y la traza de la decisión queda registrada en el grafo de contexto. Lo describen los trabajos GraphCompliance y el de grafos regulatorios para monitorización de transacciones.</w:t>
-      </w:r>
-    </w:p>
-    <w:p>
-      <w:pPr/>
-      <w:r>
-        <w:rPr>
-          <w:b/>
-        </w:rPr>
-        <w:t xml:space="preserve">Lo que tienen en común y lo que hay que vigilar.</w:t>
-      </w:r>
-      <w:r>
-        <w:t xml:space="preserve"> En los tres casos un modelo produce datos: atributos extraídos, documentos seleccionados, reglas aplicadas. Un dato producido por un modelo puede estar mal, y en banca eso tiene tres consecuencias prácticas. Primera, cada hecho extraído lleva una medida de confianza y la versión del modelo que lo produjo, se valida por muestreo, y el pipeline de extracción entra en el marco de riesgo de modelo como cualquier otro modelo. Segunda, el vínculo entre el documento y el registro estructurado, que el firmante del contrato escaneado sea el titular del core, es también una decisión con margen de error y necesita su propia validación. Tercera, los embeddings y los logs de consulta contienen datos personales aunque la tabla de origen esté enmascarada: el enmascarado se aplica en el momento en que el contexto llega al modelo, no solo en la fuente.</w:t>
-      </w:r>
-    </w:p>
-    <w:p>
-      <w:pPr>
-        <w:pStyle w:val="Heading2"/>
-      </w:pPr>
-      <w:r>
-        <w:t xml:space="preserve">Cifras y relaciones: capa de métricas frente a grafos</w:t>
+        <w:t xml:space="preserve">Cómo responde un agente: dos vías según dónde está el dato</w:t>
+      </w:r>
+    </w:p>
+    <w:p>
+      <w:pPr/>
+      <w:r>
+        <w:t xml:space="preserve">Todo lo que un agente responde sale de uno de dos sitios: de un almacén de datos estructurados, donde la pregunta se convierte en una consulta, o de documentos, donde la pregunta se convierte en una lectura. Las dos vías tienen opciones distintas, riesgos distintos y evidencia distinta sobre lo que aciertan. Y entre las dos hay un puente que es una decisión del banco: qué datos de los documentos se convierten en estructurados y cuáles se quedan como texto.</w:t>
+      </w:r>
+    </w:p>
+    <w:p>
+      <w:pPr>
+        <w:pStyle w:val="Heading3"/>
+      </w:pPr>
+      <w:r>
+        <w:t xml:space="preserve">Vía 1 · Sobre datos estructurados: hay un almacén detrás</w:t>
+      </w:r>
+    </w:p>
+    <w:p>
+      <w:pPr/>
+      <w:r>
+        <w:t xml:space="preserve">Cuando el dato está en tablas, la pregunta es quién escribe la consulta y con qué ayuda. Las opciones, de menos a más control: que el LLM escriba SQL viendo solo el esquema; que lo escriba con las definiciones de negocio delante, el contexto semántico; que consulte conceptos en un grafo con ontología y el grafo traduzca a SQL; que un grafo del esquema le diga qué tablas unir; o que el LLM no escriba la consulta y solo elija métrica, dimensiones y fecha para que un compilador la genere, text-to-metrics. El banco ha elegido la última para la vía certificada y mantiene la segunda como vía exploratoria; el porqué está en Capa semántica · 0 Concepto. Lo que sigue explica qué aportan los grafos en esta vía y qué dice la evidencia.</w:t>
       </w:r>
     </w:p>
     <w:p>
@@ -1935,32 +1875,6 @@
       </w:r>
     </w:p>
     <w:p>
-      <w:pPr>
-        <w:pStyle w:val="Heading2"/>
-      </w:pPr>
-      <w:r>
-        <w:t xml:space="preserve">Estado del arte en 2026</w:t>
-      </w:r>
-    </w:p>
-    <w:p>
-      <w:pPr/>
-      <w:r>
-        <w:t xml:space="preserve">De lo que se ha movido en 2025 y 2026 hay cuatro cosas que cambian decisiones del banco: un formato abierto para las definiciones, que permite no depender del proveedor; la evidencia sobre qué enfoque acierta, que respalda text-to-metrics; los primeros sistemas en los que la ontología se mantiene sola, que hacen creíble la foto final; y el grafo de contexto, que conviene conocer para no comprarlo antes de tiempo.</w:t>
-      </w:r>
-    </w:p>
-    <w:p>
-      <w:pPr/>
-      <w:r>
-        <w:rPr>
-          <w:b/>
-        </w:rPr>
-        <w:t xml:space="preserve">Un formato abierto para las definiciones.</w:t>
-      </w:r>
-      <w:r>
-        <w:t xml:space="preserve"> El problema que resuelve: cada herramienta de BI y cada plataforma de datos guarda las definiciones de métricas en su propio formato, así que cambiar de herramienta es reescribirlas, y tener dos herramientas es tener dos versiones de cada métrica. Open Semantic Interchange es un formato abierto para escribir métricas, dimensiones y relaciones una sola vez y que cualquier plataforma las lea. Lo impulsaron Snowflake, Salesforce, dbt Labs, BlackRock y RelationalAI en septiembre de 2025, la especificación 1.0 salió en enero de 2026 y en junio de 2026 pasó a la Apache Software Foundation con el nombre de Apache Ossie, con más de cincuenta organizaciones detrás. Todavía ningún producto lo importa y exporta de forma nativa, así que de momento es una promesa. Pero es la única promesa de independencia que existe, y por eso el banco escribe sus YAML en Ossie desde el primer día y debe exigir compatibilidad con ese formato a cualquier proveedor de capa semántica.</w:t>
-      </w:r>
-    </w:p>
-    <w:p>
       <w:pPr/>
       <w:r>
         <w:rPr>
@@ -2880,6 +2794,184 @@
       </w:r>
     </w:p>
     <w:p>
+      <w:pPr>
+        <w:pStyle w:val="Heading3"/>
+      </w:pPr>
+      <w:r>
+        <w:t xml:space="preserve">Vía 2 · Sobre documentos: no hay almacén, o todavía no</w:t>
+      </w:r>
+    </w:p>
+    <w:p>
+      <w:pPr/>
+      <w:r>
+        <w:t xml:space="preserve">Cuando el dato está en documentos no hay consulta que compilar: hay que leer, y lo que se lee tiene que enlazarse con lo que ya está en tablas, el cliente, el contrato, la versión vigente de la política. Esta vía es más nueva, tiene menos evidencia y es donde más pilotos fallan al pasar a producción.</w:t>
+      </w:r>
+    </w:p>
+    <w:p>
+      <w:pPr/>
+      <w:r>
+        <w:t xml:space="preserve">La ontología es el contrato entre las dos familias de datos. Un contrato de préstamo en PDF y el registro del préstamo en el core bancario son dos manifestaciones del mismo concepto, "contrato de préstamo", con los mismos atributos: importe, tipo, vencimiento, garantías, firmantes. Si el concepto está definido una vez, el documento se puede extraer a esa estructura y conciliar con el registro. Si no lo está, el documento se queda en un índice vectorial que devuelve fragmentos parecidos a la pregunta, sin saber a qué cliente, contrato o cuenta pertenecen.</w:t>
+      </w:r>
+    </w:p>
+    <w:p>
+      <w:pPr/>
+      <w:r>
+        <w:t xml:space="preserve">El punto de encuentro es el grafo de conocimiento con procedencia. Cada hecho del grafo lleva dos enlaces hacia atrás: a la tabla y campo del sistema origen si viene de datos estructurados, o al documento, página y fragmento si viene de extracción. Esa procedencia es exactamente el linaje a nivel de campo que BCBS 239 pide y que el Comité de Basilea sigue echando en falta en 2026. Y es lo que permite responder a un supervisor "de dónde sale este dato" con un enlace en lugar de con una reconstrucción.</w:t>
+      </w:r>
+    </w:p>
+    <w:p>
+      <w:pPr/>
+      <w:r>
+        <w:rPr>
+          <w:b/>
+        </w:rPr>
+        <w:t xml:space="preserve">Tres formas de combinar documentos y tablas, según la pregunta.</w:t>
+      </w:r>
+      <w:r>
+        <w:t xml:space="preserve"> Un agente recibe tres tipos de pregunta sobre documentos, y cada tipo exige una forma distinta de juntar lo que está en el documento con lo que está en las tablas: extraer y consultar, cuando la pregunta pide una cifra; filtrar por el grafo y buscar en el texto, cuando pide leer el documento correcto; y contrastar contra la norma estructurada, cuando pide comprobar una decisión. En las tres el dato estructurado está presente: es lo que dice a qué cliente, contrato o versión pertenece el documento. Confundirlas es la causa más frecuente de que un piloto funcione en la demostración y falle en producción.</w:t>
+      </w:r>
+    </w:p>
+    <w:p>
+      <w:pPr/>
+      <w:r>
+        <w:rPr>
+          <w:b/>
+        </w:rPr>
+        <w:t xml:space="preserve">Preguntas que piden una cifra que solo está en documentos.</w:t>
+      </w:r>
+      <w:r>
+        <w:t xml:space="preserve"> «¿Cuántos contratos tienen cláusula de vencimiento anticipado?», «¿qué exposición total hay bajo garantías de un mismo garante?». No se responden leyendo: hay que contar o sumar sobre cientos de contratos. La forma de hacerlo es extraer primero y consultar después. Un modelo lee cada documento y rellena los atributos que la ontología define para ese tipo de documento; cada hecho se guarda en una tabla o en el grafo con un enlace al fragmento del que salió; y la cifra la calcula el compilador de métricas por la vía certificada, igual que si el dato viniera del core. Lo que gana el banco: el hecho extraído pasa a ser un dato más, con linaje hasta el documento, y la cifra sale por la misma vía determinista que cualquier otra. Eso es lo que BCBS 239 y la guía del BCE piden para un dato de riesgo, aunque su origen sea un PDF. Palantir lo vende como producto desde febrero de 2026 con AIP Document Intelligence, y la literatura lo llama «Structure then Query».</w:t>
+      </w:r>
+    </w:p>
+    <w:p>
+      <w:pPr/>
+      <w:r>
+        <w:rPr>
+          <w:b/>
+        </w:rPr>
+        <w:t xml:space="preserve">Preguntas que piden leer el documento correcto.</w:t>
+      </w:r>
+      <w:r>
+        <w:t xml:space="preserve"> «¿Qué dice la política vigente sobre este caso?», «¿qué cláusula aplica a este contrato?». Aquí no hay cifra: hay que encontrar el párrafo adecuado. La búsqueda por vectores lo hace bien cuando la pregunta y el párrafo se parecen, y mal en tres situaciones habituales en banca: cuando la norma remite a otra, cuando hay varias versiones y solo una está en vigor, y cuando el usuario no tiene permiso para ver parte de los documentos. La forma de hacerlo es combinar: el grafo decide qué documentos son los relevantes (los de esta entidad, en la versión vigente a esa fecha, los que este usuario puede ver) y el vector localiza el párrafo dentro de ellos. Lo que gana el banco: la respuesta cita un documento concreto en su versión vigente y respeta los permisos, que es lo que exige el Reglamento de IA para poder reconstruir qué información tenía el sistema al responder. Los vectores, en resumen, son motores de coincidencia difusa: localizan el párrafo que habla de algo, pero no dan el dato exacto; el vector localiza y la estructura responde.</w:t>
+      </w:r>
+    </w:p>
+    <w:p>
+      <w:pPr/>
+      <w:r>
+        <w:rPr>
+          <w:b/>
+        </w:rPr>
+        <w:t xml:space="preserve">Preguntas que piden comprobar una decisión contra la norma.</w:t>
+      </w:r>
+      <w:r>
+        <w:t xml:space="preserve"> «¿Esta operación cumple la política de blanqueo?», «¿esta excepción de precio está dentro de lo autorizado?». Ni cifra ni lectura: una comprobación. La forma de hacerlo es convertir la norma en una lista estructurada de obligaciones y condiciones, y contrastar contra ella los datos de la operación. La salida no es solo sí o no, sino la explicación: qué regla se aplicó y con qué datos. Lo que gana el banco: la explicación de cumplimiento que el supervisor pide en monitorización de transacciones se genera en el momento, y la traza de la decisión queda registrada en el grafo de contexto. Lo describen los trabajos GraphCompliance y el de grafos regulatorios para monitorización de transacciones.</w:t>
+      </w:r>
+    </w:p>
+    <w:p>
+      <w:pPr/>
+      <w:r>
+        <w:rPr>
+          <w:b/>
+        </w:rPr>
+        <w:t xml:space="preserve">Qué dice la evidencia en esta vía.</w:t>
+      </w:r>
+      <w:r>
+        <w:t xml:space="preserve"> Es más escasa que en la vía 1 y mide otra cosa: no si una cifra es correcta, sino si el sistema encontró el pasaje adecuado o seleccionó el documento vigente. Lo disponible apunta en una dirección. Sobre el Code of Federal Regulations, combinar grafo y búsqueda vectorial mejoró un 70 % sobre la búsqueda vectorial sola en preguntas con referencias cruzadas y normas derogadas, que es el caso de cualquier normativa interna de un banco (</w:t>
+      </w:r>
+      <w:hyperlink r:id="rId26" w:history="1">
+        <w:r>
+          <w:rPr>
+            <w:rStyle w:val="Hyperlink"/>
+          </w:rPr>
+          <w:t xml:space="preserve">Knowledge Graph RAG: Agentic Crawling</w:t>
+        </w:r>
+      </w:hyperlink>
+      <w:r>
+        <w:t xml:space="preserve">). Y un trabajo de diciembre de 2025 (</w:t>
+      </w:r>
+      <w:hyperlink r:id="rId27" w:history="1">
+        <w:r>
+          <w:rPr>
+            <w:rStyle w:val="Hyperlink"/>
+          </w:rPr>
+          <w:t xml:space="preserve">The Semantic Illusion</w:t>
+        </w:r>
+      </w:hyperlink>
+      <w:r>
+        <w:t xml:space="preserve">) demuestra que la similitud de embeddings, por sí sola, no puede detectar cuándo una respuesta se ha inventado: hace falta la estructura para comprobarla. No hay todavía un estudio con documentos bancarios reales, y por eso el banco de pruebas propio es tan necesario aquí como en la vía 1.</w:t>
+      </w:r>
+    </w:p>
+    <w:p>
+      <w:pPr/>
+      <w:r>
+        <w:rPr>
+          <w:b/>
+        </w:rPr>
+        <w:t xml:space="preserve">Lo que tienen en común y lo que hay que vigilar.</w:t>
+      </w:r>
+      <w:r>
+        <w:t xml:space="preserve"> En los tres casos un modelo produce datos: atributos extraídos, documentos seleccionados, reglas aplicadas. Un dato producido por un modelo puede estar mal, y en banca eso tiene tres consecuencias prácticas. Primera, cada hecho extraído lleva una medida de confianza y la versión del modelo que lo produjo, se valida por muestreo, y el pipeline de extracción entra en el marco de riesgo de modelo como cualquier otro modelo. Segunda, el vínculo entre el documento y el registro estructurado, que el firmante del contrato escaneado sea el titular del core, es también una decisión con margen de error y necesita su propia validación. Tercera, los embeddings y los logs de consulta contienen datos personales aunque la tabla de origen esté enmascarada: el enmascarado se aplica en el momento en que el contexto llega al modelo, no solo en la fuente.</w:t>
+      </w:r>
+    </w:p>
+    <w:p>
+      <w:pPr>
+        <w:pStyle w:val="Heading3"/>
+      </w:pPr>
+      <w:r>
+        <w:t xml:space="preserve">El puente: qué se convierte en estructurado y qué se queda en documento</w:t>
+      </w:r>
+    </w:p>
+    <w:p>
+      <w:pPr/>
+      <w:r>
+        <w:t xml:space="preserve">No hay una norma única que lo decida, pero sí tres criterios que convergen y que el banco puede adoptar como regla. El primero viene de BCBS 239: todo dato que alimente la agregación de riesgos, el reporting regulatorio o una decisión operativa es un elemento crítico y tiene que existir como dato estructurado con definición, dueño y linaje, venga de una tabla o de una escritura. El segundo viene de la gestión documental, el cuerpo de conocimiento DAMA y la norma ISO 15489 de gestión de registros: el documento es la evidencia y el registro estructurado es la copia operativa; los dos coexisten, y si discrepan manda el documento. El tercero es el que usan los sistemas de captura de documentos: se estructura lo que se va a contar, sumar, filtrar o validar en un proceso, y se deja como texto lo que se va a leer e interpretar.</w:t>
+      </w:r>
+    </w:p>
+    <w:p>
+      <w:pPr/>
+      <w:r>
+        <w:t xml:space="preserve">En el banco hay un cuarto criterio que cierra los otros tres: se extrae lo que la ontología tiene definido como atributo del concepto. Si «contrato de préstamo» tiene el atributo «tasación», se extrae de la escritura y se concilia con el core; si no lo tiene y hace falta, primero se añade al concepto, con su dueño, y después se extrae. Así la decisión de qué estructurar no la toma cada proyecto, sino el modelo.</w:t>
+      </w:r>
+    </w:p>
+    <w:p>
+      <w:pPr/>
+      <w:r>
+        <w:t xml:space="preserve">La escritura de hipoteca lo resume. Importe, tipo, plazo, titulares, garantía y tasación pasan a estructurado: están en el modelo de datos del préstamo y los usan los procesos operativos cada día. Las cláusulas se quedan como texto, indexadas con sus metadatos (contrato, fecha, versión), porque lo que se hace con ellas es leerlas cuando surge un caso. Y la escritura completa se conserva como evidencia, porque es lo que vale ante un juez.</w:t>
+      </w:r>
+    </w:p>
+    <w:p>
+      <w:pPr/>
+      <w:r>
+        <w:t xml:space="preserve">Dos consecuencias. Todo dato que se extrae de un documento con un modelo es un dato producido por un modelo, y entra en la gestión de riesgo de modelo con confianza, versión y validación por muestreo, como se ha dicho más arriba. Y la extracción se hace una vez y se gobierna, no se repite en cada pregunta: lo que hoy se extrae a demanda en un piloto es mañana un producto de dato más.</w:t>
+      </w:r>
+    </w:p>
+    <w:p>
+      <w:pPr>
+        <w:pStyle w:val="Heading2"/>
+      </w:pPr>
+      <w:r>
+        <w:t xml:space="preserve">Estado del arte en 2026</w:t>
+      </w:r>
+    </w:p>
+    <w:p>
+      <w:pPr/>
+      <w:r>
+        <w:t xml:space="preserve">De lo que se ha movido en 2025 y 2026 hay tres cosas que cambian decisiones del banco: un formato abierto para las definiciones, que permite no depender del proveedor; los primeros sistemas en los que la ontología se mantiene sola, que hacen creíble la foto final; y el grafo de contexto, que conviene conocer para no comprarlo antes de tiempo. La evidencia sobre qué enfoque acierta está en la sección anterior, con cada vía.</w:t>
+      </w:r>
+    </w:p>
+    <w:p>
+      <w:pPr/>
+      <w:r>
+        <w:rPr>
+          <w:b/>
+        </w:rPr>
+        <w:t xml:space="preserve">Un formato abierto para las definiciones.</w:t>
+      </w:r>
+      <w:r>
+        <w:t xml:space="preserve"> El problema que resuelve: cada herramienta de BI y cada plataforma de datos guarda las definiciones de métricas en su propio formato, así que cambiar de herramienta es reescribirlas, y tener dos herramientas es tener dos versiones de cada métrica. Open Semantic Interchange es un formato abierto para escribir métricas, dimensiones y relaciones una sola vez y que cualquier plataforma las lea. Lo impulsaron Snowflake, Salesforce, dbt Labs, BlackRock y RelationalAI en septiembre de 2025, la especificación 1.0 salió en enero de 2026 y en junio de 2026 pasó a la Apache Software Foundation con el nombre de Apache Ossie, con más de cincuenta organizaciones detrás. Todavía ningún producto lo importa y exporta de forma nativa, así que de momento es una promesa. Pero es la única promesa de independencia que existe, y por eso el banco escribe sus YAML en Ossie desde el primer día y debe exigir compatibilidad con ese formato a cualquier proveedor de capa semántica.</w:t>
+      </w:r>
+    </w:p>
+    <w:p>
       <w:pPr/>
       <w:r>
         <w:rPr>
@@ -2890,7 +2982,7 @@
       <w:r>
         <w:t xml:space="preserve"> El problema que resuelve: una ontología hecha a mano se queda vieja porque nadie tiene tiempo de actualizarla cada vez que cambia un proceso. En septiembre de 2026 se publicó </w:t>
       </w:r>
-      <w:hyperlink r:id="rId26" w:history="1">
+      <w:hyperlink r:id="rId28" w:history="1">
         <w:r>
           <w:rPr>
             <w:rStyle w:val="Hyperlink"/>
@@ -2901,7 +2993,7 @@
       <w:r>
         <w:t xml:space="preserve">, un sistema en el que un agente construye la ontología leyendo las fuentes y después la corrige a partir de sus propios fallos: cuando una consulta sale mal, localiza qué concepto faltaba o estaba mal definido, propone el cambio y solo lo incorpora si una prueba demuestra que las consultas mejoran. Otro trabajo del mismo año (</w:t>
       </w:r>
-      <w:hyperlink r:id="rId27" w:history="1">
+      <w:hyperlink r:id="rId29" w:history="1">
         <w:r>
           <w:rPr>
             <w:rStyle w:val="Hyperlink"/>
@@ -2984,7 +3076,7 @@
                     <pic:cNvPicPr/>
                   </pic:nvPicPr>
                   <pic:blipFill>
-                    <a:blip r:embed="rId28"/>
+                    <a:blip r:embed="rId30"/>
                     <a:stretch>
                       <a:fillRect/>
                     </a:stretch>
@@ -3876,7 +3968,7 @@
           <w:numId w:val="6"/>
         </w:numPr>
       </w:pPr>
-      <w:hyperlink r:id="rId29" w:history="1">
+      <w:hyperlink r:id="rId31" w:history="1">
         <w:r>
           <w:rPr>
             <w:rStyle w:val="Hyperlink"/>
@@ -3970,7 +4062,7 @@
           <w:numId w:val="7"/>
         </w:numPr>
       </w:pPr>
-      <w:hyperlink r:id="rId30" w:history="1">
+      <w:hyperlink r:id="rId32" w:history="1">
         <w:r>
           <w:rPr>
             <w:rStyle w:val="Hyperlink"/>
@@ -3987,7 +4079,7 @@
           <w:numId w:val="7"/>
         </w:numPr>
       </w:pPr>
-      <w:hyperlink r:id="rId31" w:history="1">
+      <w:hyperlink r:id="rId33" w:history="1">
         <w:r>
           <w:rPr>
             <w:rStyle w:val="Hyperlink"/>
@@ -4038,7 +4130,7 @@
           <w:numId w:val="7"/>
         </w:numPr>
       </w:pPr>
-      <w:hyperlink r:id="rId32" w:history="1">
+      <w:hyperlink r:id="rId34" w:history="1">
         <w:r>
           <w:rPr>
             <w:rStyle w:val="Hyperlink"/>
@@ -4055,7 +4147,7 @@
           <w:numId w:val="7"/>
         </w:numPr>
       </w:pPr>
-      <w:hyperlink r:id="rId33" w:history="1">
+      <w:hyperlink r:id="rId35" w:history="1">
         <w:r>
           <w:rPr>
             <w:rStyle w:val="Hyperlink"/>
@@ -4115,7 +4207,7 @@
           <w:numId w:val="8"/>
         </w:numPr>
       </w:pPr>
-      <w:hyperlink r:id="rId34" w:history="1">
+      <w:hyperlink r:id="rId36" w:history="1">
         <w:r>
           <w:rPr>
             <w:rStyle w:val="Hyperlink"/>
@@ -4132,7 +4224,7 @@
           <w:numId w:val="8"/>
         </w:numPr>
       </w:pPr>
-      <w:hyperlink r:id="rId35" w:history="1">
+      <w:hyperlink r:id="rId37" w:history="1">
         <w:r>
           <w:rPr>
             <w:rStyle w:val="Hyperlink"/>
@@ -4149,7 +4241,7 @@
           <w:numId w:val="8"/>
         </w:numPr>
       </w:pPr>
-      <w:hyperlink r:id="rId36" w:history="1">
+      <w:hyperlink r:id="rId38" w:history="1">
         <w:r>
           <w:rPr>
             <w:rStyle w:val="Hyperlink"/>
@@ -4166,7 +4258,7 @@
           <w:numId w:val="8"/>
         </w:numPr>
       </w:pPr>
-      <w:hyperlink r:id="rId37" w:history="1">
+      <w:hyperlink r:id="rId39" w:history="1">
         <w:r>
           <w:rPr>
             <w:rStyle w:val="Hyperlink"/>
@@ -4209,7 +4301,7 @@
           <w:numId w:val="9"/>
         </w:numPr>
       </w:pPr>
-      <w:hyperlink r:id="rId38" w:history="1">
+      <w:hyperlink r:id="rId40" w:history="1">
         <w:r>
           <w:rPr>
             <w:rStyle w:val="Hyperlink"/>
@@ -4226,7 +4318,7 @@
           <w:numId w:val="9"/>
         </w:numPr>
       </w:pPr>
-      <w:hyperlink r:id="rId39" w:history="1">
+      <w:hyperlink r:id="rId41" w:history="1">
         <w:r>
           <w:rPr>
             <w:rStyle w:val="Hyperlink"/>
@@ -4277,7 +4369,7 @@
           <w:numId w:val="9"/>
         </w:numPr>
       </w:pPr>
-      <w:hyperlink r:id="rId26" w:history="1">
+      <w:hyperlink r:id="rId28" w:history="1">
         <w:r>
           <w:rPr>
             <w:rStyle w:val="Hyperlink"/>
@@ -4294,7 +4386,7 @@
           <w:numId w:val="9"/>
         </w:numPr>
       </w:pPr>
-      <w:hyperlink r:id="rId27" w:history="1">
+      <w:hyperlink r:id="rId29" w:history="1">
         <w:r>
           <w:rPr>
             <w:rStyle w:val="Hyperlink"/>
@@ -4311,7 +4403,7 @@
           <w:numId w:val="9"/>
         </w:numPr>
       </w:pPr>
-      <w:hyperlink r:id="rId40" w:history="1">
+      <w:hyperlink r:id="rId42" w:history="1">
         <w:r>
           <w:rPr>
             <w:rStyle w:val="Hyperlink"/>
@@ -4328,7 +4420,7 @@
           <w:numId w:val="9"/>
         </w:numPr>
       </w:pPr>
-      <w:hyperlink r:id="rId41" w:history="1">
+      <w:hyperlink r:id="rId26" w:history="1">
         <w:r>
           <w:rPr>
             <w:rStyle w:val="Hyperlink"/>
@@ -4345,7 +4437,7 @@
           <w:numId w:val="9"/>
         </w:numPr>
       </w:pPr>
-      <w:hyperlink r:id="rId42" w:history="1">
+      <w:hyperlink r:id="rId43" w:history="1">
         <w:r>
           <w:rPr>
             <w:rStyle w:val="Hyperlink"/>
@@ -4362,7 +4454,7 @@
           <w:numId w:val="9"/>
         </w:numPr>
       </w:pPr>
-      <w:hyperlink r:id="rId43" w:history="1">
+      <w:hyperlink r:id="rId44" w:history="1">
         <w:r>
           <w:rPr>
             <w:rStyle w:val="Hyperlink"/>
@@ -4379,7 +4471,7 @@
           <w:numId w:val="9"/>
         </w:numPr>
       </w:pPr>
-      <w:hyperlink r:id="rId44" w:history="1">
+      <w:hyperlink r:id="rId45" w:history="1">
         <w:r>
           <w:rPr>
             <w:rStyle w:val="Hyperlink"/>
@@ -4396,7 +4488,7 @@
           <w:numId w:val="9"/>
         </w:numPr>
       </w:pPr>
-      <w:hyperlink r:id="rId45" w:history="1">
+      <w:hyperlink r:id="rId27" w:history="1">
         <w:r>
           <w:rPr>
             <w:rStyle w:val="Hyperlink"/>

</xml_diff>

<commit_message>
Framework doc: remove FIBO references
Co-Authored-By: Claude Fable 5.1 <noreply@anthropic.com>
Claude-Session: https://claude.ai/code/session_013A7bCLd4PzhQYG95DagcQd
</commit_message>
<xml_diff>
--- a/docs/Semantica_grafos_agentes_banca.docx
+++ b/docs/Semantica_grafos_agentes_banca.docx
@@ -118,7 +118,7 @@
         <w:t xml:space="preserve">Ontología.</w:t>
       </w:r>
       <w:r>
-        <w:t xml:space="preserve"> Es el modelo que fija qué es cada concepto del negocio y cómo se relaciona con los demás: qué es un cliente, en qué se diferencia de un titular o de una cuenta, cómo se vincula a un contrato y a un grupo económico, y qué reglas valen entre ellos. No responde preguntas en tiempo de ejecución: a ella acuden las piezas que sí responden, la capa semántica cuando compila una métrica, el grafo cuando recorre relaciones y el agente cuando lee la ficha de una métrica. Recoge la definición del concepto; la de cómo se calcula una métrica vive en la capa semántica. El término tiene dos sentidos. Uno formal, ligado a una tecnología de los años 2000, la web semántica, en la que la ontología se escribe en un lenguaje propio para que un programa deduzca hechos nuevos a partir de las reglas. Y otro laxo, que es el que se usa normalmente hoy: un modelo conceptual explícito del negocio, con sus entidades, relaciones y reglas, con dueño y versión, escrito en el formato que se tenga. Es este segundo el que se usa en este documento. Y conviene ver que una ontología así está implícita en cualquier entorno de datos gobernado: un diccionario de datos con entidades, claves y relaciones es ya una ontología sin nombre. Por eso la capa semántica del banco la lleva dentro, en sus YAML (entidades de negocio, relaciones, conceptos, valores válidos y reglas), y hacerla explícita es ordenar lo que ya hay, no empezar de cero. El sentido formal queda fuera de este documento. FIBO, la ontología de referencia del sector mantenida por el EDM Council, sirve como vocabulario al que alinear nombres, no como ontología a implementar.</w:t>
+        <w:t xml:space="preserve"> Es el modelo que fija qué es cada concepto del negocio y cómo se relaciona con los demás: qué es un cliente, en qué se diferencia de un titular o de una cuenta, cómo se vincula a un contrato y a un grupo económico, y qué reglas valen entre ellos. No responde preguntas en tiempo de ejecución: a ella acuden las piezas que sí responden, la capa semántica cuando compila una métrica, el grafo cuando recorre relaciones y el agente cuando lee la ficha de una métrica. Recoge la definición del concepto; la de cómo se calcula una métrica vive en la capa semántica. El término tiene dos sentidos. Uno formal, ligado a una tecnología de los años 2000, la web semántica, en la que la ontología se escribe en un lenguaje propio para que un programa deduzca hechos nuevos a partir de las reglas. Y otro laxo, que es el que se usa normalmente hoy: un modelo conceptual explícito del negocio, con sus entidades, relaciones y reglas, con dueño y versión, escrito en el formato que se tenga. Es este segundo el que se usa en este documento. Y conviene ver que una ontología así está implícita en cualquier entorno de datos gobernado: un diccionario de datos con entidades, claves y relaciones es ya una ontología sin nombre. Por eso la capa semántica del banco la lleva dentro, en sus YAML (entidades de negocio, relaciones, conceptos, valores válidos y reglas), y hacerla explícita es ordenar lo que ya hay, no empezar de cero. El sentido formal queda fuera de este documento.</w:t>
       </w:r>
     </w:p>
     <w:p>
@@ -341,16 +341,8 @@
           <w:p>
             <w:pPr/>
             <w:r>
-              <w:t xml:space="preserve">OWL, RDF, </w:t>
-            </w:r>
-            <w:hyperlink r:id="rId4" w:history="1">
-              <w:r>
-                <w:rPr>
-                  <w:rStyle w:val="Hyperlink"/>
-                </w:rPr>
-                <w:t xml:space="preserve">FIBO</w:t>
-              </w:r>
-            </w:hyperlink>
+              <w:t xml:space="preserve">El YAML en Ossie; OWL solo si algún día se formaliza</w:t>
+            </w:r>
           </w:p>
         </w:tc>
       </w:tr>
@@ -465,7 +457,7 @@
             <w:r>
               <w:t xml:space="preserve">Sin estándar; </w:t>
             </w:r>
-            <w:hyperlink r:id="rId5" w:history="1">
+            <w:hyperlink r:id="rId4" w:history="1">
               <w:r>
                 <w:rPr>
                   <w:rStyle w:val="Hyperlink"/>
@@ -476,7 +468,7 @@
             <w:r>
               <w:t xml:space="preserve">, </w:t>
             </w:r>
-            <w:hyperlink r:id="rId6" w:history="1">
+            <w:hyperlink r:id="rId5" w:history="1">
               <w:r>
                 <w:rPr>
                   <w:rStyle w:val="Hyperlink"/>
@@ -509,7 +501,7 @@
                     <pic:cNvPicPr/>
                   </pic:nvPicPr>
                   <pic:blipFill>
-                    <a:blip r:embed="rId7"/>
+                    <a:blip r:embed="rId6"/>
                     <a:stretch>
                       <a:fillRect/>
                     </a:stretch>
@@ -616,7 +608,7 @@
           </w:tcPr>
           <w:p>
             <w:pPr/>
-            <w:hyperlink r:id="rId8" w:history="1">
+            <w:hyperlink r:id="rId7" w:history="1">
               <w:r>
                 <w:rPr>
                   <w:rStyle w:val="Hyperlink"/>
@@ -659,7 +651,7 @@
           </w:tcPr>
           <w:p>
             <w:pPr/>
-            <w:hyperlink r:id="rId9" w:history="1">
+            <w:hyperlink r:id="rId8" w:history="1">
               <w:r>
                 <w:rPr>
                   <w:rStyle w:val="Hyperlink"/>
@@ -702,7 +694,7 @@
           </w:tcPr>
           <w:p>
             <w:pPr/>
-            <w:hyperlink r:id="rId10" w:history="1">
+            <w:hyperlink r:id="rId9" w:history="1">
               <w:r>
                 <w:rPr>
                   <w:rStyle w:val="Hyperlink"/>
@@ -745,7 +737,7 @@
           </w:tcPr>
           <w:p>
             <w:pPr/>
-            <w:hyperlink r:id="rId11" w:history="1">
+            <w:hyperlink r:id="rId10" w:history="1">
               <w:r>
                 <w:rPr>
                   <w:rStyle w:val="Hyperlink"/>
@@ -791,7 +783,7 @@
             <w:r>
               <w:t xml:space="preserve">RGPD y </w:t>
             </w:r>
-            <w:hyperlink r:id="rId12" w:history="1">
+            <w:hyperlink r:id="rId11" w:history="1">
               <w:r>
                 <w:rPr>
                   <w:rStyle w:val="Hyperlink"/>
@@ -869,7 +861,7 @@
             <w:r>
               <w:t xml:space="preserve">Gestión de riesgo de modelo (</w:t>
             </w:r>
-            <w:hyperlink r:id="rId13" w:history="1">
+            <w:hyperlink r:id="rId12" w:history="1">
               <w:r>
                 <w:rPr>
                   <w:rStyle w:val="Hyperlink"/>
@@ -1066,7 +1058,7 @@
           </w:tcPr>
           <w:p>
             <w:pPr/>
-            <w:hyperlink r:id="rId14" w:history="1">
+            <w:hyperlink r:id="rId13" w:history="1">
               <w:r>
                 <w:rPr>
                   <w:rStyle w:val="Hyperlink"/>
@@ -1222,7 +1214,7 @@
       <w:r>
         <w:t xml:space="preserve">El dato más citado viene de data.world, en un benchmark del sector seguros con GPT-4. Escribiendo SQL directamente sobre el esquema, el acierto fue del 16,7 %. A través de un grafo con ontología sobre las mismas tablas, del 54,2 %. Añadiendo una comprobación de la consulta contra la ontología y reparación por el LLM, del 72,55 %, con un 8 % de respuestas «no lo sé» y una tasa de error del 19,44 % (</w:t>
       </w:r>
-      <w:hyperlink r:id="rId15" w:history="1">
+      <w:hyperlink r:id="rId14" w:history="1">
         <w:r>
           <w:rPr>
             <w:rStyle w:val="Hyperlink"/>
@@ -1233,7 +1225,7 @@
       <w:r>
         <w:t xml:space="preserve">; </w:t>
       </w:r>
-      <w:hyperlink r:id="rId16" w:history="1">
+      <w:hyperlink r:id="rId15" w:history="1">
         <w:r>
           <w:rPr>
             <w:rStyle w:val="Hyperlink"/>
@@ -1396,7 +1388,7 @@
       <w:r>
         <w:t xml:space="preserve"> La propuesta de </w:t>
       </w:r>
-      <w:hyperlink r:id="rId14" w:history="1">
+      <w:hyperlink r:id="rId13" w:history="1">
         <w:r>
           <w:rPr>
             <w:rStyle w:val="Hyperlink"/>
@@ -1787,7 +1779,7 @@
                     <pic:cNvPicPr/>
                   </pic:nvPicPr>
                   <pic:blipFill>
-                    <a:blip r:embed="rId17"/>
+                    <a:blip r:embed="rId16"/>
                     <a:stretch>
                       <a:fillRect/>
                     </a:stretch>
@@ -1989,7 +1981,7 @@
           </w:tcPr>
           <w:p>
             <w:pPr/>
-            <w:hyperlink r:id="rId18" w:history="1">
+            <w:hyperlink r:id="rId17" w:history="1">
               <w:r>
                 <w:rPr>
                   <w:rStyle w:val="Hyperlink"/>
@@ -2108,7 +2100,7 @@
           </w:tcPr>
           <w:p>
             <w:pPr/>
-            <w:hyperlink r:id="rId19" w:history="1">
+            <w:hyperlink r:id="rId18" w:history="1">
               <w:r>
                 <w:rPr>
                   <w:rStyle w:val="Hyperlink"/>
@@ -2170,7 +2162,7 @@
           </w:tcPr>
           <w:p>
             <w:pPr/>
-            <w:hyperlink r:id="rId20" w:history="1">
+            <w:hyperlink r:id="rId19" w:history="1">
               <w:r>
                 <w:rPr>
                   <w:rStyle w:val="Hyperlink"/>
@@ -2232,7 +2224,7 @@
           </w:tcPr>
           <w:p>
             <w:pPr/>
-            <w:hyperlink r:id="rId21" w:history="1">
+            <w:hyperlink r:id="rId20" w:history="1">
               <w:r>
                 <w:rPr>
                   <w:rStyle w:val="Hyperlink"/>
@@ -2351,7 +2343,7 @@
           </w:tcPr>
           <w:p>
             <w:pPr/>
-            <w:hyperlink r:id="rId22" w:history="1">
+            <w:hyperlink r:id="rId21" w:history="1">
               <w:r>
                 <w:rPr>
                   <w:rStyle w:val="Hyperlink"/>
@@ -2413,7 +2405,7 @@
           </w:tcPr>
           <w:p>
             <w:pPr/>
-            <w:hyperlink r:id="rId15" w:history="1">
+            <w:hyperlink r:id="rId14" w:history="1">
               <w:r>
                 <w:rPr>
                   <w:rStyle w:val="Hyperlink"/>
@@ -2475,7 +2467,7 @@
           </w:tcPr>
           <w:p>
             <w:pPr/>
-            <w:hyperlink r:id="rId16" w:history="1">
+            <w:hyperlink r:id="rId15" w:history="1">
               <w:r>
                 <w:rPr>
                   <w:rStyle w:val="Hyperlink"/>
@@ -2708,7 +2700,7 @@
           </w:tcPr>
           <w:p>
             <w:pPr/>
-            <w:hyperlink r:id="rId23" w:history="1">
+            <w:hyperlink r:id="rId22" w:history="1">
               <w:r>
                 <w:rPr>
                   <w:rStyle w:val="Hyperlink"/>
@@ -2770,7 +2762,7 @@
       <w:r>
         <w:t xml:space="preserve">Más relevante que las cifras es lo que varios trabajos de 2026 muestran sobre dónde está la fiabilidad. Dos ejemplos. En uno, un modelo pequeño, de siete mil millones de parámetros, al que se le imponen las reglas del negocio acierta más que un modelo cuatro veces mayor sin ellas (</w:t>
       </w:r>
-      <w:hyperlink r:id="rId24" w:history="1">
+      <w:hyperlink r:id="rId23" w:history="1">
         <w:r>
           <w:rPr>
             <w:rStyle w:val="Hyperlink"/>
@@ -2781,7 +2773,7 @@
       <w:r>
         <w:t xml:space="preserve">). En otro, el modelo solo elige entre opciones permitidas y un compilador determinista escribe la consulta (</w:t>
       </w:r>
-      <w:hyperlink r:id="rId25" w:history="1">
+      <w:hyperlink r:id="rId24" w:history="1">
         <w:r>
           <w:rPr>
             <w:rStyle w:val="Hyperlink"/>
@@ -2878,7 +2870,7 @@
       <w:r>
         <w:t xml:space="preserve"> Es más escasa que en la vía 1 y mide otra cosa: no si una cifra es correcta, sino si el sistema encontró el pasaje adecuado o seleccionó el documento vigente. Lo disponible apunta en una dirección. Sobre el Code of Federal Regulations, combinar grafo y búsqueda vectorial mejoró un 70 % sobre la búsqueda vectorial sola en preguntas con referencias cruzadas y normas derogadas, que es el caso de cualquier normativa interna de un banco (</w:t>
       </w:r>
-      <w:hyperlink r:id="rId26" w:history="1">
+      <w:hyperlink r:id="rId25" w:history="1">
         <w:r>
           <w:rPr>
             <w:rStyle w:val="Hyperlink"/>
@@ -2889,7 +2881,7 @@
       <w:r>
         <w:t xml:space="preserve">). Y un trabajo de diciembre de 2025 (</w:t>
       </w:r>
-      <w:hyperlink r:id="rId27" w:history="1">
+      <w:hyperlink r:id="rId26" w:history="1">
         <w:r>
           <w:rPr>
             <w:rStyle w:val="Hyperlink"/>
@@ -2982,7 +2974,7 @@
       <w:r>
         <w:t xml:space="preserve"> El problema que resuelve: una ontología hecha a mano se queda vieja porque nadie tiene tiempo de actualizarla cada vez que cambia un proceso. En septiembre de 2026 se publicó </w:t>
       </w:r>
-      <w:hyperlink r:id="rId28" w:history="1">
+      <w:hyperlink r:id="rId27" w:history="1">
         <w:r>
           <w:rPr>
             <w:rStyle w:val="Hyperlink"/>
@@ -2993,7 +2985,7 @@
       <w:r>
         <w:t xml:space="preserve">, un sistema en el que un agente construye la ontología leyendo las fuentes y después la corrige a partir de sus propios fallos: cuando una consulta sale mal, localiza qué concepto faltaba o estaba mal definido, propone el cambio y solo lo incorpora si una prueba demuestra que las consultas mejoran. Otro trabajo del mismo año (</w:t>
       </w:r>
-      <w:hyperlink r:id="rId29" w:history="1">
+      <w:hyperlink r:id="rId28" w:history="1">
         <w:r>
           <w:rPr>
             <w:rStyle w:val="Hyperlink"/>
@@ -3076,7 +3068,7 @@
                     <pic:cNvPicPr/>
                   </pic:nvPicPr>
                   <pic:blipFill>
-                    <a:blip r:embed="rId30"/>
+                    <a:blip r:embed="rId29"/>
                     <a:stretch>
                       <a:fillRect/>
                     </a:stretch>
@@ -3396,7 +3388,7 @@
           <w:p>
             <w:pPr/>
             <w:r>
-              <w:t xml:space="preserve">Ontología explícita y versionada para un dominio, alineada a FIBO y a la taxonomía de grupo</w:t>
+              <w:t xml:space="preserve">Ontología explícita y versionada para un dominio, alineada a la taxonomía de grupo</w:t>
             </w:r>
           </w:p>
         </w:tc>
@@ -3730,7 +3722,7 @@
         <w:t xml:space="preserve">Bloqueo de proveedor y límites técnicos.</w:t>
       </w:r>
       <w:r>
-        <w:t xml:space="preserve"> Una ontología en formato propietario es un activo cautivo. Un grafo virtual sobre SQL sirve para métricas y joins pero no para análisis de redes. FIBO es extenso y su adopción parcial. El grafo de contexto no tiene estándar y cada proveedor lo define a su conveniencia.</w:t>
+        <w:t xml:space="preserve"> Una ontología en formato propietario es un activo cautivo. Un grafo virtual sobre SQL sirve para métricas y joins pero no para análisis de redes. El grafo de contexto no tiene estándar y cada proveedor lo define a su conveniencia.</w:t>
       </w:r>
     </w:p>
     <w:p>
@@ -3822,7 +3814,7 @@
         <w:t xml:space="preserve">Ontología y grafo por dominio, empezando por uno documental.</w:t>
       </w:r>
       <w:r>
-        <w:t xml:space="preserve"> El candidato es la aplicación de demandas judiciales de la iniciativa 2 de Dato como Producto: documentos, no tablas. Modelar solo los conceptos del inventario de BCBS 239 que toque, con FIBO como referencia; extraer un tipo de documento con procedencia al fragmento; tratar los pipelines de extracción como modelos bajo gobernanza.</w:t>
+        <w:t xml:space="preserve"> El candidato es la aplicación de demandas judiciales de la iniciativa 2 de Dato como Producto: documentos, no tablas. Modelar solo los conceptos del inventario de BCBS 239 que toque; extraer un tipo de documento con procedencia al fragmento; tratar los pipelines de extracción como modelos bajo gobernanza.</w:t>
       </w:r>
     </w:p>
     <w:p>
@@ -3934,7 +3926,7 @@
           <w:numId w:val="6"/>
         </w:numPr>
       </w:pPr>
-      <w:hyperlink r:id="rId8" w:history="1">
+      <w:hyperlink r:id="rId7" w:history="1">
         <w:r>
           <w:rPr>
             <w:rStyle w:val="Hyperlink"/>
@@ -3951,7 +3943,7 @@
           <w:numId w:val="6"/>
         </w:numPr>
       </w:pPr>
-      <w:hyperlink r:id="rId9" w:history="1">
+      <w:hyperlink r:id="rId8" w:history="1">
         <w:r>
           <w:rPr>
             <w:rStyle w:val="Hyperlink"/>
@@ -3968,7 +3960,7 @@
           <w:numId w:val="6"/>
         </w:numPr>
       </w:pPr>
-      <w:hyperlink r:id="rId31" w:history="1">
+      <w:hyperlink r:id="rId30" w:history="1">
         <w:r>
           <w:rPr>
             <w:rStyle w:val="Hyperlink"/>
@@ -3985,7 +3977,7 @@
           <w:numId w:val="6"/>
         </w:numPr>
       </w:pPr>
-      <w:hyperlink r:id="rId10" w:history="1">
+      <w:hyperlink r:id="rId9" w:history="1">
         <w:r>
           <w:rPr>
             <w:rStyle w:val="Hyperlink"/>
@@ -4002,7 +3994,7 @@
           <w:numId w:val="6"/>
         </w:numPr>
       </w:pPr>
-      <w:hyperlink r:id="rId11" w:history="1">
+      <w:hyperlink r:id="rId10" w:history="1">
         <w:r>
           <w:rPr>
             <w:rStyle w:val="Hyperlink"/>
@@ -4019,7 +4011,7 @@
           <w:numId w:val="6"/>
         </w:numPr>
       </w:pPr>
-      <w:hyperlink r:id="rId13" w:history="1">
+      <w:hyperlink r:id="rId12" w:history="1">
         <w:r>
           <w:rPr>
             <w:rStyle w:val="Hyperlink"/>
@@ -4036,7 +4028,7 @@
           <w:numId w:val="6"/>
         </w:numPr>
       </w:pPr>
-      <w:hyperlink r:id="rId12" w:history="1">
+      <w:hyperlink r:id="rId11" w:history="1">
         <w:r>
           <w:rPr>
             <w:rStyle w:val="Hyperlink"/>
@@ -4062,7 +4054,7 @@
           <w:numId w:val="7"/>
         </w:numPr>
       </w:pPr>
-      <w:hyperlink r:id="rId32" w:history="1">
+      <w:hyperlink r:id="rId31" w:history="1">
         <w:r>
           <w:rPr>
             <w:rStyle w:val="Hyperlink"/>
@@ -4079,7 +4071,7 @@
           <w:numId w:val="7"/>
         </w:numPr>
       </w:pPr>
-      <w:hyperlink r:id="rId33" w:history="1">
+      <w:hyperlink r:id="rId32" w:history="1">
         <w:r>
           <w:rPr>
             <w:rStyle w:val="Hyperlink"/>
@@ -4096,7 +4088,7 @@
           <w:numId w:val="7"/>
         </w:numPr>
       </w:pPr>
-      <w:hyperlink r:id="rId5" w:history="1">
+      <w:hyperlink r:id="rId4" w:history="1">
         <w:r>
           <w:rPr>
             <w:rStyle w:val="Hyperlink"/>
@@ -4113,7 +4105,7 @@
           <w:numId w:val="7"/>
         </w:numPr>
       </w:pPr>
-      <w:hyperlink r:id="rId6" w:history="1">
+      <w:hyperlink r:id="rId5" w:history="1">
         <w:r>
           <w:rPr>
             <w:rStyle w:val="Hyperlink"/>
@@ -4130,7 +4122,7 @@
           <w:numId w:val="7"/>
         </w:numPr>
       </w:pPr>
-      <w:hyperlink r:id="rId34" w:history="1">
+      <w:hyperlink r:id="rId33" w:history="1">
         <w:r>
           <w:rPr>
             <w:rStyle w:val="Hyperlink"/>
@@ -4147,7 +4139,7 @@
           <w:numId w:val="7"/>
         </w:numPr>
       </w:pPr>
-      <w:hyperlink r:id="rId35" w:history="1">
+      <w:hyperlink r:id="rId34" w:history="1">
         <w:r>
           <w:rPr>
             <w:rStyle w:val="Hyperlink"/>
@@ -4164,7 +4156,7 @@
           <w:numId w:val="7"/>
         </w:numPr>
       </w:pPr>
-      <w:hyperlink r:id="rId4" w:history="1">
+      <w:hyperlink r:id="rId35" w:history="1">
         <w:r>
           <w:rPr>
             <w:rStyle w:val="Hyperlink"/>
@@ -4284,7 +4276,7 @@
           <w:numId w:val="9"/>
         </w:numPr>
       </w:pPr>
-      <w:hyperlink r:id="rId18" w:history="1">
+      <w:hyperlink r:id="rId17" w:history="1">
         <w:r>
           <w:rPr>
             <w:rStyle w:val="Hyperlink"/>
@@ -4335,7 +4327,7 @@
           <w:numId w:val="9"/>
         </w:numPr>
       </w:pPr>
-      <w:hyperlink r:id="rId25" w:history="1">
+      <w:hyperlink r:id="rId24" w:history="1">
         <w:r>
           <w:rPr>
             <w:rStyle w:val="Hyperlink"/>
@@ -4352,7 +4344,7 @@
           <w:numId w:val="9"/>
         </w:numPr>
       </w:pPr>
-      <w:hyperlink r:id="rId24" w:history="1">
+      <w:hyperlink r:id="rId23" w:history="1">
         <w:r>
           <w:rPr>
             <w:rStyle w:val="Hyperlink"/>
@@ -4369,7 +4361,7 @@
           <w:numId w:val="9"/>
         </w:numPr>
       </w:pPr>
-      <w:hyperlink r:id="rId28" w:history="1">
+      <w:hyperlink r:id="rId27" w:history="1">
         <w:r>
           <w:rPr>
             <w:rStyle w:val="Hyperlink"/>
@@ -4386,7 +4378,7 @@
           <w:numId w:val="9"/>
         </w:numPr>
       </w:pPr>
-      <w:hyperlink r:id="rId29" w:history="1">
+      <w:hyperlink r:id="rId28" w:history="1">
         <w:r>
           <w:rPr>
             <w:rStyle w:val="Hyperlink"/>
@@ -4420,7 +4412,7 @@
           <w:numId w:val="9"/>
         </w:numPr>
       </w:pPr>
-      <w:hyperlink r:id="rId26" w:history="1">
+      <w:hyperlink r:id="rId25" w:history="1">
         <w:r>
           <w:rPr>
             <w:rStyle w:val="Hyperlink"/>
@@ -4488,7 +4480,7 @@
           <w:numId w:val="9"/>
         </w:numPr>
       </w:pPr>
-      <w:hyperlink r:id="rId27" w:history="1">
+      <w:hyperlink r:id="rId26" w:history="1">
         <w:r>
           <w:rPr>
             <w:rStyle w:val="Hyperlink"/>
@@ -4531,7 +4523,7 @@
           <w:numId w:val="10"/>
         </w:numPr>
       </w:pPr>
-      <w:hyperlink r:id="rId15" w:history="1">
+      <w:hyperlink r:id="rId14" w:history="1">
         <w:r>
           <w:rPr>
             <w:rStyle w:val="Hyperlink"/>
@@ -4548,7 +4540,7 @@
           <w:numId w:val="10"/>
         </w:numPr>
       </w:pPr>
-      <w:hyperlink r:id="rId22" w:history="1">
+      <w:hyperlink r:id="rId21" w:history="1">
         <w:r>
           <w:rPr>
             <w:rStyle w:val="Hyperlink"/>
@@ -4565,7 +4557,7 @@
           <w:numId w:val="10"/>
         </w:numPr>
       </w:pPr>
-      <w:hyperlink r:id="rId23" w:history="1">
+      <w:hyperlink r:id="rId22" w:history="1">
         <w:r>
           <w:rPr>
             <w:rStyle w:val="Hyperlink"/>
@@ -4582,7 +4574,7 @@
           <w:numId w:val="10"/>
         </w:numPr>
       </w:pPr>
-      <w:hyperlink r:id="rId21" w:history="1">
+      <w:hyperlink r:id="rId20" w:history="1">
         <w:r>
           <w:rPr>
             <w:rStyle w:val="Hyperlink"/>
@@ -4599,7 +4591,7 @@
           <w:numId w:val="10"/>
         </w:numPr>
       </w:pPr>
-      <w:hyperlink r:id="rId20" w:history="1">
+      <w:hyperlink r:id="rId19" w:history="1">
         <w:r>
           <w:rPr>
             <w:rStyle w:val="Hyperlink"/>
@@ -4616,7 +4608,7 @@
           <w:numId w:val="10"/>
         </w:numPr>
       </w:pPr>
-      <w:hyperlink r:id="rId14" w:history="1">
+      <w:hyperlink r:id="rId13" w:history="1">
         <w:r>
           <w:rPr>
             <w:rStyle w:val="Hyperlink"/>

</xml_diff>

<commit_message>
Framework doc: explain entity identity ownership in practice
Co-Authored-By: Claude Fable 5.1 <noreply@anthropic.com>
Claude-Session: https://claude.ai/code/session_013A7bCLd4PzhQYG95DagcQd
</commit_message>
<xml_diff>
--- a/docs/Semantica_grafos_agentes_banca.docx
+++ b/docs/Semantica_grafos_agentes_banca.docx
@@ -130,7 +130,7 @@
         <w:t xml:space="preserve">Grafo de conocimiento.</w:t>
       </w:r>
       <w:r>
-        <w:t xml:space="preserve"> Es la ontología instanciada con datos reales: entidades concretas, un cliente, un contrato, una garantía, conectadas por relaciones que se pueden recorrer. Responde a "qué entidades están relacionadas con este cliente y por qué caminos". Es la estructura natural para preguntas de varios saltos, las que en SQL exigen encadenar joins que nadie quiere escribir: concentración de riesgo a través de grupos económicos, redes de blanqueo, cadenas de garantías. Hay dos formas de tenerlo. La primera es dibujar el grafo sobre las tablas que ya existen, sin copiar nada: los datos se quedan donde están, los permisos son los del almacén, y basta para navegar conceptos, productos y métricas y para unir una tabla con otra por la relación correcta. La segunda es copiar las entidades y sus relaciones a una base de datos de grafos. Hace falta cuando la pregunta no es sobre un cliente sino sobre la forma de la red: qué clientes están unidos entre sí por avalistas o cuentas compartidas aunque nadie los haya declarado grupo, o qué sociedad aparece en medio de muchas operaciones sin ser titular de ninguna. Eso es lo que necesitan blanqueo y las concentraciones ocultas, y no se puede calcular sobre tablas. Lo que debe tener dueño y versión es la entidad resuelta: que el cliente 4711 del core, el 88-A del CRM y el firmante del contrato escaneado sean la misma persona.</w:t>
+        <w:t xml:space="preserve"> Es la ontología instanciada con datos reales: entidades concretas, un cliente, un contrato, una garantía, conectadas por relaciones que se pueden recorrer. Responde a "qué entidades están relacionadas con este cliente y por qué caminos". Es la estructura natural para preguntas de varios saltos, las que en SQL exigen encadenar joins que nadie quiere escribir: concentración de riesgo a través de grupos económicos, redes de blanqueo, cadenas de garantías. Hay dos formas de tenerlo. La primera es dibujar el grafo sobre las tablas que ya existen, sin copiar nada: los datos se quedan donde están, los permisos son los del almacén, y basta para navegar conceptos, productos y métricas y para unir una tabla con otra por la relación correcta. La segunda es copiar las entidades y sus relaciones a una base de datos de grafos. Hace falta cuando la pregunta no es sobre un cliente sino sobre la forma de la red: qué clientes están unidos entre sí por avalistas o cuentas compartidas aunque nadie los haya declarado grupo, o qué sociedad aparece en medio de muchas operaciones sin ser titular de ninguna. Eso es lo que necesitan blanqueo y las concentraciones ocultas, y no se puede calcular sobre tablas. Lo que debe tener dueño y versión aquí es la identidad de las entidades: la regla que dice cuándo dos registros son la misma persona (mismo NIF, o mismo nombre y fecha de nacimiento, o una decisión manual) y la tabla de correspondencias que resulta de aplicarla, la que dice que el cliente 4711 del core, el 88-A del CRM y el firmante del contrato escaneado son uno solo. En el banco eso ya existe para las tablas: es el fichero de personas, con su código de cliente único y el área que responde de él. Lo nuevo es extender esa responsabilidad a lo que llega de los documentos: cada vez que se extrae un firmante o un garante hay que vincularlo a un código de cliente, y ese vínculo, con su grado de confianza, se guarda en la misma tabla y lo revisa el mismo responsable. Versionar significa que, cuando cambia la regla o se corrige un vínculo, queda registrado desde cuándo.</w:t>
       </w:r>
     </w:p>
     <w:p>
@@ -376,7 +376,7 @@
           <w:p>
             <w:pPr/>
             <w:r>
-              <w:t xml:space="preserve">Entidad resuelta y relación</w:t>
+              <w:t xml:space="preserve">La identidad de cada entidad: la regla de correspondencia y los vínculos entre sistemas</w:t>
             </w:r>
           </w:p>
         </w:tc>

</xml_diff>

<commit_message>
Framework doc: enumerate structured-path options; bank position moved after evidence as hypothesis
Co-Authored-By: Claude Fable 5.1 <noreply@anthropic.com>
Claude-Session: https://claude.ai/code/session_013A7bCLd4PzhQYG95DagcQd
</commit_message>
<xml_diff>
--- a/docs/Semantica_grafos_agentes_banca.docx
+++ b/docs/Semantica_grafos_agentes_banca.docx
@@ -929,7 +929,43 @@
     <w:p>
       <w:pPr/>
       <w:r>
-        <w:t xml:space="preserve">Cuando el dato está en tablas, la pregunta es quién escribe la consulta y con qué ayuda. Las opciones, de menos a más control: que el LLM escriba SQL viendo solo el esquema; que lo escriba con las definiciones de negocio delante, el contexto semántico; que consulte conceptos en un grafo con ontología y el grafo traduzca a SQL; que un grafo del esquema le diga qué tablas unir; o que el LLM no escriba la consulta y solo elija métrica, dimensiones y fecha para que un compilador la genere, text-to-metrics. El banco ha elegido la última para la vía certificada y mantiene la segunda como vía exploratoria; el porqué está en Capa semántica · 0 Concepto. Lo que sigue explica qué aportan los grafos en esta vía y qué dice la evidencia.</w:t>
+        <w:t xml:space="preserve">Cuando el dato está en tablas, la pregunta es quién escribe la consulta y con qué ayuda. Las opciones, de menos a más control:</w:t>
+      </w:r>
+    </w:p>
+    <w:p>
+      <w:pPr/>
+      <w:r>
+        <w:t xml:space="preserve">a) Text-to-SQL sobre el esquema: el LLM escribe el SQL viendo solo los nombres de tablas y columnas.</w:t>
+      </w:r>
+    </w:p>
+    <w:p>
+      <w:pPr/>
+      <w:r>
+        <w:t xml:space="preserve">b) Text-to-SQL con contexto semántico: el LLM escribe el SQL con las definiciones de negocio delante, los YAML de la capa semántica.</w:t>
+      </w:r>
+    </w:p>
+    <w:p>
+      <w:pPr/>
+      <w:r>
+        <w:t xml:space="preserve">c) Grafo con ontología: el LLM consulta conceptos de negocio en un grafo virtual y el grafo traduce la consulta a SQL.</w:t>
+      </w:r>
+    </w:p>
+    <w:p>
+      <w:pPr/>
+      <w:r>
+        <w:t xml:space="preserve">d) Grafo del esquema: un grafo de tablas y claves le dice al LLM qué tablas unir, y el LLM escribe el SQL con esa ruta.</w:t>
+      </w:r>
+    </w:p>
+    <w:p>
+      <w:pPr/>
+      <w:r>
+        <w:t xml:space="preserve">e) Text-to-metrics: el LLM no escribe la consulta; elige métrica, dimensiones, filtros y fecha, y un compilador genera el SQL con reglas fijas.</w:t>
+      </w:r>
+    </w:p>
+    <w:p>
+      <w:pPr/>
+      <w:r>
+        <w:t xml:space="preserve">Lo que sigue explica qué aportan los grafos, opciones c y d, frente a la capa de métricas, opción e, y qué dice la evidencia sobre el acierto de cada una. Dónde está el banco en este abanico se dice al final, cuando se han visto los resultados.</w:t>
       </w:r>
     </w:p>
     <w:p>
@@ -2783,6 +2819,18 @@
       </w:hyperlink>
       <w:r>
         <w:t xml:space="preserve">). La lectura para el banco es la misma en los dos: la fiabilidad viene de las reglas y del compilador, no del tamaño del modelo, así que la inversión va al YAML y a la vía certificada, no a modelos más grandes. Es exactamente el diseño de text-to-metrics, y para un entorno regulado es el único defendible, porque la consulta que se ejecuta es siempre una que alguien ha aprobado.</w:t>
+      </w:r>
+    </w:p>
+    <w:p>
+      <w:pPr/>
+      <w:r>
+        <w:rPr>
+          <w:b/>
+        </w:rPr>
+        <w:t xml:space="preserve">Dónde está el banco.</w:t>
+      </w:r>
+      <w:r>
+        <w:t xml:space="preserve"> Ha hecho una PoC con la opción b, text-to-SQL con los YAML como contexto, que funcionó bien para un número limitado de vistas, y va a hacer la siguiente con la opción e, text-to-metrics, porque con la evidencia disponible es la que da mejor relación entre acierto y esfuerzo: elimina los errores de SQL dentro de lo que cubre, y lo que no cubre lo convierte en «no puedo». Es una hipótesis a confirmar con el banco de pruebas propio. Si se confirma, la opción e será la vía certificada y la b seguirá como vía exploratoria. El detalle está en Capa semántica · 0 Concepto.</w:t>
       </w:r>
     </w:p>
     <w:p>

</xml_diff>

<commit_message>
Framework doc: two-step reparto diagram; bold 100% rows in studies table
Co-Authored-By: Claude Fable 5.1 <noreply@anthropic.com>
Claude-Session: https://claude.ai/code/session_013A7bCLd4PzhQYG95DagcQd
</commit_message>
<xml_diff>
--- a/docs/Semantica_grafos_agentes_banca.docx
+++ b/docs/Semantica_grafos_agentes_banca.docx
@@ -1794,10 +1794,10 @@
         <w:rPr>
           <w:b/>
         </w:rPr>
-        <w:t xml:space="preserve">El reparto que proponemos como evolución.</w:t>
-      </w:r>
-      <w:r>
-        <w:t xml:space="preserve"> El agente pregunta al grafo qué significa algo y qué métrica lo responde; pide la cifra a la capa de métricas; el almacén la calcula.</w:t>
+        <w:t xml:space="preserve">El reparto que proponemos, en dos pasos.</w:t>
+      </w:r>
+      <w:r>
+        <w:t xml:space="preserve"> Hoy, sin grafo: el agente pregunta a la capa de métricas qué existe y qué significa, y las herramientas list_metrics y describe_metric responden leyendo el YAML; después le pide la cifra y el almacén la calcula. Mañana, si los casos de uso lo piden, un grafo de conocimiento cargado desde los mismos YAML, más el linaje de Rosetta, hace de mapa para las preguntas que la capa de métricas no responde: qué se relaciona con qué, de dónde sale un dato, qué métrica es la oficial y quién responde de ella. Se hace en este orden para no esperar al grafo. El YAML es otra expresión de la misma información, y pasar del primer paso al segundo es cargar lo que ya está escrito, no volver a definirlo: la capa de métricas no cambia, solo se le pone un mapa al lado.</w:t>
       </w:r>
     </w:p>
     <w:p>
@@ -1805,13 +1805,13 @@
       <w:r>
         <w:drawing>
           <wp:inline distT="0" distB="0" distL="0" distR="0">
-            <wp:extent cx="5486400" cy="3012621"/>
-            <wp:docPr id="2" name="image2" descr="reparto entre grafo, capa de métricas y almacén · el grafo responde qué, la capa cuánto"/>
+            <wp:extent cx="5486400" cy="5535385"/>
+            <wp:docPr id="2" name="image2" descr="reparto en dos pasos · hoy la fachada responde desde el YAML; mañana el grafo, cargado desde los mismos YAML"/>
             <a:graphic xmlns:a="http://schemas.openxmlformats.org/drawingml/2006/main">
               <a:graphicData uri="http://schemas.openxmlformats.org/drawingml/2006/picture">
                 <pic:pic xmlns:pic="http://schemas.openxmlformats.org/drawingml/2006/picture">
                   <pic:nvPicPr>
-                    <pic:cNvPr id="2" name="image2" descr="reparto entre grafo, capa de métricas y almacén · el grafo responde qué, la capa cuánto"/>
+                    <pic:cNvPr id="2" name="image2" descr="reparto en dos pasos · hoy la fachada responde desde el YAML; mañana el grafo, cargado desde los mismos YAML"/>
                     <pic:cNvPicPr/>
                   </pic:nvPicPr>
                   <pic:blipFill>
@@ -1823,7 +1823,7 @@
                   <pic:spPr>
                     <a:xfrm>
                       <a:off x="0" y="0"/>
-                      <a:ext cx="5486400" cy="3012621"/>
+                      <a:ext cx="5486400" cy="5535385"/>
                     </a:xfrm>
                     <a:prstGeom prst="rect">
                       <a:avLst/>
@@ -1839,7 +1839,7 @@
     <w:p>
       <w:pPr/>
       <w:r>
-        <w:t xml:space="preserve">reparto entre grafo, capa de métricas y almacén · el grafo responde qué, la capa cuánto</w:t>
+        <w:t xml:space="preserve">reparto en dos pasos · hoy la fachada responde desde el YAML; mañana el grafo, cargado desde los mismos YAML</w:t>
       </w:r>
     </w:p>
     <w:p>
@@ -2555,6 +2555,9 @@
           <w:p>
             <w:pPr/>
             <w:r>
+              <w:rPr>
+                <w:b/>
+              </w:rPr>
               <w:t xml:space="preserve">Text-to-metrics</w:t>
             </w:r>
           </w:p>
@@ -2566,6 +2569,9 @@
           <w:p>
             <w:pPr/>
             <w:r>
+              <w:rPr>
+                <w:b/>
+              </w:rPr>
               <w:t xml:space="preserve">dbt Labs, 2026</w:t>
             </w:r>
           </w:p>
@@ -2577,6 +2583,9 @@
           <w:p>
             <w:pPr/>
             <w:r>
+              <w:rPr>
+                <w:b/>
+              </w:rPr>
               <w:t xml:space="preserve">Seguros ACME, solo las preguntas que el modelo cubre</w:t>
             </w:r>
           </w:p>
@@ -2588,6 +2597,9 @@
           <w:p>
             <w:pPr/>
             <w:r>
+              <w:rPr>
+                <w:b/>
+              </w:rPr>
               <w:t xml:space="preserve">Claude Sonnet 4.6 / GPT-5.3 Codex</w:t>
             </w:r>
           </w:p>
@@ -2599,6 +2611,9 @@
           <w:p>
             <w:pPr/>
             <w:r>
+              <w:rPr>
+                <w:b/>
+              </w:rPr>
               <w:t xml:space="preserve">100 % / 100 %</w:t>
             </w:r>
           </w:p>
@@ -2669,6 +2684,9 @@
           <w:p>
             <w:pPr/>
             <w:r>
+              <w:rPr>
+                <w:b/>
+              </w:rPr>
               <w:t xml:space="preserve">Text-to-metrics</w:t>
             </w:r>
           </w:p>
@@ -2680,6 +2698,9 @@
           <w:p>
             <w:pPr/>
             <w:r>
+              <w:rPr>
+                <w:b/>
+              </w:rPr>
               <w:t xml:space="preserve">dbt Labs, 2026</w:t>
             </w:r>
           </w:p>
@@ -2691,6 +2712,9 @@
           <w:p>
             <w:pPr/>
             <w:r>
+              <w:rPr>
+                <w:b/>
+              </w:rPr>
               <w:t xml:space="preserve">El mismo, tras ampliar la cobertura con 3 tablas preparadas</w:t>
             </w:r>
           </w:p>
@@ -2702,6 +2726,9 @@
           <w:p>
             <w:pPr/>
             <w:r>
+              <w:rPr>
+                <w:b/>
+              </w:rPr>
               <w:t xml:space="preserve">Claude Sonnet 4.6 / GPT-5.3 Codex</w:t>
             </w:r>
           </w:p>
@@ -2713,6 +2740,9 @@
           <w:p>
             <w:pPr/>
             <w:r>
+              <w:rPr>
+                <w:b/>
+              </w:rPr>
               <w:t xml:space="preserve">98,2 % / 100 %</w:t>
             </w:r>
           </w:p>

</xml_diff>

<commit_message>
Framework doc: scope paragraph (applies when an agent intervenes)
Co-Authored-By: Claude Fable 5.1 <noreply@anthropic.com>
Claude-Session: https://claude.ai/code/session_013A7bCLd4PzhQYG95DagcQd
</commit_message>
<xml_diff>
--- a/docs/Semantica_grafos_agentes_banca.docx
+++ b/docs/Semantica_grafos_agentes_banca.docx
@@ -25,6 +25,18 @@
       </w:pPr>
       <w:r>
         <w:t xml:space="preserve">Resumen ejecutivo</w:t>
+      </w:r>
+    </w:p>
+    <w:p>
+      <w:pPr/>
+      <w:r>
+        <w:rPr>
+          <w:b/>
+        </w:rPr>
+        <w:t xml:space="preserve">Alcance.</w:t>
+      </w:r>
+      <w:r>
+        <w:t xml:space="preserve"> Todo lo que sigue aplica cuando un agente de IA interviene en el proceso: consulta datos, lee documentos o toma o prepara una decisión. Cuando quien lo hace es una persona, estas funciones ya están contempladas, en mayor o menor medida, en el gobierno del dato actual: las definiciones en el diccionario y en los informes, la versión vigente de una política en su dueño, las relaciones entre clientes en los analistas que las cruzan a mano, y el porqué de una excepción en un correo o un acta. Lo que cambia con el agente es que lo que una persona hacía de forma implícita, y corregía cuando algo le extrañaba, tiene que estar explícito, legible por máquina y comprobado antes de usarse. Las piezas que se construyen para el agente sirven también a las personas: la misma capa semántica que da cifras certificadas al agente da consistencia a los informes de BI.</w:t>
       </w:r>
     </w:p>
     <w:p>

</xml_diff>

<commit_message>
Framework doc: refactor structured path into four steps (options and evidence, what a graph changes, where each wins, two-step split)
Co-Authored-By: Claude Fable 5.1 <noreply@anthropic.com>
Claude-Session: https://claude.ai/code/session_013A7bCLd4PzhQYG95DagcQd
</commit_message>
<xml_diff>
--- a/docs/Semantica_grafos_agentes_banca.docx
+++ b/docs/Semantica_grafos_agentes_banca.docx
@@ -941,7 +941,19 @@
     <w:p>
       <w:pPr/>
       <w:r>
-        <w:t xml:space="preserve">Cuando el dato está en tablas, la pregunta es quién escribe la consulta y con qué ayuda. Las opciones, de menos a más control:</w:t>
+        <w:t xml:space="preserve">Cuando el dato está en tablas, la pregunta es quién escribe la consulta y con qué ayuda. Hay cinco opciones, y esta parte las recorre en cuatro pasos: qué es cada una y qué acierto se ha medido; qué cambia cuando entra un grafo; en qué preguntas gana cada enfoque; y el reparto que proponemos.</w:t>
+      </w:r>
+    </w:p>
+    <w:p>
+      <w:pPr/>
+      <w:r>
+        <w:rPr>
+          <w:b/>
+        </w:rPr>
+        <w:t xml:space="preserve">1. Las opciones y su acierto medido.</w:t>
+      </w:r>
+      <w:r>
+        <w:t xml:space="preserve"> De menos a más control:</w:t>
       </w:r>
     </w:p>
     <w:p>
@@ -977,25 +989,7 @@
     <w:p>
       <w:pPr/>
       <w:r>
-        <w:t xml:space="preserve">Lo que sigue explica qué aportan los grafos, opciones c y d, frente a la capa de métricas, opción e, y qué dice la evidencia sobre el acierto de cada una. Dónde está el banco en este abanico se dice al final, cuando se han visto los resultados.</w:t>
-      </w:r>
-    </w:p>
-    <w:p>
-      <w:pPr/>
-      <w:r>
-        <w:t xml:space="preserve">Un grafo no sustituye a la capa de métricas para calcular cifras: la complementa como mapa. El grafo dice qué significa cada cosa, cómo se conecta y de dónde viene; la capa de métricas dice cómo se calcula; el almacén ejecuta.</w:t>
-      </w:r>
-    </w:p>
-    <w:p>
-      <w:pPr/>
-      <w:r>
-        <w:rPr>
-          <w:b/>
-        </w:rPr>
-        <w:t xml:space="preserve">Tres usos de un grafo cuando hay un almacén detrás.</w:t>
-      </w:r>
-      <w:r>
-        <w:t xml:space="preserve"> En el mercado y en la investigación reciente el grafo aparece de tres formas distintas, y conviene no mezclarlas.</w:t>
+        <w:t xml:space="preserve">Los estudios disponibles miden estas opciones con modelos y bancos de pruebas distintos, así que los porcentajes solo se comparan dentro de cada estudio. En la tabla, «LLM sobre tablas» es la opción a, «contexto semántico» la b, «grafo con ontología» la c y «text-to-metrics» la e. La opción d, el grafo del esquema, no tiene una medición comparable: sus autores publican resultados en los benchmarks académicos BIRD y Spider 2.0, pero no contra las otras opciones sobre las mismas preguntas. Conviene leer la tabla sabiendo quién la firma: casi todos los estudios son de proveedores con producto propio.</w:t>
       </w:r>
     </w:p>
     <w:tbl>
@@ -1024,7 +1018,7 @@
           <w:p>
             <w:pPr/>
             <w:r>
-              <w:t xml:space="preserve">Uso</w:t>
+              <w:t xml:space="preserve">Enfoque</w:t>
             </w:r>
           </w:p>
         </w:tc>
@@ -1036,7 +1030,7 @@
           <w:p>
             <w:pPr/>
             <w:r>
-              <w:t xml:space="preserve">Qué hace</w:t>
+              <w:t xml:space="preserve">Estudio y año</w:t>
             </w:r>
           </w:p>
         </w:tc>
@@ -1048,7 +1042,7 @@
           <w:p>
             <w:pPr/>
             <w:r>
-              <w:t xml:space="preserve">Ejemplos</w:t>
+              <w:t xml:space="preserve">Banco de pruebas</w:t>
             </w:r>
           </w:p>
         </w:tc>
@@ -1060,7 +1054,7 @@
           <w:p>
             <w:pPr/>
             <w:r>
-              <w:t xml:space="preserve">Qué aporta</w:t>
+              <w:t xml:space="preserve">Modelo</w:t>
             </w:r>
           </w:p>
         </w:tc>
@@ -1072,7 +1066,7 @@
           <w:p>
             <w:pPr/>
             <w:r>
-              <w:t xml:space="preserve">Qué no resuelve</w:t>
+              <w:t xml:space="preserve">Acierto</w:t>
             </w:r>
           </w:p>
         </w:tc>
@@ -1085,18 +1079,7 @@
           <w:p>
             <w:pPr/>
             <w:r>
-              <w:t xml:space="preserve">Grafo del esquema para text-to-SQL</w:t>
-            </w:r>
-          </w:p>
-        </w:tc>
-        <w:tc>
-          <w:tcPr>
-            <w:tcW w:w="1872" w:type="dxa"/>
-          </w:tcPr>
-          <w:p>
-            <w:pPr/>
-            <w:r>
-              <w:t xml:space="preserve">Tablas y claves como grafo; un algoritmo de caminos indica al LLM qué tablas unir y por qué ruta</w:t>
+              <w:t xml:space="preserve">LLM sobre tablas</w:t>
             </w:r>
           </w:p>
         </w:tc>
@@ -1111,33 +1094,41 @@
                 <w:rPr>
                   <w:rStyle w:val="Hyperlink"/>
                 </w:rPr>
-                <w:t xml:space="preserve">QueryWeaver (FalkorDB)</w:t>
+                <w:t xml:space="preserve">dbt Labs, 2026</w:t>
               </w:r>
             </w:hyperlink>
-            <w:r>
-              <w:t xml:space="preserve">, SchemaGraphSQL (EACL 2026)</w:t>
-            </w:r>
-          </w:p>
-        </w:tc>
-        <w:tc>
-          <w:tcPr>
-            <w:tcW w:w="1872" w:type="dxa"/>
-          </w:tcPr>
-          <w:p>
-            <w:pPr/>
-            <w:r>
-              <w:t xml:space="preserve">Mejor elección de tablas y joins, sobre todo con tablas puente</w:t>
-            </w:r>
-          </w:p>
-        </w:tc>
-        <w:tc>
-          <w:tcPr>
-            <w:tcW w:w="1872" w:type="dxa"/>
-          </w:tcPr>
-          <w:p>
-            <w:pPr/>
-            <w:r>
-              <w:t xml:space="preserve">El LLM sigue escribiendo el SQL; no sabe que un saldo es una foto</w:t>
+          </w:p>
+        </w:tc>
+        <w:tc>
+          <w:tcPr>
+            <w:tcW w:w="1872" w:type="dxa"/>
+          </w:tcPr>
+          <w:p>
+            <w:pPr/>
+            <w:r>
+              <w:t xml:space="preserve">Seguros ACME (data.world), 11 preguntas × 20 ejecuciones</w:t>
+            </w:r>
+          </w:p>
+        </w:tc>
+        <w:tc>
+          <w:tcPr>
+            <w:tcW w:w="1872" w:type="dxa"/>
+          </w:tcPr>
+          <w:p>
+            <w:pPr/>
+            <w:r>
+              <w:t xml:space="preserve">Claude Sonnet 4.6 / GPT-5.3 Codex</w:t>
+            </w:r>
+          </w:p>
+        </w:tc>
+        <w:tc>
+          <w:tcPr>
+            <w:tcW w:w="1872" w:type="dxa"/>
+          </w:tcPr>
+          <w:p>
+            <w:pPr/>
+            <w:r>
+              <w:t xml:space="preserve">64,5 % / 64,5 %</w:t>
             </w:r>
           </w:p>
         </w:tc>
@@ -1150,51 +1141,51 @@
           <w:p>
             <w:pPr/>
             <w:r>
-              <w:t xml:space="preserve">Grafo virtual con ontología</w:t>
-            </w:r>
-          </w:p>
-        </w:tc>
-        <w:tc>
-          <w:tcPr>
-            <w:tcW w:w="1872" w:type="dxa"/>
-          </w:tcPr>
-          <w:p>
-            <w:pPr/>
-            <w:r>
-              <w:t xml:space="preserve">El LLM consulta conceptos de negocio (SPARQL o SQL sobre la ontología); la consulta se traduce a SQL y la ejecuta el almacén</w:t>
-            </w:r>
-          </w:p>
-        </w:tc>
-        <w:tc>
-          <w:tcPr>
-            <w:tcW w:w="1872" w:type="dxa"/>
-          </w:tcPr>
-          <w:p>
-            <w:pPr/>
-            <w:r>
-              <w:t xml:space="preserve">Stardog, Timbr, data.world</w:t>
-            </w:r>
-          </w:p>
-        </w:tc>
-        <w:tc>
-          <w:tcPr>
-            <w:tcW w:w="1872" w:type="dxa"/>
-          </w:tcPr>
-          <w:p>
-            <w:pPr/>
-            <w:r>
-              <w:t xml:space="preserve">Más acierto: el LLM razona con conceptos y relaciones con nombre</w:t>
-            </w:r>
-          </w:p>
-        </w:tc>
-        <w:tc>
-          <w:tcPr>
-            <w:tcW w:w="1872" w:type="dxa"/>
-          </w:tcPr>
-          <w:p>
-            <w:pPr/>
-            <w:r>
-              <w:t xml:space="preserve">Sigue siendo el LLM escribiendo consultas; acierto alto, pero no garantizado</w:t>
+              <w:t xml:space="preserve">LLM sobre tablas</w:t>
+            </w:r>
+          </w:p>
+        </w:tc>
+        <w:tc>
+          <w:tcPr>
+            <w:tcW w:w="1872" w:type="dxa"/>
+          </w:tcPr>
+          <w:p>
+            <w:pPr/>
+            <w:r>
+              <w:t xml:space="preserve">dbt Labs, 2026</w:t>
+            </w:r>
+          </w:p>
+        </w:tc>
+        <w:tc>
+          <w:tcPr>
+            <w:tcW w:w="1872" w:type="dxa"/>
+          </w:tcPr>
+          <w:p>
+            <w:pPr/>
+            <w:r>
+              <w:t xml:space="preserve">El mismo, con 3 tablas preparadas añadidas</w:t>
+            </w:r>
+          </w:p>
+        </w:tc>
+        <w:tc>
+          <w:tcPr>
+            <w:tcW w:w="1872" w:type="dxa"/>
+          </w:tcPr>
+          <w:p>
+            <w:pPr/>
+            <w:r>
+              <w:t xml:space="preserve">Claude Sonnet 4.6 / GPT-5.3 Codex</w:t>
+            </w:r>
+          </w:p>
+        </w:tc>
+        <w:tc>
+          <w:tcPr>
+            <w:tcW w:w="1872" w:type="dxa"/>
+          </w:tcPr>
+          <w:p>
+            <w:pPr/>
+            <w:r>
+              <w:t xml:space="preserve">90,0 % / 84,1 %</w:t>
             </w:r>
           </w:p>
         </w:tc>
@@ -1207,51 +1198,686 @@
           <w:p>
             <w:pPr/>
             <w:r>
-              <w:t xml:space="preserve">Grafo como almacén</w:t>
-            </w:r>
-          </w:p>
-        </w:tc>
-        <w:tc>
-          <w:tcPr>
-            <w:tcW w:w="1872" w:type="dxa"/>
-          </w:tcPr>
-          <w:p>
-            <w:pPr/>
-            <w:r>
-              <w:t xml:space="preserve">Las entidades y sus relaciones se cargan en una base de grafos</w:t>
-            </w:r>
-          </w:p>
-        </w:tc>
-        <w:tc>
-          <w:tcPr>
-            <w:tcW w:w="1872" w:type="dxa"/>
-          </w:tcPr>
-          <w:p>
-            <w:pPr/>
-            <w:r>
-              <w:t xml:space="preserve">Neo4j, FalkorDB</w:t>
-            </w:r>
-          </w:p>
-        </w:tc>
-        <w:tc>
-          <w:tcPr>
-            <w:tcW w:w="1872" w:type="dxa"/>
-          </w:tcPr>
-          <w:p>
-            <w:pPr/>
-            <w:r>
-              <w:t xml:space="preserve">Preguntas de relaciones a varios saltos</w:t>
-            </w:r>
-          </w:p>
-        </w:tc>
-        <w:tc>
-          <w:tcPr>
-            <w:tcW w:w="1872" w:type="dxa"/>
-          </w:tcPr>
-          <w:p>
-            <w:pPr/>
-            <w:r>
-              <w:t xml:space="preserve">Agregaciones masivas; exige copiar datos</w:t>
+              <w:t xml:space="preserve">LLM sobre tablas</w:t>
+            </w:r>
+          </w:p>
+        </w:tc>
+        <w:tc>
+          <w:tcPr>
+            <w:tcW w:w="1872" w:type="dxa"/>
+          </w:tcPr>
+          <w:p>
+            <w:pPr/>
+            <w:hyperlink r:id="rId14" w:history="1">
+              <w:r>
+                <w:rPr>
+                  <w:rStyle w:val="Hyperlink"/>
+                </w:rPr>
+                <w:t xml:space="preserve">Cube, 2026</w:t>
+              </w:r>
+            </w:hyperlink>
+          </w:p>
+        </w:tc>
+        <w:tc>
+          <w:tcPr>
+            <w:tcW w:w="1872" w:type="dxa"/>
+          </w:tcPr>
+          <w:p>
+            <w:pPr/>
+            <w:r>
+              <w:t xml:space="preserve">Comercio minorista (Contoso), 99 preguntas</w:t>
+            </w:r>
+          </w:p>
+        </w:tc>
+        <w:tc>
+          <w:tcPr>
+            <w:tcW w:w="1872" w:type="dxa"/>
+          </w:tcPr>
+          <w:p>
+            <w:pPr/>
+            <w:r>
+              <w:t xml:space="preserve">Claude Opus 4.7 / Sonnet 4.6 / GPT-5.4</w:t>
+            </w:r>
+          </w:p>
+        </w:tc>
+        <w:tc>
+          <w:tcPr>
+            <w:tcW w:w="1872" w:type="dxa"/>
+          </w:tcPr>
+          <w:p>
+            <w:pPr/>
+            <w:r>
+              <w:t xml:space="preserve">50,5 % / 46,5 % / 45,5 %</w:t>
+            </w:r>
+          </w:p>
+        </w:tc>
+      </w:tr>
+      <w:tr>
+        <w:tc>
+          <w:tcPr>
+            <w:tcW w:w="1872" w:type="dxa"/>
+          </w:tcPr>
+          <w:p>
+            <w:pPr/>
+            <w:r>
+              <w:t xml:space="preserve">LLM sobre tablas, con pistas por pregunta</w:t>
+            </w:r>
+          </w:p>
+        </w:tc>
+        <w:tc>
+          <w:tcPr>
+            <w:tcW w:w="1872" w:type="dxa"/>
+          </w:tcPr>
+          <w:p>
+            <w:pPr/>
+            <w:hyperlink r:id="rId15" w:history="1">
+              <w:r>
+                <w:rPr>
+                  <w:rStyle w:val="Hyperlink"/>
+                </w:rPr>
+                <w:t xml:space="preserve">BIRD: Gemini-SQL2, junio 2026</w:t>
+              </w:r>
+            </w:hyperlink>
+          </w:p>
+        </w:tc>
+        <w:tc>
+          <w:tcPr>
+            <w:tcW w:w="1872" w:type="dxa"/>
+          </w:tcPr>
+          <w:p>
+            <w:pPr/>
+            <w:r>
+              <w:t xml:space="preserve">Académico: 12.751 preguntas, 95 bases de datos, 37 dominios</w:t>
+            </w:r>
+          </w:p>
+        </w:tc>
+        <w:tc>
+          <w:tcPr>
+            <w:tcW w:w="1872" w:type="dxa"/>
+          </w:tcPr>
+          <w:p>
+            <w:pPr/>
+            <w:r>
+              <w:t xml:space="preserve">Gemini 3.1 Pro, mejor modelo único</w:t>
+            </w:r>
+          </w:p>
+        </w:tc>
+        <w:tc>
+          <w:tcPr>
+            <w:tcW w:w="1872" w:type="dxa"/>
+          </w:tcPr>
+          <w:p>
+            <w:pPr/>
+            <w:r>
+              <w:t xml:space="preserve">80,04 % (personas: 92,96 %)</w:t>
+            </w:r>
+          </w:p>
+        </w:tc>
+      </w:tr>
+      <w:tr>
+        <w:tc>
+          <w:tcPr>
+            <w:tcW w:w="1872" w:type="dxa"/>
+          </w:tcPr>
+          <w:p>
+            <w:pPr/>
+            <w:r>
+              <w:t xml:space="preserve">LLM sobre tablas</w:t>
+            </w:r>
+          </w:p>
+        </w:tc>
+        <w:tc>
+          <w:tcPr>
+            <w:tcW w:w="1872" w:type="dxa"/>
+          </w:tcPr>
+          <w:p>
+            <w:pPr/>
+            <w:hyperlink r:id="rId16" w:history="1">
+              <w:r>
+                <w:rPr>
+                  <w:rStyle w:val="Hyperlink"/>
+                </w:rPr>
+                <w:t xml:space="preserve">Spider 2.0, ICLR 2025</w:t>
+              </w:r>
+            </w:hyperlink>
+          </w:p>
+        </w:tc>
+        <w:tc>
+          <w:tcPr>
+            <w:tcW w:w="1872" w:type="dxa"/>
+          </w:tcPr>
+          <w:p>
+            <w:pPr/>
+            <w:r>
+              <w:t xml:space="preserve">Flujos empresariales reales en BigQuery, Snowflake y dbt; unas 800 columnas por base</w:t>
+            </w:r>
+          </w:p>
+        </w:tc>
+        <w:tc>
+          <w:tcPr>
+            <w:tcW w:w="1872" w:type="dxa"/>
+          </w:tcPr>
+          <w:p>
+            <w:pPr/>
+            <w:r>
+              <w:t xml:space="preserve">o1-preview / Claude 3.5 Sonnet / GPT-4o</w:t>
+            </w:r>
+          </w:p>
+        </w:tc>
+        <w:tc>
+          <w:tcPr>
+            <w:tcW w:w="1872" w:type="dxa"/>
+          </w:tcPr>
+          <w:p>
+            <w:pPr/>
+            <w:r>
+              <w:t xml:space="preserve">21,4 % / 14,9 % / 12,3 %</w:t>
+            </w:r>
+          </w:p>
+        </w:tc>
+      </w:tr>
+      <w:tr>
+        <w:tc>
+          <w:tcPr>
+            <w:tcW w:w="1872" w:type="dxa"/>
+          </w:tcPr>
+          <w:p>
+            <w:pPr/>
+            <w:r>
+              <w:t xml:space="preserve">Contexto semántico</w:t>
+            </w:r>
+          </w:p>
+        </w:tc>
+        <w:tc>
+          <w:tcPr>
+            <w:tcW w:w="1872" w:type="dxa"/>
+          </w:tcPr>
+          <w:p>
+            <w:pPr/>
+            <w:r>
+              <w:t xml:space="preserve">Cube, 2026</w:t>
+            </w:r>
+          </w:p>
+        </w:tc>
+        <w:tc>
+          <w:tcPr>
+            <w:tcW w:w="1872" w:type="dxa"/>
+          </w:tcPr>
+          <w:p>
+            <w:pPr/>
+            <w:r>
+              <w:t xml:space="preserve">Contoso, con un documento semántico de 4 KB</w:t>
+            </w:r>
+          </w:p>
+        </w:tc>
+        <w:tc>
+          <w:tcPr>
+            <w:tcW w:w="1872" w:type="dxa"/>
+          </w:tcPr>
+          <w:p>
+            <w:pPr/>
+            <w:r>
+              <w:t xml:space="preserve">Claude Opus 4.7 / Sonnet 4.6 / GPT-5.4</w:t>
+            </w:r>
+          </w:p>
+        </w:tc>
+        <w:tc>
+          <w:tcPr>
+            <w:tcW w:w="1872" w:type="dxa"/>
+          </w:tcPr>
+          <w:p>
+            <w:pPr/>
+            <w:r>
+              <w:t xml:space="preserve">67,7 % / 68,7 % / 68,7 %</w:t>
+            </w:r>
+          </w:p>
+        </w:tc>
+      </w:tr>
+      <w:tr>
+        <w:tc>
+          <w:tcPr>
+            <w:tcW w:w="1872" w:type="dxa"/>
+          </w:tcPr>
+          <w:p>
+            <w:pPr/>
+            <w:r>
+              <w:t xml:space="preserve">Contexto semántico</w:t>
+            </w:r>
+          </w:p>
+        </w:tc>
+        <w:tc>
+          <w:tcPr>
+            <w:tcW w:w="1872" w:type="dxa"/>
+          </w:tcPr>
+          <w:p>
+            <w:pPr/>
+            <w:hyperlink r:id="rId17" w:history="1">
+              <w:r>
+                <w:rPr>
+                  <w:rStyle w:val="Hyperlink"/>
+                </w:rPr>
+                <w:t xml:space="preserve">Snowflake, 2024</w:t>
+              </w:r>
+            </w:hyperlink>
+          </w:p>
+        </w:tc>
+        <w:tc>
+          <w:tcPr>
+            <w:tcW w:w="1872" w:type="dxa"/>
+          </w:tcPr>
+          <w:p>
+            <w:pPr/>
+            <w:r>
+              <w:t xml:space="preserve">Interno, 150 preguntas; mide coincidencia de columnas, no ejecución</w:t>
+            </w:r>
+          </w:p>
+        </w:tc>
+        <w:tc>
+          <w:tcPr>
+            <w:tcW w:w="1872" w:type="dxa"/>
+          </w:tcPr>
+          <w:p>
+            <w:pPr/>
+            <w:r>
+              <w:t xml:space="preserve">Cortex Analyst frente a GPT-4o sobre tablas</w:t>
+            </w:r>
+          </w:p>
+        </w:tc>
+        <w:tc>
+          <w:tcPr>
+            <w:tcW w:w="1872" w:type="dxa"/>
+          </w:tcPr>
+          <w:p>
+            <w:pPr/>
+            <w:r>
+              <w:t xml:space="preserve">Más del 90 % frente a 51 %</w:t>
+            </w:r>
+          </w:p>
+        </w:tc>
+      </w:tr>
+      <w:tr>
+        <w:tc>
+          <w:tcPr>
+            <w:tcW w:w="1872" w:type="dxa"/>
+          </w:tcPr>
+          <w:p>
+            <w:pPr/>
+            <w:r>
+              <w:t xml:space="preserve">Grafo con ontología</w:t>
+            </w:r>
+          </w:p>
+        </w:tc>
+        <w:tc>
+          <w:tcPr>
+            <w:tcW w:w="1872" w:type="dxa"/>
+          </w:tcPr>
+          <w:p>
+            <w:pPr/>
+            <w:hyperlink r:id="rId18" w:history="1">
+              <w:r>
+                <w:rPr>
+                  <w:rStyle w:val="Hyperlink"/>
+                </w:rPr>
+                <w:t xml:space="preserve">data.world, 2023</w:t>
+              </w:r>
+            </w:hyperlink>
+          </w:p>
+        </w:tc>
+        <w:tc>
+          <w:tcPr>
+            <w:tcW w:w="1872" w:type="dxa"/>
+          </w:tcPr>
+          <w:p>
+            <w:pPr/>
+            <w:r>
+              <w:t xml:space="preserve">Seguros ACME</w:t>
+            </w:r>
+          </w:p>
+        </w:tc>
+        <w:tc>
+          <w:tcPr>
+            <w:tcW w:w="1872" w:type="dxa"/>
+          </w:tcPr>
+          <w:p>
+            <w:pPr/>
+            <w:r>
+              <w:t xml:space="preserve">GPT-4</w:t>
+            </w:r>
+          </w:p>
+        </w:tc>
+        <w:tc>
+          <w:tcPr>
+            <w:tcW w:w="1872" w:type="dxa"/>
+          </w:tcPr>
+          <w:p>
+            <w:pPr/>
+            <w:r>
+              <w:t xml:space="preserve">54,2 % (sobre tablas: 16,7 %)</w:t>
+            </w:r>
+          </w:p>
+        </w:tc>
+      </w:tr>
+      <w:tr>
+        <w:tc>
+          <w:tcPr>
+            <w:tcW w:w="1872" w:type="dxa"/>
+          </w:tcPr>
+          <w:p>
+            <w:pPr/>
+            <w:r>
+              <w:t xml:space="preserve">Grafo con ontología</w:t>
+            </w:r>
+          </w:p>
+        </w:tc>
+        <w:tc>
+          <w:tcPr>
+            <w:tcW w:w="1872" w:type="dxa"/>
+          </w:tcPr>
+          <w:p>
+            <w:pPr/>
+            <w:hyperlink r:id="rId19" w:history="1">
+              <w:r>
+                <w:rPr>
+                  <w:rStyle w:val="Hyperlink"/>
+                </w:rPr>
+                <w:t xml:space="preserve">data.world, 2024</w:t>
+              </w:r>
+            </w:hyperlink>
+          </w:p>
+        </w:tc>
+        <w:tc>
+          <w:tcPr>
+            <w:tcW w:w="1872" w:type="dxa"/>
+          </w:tcPr>
+          <w:p>
+            <w:pPr/>
+            <w:r>
+              <w:t xml:space="preserve">El mismo, con comprobación contra la ontología y reparación</w:t>
+            </w:r>
+          </w:p>
+        </w:tc>
+        <w:tc>
+          <w:tcPr>
+            <w:tcW w:w="1872" w:type="dxa"/>
+          </w:tcPr>
+          <w:p>
+            <w:pPr/>
+            <w:r>
+              <w:t xml:space="preserve">GPT-4</w:t>
+            </w:r>
+          </w:p>
+        </w:tc>
+        <w:tc>
+          <w:tcPr>
+            <w:tcW w:w="1872" w:type="dxa"/>
+          </w:tcPr>
+          <w:p>
+            <w:pPr/>
+            <w:r>
+              <w:t xml:space="preserve">72,55 % (8 % «no lo sé», 19 % de error)</w:t>
+            </w:r>
+          </w:p>
+        </w:tc>
+      </w:tr>
+      <w:tr>
+        <w:tc>
+          <w:tcPr>
+            <w:tcW w:w="1872" w:type="dxa"/>
+          </w:tcPr>
+          <w:p>
+            <w:pPr/>
+            <w:r>
+              <w:rPr>
+                <w:b/>
+              </w:rPr>
+              <w:t xml:space="preserve">Text-to-metrics</w:t>
+            </w:r>
+          </w:p>
+        </w:tc>
+        <w:tc>
+          <w:tcPr>
+            <w:tcW w:w="1872" w:type="dxa"/>
+          </w:tcPr>
+          <w:p>
+            <w:pPr/>
+            <w:r>
+              <w:rPr>
+                <w:b/>
+              </w:rPr>
+              <w:t xml:space="preserve">dbt Labs, 2026</w:t>
+            </w:r>
+          </w:p>
+        </w:tc>
+        <w:tc>
+          <w:tcPr>
+            <w:tcW w:w="1872" w:type="dxa"/>
+          </w:tcPr>
+          <w:p>
+            <w:pPr/>
+            <w:r>
+              <w:rPr>
+                <w:b/>
+              </w:rPr>
+              <w:t xml:space="preserve">Seguros ACME, solo las preguntas que el modelo cubre</w:t>
+            </w:r>
+          </w:p>
+        </w:tc>
+        <w:tc>
+          <w:tcPr>
+            <w:tcW w:w="1872" w:type="dxa"/>
+          </w:tcPr>
+          <w:p>
+            <w:pPr/>
+            <w:r>
+              <w:rPr>
+                <w:b/>
+              </w:rPr>
+              <w:t xml:space="preserve">Claude Sonnet 4.6 / GPT-5.3 Codex</w:t>
+            </w:r>
+          </w:p>
+        </w:tc>
+        <w:tc>
+          <w:tcPr>
+            <w:tcW w:w="1872" w:type="dxa"/>
+          </w:tcPr>
+          <w:p>
+            <w:pPr/>
+            <w:r>
+              <w:rPr>
+                <w:b/>
+              </w:rPr>
+              <w:t xml:space="preserve">100 % / 100 %</w:t>
+            </w:r>
+          </w:p>
+        </w:tc>
+      </w:tr>
+      <w:tr>
+        <w:tc>
+          <w:tcPr>
+            <w:tcW w:w="1872" w:type="dxa"/>
+          </w:tcPr>
+          <w:p>
+            <w:pPr/>
+            <w:r>
+              <w:t xml:space="preserve">Text-to-metrics</w:t>
+            </w:r>
+          </w:p>
+        </w:tc>
+        <w:tc>
+          <w:tcPr>
+            <w:tcW w:w="1872" w:type="dxa"/>
+          </w:tcPr>
+          <w:p>
+            <w:pPr/>
+            <w:r>
+              <w:t xml:space="preserve">dbt Labs, 2026</w:t>
+            </w:r>
+          </w:p>
+        </w:tc>
+        <w:tc>
+          <w:tcPr>
+            <w:tcW w:w="1872" w:type="dxa"/>
+          </w:tcPr>
+          <w:p>
+            <w:pPr/>
+            <w:r>
+              <w:t xml:space="preserve">El mismo, todas las preguntas (las no cubiertas se contestan «no puedo»)</w:t>
+            </w:r>
+          </w:p>
+        </w:tc>
+        <w:tc>
+          <w:tcPr>
+            <w:tcW w:w="1872" w:type="dxa"/>
+          </w:tcPr>
+          <w:p>
+            <w:pPr/>
+            <w:r>
+              <w:t xml:space="preserve">Claude Sonnet 4.6 / GPT-5.3 Codex</w:t>
+            </w:r>
+          </w:p>
+        </w:tc>
+        <w:tc>
+          <w:tcPr>
+            <w:tcW w:w="1872" w:type="dxa"/>
+          </w:tcPr>
+          <w:p>
+            <w:pPr/>
+            <w:r>
+              <w:t xml:space="preserve">72,7 % / 72,7 %</w:t>
+            </w:r>
+          </w:p>
+        </w:tc>
+      </w:tr>
+      <w:tr>
+        <w:tc>
+          <w:tcPr>
+            <w:tcW w:w="1872" w:type="dxa"/>
+          </w:tcPr>
+          <w:p>
+            <w:pPr/>
+            <w:r>
+              <w:rPr>
+                <w:b/>
+              </w:rPr>
+              <w:t xml:space="preserve">Text-to-metrics</w:t>
+            </w:r>
+          </w:p>
+        </w:tc>
+        <w:tc>
+          <w:tcPr>
+            <w:tcW w:w="1872" w:type="dxa"/>
+          </w:tcPr>
+          <w:p>
+            <w:pPr/>
+            <w:r>
+              <w:rPr>
+                <w:b/>
+              </w:rPr>
+              <w:t xml:space="preserve">dbt Labs, 2026</w:t>
+            </w:r>
+          </w:p>
+        </w:tc>
+        <w:tc>
+          <w:tcPr>
+            <w:tcW w:w="1872" w:type="dxa"/>
+          </w:tcPr>
+          <w:p>
+            <w:pPr/>
+            <w:r>
+              <w:rPr>
+                <w:b/>
+              </w:rPr>
+              <w:t xml:space="preserve">El mismo, tras ampliar la cobertura con 3 tablas preparadas</w:t>
+            </w:r>
+          </w:p>
+        </w:tc>
+        <w:tc>
+          <w:tcPr>
+            <w:tcW w:w="1872" w:type="dxa"/>
+          </w:tcPr>
+          <w:p>
+            <w:pPr/>
+            <w:r>
+              <w:rPr>
+                <w:b/>
+              </w:rPr>
+              <w:t xml:space="preserve">Claude Sonnet 4.6 / GPT-5.3 Codex</w:t>
+            </w:r>
+          </w:p>
+        </w:tc>
+        <w:tc>
+          <w:tcPr>
+            <w:tcW w:w="1872" w:type="dxa"/>
+          </w:tcPr>
+          <w:p>
+            <w:pPr/>
+            <w:r>
+              <w:rPr>
+                <w:b/>
+              </w:rPr>
+              <w:t xml:space="preserve">98,2 % / 100 %</w:t>
+            </w:r>
+          </w:p>
+        </w:tc>
+      </w:tr>
+      <w:tr>
+        <w:tc>
+          <w:tcPr>
+            <w:tcW w:w="1872" w:type="dxa"/>
+          </w:tcPr>
+          <w:p>
+            <w:pPr/>
+            <w:r>
+              <w:t xml:space="preserve">Text-to-metrics (variante)</w:t>
+            </w:r>
+          </w:p>
+        </w:tc>
+        <w:tc>
+          <w:tcPr>
+            <w:tcW w:w="1872" w:type="dxa"/>
+          </w:tcPr>
+          <w:p>
+            <w:pPr/>
+            <w:hyperlink r:id="rId20" w:history="1">
+              <w:r>
+                <w:rPr>
+                  <w:rStyle w:val="Hyperlink"/>
+                </w:rPr>
+                <w:t xml:space="preserve">AtScale, agosto 2024</w:t>
+              </w:r>
+            </w:hyperlink>
+          </w:p>
+        </w:tc>
+        <w:tc>
+          <w:tcPr>
+            <w:tcW w:w="1872" w:type="dxa"/>
+          </w:tcPr>
+          <w:p>
+            <w:pPr/>
+            <w:r>
+              <w:t xml:space="preserve">TPC-DS, 40 preguntas; el LLM escribe SQL contra el modelo semántico y el motor resuelve joins y agregaciones</w:t>
+            </w:r>
+          </w:p>
+        </w:tc>
+        <w:tc>
+          <w:tcPr>
+            <w:tcW w:w="1872" w:type="dxa"/>
+          </w:tcPr>
+          <w:p>
+            <w:pPr/>
+            <w:r>
+              <w:t xml:space="preserve">Gemini 1.5 Pro</w:t>
+            </w:r>
+          </w:p>
+        </w:tc>
+        <w:tc>
+          <w:tcPr>
+            <w:tcW w:w="1872" w:type="dxa"/>
+          </w:tcPr>
+          <w:p>
+            <w:pPr/>
+            <w:r>
+              <w:t xml:space="preserve">92,5 % (sin capa: 20 %)</w:t>
             </w:r>
           </w:p>
         </w:tc>
@@ -1260,204 +1886,107 @@
     <w:p>
       <w:pPr/>
       <w:r>
-        <w:t xml:space="preserve">El dato más citado viene de data.world, en un benchmark del sector seguros con GPT-4. Escribiendo SQL directamente sobre el esquema, el acierto fue del 16,7 %. A través de un grafo con ontología sobre las mismas tablas, del 54,2 %. Añadiendo una comprobación de la consulta contra la ontología y reparación por el LLM, del 72,55 %, con un 8 % de respuestas «no lo sé» y una tasa de error del 19,44 % (</w:t>
-      </w:r>
-      <w:hyperlink r:id="rId14" w:history="1">
+        <w:t xml:space="preserve">Lo que se lee en la tabla, estudio por estudio. Primero, dar al LLM definiciones de negocio en lugar de nombres técnicos sube el acierto en todos los casos: de 16,7 % a 54,2 % en data.world con una ontología, y entre 17 y 23 puntos en Cube con un documento de texto de 4 KB. Es el mismo contenido que llevan los YAML de la capa semántica, y el formato, texto, YAML o grafo, importa menos que el contenido. Segundo, mientras el LLM escriba la consulta queda un error que parece acierto: Cube se queda en torno al 68 %, y data.world, aun comprobando cada consulta contra la ontología, deja uno de cada cinco erróneo. Tercero, text-to-metrics llega al 100 % en lo que cubre, por generación determinista y no por perfección del modelo, y lo que no cubre lo convierte en «no puedo»; al ampliar la cobertura con tres tablas preparadas pasa del 72,7 % al 98–100 %. No hay un estudio de 2026 que mida el enfoque de grafo con modelos actuales; sus cifras son de GPT-4.</w:t>
+      </w:r>
+    </w:p>
+    <w:p>
+      <w:pPr/>
+      <w:r>
+        <w:t xml:space="preserve">Para un banco la cifra que importa no es el acierto sino cuántas respuestas son erróneas y parecen buenas. Text-to-metrics elimina dentro de su alcance los errores de aritmética y de SQL, y lo que no puede responder lo convierte en «no puedo». Quedan dos errores que sí pueden parecer buenos: que el LLM elija mal la métrica, el filtro o la fecha, y que la métrica esté mal definida; se atacan con el juego de pruebas y con la firma del dueño. Cautelas: casi todos los estudios los firman proveedores con producto propio (dbt, Cube, Snowflake, data.world, AtScale) y las muestras son pequeñas; sirven como indicio de dirección, no como cifras para comprometer. La medición que conviene presentar es la propia, con las preguntas reales del banco en tres condiciones (SQL sobre tablas, SQL con los YAML como contexto y text-to-metrics), contando por separado aciertos, errores y «no puedo».</w:t>
+      </w:r>
+    </w:p>
+    <w:p>
+      <w:pPr/>
+      <w:r>
+        <w:t xml:space="preserve">Más relevante que las cifras es lo que varios trabajos de 2026 muestran sobre dónde está la fiabilidad. Dos ejemplos. En uno, un modelo pequeño, de siete mil millones de parámetros, al que se le imponen las reglas del negocio acierta más que un modelo cuatro veces mayor sin ellas (</w:t>
+      </w:r>
+      <w:hyperlink r:id="rId21" w:history="1">
         <w:r>
           <w:rPr>
             <w:rStyle w:val="Hyperlink"/>
           </w:rPr>
-          <w:t xml:space="preserve">Sequeda y otros, 2023</w:t>
+          <w:t xml:space="preserve">Business Truth, not SQL Accuracy</w:t>
         </w:r>
       </w:hyperlink>
       <w:r>
-        <w:t xml:space="preserve">; </w:t>
-      </w:r>
-      <w:hyperlink r:id="rId15" w:history="1">
+        <w:t xml:space="preserve">). En otro, el modelo solo elige entre opciones permitidas y un compilador determinista escribe la consulta (</w:t>
+      </w:r>
+      <w:hyperlink r:id="rId22" w:history="1">
         <w:r>
           <w:rPr>
             <w:rStyle w:val="Hyperlink"/>
           </w:rPr>
-          <w:t xml:space="preserve">Allemang y Sequeda, 2024</w:t>
+          <w:t xml:space="preserve">Bounded Semantic Planning and Deterministic Compilation</w:t>
         </w:r>
       </w:hyperlink>
       <w:r>
-        <w:t xml:space="preserve">).</w:t>
-      </w:r>
-    </w:p>
-    <w:p>
-      <w:pPr/>
-      <w:r>
-        <w:t xml:space="preserve">La lectura: lo que mejora el acierto es la semántica explícita, no el formato de grafo. En ese experimento los datos no salieron de sus tablas y el modelo fue el mismo; lo único que cambió es lo que el LLM tenía delante. Con el esquema en bruto veía nombres técnicos; con la ontología veía conceptos del negocio con nombre, cómo se relacionan y a qué columna corresponde cada uno. Es la misma información que llevan los YAML de la capa semántica: descripciones de negocio, valores válidos, relaciones y la fórmula de cada métrica. El estudio de Cube de 2026 apunta en la misma dirección sin ningún grafo: un documento de definiciones de 4 KB en texto subió el acierto entre 17 y 23 puntos. El formato importa menos que el contenido.</w:t>
-      </w:r>
-    </w:p>
-    <w:p>
-      <w:pPr/>
-      <w:r>
-        <w:t xml:space="preserve">Pero la semántica sola no basta. Aun con la ontología y una comprobación automática de cada consulta, casi una de cada cinco respuestas del benchmark fueron erróneas, y con la misma apariencia que las correctas. La razón es que el LLM seguía escribiendo la consulta, y la comprobación solo revisa su forma, no los filtros, las agregaciones ni las fórmulas, que es donde se cuelan los errores. De ahí salen las dos palancas del diseño: hacer explícita la semántica, que la aportan los YAML y mejora incluso la vía exploratoria, y quitarle al LLM la escritura de la consulta, que la aporta el compilador y elimina el error residual en la vía certificada. Un grafo aporta la primera palanca, pero no la segunda.</w:t>
-      </w:r>
-    </w:p>
-    <w:p>
-      <w:pPr/>
-      <w:r>
-        <w:rPr>
-          <w:b/>
-        </w:rPr>
-        <w:t xml:space="preserve">¿Aporta un grafo virtual con ontología más determinismo? El caso de Stardog.</w:t>
-      </w:r>
-      <w:r>
-        <w:t xml:space="preserve"> Depende de cómo se exponga al agente. El determinismo no lo da la tecnología, tabular o de grafo, sino el encapsulamiento: un vocabulario cerrado y un motor que genera la consulta. Si las métricas se publican en Stardog como consultas almacenadas y parametrizadas, el agente solo elige y rellena parámetros, y el resultado es tan determinista como text-to-metrics. En el otro modo, el habitual en los asistentes conversacionales de grafos, el LLM (o el asistente Voicebox de Stardog) escribe una consulta SPARQL libre, y entonces aporta más acierto, no determinismo. La comprobación contra la ontología es determinista, pero solo revisa la forma: que cada propiedad se use con el tipo de entidad correcto y que el camino entre conceptos exista. No revisa filtros, agregaciones ni fórmulas.</w:t>
-      </w:r>
-    </w:p>
-    <w:p>
-      <w:pPr/>
-      <w:r>
-        <w:t xml:space="preserve">La misma pregunta por un grafo virtual: «¿Cómo está la morosidad de las operaciones refinanciadas frente a las no refinanciadas a cierre de agosto?». La ontología define el concepto FotoContrato con las propiedades fechaDato, esRefinanciado, saldoNormal y saldoDudoso, y un mapeo enlaza cada propiedad con una columna de ACT_ACTIVO_H; los datos no se mueven. El LLM escribe:</w:t>
-      </w:r>
-    </w:p>
-    <w:p>
-      <w:pPr>
-        <w:pStyle w:val="Code"/>
-      </w:pPr>
-      <w:bookmarkStart w:id="1" w:name="bongo_lang_sparql_1"/>
-      <w:bookmarkEnd w:id="1"/>
-      <w:r>
-        <w:t xml:space="preserve">SELECT ?refinanciado ((SUM(?dudoso) / (SUM(?normal) + SUM(?dudoso))) AS ?tasa)</w:t>
-        <w:br/>
-        <w:t xml:space="preserve">WHERE {</w:t>
-        <w:br/>
-        <w:t xml:space="preserve">  ?foto a :FotoContrato ;</w:t>
-        <w:br/>
-        <w:t xml:space="preserve">        :fechaDato "2026-08-31"^^xsd:date ;</w:t>
-        <w:br/>
-        <w:t xml:space="preserve">        :esRefinanciado ?refinanciado ;</w:t>
-        <w:br/>
-        <w:t xml:space="preserve">        :saldoNormal ?normal ;</w:t>
-        <w:br/>
-        <w:t xml:space="preserve">        :saldoDudoso ?dudoso .</w:t>
-        <w:br/>
-        <w:t xml:space="preserve">}</w:t>
-        <w:br/>
-        <w:t xml:space="preserve">GROUP BY ?refinanciado</w:t>
-      </w:r>
-    </w:p>
-    <w:p>
-      <w:pPr/>
-      <w:r>
-        <w:t xml:space="preserve">Las cuatro propiedades pertenecen a FotoContrato: la consulta pasa la comprobación, Stardog la traduce a SQL y Teradata la ejecuta. Dónde falla, con esta misma pregunta:</w:t>
-      </w:r>
-    </w:p>
-    <w:p>
-      <w:pPr>
-        <w:pStyle w:val="ListParagraph"/>
-        <w:numPr>
-          <w:ilvl w:val="0"/>
-          <w:numId w:val="2"/>
-        </w:numPr>
-      </w:pPr>
-      <w:r>
-        <w:rPr>
-          <w:b/>
-        </w:rPr>
-        <w:t xml:space="preserve">Valores nulos que desaparecen.</w:t>
-      </w:r>
-      <w:r>
-        <w:t xml:space="preserve"> En un grafo virtual una columna nula no genera dato. Los contratos con saldo dudoso nulo no casan con el patrón y salen del cálculo con su saldo normal incluido: el denominador se queda corto sin aviso. Evitarlo exige que el LLM escriba OPTIONAL y COALESCE, y la comprobación no lo exige. Por eso la definición de la métrica en el YAML aplica COALESCE a cada sumando.</w:t>
-      </w:r>
-    </w:p>
-    <w:p>
-      <w:pPr>
-        <w:pStyle w:val="ListParagraph"/>
-        <w:numPr>
-          <w:ilvl w:val="0"/>
-          <w:numId w:val="2"/>
-        </w:numPr>
-      </w:pPr>
-      <w:r>
-        <w:rPr>
-          <w:b/>
-        </w:rPr>
-        <w:t xml:space="preserve">La fecha olvidada.</w:t>
-      </w:r>
-      <w:r>
-        <w:t xml:space="preserve"> Si el LLM omite la línea de fechaDato, la consulta sigue siendo válida para la ontología y suma todas las fotos. La ontología no sabe que un saldo es una foto.</w:t>
-      </w:r>
-    </w:p>
-    <w:p>
-      <w:pPr>
-        <w:pStyle w:val="ListParagraph"/>
-        <w:numPr>
-          <w:ilvl w:val="0"/>
-          <w:numId w:val="2"/>
-        </w:numPr>
-      </w:pPr>
-      <w:r>
-        <w:rPr>
-          <w:b/>
-        </w:rPr>
-        <w:t xml:space="preserve">La fórmula improvisada.</w:t>
-      </w:r>
-      <w:r>
-        <w:t xml:space="preserve"> Si el LLM calcula la tasa de otra forma, la ontología no lo detecta: no contiene la fórmula oficial.</w:t>
-      </w:r>
-    </w:p>
-    <w:p>
-      <w:pPr>
-        <w:pStyle w:val="ListParagraph"/>
-        <w:numPr>
-          <w:ilvl w:val="0"/>
-          <w:numId w:val="2"/>
-        </w:numPr>
-      </w:pPr>
-      <w:r>
-        <w:rPr>
-          <w:b/>
-        </w:rPr>
-        <w:t xml:space="preserve">«¿Y por oficina?»</w:t>
-      </w:r>
-      <w:r>
-        <w:t xml:space="preserve"> Si la ontología tiene el camino contrato → oficina, la consulta se acepta y se ejecuta. No existe la noción de dimensión permitida para esta métrica: la cifra sale, pero nadie la ha certificado.</w:t>
-      </w:r>
-    </w:p>
-    <w:p>
-      <w:pPr/>
-      <w:r>
-        <w:t xml:space="preserve">Otros límites: SPARQL 1.1 no tiene funciones de ventana (variación frente al mes anterior), el rendimiento depende de que la traducción a SQL sea buena, y el equipo tendría que mantener una ontología en RDF/OWL y consultas SPARQL, lenguajes que hoy no usa. El compilador de métricas va más lejos porque el LLM no escribe la consulta: la fórmula, la fecha obligatoria y las dimensiones permitidas las impone el YAML. Quedan dos riesgos, que el LLM pida una métrica, un filtro o una fecha que no corresponden a la pregunta, y que la métrica esté mal definida; este último se corrige una vez para todos.</w:t>
-      </w:r>
-    </w:p>
-    <w:p>
-      <w:pPr/>
-      <w:r>
-        <w:rPr>
-          <w:b/>
-        </w:rPr>
-        <w:t xml:space="preserve">Text-to-SQL con grafos: FalkorDB.</w:t>
-      </w:r>
-      <w:r>
-        <w:t xml:space="preserve"> La propuesta de </w:t>
-      </w:r>
-      <w:hyperlink r:id="rId13" w:history="1">
-        <w:r>
-          <w:rPr>
-            <w:rStyle w:val="Hyperlink"/>
-          </w:rPr>
-          <w:t xml:space="preserve">FalkorDB (QueryWeaver)</w:t>
-        </w:r>
-      </w:hyperlink>
-      <w:r>
-        <w:t xml:space="preserve"> guarda el esquema de la base de datos como grafo: tablas, columnas y claves como nodos y relaciones. Cuando llega una pregunta, recorre ese grafo para encontrar las tablas intermedias entre las entidades mencionadas, incluidas las tablas puente con nombres genéricos que una búsqueda semántica pasaría por alto. Después el LLM escribe el SQL con esa ruta delante y un agente de corrección repara los errores. Es el mismo principio que SchemaGraphSQL, que con caminos sobre las claves foráneas obtiene resultados punteros en los benchmarks BIRD y Spider 2.0. Qué aporta: acierta mejor los joins en esquemas grandes. Qué no aporta: el LLM sigue escribiendo el SQL, así que las fotos sumadas, el doble conteo y las fórmulas improvisadas siguen siendo posibles. Para datamarts de tablas anchas con pocos joins, como los de SIC_NEG, hoy aporta poco; mañana, cuando una métrica necesite cruzar productos, el grafo de rutas de unión puede alimentar al compilador, que seguirá siendo quien escriba el SQL.</w:t>
-      </w:r>
-    </w:p>
-    <w:p>
-      <w:pPr/>
-      <w:r>
-        <w:rPr>
-          <w:b/>
-        </w:rPr>
-        <w:t xml:space="preserve">Dónde gana cada uno.</w:t>
-      </w:r>
-      <w:r>
-        <w:t xml:space="preserve"> Las cuatro primeras son preguntas de cifras: las resuelve mejor SQL con métricas, y en algunas el grafo no es una opción real. Las cuatro últimas son preguntas de relaciones y significado: ahí gana el grafo.</w:t>
+        <w:t xml:space="preserve">). La lectura para el banco es la misma en los dos: la fiabilidad viene de las reglas y del compilador, no del tamaño del modelo, así que la inversión va al YAML y a la vía certificada, no a modelos más grandes. Es exactamente el diseño de text-to-metrics, y para un entorno regulado es el único defendible, porque la consulta que se ejecuta es siempre una que alguien ha aprobado.</w:t>
+      </w:r>
+    </w:p>
+    <w:p>
+      <w:pPr/>
+      <w:r>
+        <w:rPr>
+          <w:b/>
+        </w:rPr>
+        <w:t xml:space="preserve">2. Qué cambia cuando entra un grafo.</w:t>
+      </w:r>
+      <w:r>
+        <w:t xml:space="preserve"> Con la palabra «grafo» se nombran tres cosas distintas, y cada una cambia algo diferente. Conviene separarlas antes de decidir nada.</w:t>
+      </w:r>
+    </w:p>
+    <w:p>
+      <w:pPr/>
+      <w:r>
+        <w:rPr>
+          <w:b/>
+        </w:rPr>
+        <w:t xml:space="preserve">El grafo del esquema (opción d).</w:t>
+      </w:r>
+      <w:r>
+        <w:t xml:space="preserve"> Guarda las tablas, columnas y claves del almacén como un mapa de caminos, y cuando llega una pregunta le dice al LLM qué tablas hay que unir y por qué ruta, incluidas las tablas puente con nombres genéricos que una búsqueda por texto no encontraría. Lo hacen QueryWeaver de FalkorDB y SchemaGraphSQL. Qué cambia: el LLM acierta mejor los joins en esquemas grandes. Qué no cambia: el LLM sigue escribiendo el SQL, así que sigue sin saber que un saldo puede ser un stock, como el patrimonio de un fondo, que no se suma entre fechas, o un flujo, como las suscripciones del mes, que sí. Para datamarts de tablas anchas con pocos joins, como los de SIC_NEG, hoy aporta poco; mañana, cuando una métrica cruce productos, ese mapa de rutas puede alimentar al compilador, que seguirá siendo quien escriba el SQL.</w:t>
+      </w:r>
+    </w:p>
+    <w:p>
+      <w:pPr/>
+      <w:r>
+        <w:rPr>
+          <w:b/>
+        </w:rPr>
+        <w:t xml:space="preserve">El grafo virtual con ontología (opción c).</w:t>
+      </w:r>
+      <w:r>
+        <w:t xml:space="preserve"> No mueve los datos: pone delante del LLM los conceptos del negocio con nombre y cómo se relacionan, y traduce la consulta del LLM a SQL para que la ejecute el almacén. Lo hacen Stardog, Timbr y data.world. Qué cambia: el LLM razona con conceptos en lugar de con columnas, y acierta más. Qué no cambia: el LLM sigue escribiendo la consulta, y la comprobación contra la ontología solo revisa su forma, que cada propiedad pertenezca al concepto correcto, no los filtros, las fechas ni las fórmulas. Con la pregunta «morosidad de refinanciados frente a no refinanciados a cierre de agosto» eso se traduce en cuatro fallos silenciosos: los contratos con saldo dudoso nulo desaparecen del cálculo y el denominador se queda corto; si el LLM olvida la fecha, suma todas las fotos, porque la ontología no sabe que un saldo es una foto; si calcula la tasa de otra forma, nadie lo detecta, porque la ontología no contiene la fórmula oficial; y si pide el desglose por oficina, sale una cifra que nadie ha certificado, porque no existe la noción de dimensión permitida. Un grafo virtual solo es determinista si las métricas se publican como consultas almacenadas con parámetros, y entonces es text-to-metrics con otro motor. Además, el equipo tendría que mantener una ontología en RDF y OWL y consultas SPARQL, lenguajes que hoy no usa.</w:t>
+      </w:r>
+    </w:p>
+    <w:p>
+      <w:pPr/>
+      <w:r>
+        <w:rPr>
+          <w:b/>
+        </w:rPr>
+        <w:t xml:space="preserve">El grafo como almacén.</w:t>
+      </w:r>
+      <w:r>
+        <w:t xml:space="preserve"> Copia las entidades y sus relaciones a una base de datos de grafos, como Neo4j. Qué cambia: responde preguntas de relaciones a varios saltos que en SQL exigen joins recursivos. Qué no cambia: no sirve para agregaciones masivas, y una copia es otra versión del dato, sin conciliar, que no vale como cifra oficial.</w:t>
+      </w:r>
+    </w:p>
+    <w:p>
+      <w:pPr/>
+      <w:r>
+        <w:t xml:space="preserve">La conclusión de este paso son las dos palancas del diseño. La primera, hacer explícita la semántica, la aportan los YAML y también un grafo, y mejora incluso la vía exploratoria. La segunda, quitarle al LLM la escritura de la consulta, la aporta el compilador y elimina el error residual en la vía certificada. Un grafo aporta la primera palanca, pero no la segunda.</w:t>
+      </w:r>
+    </w:p>
+    <w:p>
+      <w:pPr/>
+      <w:r>
+        <w:rPr>
+          <w:b/>
+        </w:rPr>
+        <w:t xml:space="preserve">3. Dónde gana cada uno.</w:t>
+      </w:r>
+      <w:r>
+        <w:t xml:space="preserve"> Las cuatro primeras preguntas son de cifras y las resuelve mejor SQL con métricas; en algunas el grafo no es una opción real. Las cuatro últimas son de relaciones y significado, y ahí gana el grafo.</w:t>
       </w:r>
     </w:p>
     <w:tbl>
@@ -1806,10 +2335,10 @@
         <w:rPr>
           <w:b/>
         </w:rPr>
-        <w:t xml:space="preserve">El reparto que proponemos, en dos pasos.</w:t>
-      </w:r>
-      <w:r>
-        <w:t xml:space="preserve"> Hoy, sin grafo: el agente pregunta a la capa de métricas qué existe y qué significa, y las herramientas list_metrics y describe_metric responden leyendo el YAML; después le pide la cifra y el almacén la calcula. Mañana, si los casos de uso lo piden, un grafo de conocimiento cargado desde los mismos YAML, más el linaje de Rosetta, hace de mapa para las preguntas que la capa de métricas no responde: qué se relaciona con qué, de dónde sale un dato, qué métrica es la oficial y quién responde de ella. Se hace en este orden para no esperar al grafo. El YAML es otra expresión de la misma información, y pasar del primer paso al segundo es cargar lo que ya está escrito, no volver a definirlo: la capa de métricas no cambia, solo se le pone un mapa al lado.</w:t>
+        <w:t xml:space="preserve">4. El reparto que proponemos: primero el YAML, después el grafo.</w:t>
+      </w:r>
+      <w:r>
+        <w:t xml:space="preserve"> De lo anterior se sigue el reparto. Las cifras, por el compilador de métricas sobre el almacén, porque es la única opción que elimina el error que parece acierto y deja linaje. El significado y las relaciones, por un grafo, pero sin esperarlo: el YAML ya contiene esa información y la fachada la sirve hoy con list_metrics y describe_metric, que responden qué existe y qué significa leyendo el YAML. Mañana, si los casos de uso lo piden, un grafo de conocimiento cargado desde los mismos YAML, más el linaje de Rosetta, hace de mapa para las preguntas que la capa de métricas no responde: qué se relaciona con qué, de dónde sale un dato, qué métrica es la oficial y quién responde de ella. Pasar del primer paso al segundo es cargar lo que ya está escrito, no volver a definirlo: la capa de métricas no cambia, solo se le pone un mapa al lado.</w:t>
       </w:r>
     </w:p>
     <w:p>
@@ -1827,7 +2356,7 @@
                     <pic:cNvPicPr/>
                   </pic:nvPicPr>
                   <pic:blipFill>
-                    <a:blip r:embed="rId16"/>
+                    <a:blip r:embed="rId23"/>
                     <a:stretch>
                       <a:fillRect/>
                     </a:stretch>
@@ -1859,7 +2388,7 @@
         <w:pStyle w:val="ListParagraph"/>
         <w:numPr>
           <w:ilvl w:val="0"/>
-          <w:numId w:val="3"/>
+          <w:numId w:val="2"/>
         </w:numPr>
       </w:pPr>
       <w:r>
@@ -1877,7 +2406,7 @@
         <w:pStyle w:val="ListParagraph"/>
         <w:numPr>
           <w:ilvl w:val="0"/>
-          <w:numId w:val="3"/>
+          <w:numId w:val="2"/>
         </w:numPr>
       </w:pPr>
       <w:r>
@@ -1895,7 +2424,7 @@
         <w:pStyle w:val="ListParagraph"/>
         <w:numPr>
           <w:ilvl w:val="0"/>
-          <w:numId w:val="3"/>
+          <w:numId w:val="2"/>
         </w:numPr>
       </w:pPr>
       <w:r>
@@ -1920,1047 +2449,98 @@
         <w:rPr>
           <w:b/>
         </w:rPr>
-        <w:t xml:space="preserve">Evidencia de precisión.</w:t>
-      </w:r>
-      <w:r>
-        <w:t xml:space="preserve"> Los estudios coinciden en que dar al modelo definiciones gobernadas en lugar de esquemas crudos mejora mucho la precisión de la consulta generada. Conviene leerlos sabiendo quién los firma.</w:t>
-      </w:r>
-    </w:p>
-    <w:p>
-      <w:pPr/>
-      <w:r>
-        <w:t xml:space="preserve">Cuatro enfoques comparados: LLM sobre tablas (el LLM escribe SQL viendo solo el esquema), contexto semántico (el LLM escribe SQL con las definiciones de negocio delante), grafo con ontología (el LLM consulta conceptos en SPARQL y un grafo virtual traduce a SQL) y text-to-metrics (el LLM elige métrica, dimensiones, filtros y fecha, y un motor compila el SQL).</w:t>
-      </w:r>
-    </w:p>
-    <w:tbl>
-      <w:tblPr>
-        <w:tblStyle w:val="TableGrid"/>
-        <w:tblW w:w="0" w:type="auto"/>
-        <w:tblLayout w:type="fixed"/>
-        <w:tblLook w:val="04A0" w:firstRow="1" w:lastRow="0" w:firstColumn="0" w:lastColumn="0" w:noHBand="0" w:noVBand="1"/>
-      </w:tblPr>
-      <w:tblGrid>
-        <w:gridCol w:w="1872"/>
-        <w:gridCol w:w="1872"/>
-        <w:gridCol w:w="1872"/>
-        <w:gridCol w:w="1872"/>
-        <w:gridCol w:w="1872"/>
-      </w:tblGrid>
-      <w:tr>
-        <w:trPr>
-          <w:tblHeader/>
-        </w:trPr>
-        <w:tc>
-          <w:tcPr>
-            <w:tcW w:w="1872" w:type="dxa"/>
-            <w:shd w:val="clear" w:color="auto" w:fill="F2F2F2"/>
-          </w:tcPr>
-          <w:p>
-            <w:pPr/>
-            <w:r>
-              <w:t xml:space="preserve">Enfoque</w:t>
-            </w:r>
-          </w:p>
-        </w:tc>
-        <w:tc>
-          <w:tcPr>
-            <w:tcW w:w="1872" w:type="dxa"/>
-            <w:shd w:val="clear" w:color="auto" w:fill="F2F2F2"/>
-          </w:tcPr>
-          <w:p>
-            <w:pPr/>
-            <w:r>
-              <w:t xml:space="preserve">Estudio y año</w:t>
-            </w:r>
-          </w:p>
-        </w:tc>
-        <w:tc>
-          <w:tcPr>
-            <w:tcW w:w="1872" w:type="dxa"/>
-            <w:shd w:val="clear" w:color="auto" w:fill="F2F2F2"/>
-          </w:tcPr>
-          <w:p>
-            <w:pPr/>
-            <w:r>
-              <w:t xml:space="preserve">Banco de pruebas</w:t>
-            </w:r>
-          </w:p>
-        </w:tc>
-        <w:tc>
-          <w:tcPr>
-            <w:tcW w:w="1872" w:type="dxa"/>
-            <w:shd w:val="clear" w:color="auto" w:fill="F2F2F2"/>
-          </w:tcPr>
-          <w:p>
-            <w:pPr/>
-            <w:r>
-              <w:t xml:space="preserve">Modelo</w:t>
-            </w:r>
-          </w:p>
-        </w:tc>
-        <w:tc>
-          <w:tcPr>
-            <w:tcW w:w="1872" w:type="dxa"/>
-            <w:shd w:val="clear" w:color="auto" w:fill="F2F2F2"/>
-          </w:tcPr>
-          <w:p>
-            <w:pPr/>
-            <w:r>
-              <w:t xml:space="preserve">Acierto</w:t>
-            </w:r>
-          </w:p>
-        </w:tc>
-      </w:tr>
-      <w:tr>
-        <w:tc>
-          <w:tcPr>
-            <w:tcW w:w="1872" w:type="dxa"/>
-          </w:tcPr>
-          <w:p>
-            <w:pPr/>
-            <w:r>
-              <w:t xml:space="preserve">LLM sobre tablas</w:t>
-            </w:r>
-          </w:p>
-        </w:tc>
-        <w:tc>
-          <w:tcPr>
-            <w:tcW w:w="1872" w:type="dxa"/>
-          </w:tcPr>
-          <w:p>
-            <w:pPr/>
-            <w:hyperlink r:id="rId17" w:history="1">
-              <w:r>
-                <w:rPr>
-                  <w:rStyle w:val="Hyperlink"/>
-                </w:rPr>
-                <w:t xml:space="preserve">dbt Labs, 2026</w:t>
-              </w:r>
-            </w:hyperlink>
-          </w:p>
-        </w:tc>
-        <w:tc>
-          <w:tcPr>
-            <w:tcW w:w="1872" w:type="dxa"/>
-          </w:tcPr>
-          <w:p>
-            <w:pPr/>
-            <w:r>
-              <w:t xml:space="preserve">Seguros ACME (data.world), 11 preguntas × 20 ejecuciones</w:t>
-            </w:r>
-          </w:p>
-        </w:tc>
-        <w:tc>
-          <w:tcPr>
-            <w:tcW w:w="1872" w:type="dxa"/>
-          </w:tcPr>
-          <w:p>
-            <w:pPr/>
-            <w:r>
-              <w:t xml:space="preserve">Claude Sonnet 4.6 / GPT-5.3 Codex</w:t>
-            </w:r>
-          </w:p>
-        </w:tc>
-        <w:tc>
-          <w:tcPr>
-            <w:tcW w:w="1872" w:type="dxa"/>
-          </w:tcPr>
-          <w:p>
-            <w:pPr/>
-            <w:r>
-              <w:t xml:space="preserve">64,5 % / 64,5 %</w:t>
-            </w:r>
-          </w:p>
-        </w:tc>
-      </w:tr>
-      <w:tr>
-        <w:tc>
-          <w:tcPr>
-            <w:tcW w:w="1872" w:type="dxa"/>
-          </w:tcPr>
-          <w:p>
-            <w:pPr/>
-            <w:r>
-              <w:t xml:space="preserve">LLM sobre tablas</w:t>
-            </w:r>
-          </w:p>
-        </w:tc>
-        <w:tc>
-          <w:tcPr>
-            <w:tcW w:w="1872" w:type="dxa"/>
-          </w:tcPr>
-          <w:p>
-            <w:pPr/>
-            <w:r>
-              <w:t xml:space="preserve">dbt Labs, 2026</w:t>
-            </w:r>
-          </w:p>
-        </w:tc>
-        <w:tc>
-          <w:tcPr>
-            <w:tcW w:w="1872" w:type="dxa"/>
-          </w:tcPr>
-          <w:p>
-            <w:pPr/>
-            <w:r>
-              <w:t xml:space="preserve">El mismo, con 3 tablas preparadas añadidas</w:t>
-            </w:r>
-          </w:p>
-        </w:tc>
-        <w:tc>
-          <w:tcPr>
-            <w:tcW w:w="1872" w:type="dxa"/>
-          </w:tcPr>
-          <w:p>
-            <w:pPr/>
-            <w:r>
-              <w:t xml:space="preserve">Claude Sonnet 4.6 / GPT-5.3 Codex</w:t>
-            </w:r>
-          </w:p>
-        </w:tc>
-        <w:tc>
-          <w:tcPr>
-            <w:tcW w:w="1872" w:type="dxa"/>
-          </w:tcPr>
-          <w:p>
-            <w:pPr/>
-            <w:r>
-              <w:t xml:space="preserve">90,0 % / 84,1 %</w:t>
-            </w:r>
-          </w:p>
-        </w:tc>
-      </w:tr>
-      <w:tr>
-        <w:tc>
-          <w:tcPr>
-            <w:tcW w:w="1872" w:type="dxa"/>
-          </w:tcPr>
-          <w:p>
-            <w:pPr/>
-            <w:r>
-              <w:t xml:space="preserve">LLM sobre tablas</w:t>
-            </w:r>
-          </w:p>
-        </w:tc>
-        <w:tc>
-          <w:tcPr>
-            <w:tcW w:w="1872" w:type="dxa"/>
-          </w:tcPr>
-          <w:p>
-            <w:pPr/>
-            <w:hyperlink r:id="rId18" w:history="1">
-              <w:r>
-                <w:rPr>
-                  <w:rStyle w:val="Hyperlink"/>
-                </w:rPr>
-                <w:t xml:space="preserve">Cube, 2026</w:t>
-              </w:r>
-            </w:hyperlink>
-          </w:p>
-        </w:tc>
-        <w:tc>
-          <w:tcPr>
-            <w:tcW w:w="1872" w:type="dxa"/>
-          </w:tcPr>
-          <w:p>
-            <w:pPr/>
-            <w:r>
-              <w:t xml:space="preserve">Comercio minorista (Contoso), 99 preguntas</w:t>
-            </w:r>
-          </w:p>
-        </w:tc>
-        <w:tc>
-          <w:tcPr>
-            <w:tcW w:w="1872" w:type="dxa"/>
-          </w:tcPr>
-          <w:p>
-            <w:pPr/>
-            <w:r>
-              <w:t xml:space="preserve">Claude Opus 4.7 / Sonnet 4.6 / GPT-5.4</w:t>
-            </w:r>
-          </w:p>
-        </w:tc>
-        <w:tc>
-          <w:tcPr>
-            <w:tcW w:w="1872" w:type="dxa"/>
-          </w:tcPr>
-          <w:p>
-            <w:pPr/>
-            <w:r>
-              <w:t xml:space="preserve">50,5 % / 46,5 % / 45,5 %</w:t>
-            </w:r>
-          </w:p>
-        </w:tc>
-      </w:tr>
-      <w:tr>
-        <w:tc>
-          <w:tcPr>
-            <w:tcW w:w="1872" w:type="dxa"/>
-          </w:tcPr>
-          <w:p>
-            <w:pPr/>
-            <w:r>
-              <w:t xml:space="preserve">LLM sobre tablas, con pistas por pregunta</w:t>
-            </w:r>
-          </w:p>
-        </w:tc>
-        <w:tc>
-          <w:tcPr>
-            <w:tcW w:w="1872" w:type="dxa"/>
-          </w:tcPr>
-          <w:p>
-            <w:pPr/>
-            <w:hyperlink r:id="rId19" w:history="1">
-              <w:r>
-                <w:rPr>
-                  <w:rStyle w:val="Hyperlink"/>
-                </w:rPr>
-                <w:t xml:space="preserve">BIRD: Gemini-SQL2, junio 2026</w:t>
-              </w:r>
-            </w:hyperlink>
-          </w:p>
-        </w:tc>
-        <w:tc>
-          <w:tcPr>
-            <w:tcW w:w="1872" w:type="dxa"/>
-          </w:tcPr>
-          <w:p>
-            <w:pPr/>
-            <w:r>
-              <w:t xml:space="preserve">Académico: 12.751 preguntas, 95 bases de datos, 37 dominios</w:t>
-            </w:r>
-          </w:p>
-        </w:tc>
-        <w:tc>
-          <w:tcPr>
-            <w:tcW w:w="1872" w:type="dxa"/>
-          </w:tcPr>
-          <w:p>
-            <w:pPr/>
-            <w:r>
-              <w:t xml:space="preserve">Gemini 3.1 Pro, mejor modelo único</w:t>
-            </w:r>
-          </w:p>
-        </w:tc>
-        <w:tc>
-          <w:tcPr>
-            <w:tcW w:w="1872" w:type="dxa"/>
-          </w:tcPr>
-          <w:p>
-            <w:pPr/>
-            <w:r>
-              <w:t xml:space="preserve">80,04 % (personas: 92,96 %)</w:t>
-            </w:r>
-          </w:p>
-        </w:tc>
-      </w:tr>
-      <w:tr>
-        <w:tc>
-          <w:tcPr>
-            <w:tcW w:w="1872" w:type="dxa"/>
-          </w:tcPr>
-          <w:p>
-            <w:pPr/>
-            <w:r>
-              <w:t xml:space="preserve">LLM sobre tablas</w:t>
-            </w:r>
-          </w:p>
-        </w:tc>
-        <w:tc>
-          <w:tcPr>
-            <w:tcW w:w="1872" w:type="dxa"/>
-          </w:tcPr>
-          <w:p>
-            <w:pPr/>
-            <w:hyperlink r:id="rId20" w:history="1">
-              <w:r>
-                <w:rPr>
-                  <w:rStyle w:val="Hyperlink"/>
-                </w:rPr>
-                <w:t xml:space="preserve">Spider 2.0, ICLR 2025</w:t>
-              </w:r>
-            </w:hyperlink>
-          </w:p>
-        </w:tc>
-        <w:tc>
-          <w:tcPr>
-            <w:tcW w:w="1872" w:type="dxa"/>
-          </w:tcPr>
-          <w:p>
-            <w:pPr/>
-            <w:r>
-              <w:t xml:space="preserve">Flujos empresariales reales en BigQuery, Snowflake y dbt; unas 800 columnas por base</w:t>
-            </w:r>
-          </w:p>
-        </w:tc>
-        <w:tc>
-          <w:tcPr>
-            <w:tcW w:w="1872" w:type="dxa"/>
-          </w:tcPr>
-          <w:p>
-            <w:pPr/>
-            <w:r>
-              <w:t xml:space="preserve">o1-preview / Claude 3.5 Sonnet / GPT-4o</w:t>
-            </w:r>
-          </w:p>
-        </w:tc>
-        <w:tc>
-          <w:tcPr>
-            <w:tcW w:w="1872" w:type="dxa"/>
-          </w:tcPr>
-          <w:p>
-            <w:pPr/>
-            <w:r>
-              <w:t xml:space="preserve">21,4 % / 14,9 % / 12,3 %</w:t>
-            </w:r>
-          </w:p>
-        </w:tc>
-      </w:tr>
-      <w:tr>
-        <w:tc>
-          <w:tcPr>
-            <w:tcW w:w="1872" w:type="dxa"/>
-          </w:tcPr>
-          <w:p>
-            <w:pPr/>
-            <w:r>
-              <w:t xml:space="preserve">Contexto semántico</w:t>
-            </w:r>
-          </w:p>
-        </w:tc>
-        <w:tc>
-          <w:tcPr>
-            <w:tcW w:w="1872" w:type="dxa"/>
-          </w:tcPr>
-          <w:p>
-            <w:pPr/>
-            <w:r>
-              <w:t xml:space="preserve">Cube, 2026</w:t>
-            </w:r>
-          </w:p>
-        </w:tc>
-        <w:tc>
-          <w:tcPr>
-            <w:tcW w:w="1872" w:type="dxa"/>
-          </w:tcPr>
-          <w:p>
-            <w:pPr/>
-            <w:r>
-              <w:t xml:space="preserve">Contoso, con un documento semántico de 4 KB</w:t>
-            </w:r>
-          </w:p>
-        </w:tc>
-        <w:tc>
-          <w:tcPr>
-            <w:tcW w:w="1872" w:type="dxa"/>
-          </w:tcPr>
-          <w:p>
-            <w:pPr/>
-            <w:r>
-              <w:t xml:space="preserve">Claude Opus 4.7 / Sonnet 4.6 / GPT-5.4</w:t>
-            </w:r>
-          </w:p>
-        </w:tc>
-        <w:tc>
-          <w:tcPr>
-            <w:tcW w:w="1872" w:type="dxa"/>
-          </w:tcPr>
-          <w:p>
-            <w:pPr/>
-            <w:r>
-              <w:t xml:space="preserve">67,7 % / 68,7 % / 68,7 %</w:t>
-            </w:r>
-          </w:p>
-        </w:tc>
-      </w:tr>
-      <w:tr>
-        <w:tc>
-          <w:tcPr>
-            <w:tcW w:w="1872" w:type="dxa"/>
-          </w:tcPr>
-          <w:p>
-            <w:pPr/>
-            <w:r>
-              <w:t xml:space="preserve">Contexto semántico</w:t>
-            </w:r>
-          </w:p>
-        </w:tc>
-        <w:tc>
-          <w:tcPr>
-            <w:tcW w:w="1872" w:type="dxa"/>
-          </w:tcPr>
-          <w:p>
-            <w:pPr/>
-            <w:hyperlink r:id="rId21" w:history="1">
-              <w:r>
-                <w:rPr>
-                  <w:rStyle w:val="Hyperlink"/>
-                </w:rPr>
-                <w:t xml:space="preserve">Snowflake, 2024</w:t>
-              </w:r>
-            </w:hyperlink>
-          </w:p>
-        </w:tc>
-        <w:tc>
-          <w:tcPr>
-            <w:tcW w:w="1872" w:type="dxa"/>
-          </w:tcPr>
-          <w:p>
-            <w:pPr/>
-            <w:r>
-              <w:t xml:space="preserve">Interno, 150 preguntas; mide coincidencia de columnas, no ejecución</w:t>
-            </w:r>
-          </w:p>
-        </w:tc>
-        <w:tc>
-          <w:tcPr>
-            <w:tcW w:w="1872" w:type="dxa"/>
-          </w:tcPr>
-          <w:p>
-            <w:pPr/>
-            <w:r>
-              <w:t xml:space="preserve">Cortex Analyst frente a GPT-4o sobre tablas</w:t>
-            </w:r>
-          </w:p>
-        </w:tc>
-        <w:tc>
-          <w:tcPr>
-            <w:tcW w:w="1872" w:type="dxa"/>
-          </w:tcPr>
-          <w:p>
-            <w:pPr/>
-            <w:r>
-              <w:t xml:space="preserve">Más del 90 % frente a 51 %</w:t>
-            </w:r>
-          </w:p>
-        </w:tc>
-      </w:tr>
-      <w:tr>
-        <w:tc>
-          <w:tcPr>
-            <w:tcW w:w="1872" w:type="dxa"/>
-          </w:tcPr>
-          <w:p>
-            <w:pPr/>
-            <w:r>
-              <w:t xml:space="preserve">Grafo con ontología</w:t>
-            </w:r>
-          </w:p>
-        </w:tc>
-        <w:tc>
-          <w:tcPr>
-            <w:tcW w:w="1872" w:type="dxa"/>
-          </w:tcPr>
-          <w:p>
-            <w:pPr/>
-            <w:hyperlink r:id="rId14" w:history="1">
-              <w:r>
-                <w:rPr>
-                  <w:rStyle w:val="Hyperlink"/>
-                </w:rPr>
-                <w:t xml:space="preserve">data.world, 2023</w:t>
-              </w:r>
-            </w:hyperlink>
-          </w:p>
-        </w:tc>
-        <w:tc>
-          <w:tcPr>
-            <w:tcW w:w="1872" w:type="dxa"/>
-          </w:tcPr>
-          <w:p>
-            <w:pPr/>
-            <w:r>
-              <w:t xml:space="preserve">Seguros ACME</w:t>
-            </w:r>
-          </w:p>
-        </w:tc>
-        <w:tc>
-          <w:tcPr>
-            <w:tcW w:w="1872" w:type="dxa"/>
-          </w:tcPr>
-          <w:p>
-            <w:pPr/>
-            <w:r>
-              <w:t xml:space="preserve">GPT-4</w:t>
-            </w:r>
-          </w:p>
-        </w:tc>
-        <w:tc>
-          <w:tcPr>
-            <w:tcW w:w="1872" w:type="dxa"/>
-          </w:tcPr>
-          <w:p>
-            <w:pPr/>
-            <w:r>
-              <w:t xml:space="preserve">54,2 % (sobre tablas: 16,7 %)</w:t>
-            </w:r>
-          </w:p>
-        </w:tc>
-      </w:tr>
-      <w:tr>
-        <w:tc>
-          <w:tcPr>
-            <w:tcW w:w="1872" w:type="dxa"/>
-          </w:tcPr>
-          <w:p>
-            <w:pPr/>
-            <w:r>
-              <w:t xml:space="preserve">Grafo con ontología</w:t>
-            </w:r>
-          </w:p>
-        </w:tc>
-        <w:tc>
-          <w:tcPr>
-            <w:tcW w:w="1872" w:type="dxa"/>
-          </w:tcPr>
-          <w:p>
-            <w:pPr/>
-            <w:hyperlink r:id="rId15" w:history="1">
-              <w:r>
-                <w:rPr>
-                  <w:rStyle w:val="Hyperlink"/>
-                </w:rPr>
-                <w:t xml:space="preserve">data.world, 2024</w:t>
-              </w:r>
-            </w:hyperlink>
-          </w:p>
-        </w:tc>
-        <w:tc>
-          <w:tcPr>
-            <w:tcW w:w="1872" w:type="dxa"/>
-          </w:tcPr>
-          <w:p>
-            <w:pPr/>
-            <w:r>
-              <w:t xml:space="preserve">El mismo, con comprobación contra la ontología y reparación</w:t>
-            </w:r>
-          </w:p>
-        </w:tc>
-        <w:tc>
-          <w:tcPr>
-            <w:tcW w:w="1872" w:type="dxa"/>
-          </w:tcPr>
-          <w:p>
-            <w:pPr/>
-            <w:r>
-              <w:t xml:space="preserve">GPT-4</w:t>
-            </w:r>
-          </w:p>
-        </w:tc>
-        <w:tc>
-          <w:tcPr>
-            <w:tcW w:w="1872" w:type="dxa"/>
-          </w:tcPr>
-          <w:p>
-            <w:pPr/>
-            <w:r>
-              <w:t xml:space="preserve">72,55 % (8 % «no lo sé», 19 % de error)</w:t>
-            </w:r>
-          </w:p>
-        </w:tc>
-      </w:tr>
-      <w:tr>
-        <w:tc>
-          <w:tcPr>
-            <w:tcW w:w="1872" w:type="dxa"/>
-          </w:tcPr>
-          <w:p>
-            <w:pPr/>
-            <w:r>
-              <w:rPr>
-                <w:b/>
-              </w:rPr>
-              <w:t xml:space="preserve">Text-to-metrics</w:t>
-            </w:r>
-          </w:p>
-        </w:tc>
-        <w:tc>
-          <w:tcPr>
-            <w:tcW w:w="1872" w:type="dxa"/>
-          </w:tcPr>
-          <w:p>
-            <w:pPr/>
-            <w:r>
-              <w:rPr>
-                <w:b/>
-              </w:rPr>
-              <w:t xml:space="preserve">dbt Labs, 2026</w:t>
-            </w:r>
-          </w:p>
-        </w:tc>
-        <w:tc>
-          <w:tcPr>
-            <w:tcW w:w="1872" w:type="dxa"/>
-          </w:tcPr>
-          <w:p>
-            <w:pPr/>
-            <w:r>
-              <w:rPr>
-                <w:b/>
-              </w:rPr>
-              <w:t xml:space="preserve">Seguros ACME, solo las preguntas que el modelo cubre</w:t>
-            </w:r>
-          </w:p>
-        </w:tc>
-        <w:tc>
-          <w:tcPr>
-            <w:tcW w:w="1872" w:type="dxa"/>
-          </w:tcPr>
-          <w:p>
-            <w:pPr/>
-            <w:r>
-              <w:rPr>
-                <w:b/>
-              </w:rPr>
-              <w:t xml:space="preserve">Claude Sonnet 4.6 / GPT-5.3 Codex</w:t>
-            </w:r>
-          </w:p>
-        </w:tc>
-        <w:tc>
-          <w:tcPr>
-            <w:tcW w:w="1872" w:type="dxa"/>
-          </w:tcPr>
-          <w:p>
-            <w:pPr/>
-            <w:r>
-              <w:rPr>
-                <w:b/>
-              </w:rPr>
-              <w:t xml:space="preserve">100 % / 100 %</w:t>
-            </w:r>
-          </w:p>
-        </w:tc>
-      </w:tr>
-      <w:tr>
-        <w:tc>
-          <w:tcPr>
-            <w:tcW w:w="1872" w:type="dxa"/>
-          </w:tcPr>
-          <w:p>
-            <w:pPr/>
-            <w:r>
-              <w:t xml:space="preserve">Text-to-metrics</w:t>
-            </w:r>
-          </w:p>
-        </w:tc>
-        <w:tc>
-          <w:tcPr>
-            <w:tcW w:w="1872" w:type="dxa"/>
-          </w:tcPr>
-          <w:p>
-            <w:pPr/>
-            <w:r>
-              <w:t xml:space="preserve">dbt Labs, 2026</w:t>
-            </w:r>
-          </w:p>
-        </w:tc>
-        <w:tc>
-          <w:tcPr>
-            <w:tcW w:w="1872" w:type="dxa"/>
-          </w:tcPr>
-          <w:p>
-            <w:pPr/>
-            <w:r>
-              <w:t xml:space="preserve">El mismo, todas las preguntas (las no cubiertas se contestan «no puedo»)</w:t>
-            </w:r>
-          </w:p>
-        </w:tc>
-        <w:tc>
-          <w:tcPr>
-            <w:tcW w:w="1872" w:type="dxa"/>
-          </w:tcPr>
-          <w:p>
-            <w:pPr/>
-            <w:r>
-              <w:t xml:space="preserve">Claude Sonnet 4.6 / GPT-5.3 Codex</w:t>
-            </w:r>
-          </w:p>
-        </w:tc>
-        <w:tc>
-          <w:tcPr>
-            <w:tcW w:w="1872" w:type="dxa"/>
-          </w:tcPr>
-          <w:p>
-            <w:pPr/>
-            <w:r>
-              <w:t xml:space="preserve">72,7 % / 72,7 %</w:t>
-            </w:r>
-          </w:p>
-        </w:tc>
-      </w:tr>
-      <w:tr>
-        <w:tc>
-          <w:tcPr>
-            <w:tcW w:w="1872" w:type="dxa"/>
-          </w:tcPr>
-          <w:p>
-            <w:pPr/>
-            <w:r>
-              <w:rPr>
-                <w:b/>
-              </w:rPr>
-              <w:t xml:space="preserve">Text-to-metrics</w:t>
-            </w:r>
-          </w:p>
-        </w:tc>
-        <w:tc>
-          <w:tcPr>
-            <w:tcW w:w="1872" w:type="dxa"/>
-          </w:tcPr>
-          <w:p>
-            <w:pPr/>
-            <w:r>
-              <w:rPr>
-                <w:b/>
-              </w:rPr>
-              <w:t xml:space="preserve">dbt Labs, 2026</w:t>
-            </w:r>
-          </w:p>
-        </w:tc>
-        <w:tc>
-          <w:tcPr>
-            <w:tcW w:w="1872" w:type="dxa"/>
-          </w:tcPr>
-          <w:p>
-            <w:pPr/>
-            <w:r>
-              <w:rPr>
-                <w:b/>
-              </w:rPr>
-              <w:t xml:space="preserve">El mismo, tras ampliar la cobertura con 3 tablas preparadas</w:t>
-            </w:r>
-          </w:p>
-        </w:tc>
-        <w:tc>
-          <w:tcPr>
-            <w:tcW w:w="1872" w:type="dxa"/>
-          </w:tcPr>
-          <w:p>
-            <w:pPr/>
-            <w:r>
-              <w:rPr>
-                <w:b/>
-              </w:rPr>
-              <w:t xml:space="preserve">Claude Sonnet 4.6 / GPT-5.3 Codex</w:t>
-            </w:r>
-          </w:p>
-        </w:tc>
-        <w:tc>
-          <w:tcPr>
-            <w:tcW w:w="1872" w:type="dxa"/>
-          </w:tcPr>
-          <w:p>
-            <w:pPr/>
-            <w:r>
-              <w:rPr>
-                <w:b/>
-              </w:rPr>
-              <w:t xml:space="preserve">98,2 % / 100 %</w:t>
-            </w:r>
-          </w:p>
-        </w:tc>
-      </w:tr>
-      <w:tr>
-        <w:tc>
-          <w:tcPr>
-            <w:tcW w:w="1872" w:type="dxa"/>
-          </w:tcPr>
-          <w:p>
-            <w:pPr/>
-            <w:r>
-              <w:t xml:space="preserve">Text-to-metrics (variante)</w:t>
-            </w:r>
-          </w:p>
-        </w:tc>
-        <w:tc>
-          <w:tcPr>
-            <w:tcW w:w="1872" w:type="dxa"/>
-          </w:tcPr>
-          <w:p>
-            <w:pPr/>
-            <w:hyperlink r:id="rId22" w:history="1">
-              <w:r>
-                <w:rPr>
-                  <w:rStyle w:val="Hyperlink"/>
-                </w:rPr>
-                <w:t xml:space="preserve">AtScale, agosto 2024</w:t>
-              </w:r>
-            </w:hyperlink>
-          </w:p>
-        </w:tc>
-        <w:tc>
-          <w:tcPr>
-            <w:tcW w:w="1872" w:type="dxa"/>
-          </w:tcPr>
-          <w:p>
-            <w:pPr/>
-            <w:r>
-              <w:t xml:space="preserve">TPC-DS, 40 preguntas; el LLM escribe SQL contra el modelo semántico y el motor resuelve joins y agregaciones</w:t>
-            </w:r>
-          </w:p>
-        </w:tc>
-        <w:tc>
-          <w:tcPr>
-            <w:tcW w:w="1872" w:type="dxa"/>
-          </w:tcPr>
-          <w:p>
-            <w:pPr/>
-            <w:r>
-              <w:t xml:space="preserve">Gemini 1.5 Pro</w:t>
-            </w:r>
-          </w:p>
-        </w:tc>
-        <w:tc>
-          <w:tcPr>
-            <w:tcW w:w="1872" w:type="dxa"/>
-          </w:tcPr>
-          <w:p>
-            <w:pPr/>
-            <w:r>
-              <w:t xml:space="preserve">92,5 % (sin capa: 20 %)</w:t>
-            </w:r>
-          </w:p>
-        </w:tc>
-      </w:tr>
-    </w:tbl>
-    <w:p>
-      <w:pPr/>
-      <w:r>
-        <w:t xml:space="preserve">Los porcentajes no son comparables entre bancos de pruebas distintos: la comparación válida es dentro de cada estudio. Y no hay un estudio de 2026 que mida el enfoque de grafo con modelos actuales; sus cifras son de GPT-4. Lo que se lee dentro de cada estudio: en dbt, el SQL con LLM sobre tablas ya acierta un 64,5 % con los modelos de hoy (en 2023 era un 32,7 % en esa misma prueba) y text-to-metrics llega al 100 % en lo que cubre, por generación determinista y no por perfección del LLM. En Cube, dar las definiciones como contexto sube el acierto entre 17 y 23 puntos, pero el LLM sigue escribiendo el SQL y se queda en torno al 68 %. En data.world, el grafo triplica el acierto del SQL sobre tablas y la comprobación contra la ontología lo lleva al 72,55 %, con uno de cada cinco erróneo.</w:t>
-      </w:r>
-    </w:p>
-    <w:p>
-      <w:pPr/>
-      <w:r>
-        <w:t xml:space="preserve">Para un banco la cifra que importa no es el acierto sino cuántas respuestas son erróneas y parecen buenas. Text-to-metrics elimina dentro de su alcance los errores de aritmética y de SQL, y lo que no puede responder lo convierte en «no puedo». Quedan dos errores que sí pueden parecer buenos: que el LLM elija mal la métrica, el filtro o la fecha, y que la métrica esté mal definida; se atacan con el juego de pruebas y con la firma del dueño. Cautelas: casi todos los estudios los firman proveedores con producto propio (dbt, Cube, Snowflake, data.world, AtScale) y las muestras son pequeñas; sirven como indicio de dirección, no como cifras para comprometer. La medición que conviene presentar es la propia, con las preguntas reales del banco en tres condiciones (SQL sobre tablas, SQL con los YAML como contexto y text-to-metrics), contando por separado aciertos, errores y «no puedo».</w:t>
-      </w:r>
-    </w:p>
-    <w:p>
-      <w:pPr/>
-      <w:r>
-        <w:t xml:space="preserve">Más relevante que las cifras es lo que varios trabajos de 2026 muestran sobre dónde está la fiabilidad. Dos ejemplos. En uno, un modelo pequeño, de siete mil millones de parámetros, al que se le imponen las reglas del negocio acierta más que un modelo cuatro veces mayor sin ellas (</w:t>
-      </w:r>
-      <w:hyperlink r:id="rId23" w:history="1">
-        <w:r>
-          <w:rPr>
-            <w:rStyle w:val="Hyperlink"/>
-          </w:rPr>
-          <w:t xml:space="preserve">Business Truth, not SQL Accuracy</w:t>
-        </w:r>
-      </w:hyperlink>
-      <w:r>
-        <w:t xml:space="preserve">). En otro, el modelo solo elige entre opciones permitidas y un compilador determinista escribe la consulta (</w:t>
+        <w:t xml:space="preserve">Dónde está el banco.</w:t>
+      </w:r>
+      <w:r>
+        <w:t xml:space="preserve"> Ha hecho una PoC con la opción b, text-to-SQL con los YAML como contexto, que funcionó bien para un número limitado de vistas, y va a hacer la siguiente con la opción e, text-to-metrics, porque con la evidencia disponible es la que da mejor relación entre acierto y esfuerzo: elimina los errores de SQL dentro de lo que cubre, y lo que no cubre lo convierte en «no puedo». Es una hipótesis a confirmar con el banco de pruebas propio. Si se confirma, la opción e será la vía certificada y la b seguirá como vía exploratoria. El detalle está en Capa semántica · 0 Concepto.</w:t>
+      </w:r>
+    </w:p>
+    <w:p>
+      <w:pPr>
+        <w:pStyle w:val="Heading3"/>
+      </w:pPr>
+      <w:r>
+        <w:t xml:space="preserve">Vía 2 · Sobre documentos: no hay almacén, o todavía no</w:t>
+      </w:r>
+    </w:p>
+    <w:p>
+      <w:pPr/>
+      <w:r>
+        <w:t xml:space="preserve">Cuando el dato está en documentos no hay consulta que compilar: hay que leer, y lo que se lee tiene que enlazarse con lo que ya está en tablas, el cliente, el contrato, la versión vigente de la política. Esta vía es más nueva, tiene menos evidencia y es donde más pilotos fallan al pasar a producción.</w:t>
+      </w:r>
+    </w:p>
+    <w:p>
+      <w:pPr/>
+      <w:r>
+        <w:t xml:space="preserve">La ontología es el contrato entre las dos familias de datos. Un contrato de préstamo en PDF y el registro del préstamo en el core bancario son dos manifestaciones del mismo concepto, "contrato de préstamo", con los mismos atributos: importe, tipo, vencimiento, garantías, firmantes. Si el concepto está definido una vez, el documento se puede extraer a esa estructura y conciliar con el registro. Si no lo está, el documento se queda en un índice vectorial que devuelve fragmentos parecidos a la pregunta, sin saber a qué cliente, contrato o cuenta pertenecen.</w:t>
+      </w:r>
+    </w:p>
+    <w:p>
+      <w:pPr/>
+      <w:r>
+        <w:t xml:space="preserve">El punto de encuentro es el grafo de conocimiento con procedencia. Cada hecho del grafo lleva dos enlaces hacia atrás: a la tabla y campo del sistema origen si viene de datos estructurados, o al documento, página y fragmento si viene de extracción. Esa procedencia es exactamente el linaje a nivel de campo que BCBS 239 pide y que el Comité de Basilea sigue echando en falta en 2026. Y es lo que permite responder a un supervisor "de dónde sale este dato" con un enlace en lugar de con una reconstrucción.</w:t>
+      </w:r>
+    </w:p>
+    <w:p>
+      <w:pPr/>
+      <w:r>
+        <w:rPr>
+          <w:b/>
+        </w:rPr>
+        <w:t xml:space="preserve">Tres formas de combinar documentos y tablas, según la pregunta.</w:t>
+      </w:r>
+      <w:r>
+        <w:t xml:space="preserve"> Un agente recibe tres tipos de pregunta sobre documentos, y cada tipo exige una forma distinta de juntar lo que está en el documento con lo que está en las tablas: extraer y consultar, cuando la pregunta pide una cifra; filtrar por el grafo y buscar en el texto, cuando pide leer el documento correcto; y contrastar contra la norma estructurada, cuando pide comprobar una decisión. En las tres el dato estructurado está presente: es lo que dice a qué cliente, contrato o versión pertenece el documento. Confundirlas es la causa más frecuente de que un piloto funcione en la demostración y falle en producción.</w:t>
+      </w:r>
+    </w:p>
+    <w:p>
+      <w:pPr/>
+      <w:r>
+        <w:rPr>
+          <w:b/>
+        </w:rPr>
+        <w:t xml:space="preserve">Preguntas que piden una cifra que solo está en documentos.</w:t>
+      </w:r>
+      <w:r>
+        <w:t xml:space="preserve"> «¿Cuántos contratos tienen cláusula de vencimiento anticipado?», «¿qué exposición total hay bajo garantías de un mismo garante?». No se responden leyendo: hay que contar o sumar sobre cientos de contratos. La forma de hacerlo es extraer primero y consultar después. Un modelo lee cada documento y rellena los atributos que la ontología define para ese tipo de documento; cada hecho se guarda en una tabla o en el grafo con un enlace al fragmento del que salió; y la cifra la calcula el compilador de métricas por la vía certificada, igual que si el dato viniera del core. Lo que gana el banco: el hecho extraído pasa a ser un dato más, con linaje hasta el documento, y la cifra sale por la misma vía determinista que cualquier otra. Eso es lo que BCBS 239 y la guía del BCE piden para un dato de riesgo, aunque su origen sea un PDF. Palantir lo vende como producto desde febrero de 2026 con AIP Document Intelligence, y la literatura lo llama «Structure then Query».</w:t>
+      </w:r>
+    </w:p>
+    <w:p>
+      <w:pPr/>
+      <w:r>
+        <w:rPr>
+          <w:b/>
+        </w:rPr>
+        <w:t xml:space="preserve">Preguntas que piden leer el documento correcto.</w:t>
+      </w:r>
+      <w:r>
+        <w:t xml:space="preserve"> «¿Qué dice la política vigente sobre este caso?», «¿qué cláusula aplica a este contrato?». Aquí no hay cifra: hay que encontrar el párrafo adecuado. La búsqueda por vectores lo hace bien cuando la pregunta y el párrafo se parecen, y mal en tres situaciones habituales en banca: cuando la norma remite a otra, cuando hay varias versiones y solo una está en vigor, y cuando el usuario no tiene permiso para ver parte de los documentos. La forma de hacerlo es combinar: el grafo decide qué documentos son los relevantes (los de esta entidad, en la versión vigente a esa fecha, los que este usuario puede ver) y el vector localiza el párrafo dentro de ellos. Lo que gana el banco: la respuesta cita un documento concreto en su versión vigente y respeta los permisos, que es lo que exige el Reglamento de IA para poder reconstruir qué información tenía el sistema al responder. Los vectores, en resumen, son motores de coincidencia difusa: localizan el párrafo que habla de algo, pero no dan el dato exacto; el vector localiza y la estructura responde.</w:t>
+      </w:r>
+    </w:p>
+    <w:p>
+      <w:pPr/>
+      <w:r>
+        <w:rPr>
+          <w:b/>
+        </w:rPr>
+        <w:t xml:space="preserve">Preguntas que piden comprobar una decisión contra la norma.</w:t>
+      </w:r>
+      <w:r>
+        <w:t xml:space="preserve"> «¿Esta operación cumple la política de blanqueo?», «¿esta excepción de precio está dentro de lo autorizado?». Ni cifra ni lectura: una comprobación. La forma de hacerlo es convertir la norma en una lista estructurada de obligaciones y condiciones, y contrastar contra ella los datos de la operación. La salida no es solo sí o no, sino la explicación: qué regla se aplicó y con qué datos. Lo que gana el banco: la explicación de cumplimiento que el supervisor pide en monitorización de transacciones se genera en el momento, y la traza de la decisión queda registrada en el grafo de contexto. Lo describen los trabajos GraphCompliance y el de grafos regulatorios para monitorización de transacciones.</w:t>
+      </w:r>
+    </w:p>
+    <w:p>
+      <w:pPr/>
+      <w:r>
+        <w:rPr>
+          <w:b/>
+        </w:rPr>
+        <w:t xml:space="preserve">Qué dice la evidencia en esta vía.</w:t>
+      </w:r>
+      <w:r>
+        <w:t xml:space="preserve"> Es más escasa que en la vía 1 y mide otra cosa: no si una cifra es correcta, sino si el sistema encontró el pasaje adecuado o seleccionó el documento vigente. Lo disponible apunta en una dirección. Sobre el Code of Federal Regulations, combinar grafo y búsqueda vectorial mejoró un 70 % sobre la búsqueda vectorial sola en preguntas con referencias cruzadas y normas derogadas, que es el caso de cualquier normativa interna de un banco (</w:t>
       </w:r>
       <w:hyperlink r:id="rId24" w:history="1">
-        <w:r>
-          <w:rPr>
-            <w:rStyle w:val="Hyperlink"/>
-          </w:rPr>
-          <w:t xml:space="preserve">Bounded Semantic Planning and Deterministic Compilation</w:t>
-        </w:r>
-      </w:hyperlink>
-      <w:r>
-        <w:t xml:space="preserve">). La lectura para el banco es la misma en los dos: la fiabilidad viene de las reglas y del compilador, no del tamaño del modelo, así que la inversión va al YAML y a la vía certificada, no a modelos más grandes. Es exactamente el diseño de text-to-metrics, y para un entorno regulado es el único defendible, porque la consulta que se ejecuta es siempre una que alguien ha aprobado.</w:t>
-      </w:r>
-    </w:p>
-    <w:p>
-      <w:pPr/>
-      <w:r>
-        <w:rPr>
-          <w:b/>
-        </w:rPr>
-        <w:t xml:space="preserve">Dónde está el banco.</w:t>
-      </w:r>
-      <w:r>
-        <w:t xml:space="preserve"> Ha hecho una PoC con la opción b, text-to-SQL con los YAML como contexto, que funcionó bien para un número limitado de vistas, y va a hacer la siguiente con la opción e, text-to-metrics, porque con la evidencia disponible es la que da mejor relación entre acierto y esfuerzo: elimina los errores de SQL dentro de lo que cubre, y lo que no cubre lo convierte en «no puedo». Es una hipótesis a confirmar con el banco de pruebas propio. Si se confirma, la opción e será la vía certificada y la b seguirá como vía exploratoria. El detalle está en Capa semántica · 0 Concepto.</w:t>
-      </w:r>
-    </w:p>
-    <w:p>
-      <w:pPr>
-        <w:pStyle w:val="Heading3"/>
-      </w:pPr>
-      <w:r>
-        <w:t xml:space="preserve">Vía 2 · Sobre documentos: no hay almacén, o todavía no</w:t>
-      </w:r>
-    </w:p>
-    <w:p>
-      <w:pPr/>
-      <w:r>
-        <w:t xml:space="preserve">Cuando el dato está en documentos no hay consulta que compilar: hay que leer, y lo que se lee tiene que enlazarse con lo que ya está en tablas, el cliente, el contrato, la versión vigente de la política. Esta vía es más nueva, tiene menos evidencia y es donde más pilotos fallan al pasar a producción.</w:t>
-      </w:r>
-    </w:p>
-    <w:p>
-      <w:pPr/>
-      <w:r>
-        <w:t xml:space="preserve">La ontología es el contrato entre las dos familias de datos. Un contrato de préstamo en PDF y el registro del préstamo en el core bancario son dos manifestaciones del mismo concepto, "contrato de préstamo", con los mismos atributos: importe, tipo, vencimiento, garantías, firmantes. Si el concepto está definido una vez, el documento se puede extraer a esa estructura y conciliar con el registro. Si no lo está, el documento se queda en un índice vectorial que devuelve fragmentos parecidos a la pregunta, sin saber a qué cliente, contrato o cuenta pertenecen.</w:t>
-      </w:r>
-    </w:p>
-    <w:p>
-      <w:pPr/>
-      <w:r>
-        <w:t xml:space="preserve">El punto de encuentro es el grafo de conocimiento con procedencia. Cada hecho del grafo lleva dos enlaces hacia atrás: a la tabla y campo del sistema origen si viene de datos estructurados, o al documento, página y fragmento si viene de extracción. Esa procedencia es exactamente el linaje a nivel de campo que BCBS 239 pide y que el Comité de Basilea sigue echando en falta en 2026. Y es lo que permite responder a un supervisor "de dónde sale este dato" con un enlace en lugar de con una reconstrucción.</w:t>
-      </w:r>
-    </w:p>
-    <w:p>
-      <w:pPr/>
-      <w:r>
-        <w:rPr>
-          <w:b/>
-        </w:rPr>
-        <w:t xml:space="preserve">Tres formas de combinar documentos y tablas, según la pregunta.</w:t>
-      </w:r>
-      <w:r>
-        <w:t xml:space="preserve"> Un agente recibe tres tipos de pregunta sobre documentos, y cada tipo exige una forma distinta de juntar lo que está en el documento con lo que está en las tablas: extraer y consultar, cuando la pregunta pide una cifra; filtrar por el grafo y buscar en el texto, cuando pide leer el documento correcto; y contrastar contra la norma estructurada, cuando pide comprobar una decisión. En las tres el dato estructurado está presente: es lo que dice a qué cliente, contrato o versión pertenece el documento. Confundirlas es la causa más frecuente de que un piloto funcione en la demostración y falle en producción.</w:t>
-      </w:r>
-    </w:p>
-    <w:p>
-      <w:pPr/>
-      <w:r>
-        <w:rPr>
-          <w:b/>
-        </w:rPr>
-        <w:t xml:space="preserve">Preguntas que piden una cifra que solo está en documentos.</w:t>
-      </w:r>
-      <w:r>
-        <w:t xml:space="preserve"> «¿Cuántos contratos tienen cláusula de vencimiento anticipado?», «¿qué exposición total hay bajo garantías de un mismo garante?». No se responden leyendo: hay que contar o sumar sobre cientos de contratos. La forma de hacerlo es extraer primero y consultar después. Un modelo lee cada documento y rellena los atributos que la ontología define para ese tipo de documento; cada hecho se guarda en una tabla o en el grafo con un enlace al fragmento del que salió; y la cifra la calcula el compilador de métricas por la vía certificada, igual que si el dato viniera del core. Lo que gana el banco: el hecho extraído pasa a ser un dato más, con linaje hasta el documento, y la cifra sale por la misma vía determinista que cualquier otra. Eso es lo que BCBS 239 y la guía del BCE piden para un dato de riesgo, aunque su origen sea un PDF. Palantir lo vende como producto desde febrero de 2026 con AIP Document Intelligence, y la literatura lo llama «Structure then Query».</w:t>
-      </w:r>
-    </w:p>
-    <w:p>
-      <w:pPr/>
-      <w:r>
-        <w:rPr>
-          <w:b/>
-        </w:rPr>
-        <w:t xml:space="preserve">Preguntas que piden leer el documento correcto.</w:t>
-      </w:r>
-      <w:r>
-        <w:t xml:space="preserve"> «¿Qué dice la política vigente sobre este caso?», «¿qué cláusula aplica a este contrato?». Aquí no hay cifra: hay que encontrar el párrafo adecuado. La búsqueda por vectores lo hace bien cuando la pregunta y el párrafo se parecen, y mal en tres situaciones habituales en banca: cuando la norma remite a otra, cuando hay varias versiones y solo una está en vigor, y cuando el usuario no tiene permiso para ver parte de los documentos. La forma de hacerlo es combinar: el grafo decide qué documentos son los relevantes (los de esta entidad, en la versión vigente a esa fecha, los que este usuario puede ver) y el vector localiza el párrafo dentro de ellos. Lo que gana el banco: la respuesta cita un documento concreto en su versión vigente y respeta los permisos, que es lo que exige el Reglamento de IA para poder reconstruir qué información tenía el sistema al responder. Los vectores, en resumen, son motores de coincidencia difusa: localizan el párrafo que habla de algo, pero no dan el dato exacto; el vector localiza y la estructura responde.</w:t>
-      </w:r>
-    </w:p>
-    <w:p>
-      <w:pPr/>
-      <w:r>
-        <w:rPr>
-          <w:b/>
-        </w:rPr>
-        <w:t xml:space="preserve">Preguntas que piden comprobar una decisión contra la norma.</w:t>
-      </w:r>
-      <w:r>
-        <w:t xml:space="preserve"> «¿Esta operación cumple la política de blanqueo?», «¿esta excepción de precio está dentro de lo autorizado?». Ni cifra ni lectura: una comprobación. La forma de hacerlo es convertir la norma en una lista estructurada de obligaciones y condiciones, y contrastar contra ella los datos de la operación. La salida no es solo sí o no, sino la explicación: qué regla se aplicó y con qué datos. Lo que gana el banco: la explicación de cumplimiento que el supervisor pide en monitorización de transacciones se genera en el momento, y la traza de la decisión queda registrada en el grafo de contexto. Lo describen los trabajos GraphCompliance y el de grafos regulatorios para monitorización de transacciones.</w:t>
-      </w:r>
-    </w:p>
-    <w:p>
-      <w:pPr/>
-      <w:r>
-        <w:rPr>
-          <w:b/>
-        </w:rPr>
-        <w:t xml:space="preserve">Qué dice la evidencia en esta vía.</w:t>
-      </w:r>
-      <w:r>
-        <w:t xml:space="preserve"> Es más escasa que en la vía 1 y mide otra cosa: no si una cifra es correcta, sino si el sistema encontró el pasaje adecuado o seleccionó el documento vigente. Lo disponible apunta en una dirección. Sobre el Code of Federal Regulations, combinar grafo y búsqueda vectorial mejoró un 70 % sobre la búsqueda vectorial sola en preguntas con referencias cruzadas y normas derogadas, que es el caso de cualquier normativa interna de un banco (</w:t>
-      </w:r>
-      <w:hyperlink r:id="rId25" w:history="1">
         <w:r>
           <w:rPr>
             <w:rStyle w:val="Hyperlink"/>
@@ -2971,7 +2551,7 @@
       <w:r>
         <w:t xml:space="preserve">). Y un trabajo de diciembre de 2025 (</w:t>
       </w:r>
-      <w:hyperlink r:id="rId26" w:history="1">
+      <w:hyperlink r:id="rId25" w:history="1">
         <w:r>
           <w:rPr>
             <w:rStyle w:val="Hyperlink"/>
@@ -3064,7 +2644,7 @@
       <w:r>
         <w:t xml:space="preserve"> El problema que resuelve: una ontología hecha a mano se queda vieja porque nadie tiene tiempo de actualizarla cada vez que cambia un proceso. En septiembre de 2026 se publicó </w:t>
       </w:r>
-      <w:hyperlink r:id="rId27" w:history="1">
+      <w:hyperlink r:id="rId26" w:history="1">
         <w:r>
           <w:rPr>
             <w:rStyle w:val="Hyperlink"/>
@@ -3075,7 +2655,7 @@
       <w:r>
         <w:t xml:space="preserve">, un sistema en el que un agente construye la ontología leyendo las fuentes y después la corrige a partir de sus propios fallos: cuando una consulta sale mal, localiza qué concepto faltaba o estaba mal definido, propone el cambio y solo lo incorpora si una prueba demuestra que las consultas mejoran. Otro trabajo del mismo año (</w:t>
       </w:r>
-      <w:hyperlink r:id="rId28" w:history="1">
+      <w:hyperlink r:id="rId27" w:history="1">
         <w:r>
           <w:rPr>
             <w:rStyle w:val="Hyperlink"/>
@@ -3158,7 +2738,7 @@
                     <pic:cNvPicPr/>
                   </pic:nvPicPr>
                   <pic:blipFill>
-                    <a:blip r:embed="rId29"/>
+                    <a:blip r:embed="rId28"/>
                     <a:stretch>
                       <a:fillRect/>
                     </a:stretch>
@@ -3694,6 +3274,152 @@
         <w:pStyle w:val="ListParagraph"/>
         <w:numPr>
           <w:ilvl w:val="0"/>
+          <w:numId w:val="3"/>
+        </w:numPr>
+      </w:pPr>
+      <w:r>
+        <w:rPr>
+          <w:b/>
+        </w:rPr>
+        <w:t xml:space="preserve">Lo descriptivo no es lo normativo.</w:t>
+      </w:r>
+      <w:r>
+        <w:t xml:space="preserve"> Minar código y logs dice cómo la organización calcula las cosas de hecho, no cómo debe calcularlas. La definición de impago viene del artículo 178 del CRR, no de la consulta más frecuente. Si la implementación mayoritaria es la incorrecta, una ontología que evoluciona por uso consolida el error con autoridad. Por eso la propuesta es automática y la aprobación humana.</w:t>
+      </w:r>
+    </w:p>
+    <w:p>
+      <w:pPr>
+        <w:pStyle w:val="ListParagraph"/>
+        <w:numPr>
+          <w:ilvl w:val="0"/>
+          <w:numId w:val="3"/>
+        </w:numPr>
+      </w:pPr>
+      <w:r>
+        <w:rPr>
+          <w:b/>
+        </w:rPr>
+        <w:t xml:space="preserve">El código guarda la implementación, no el porqué.</w:t>
+      </w:r>
+      <w:r>
+        <w:t xml:space="preserve"> Un umbral de 90 días aparece en código; la razón está en una circular o un correo. Sin enlazar la regla con su fuente documental la ontología es correcta pero no explicable.</w:t>
+      </w:r>
+    </w:p>
+    <w:p>
+      <w:pPr>
+        <w:pStyle w:val="ListParagraph"/>
+        <w:numPr>
+          <w:ilvl w:val="0"/>
+          <w:numId w:val="3"/>
+        </w:numPr>
+      </w:pPr>
+      <w:r>
+        <w:rPr>
+          <w:b/>
+        </w:rPr>
+        <w:t xml:space="preserve">Un cambio semántico es un cambio en todos los informes aguas abajo.</w:t>
+      </w:r>
+      <w:r>
+        <w:t xml:space="preserve"> Sin fecha de efectividad, análisis de impacto y versionado, un cambio de definición altera el reporting regulatorio del trimestre sin que nadie lo haya decidido.</w:t>
+      </w:r>
+    </w:p>
+    <w:p>
+      <w:pPr>
+        <w:pStyle w:val="ListParagraph"/>
+        <w:numPr>
+          <w:ilvl w:val="0"/>
+          <w:numId w:val="3"/>
+        </w:numPr>
+      </w:pPr>
+      <w:r>
+        <w:rPr>
+          <w:b/>
+        </w:rPr>
+        <w:t xml:space="preserve">La ontología derivada por un modelo es salida de un modelo.</w:t>
+      </w:r>
+      <w:r>
+        <w:t xml:space="preserve"> Puede inventar relaciones plausibles. Entra en gestión de riesgo de modelo, con validación independiente, igual que un scoring.</w:t>
+      </w:r>
+    </w:p>
+    <w:p>
+      <w:pPr>
+        <w:pStyle w:val="ListParagraph"/>
+        <w:numPr>
+          <w:ilvl w:val="0"/>
+          <w:numId w:val="3"/>
+        </w:numPr>
+      </w:pPr>
+      <w:r>
+        <w:rPr>
+          <w:b/>
+        </w:rPr>
+        <w:t xml:space="preserve">Bucle de retroalimentación.</w:t>
+      </w:r>
+      <w:r>
+        <w:t xml:space="preserve"> Si los agentes generan la mayoría de las consultas, el sistema aprende de sí mismo. Hay que distinguir en los logs el uso humano del uso de agentes y ponderar en consecuencia.</w:t>
+      </w:r>
+    </w:p>
+    <w:p>
+      <w:pPr>
+        <w:pStyle w:val="ListParagraph"/>
+        <w:numPr>
+          <w:ilvl w:val="0"/>
+          <w:numId w:val="3"/>
+        </w:numPr>
+      </w:pPr>
+      <w:r>
+        <w:rPr>
+          <w:b/>
+        </w:rPr>
+        <w:t xml:space="preserve">Privacidad en logs y embeddings.</w:t>
+      </w:r>
+      <w:r>
+        <w:t xml:space="preserve"> Los logs de consulta contienen nombres y documentos de identidad; los embeddings pueden reconstruir texto. Ambos son datos personales bajo RGPD y necesitan enmascarado y retención definida.</w:t>
+      </w:r>
+    </w:p>
+    <w:p>
+      <w:pPr>
+        <w:pStyle w:val="ListParagraph"/>
+        <w:numPr>
+          <w:ilvl w:val="0"/>
+          <w:numId w:val="3"/>
+        </w:numPr>
+      </w:pPr>
+      <w:r>
+        <w:rPr>
+          <w:b/>
+        </w:rPr>
+        <w:t xml:space="preserve">Bloqueo de proveedor y límites técnicos.</w:t>
+      </w:r>
+      <w:r>
+        <w:t xml:space="preserve"> Una ontología en formato propietario es un activo cautivo. Un grafo virtual sobre SQL sirve para métricas y joins pero no para análisis de redes. El grafo de contexto no tiene estándar y cada proveedor lo define a su conveniencia.</w:t>
+      </w:r>
+    </w:p>
+    <w:p>
+      <w:pPr/>
+      <w:r>
+        <w:t xml:space="preserve">A estos se añade un límite organizativo: el propietario de concepto solo funciona si tiene autoridad real para rechazar un cambio que un área de negocio quiere. Sin esa autoridad, el ciclo de aprobación se convierte en un trámite y la ontología vuelve a divergir, ahora más rápido.</w:t>
+      </w:r>
+    </w:p>
+    <w:p>
+      <w:pPr>
+        <w:pStyle w:val="Heading2"/>
+      </w:pPr>
+      <w:r>
+        <w:t xml:space="preserve">Hoja de ruta para una entidad financiera</w:t>
+      </w:r>
+    </w:p>
+    <w:p>
+      <w:pPr/>
+      <w:r>
+        <w:t xml:space="preserve">Dos reglas ordenan el camino. La capa semántica avanza en transversal y ahora, porque el entorno informacional ya está gobernado y los YAML existen: es el componente 1 de Dato como Producto y no espera a los demás. Los otros tres componentes avanzan por dominio de uso, allí donde haya agentes haciendo tareas que exijan relaciones, documentos o precedentes. Las líneas van separadas pero coordinadas por una costura: los campos del YAML y del registro de peticiones que alimentarán a la ontología, al grafo y al contexto se deciden ahora, para que la capa semántica no se rehaga.</w:t>
+      </w:r>
+    </w:p>
+    <w:p>
+      <w:pPr>
+        <w:pStyle w:val="ListParagraph"/>
+        <w:numPr>
+          <w:ilvl w:val="0"/>
           <w:numId w:val="4"/>
         </w:numPr>
       </w:pPr>
@@ -3701,10 +3427,10 @@
         <w:rPr>
           <w:b/>
         </w:rPr>
-        <w:t xml:space="preserve">Lo descriptivo no es lo normativo.</w:t>
-      </w:r>
-      <w:r>
-        <w:t xml:space="preserve"> Minar código y logs dice cómo la organización calcula las cosas de hecho, no cómo debe calcularlas. La definición de impago viene del artículo 178 del CRR, no de la consulta más frecuente. Si la implementación mayoritaria es la incorrecta, una ontología que evoluciona por uso consolida el error con autoridad. Por eso la propuesta es automática y la aprobación humana.</w:t>
+        <w:t xml:space="preserve">Capa semántica, transversal y ahora.</w:t>
+      </w:r>
+      <w:r>
+        <w:t xml:space="preserve"> Extender la etapa 1 (text-to-SQL con el YAML como contexto) a más vistas de Teradata y probar la etapa 2 (text-to-metrics con compilador determinista) sobre ese entorno; diseñar la etapa 3 (fachada multiplataforma y repositorio único) para no rehacer nada. El detalle está en Capa semántica · 0 Concepto y en sus aplicaciones 1 · Teradata y 2 · Elastic.</w:t>
       </w:r>
     </w:p>
     <w:p>
@@ -3719,10 +3445,10 @@
         <w:rPr>
           <w:b/>
         </w:rPr>
-        <w:t xml:space="preserve">El código guarda la implementación, no el porqué.</w:t>
-      </w:r>
-      <w:r>
-        <w:t xml:space="preserve"> Un umbral de 90 días aparece en código; la razón está en una circular o un correo. Sin enlazar la regla con su fuente documental la ontología es correcta pero no explicable.</w:t>
+        <w:t xml:space="preserve">Definiciones portables.</w:t>
+      </w:r>
+      <w:r>
+        <w:t xml:space="preserve"> Apache Ossie desde el día 1 con la extensión del banco, y compatibilidad con ese formato exigida en cualquier contrato con proveedores de capas semánticas.</w:t>
       </w:r>
     </w:p>
     <w:p>
@@ -3737,10 +3463,10 @@
         <w:rPr>
           <w:b/>
         </w:rPr>
-        <w:t xml:space="preserve">Un cambio semántico es un cambio en todos los informes aguas abajo.</w:t>
-      </w:r>
-      <w:r>
-        <w:t xml:space="preserve"> Sin fecha de efectividad, análisis de impacto y versionado, un cambio de definición altera el reporting regulatorio del trimestre sin que nadie lo haya decidido.</w:t>
+        <w:t xml:space="preserve">La costura.</w:t>
+      </w:r>
+      <w:r>
+        <w:t xml:space="preserve"> Fijar en el YAML y en el registro de peticiones los campos que alimentarán a los otros componentes: entidades y relaciones de negocio para la ontología; dueño, versión y rutas de unión para el grafo; identificador de correlación y versión del producto en cada petición para el contexto.</w:t>
       </w:r>
     </w:p>
     <w:p>
@@ -3755,10 +3481,10 @@
         <w:rPr>
           <w:b/>
         </w:rPr>
-        <w:t xml:space="preserve">La ontología derivada por un modelo es salida de un modelo.</w:t>
-      </w:r>
-      <w:r>
-        <w:t xml:space="preserve"> Puede inventar relaciones plausibles. Entra en gestión de riesgo de modelo, con validación independiente, igual que un scoring.</w:t>
+        <w:t xml:space="preserve">Ontología y grafo por dominio, empezando por uno documental.</w:t>
+      </w:r>
+      <w:r>
+        <w:t xml:space="preserve"> El candidato es la aplicación de demandas judiciales de la iniciativa 2 de Dato como Producto: documentos, no tablas. Modelar solo los conceptos del inventario de BCBS 239 que toque; extraer un tipo de documento con procedencia al fragmento; tratar los pipelines de extracción como modelos bajo gobernanza.</w:t>
       </w:r>
     </w:p>
     <w:p>
@@ -3773,10 +3499,10 @@
         <w:rPr>
           <w:b/>
         </w:rPr>
-        <w:t xml:space="preserve">Bucle de retroalimentación.</w:t>
-      </w:r>
-      <w:r>
-        <w:t xml:space="preserve"> Si los agentes generan la mayoría de las consultas, el sistema aprende de sí mismo. Hay que distinguir en los logs el uso humano del uso de agentes y ponderar en consecuencia.</w:t>
+        <w:t xml:space="preserve">Grafo de contexto en un proceso con agentes.</w:t>
+      </w:r>
+      <w:r>
+        <w:t xml:space="preserve"> Capturar las trazas de decisión (excepciones, derivaciones a cumplimiento) con los campos del registro de eventos del Reglamento de IA, y probar que un requerimiento del supervisor sobre ese proceso se responde con una consulta. IRRBB, en analítica avanzada, es el otro candidato.</w:t>
       </w:r>
     </w:p>
     <w:p>
@@ -3791,10 +3517,10 @@
         <w:rPr>
           <w:b/>
         </w:rPr>
-        <w:t xml:space="preserve">Privacidad en logs y embeddings.</w:t>
-      </w:r>
-      <w:r>
-        <w:t xml:space="preserve"> Los logs de consulta contienen nombres y documentos de identidad; los embeddings pueden reconstruir texto. Ambos son datos personales bajo RGPD y necesitan enmascarado y retención definida.</w:t>
+        <w:t xml:space="preserve">Compilar, no generar.</w:t>
+      </w:r>
+      <w:r>
+        <w:t xml:space="preserve"> En todo acceso de agentes a datos estructurados el modelo elige piezas aprobadas y un compilador produce la consulta. Prohibir en producción el SQL generado directamente por el modelo para cifras certificadas.</w:t>
       </w:r>
     </w:p>
     <w:p>
@@ -3809,16 +3535,34 @@
         <w:rPr>
           <w:b/>
         </w:rPr>
-        <w:t xml:space="preserve">Bloqueo de proveedor y límites técnicos.</w:t>
-      </w:r>
-      <w:r>
-        <w:t xml:space="preserve"> Una ontología en formato propietario es un activo cautivo. Un grafo virtual sobre SQL sirve para métricas y joins pero no para análisis de redes. El grafo de contexto no tiene estándar y cada proveedor lo define a su conveniencia.</w:t>
-      </w:r>
-    </w:p>
-    <w:p>
-      <w:pPr/>
-      <w:r>
-        <w:t xml:space="preserve">A estos se añade un límite organizativo: el propietario de concepto solo funciona si tiene autoridad real para rechazar un cambio que un área de negocio quiere. Sin esa autoridad, el ciclo de aprobación se convierte en un trámite y la ontología vuelve a divergir, ahora más rápido.</w:t>
+        <w:t xml:space="preserve">Banco de pruebas propio</w:t>
+      </w:r>
+      <w:r>
+        <w:t xml:space="preserve"> antes de creer las cifras de ningún proveedor: las mismas preguntas reales con y sin capa semántica, con el juego de pruebas que sale del log, contando aciertos, errores y «no puedo».</w:t>
+      </w:r>
+    </w:p>
+    <w:p>
+      <w:pPr>
+        <w:pStyle w:val="ListParagraph"/>
+        <w:numPr>
+          <w:ilvl w:val="0"/>
+          <w:numId w:val="4"/>
+        </w:numPr>
+      </w:pPr>
+      <w:r>
+        <w:rPr>
+          <w:b/>
+        </w:rPr>
+        <w:t xml:space="preserve">Agentes de lectura en modo solo propuesta</w:t>
+      </w:r>
+      <w:r>
+        <w:t xml:space="preserve"> sobre código, logs y documentos, seis meses midiendo la calidad de las propuestas; abrir la fusión asistida solo cuando el propietario de concepto tenga autoridad demostrada. Es el paso al nivel 4 y el último.</w:t>
+      </w:r>
+    </w:p>
+    <w:p>
+      <w:pPr/>
+      <w:r>
+        <w:t xml:space="preserve">Avanzar en cada línea por separado pero coordinadamente tiene sentido porque cada componente tiene su propio ritmo y su propio dominio de arranque, y lo único que los une es la costura del punto 3.</w:t>
       </w:r>
     </w:p>
     <w:p>
@@ -3826,13 +3570,22 @@
         <w:pStyle w:val="Heading2"/>
       </w:pPr>
       <w:r>
-        <w:t xml:space="preserve">Hoja de ruta para una entidad financiera</w:t>
-      </w:r>
-    </w:p>
-    <w:p>
-      <w:pPr/>
-      <w:r>
-        <w:t xml:space="preserve">Dos reglas ordenan el camino. La capa semántica avanza en transversal y ahora, porque el entorno informacional ya está gobernado y los YAML existen: es el componente 1 de Dato como Producto y no espera a los demás. Los otros tres componentes avanzan por dominio de uso, allí donde haya agentes haciendo tareas que exijan relaciones, documentos o precedentes. Las líneas van separadas pero coordinadas por una costura: los campos del YAML y del registro de peticiones que alimentarán a la ontología, al grafo y al contexto se deciden ahora, para que la capa semántica no se rehaga.</w:t>
+        <w:t xml:space="preserve">Fuentes</w:t>
+      </w:r>
+    </w:p>
+    <w:p>
+      <w:pPr/>
+      <w:r>
+        <w:t xml:space="preserve">Este documento sustituye al artículo comparativo de Timbr que sirvió de punto de partida. Las cifras de los estudios externos proceden de los propios estudios cuando se pudo acceder a ellos y, en los demás casos, de resúmenes y fuentes secundarias; conviene verificarlas antes de citarlas en un documento oficial.</w:t>
+      </w:r>
+    </w:p>
+    <w:p>
+      <w:pPr/>
+      <w:r>
+        <w:rPr>
+          <w:b/>
+        </w:rPr>
+        <w:t xml:space="preserve">Regulación</w:t>
       </w:r>
     </w:p>
     <w:p>
@@ -3841,179 +3594,6 @@
         <w:numPr>
           <w:ilvl w:val="0"/>
           <w:numId w:val="5"/>
-        </w:numPr>
-      </w:pPr>
-      <w:r>
-        <w:rPr>
-          <w:b/>
-        </w:rPr>
-        <w:t xml:space="preserve">Capa semántica, transversal y ahora.</w:t>
-      </w:r>
-      <w:r>
-        <w:t xml:space="preserve"> Extender la etapa 1 (text-to-SQL con el YAML como contexto) a más vistas de Teradata y probar la etapa 2 (text-to-metrics con compilador determinista) sobre ese entorno; diseñar la etapa 3 (fachada multiplataforma y repositorio único) para no rehacer nada. El detalle está en Capa semántica · 0 Concepto y en sus aplicaciones 1 · Teradata y 2 · Elastic.</w:t>
-      </w:r>
-    </w:p>
-    <w:p>
-      <w:pPr>
-        <w:pStyle w:val="ListParagraph"/>
-        <w:numPr>
-          <w:ilvl w:val="0"/>
-          <w:numId w:val="5"/>
-        </w:numPr>
-      </w:pPr>
-      <w:r>
-        <w:rPr>
-          <w:b/>
-        </w:rPr>
-        <w:t xml:space="preserve">Definiciones portables.</w:t>
-      </w:r>
-      <w:r>
-        <w:t xml:space="preserve"> Apache Ossie desde el día 1 con la extensión del banco, y compatibilidad con ese formato exigida en cualquier contrato con proveedores de capas semánticas.</w:t>
-      </w:r>
-    </w:p>
-    <w:p>
-      <w:pPr>
-        <w:pStyle w:val="ListParagraph"/>
-        <w:numPr>
-          <w:ilvl w:val="0"/>
-          <w:numId w:val="5"/>
-        </w:numPr>
-      </w:pPr>
-      <w:r>
-        <w:rPr>
-          <w:b/>
-        </w:rPr>
-        <w:t xml:space="preserve">La costura.</w:t>
-      </w:r>
-      <w:r>
-        <w:t xml:space="preserve"> Fijar en el YAML y en el registro de peticiones los campos que alimentarán a los otros componentes: entidades y relaciones de negocio para la ontología; dueño, versión y rutas de unión para el grafo; identificador de correlación y versión del producto en cada petición para el contexto.</w:t>
-      </w:r>
-    </w:p>
-    <w:p>
-      <w:pPr>
-        <w:pStyle w:val="ListParagraph"/>
-        <w:numPr>
-          <w:ilvl w:val="0"/>
-          <w:numId w:val="5"/>
-        </w:numPr>
-      </w:pPr>
-      <w:r>
-        <w:rPr>
-          <w:b/>
-        </w:rPr>
-        <w:t xml:space="preserve">Ontología y grafo por dominio, empezando por uno documental.</w:t>
-      </w:r>
-      <w:r>
-        <w:t xml:space="preserve"> El candidato es la aplicación de demandas judiciales de la iniciativa 2 de Dato como Producto: documentos, no tablas. Modelar solo los conceptos del inventario de BCBS 239 que toque; extraer un tipo de documento con procedencia al fragmento; tratar los pipelines de extracción como modelos bajo gobernanza.</w:t>
-      </w:r>
-    </w:p>
-    <w:p>
-      <w:pPr>
-        <w:pStyle w:val="ListParagraph"/>
-        <w:numPr>
-          <w:ilvl w:val="0"/>
-          <w:numId w:val="5"/>
-        </w:numPr>
-      </w:pPr>
-      <w:r>
-        <w:rPr>
-          <w:b/>
-        </w:rPr>
-        <w:t xml:space="preserve">Grafo de contexto en un proceso con agentes.</w:t>
-      </w:r>
-      <w:r>
-        <w:t xml:space="preserve"> Capturar las trazas de decisión (excepciones, derivaciones a cumplimiento) con los campos del registro de eventos del Reglamento de IA, y probar que un requerimiento del supervisor sobre ese proceso se responde con una consulta. IRRBB, en analítica avanzada, es el otro candidato.</w:t>
-      </w:r>
-    </w:p>
-    <w:p>
-      <w:pPr>
-        <w:pStyle w:val="ListParagraph"/>
-        <w:numPr>
-          <w:ilvl w:val="0"/>
-          <w:numId w:val="5"/>
-        </w:numPr>
-      </w:pPr>
-      <w:r>
-        <w:rPr>
-          <w:b/>
-        </w:rPr>
-        <w:t xml:space="preserve">Compilar, no generar.</w:t>
-      </w:r>
-      <w:r>
-        <w:t xml:space="preserve"> En todo acceso de agentes a datos estructurados el modelo elige piezas aprobadas y un compilador produce la consulta. Prohibir en producción el SQL generado directamente por el modelo para cifras certificadas.</w:t>
-      </w:r>
-    </w:p>
-    <w:p>
-      <w:pPr>
-        <w:pStyle w:val="ListParagraph"/>
-        <w:numPr>
-          <w:ilvl w:val="0"/>
-          <w:numId w:val="5"/>
-        </w:numPr>
-      </w:pPr>
-      <w:r>
-        <w:rPr>
-          <w:b/>
-        </w:rPr>
-        <w:t xml:space="preserve">Banco de pruebas propio</w:t>
-      </w:r>
-      <w:r>
-        <w:t xml:space="preserve"> antes de creer las cifras de ningún proveedor: las mismas preguntas reales con y sin capa semántica, con el juego de pruebas que sale del log, contando aciertos, errores y «no puedo».</w:t>
-      </w:r>
-    </w:p>
-    <w:p>
-      <w:pPr>
-        <w:pStyle w:val="ListParagraph"/>
-        <w:numPr>
-          <w:ilvl w:val="0"/>
-          <w:numId w:val="5"/>
-        </w:numPr>
-      </w:pPr>
-      <w:r>
-        <w:rPr>
-          <w:b/>
-        </w:rPr>
-        <w:t xml:space="preserve">Agentes de lectura en modo solo propuesta</w:t>
-      </w:r>
-      <w:r>
-        <w:t xml:space="preserve"> sobre código, logs y documentos, seis meses midiendo la calidad de las propuestas; abrir la fusión asistida solo cuando el propietario de concepto tenga autoridad demostrada. Es el paso al nivel 4 y el último.</w:t>
-      </w:r>
-    </w:p>
-    <w:p>
-      <w:pPr/>
-      <w:r>
-        <w:t xml:space="preserve">Avanzar en cada línea por separado pero coordinadamente tiene sentido porque cada componente tiene su propio ritmo y su propio dominio de arranque, y lo único que los une es la costura del punto 3.</w:t>
-      </w:r>
-    </w:p>
-    <w:p>
-      <w:pPr>
-        <w:pStyle w:val="Heading2"/>
-      </w:pPr>
-      <w:r>
-        <w:t xml:space="preserve">Fuentes</w:t>
-      </w:r>
-    </w:p>
-    <w:p>
-      <w:pPr/>
-      <w:r>
-        <w:t xml:space="preserve">Este documento sustituye al artículo comparativo de Timbr que sirvió de punto de partida. Las cifras de los estudios externos proceden de los propios estudios cuando se pudo acceder a ellos y, en los demás casos, de resúmenes y fuentes secundarias; conviene verificarlas antes de citarlas en un documento oficial.</w:t>
-      </w:r>
-    </w:p>
-    <w:p>
-      <w:pPr/>
-      <w:r>
-        <w:rPr>
-          <w:b/>
-        </w:rPr>
-        <w:t xml:space="preserve">Regulación</w:t>
-      </w:r>
-    </w:p>
-    <w:p>
-      <w:pPr>
-        <w:pStyle w:val="ListParagraph"/>
-        <w:numPr>
-          <w:ilvl w:val="0"/>
-          <w:numId w:val="6"/>
         </w:numPr>
       </w:pPr>
       <w:hyperlink r:id="rId7" w:history="1">
@@ -4030,7 +3610,7 @@
         <w:pStyle w:val="ListParagraph"/>
         <w:numPr>
           <w:ilvl w:val="0"/>
-          <w:numId w:val="6"/>
+          <w:numId w:val="5"/>
         </w:numPr>
       </w:pPr>
       <w:hyperlink r:id="rId8" w:history="1">
@@ -4047,10 +3627,10 @@
         <w:pStyle w:val="ListParagraph"/>
         <w:numPr>
           <w:ilvl w:val="0"/>
-          <w:numId w:val="6"/>
-        </w:numPr>
-      </w:pPr>
-      <w:hyperlink r:id="rId30" w:history="1">
+          <w:numId w:val="5"/>
+        </w:numPr>
+      </w:pPr>
+      <w:hyperlink r:id="rId29" w:history="1">
         <w:r>
           <w:rPr>
             <w:rStyle w:val="Hyperlink"/>
@@ -4064,7 +3644,7 @@
         <w:pStyle w:val="ListParagraph"/>
         <w:numPr>
           <w:ilvl w:val="0"/>
-          <w:numId w:val="6"/>
+          <w:numId w:val="5"/>
         </w:numPr>
       </w:pPr>
       <w:hyperlink r:id="rId9" w:history="1">
@@ -4081,7 +3661,7 @@
         <w:pStyle w:val="ListParagraph"/>
         <w:numPr>
           <w:ilvl w:val="0"/>
-          <w:numId w:val="6"/>
+          <w:numId w:val="5"/>
         </w:numPr>
       </w:pPr>
       <w:hyperlink r:id="rId10" w:history="1">
@@ -4098,7 +3678,7 @@
         <w:pStyle w:val="ListParagraph"/>
         <w:numPr>
           <w:ilvl w:val="0"/>
-          <w:numId w:val="6"/>
+          <w:numId w:val="5"/>
         </w:numPr>
       </w:pPr>
       <w:hyperlink r:id="rId12" w:history="1">
@@ -4115,7 +3695,7 @@
         <w:pStyle w:val="ListParagraph"/>
         <w:numPr>
           <w:ilvl w:val="0"/>
-          <w:numId w:val="6"/>
+          <w:numId w:val="5"/>
         </w:numPr>
       </w:pPr>
       <w:hyperlink r:id="rId11" w:history="1">
@@ -4141,10 +3721,10 @@
         <w:pStyle w:val="ListParagraph"/>
         <w:numPr>
           <w:ilvl w:val="0"/>
-          <w:numId w:val="7"/>
-        </w:numPr>
-      </w:pPr>
-      <w:hyperlink r:id="rId31" w:history="1">
+          <w:numId w:val="6"/>
+        </w:numPr>
+      </w:pPr>
+      <w:hyperlink r:id="rId30" w:history="1">
         <w:r>
           <w:rPr>
             <w:rStyle w:val="Hyperlink"/>
@@ -4158,10 +3738,10 @@
         <w:pStyle w:val="ListParagraph"/>
         <w:numPr>
           <w:ilvl w:val="0"/>
-          <w:numId w:val="7"/>
-        </w:numPr>
-      </w:pPr>
-      <w:hyperlink r:id="rId32" w:history="1">
+          <w:numId w:val="6"/>
+        </w:numPr>
+      </w:pPr>
+      <w:hyperlink r:id="rId31" w:history="1">
         <w:r>
           <w:rPr>
             <w:rStyle w:val="Hyperlink"/>
@@ -4175,7 +3755,7 @@
         <w:pStyle w:val="ListParagraph"/>
         <w:numPr>
           <w:ilvl w:val="0"/>
-          <w:numId w:val="7"/>
+          <w:numId w:val="6"/>
         </w:numPr>
       </w:pPr>
       <w:hyperlink r:id="rId4" w:history="1">
@@ -4192,7 +3772,7 @@
         <w:pStyle w:val="ListParagraph"/>
         <w:numPr>
           <w:ilvl w:val="0"/>
-          <w:numId w:val="7"/>
+          <w:numId w:val="6"/>
         </w:numPr>
       </w:pPr>
       <w:hyperlink r:id="rId5" w:history="1">
@@ -4209,10 +3789,10 @@
         <w:pStyle w:val="ListParagraph"/>
         <w:numPr>
           <w:ilvl w:val="0"/>
-          <w:numId w:val="7"/>
-        </w:numPr>
-      </w:pPr>
-      <w:hyperlink r:id="rId33" w:history="1">
+          <w:numId w:val="6"/>
+        </w:numPr>
+      </w:pPr>
+      <w:hyperlink r:id="rId32" w:history="1">
         <w:r>
           <w:rPr>
             <w:rStyle w:val="Hyperlink"/>
@@ -4226,10 +3806,10 @@
         <w:pStyle w:val="ListParagraph"/>
         <w:numPr>
           <w:ilvl w:val="0"/>
-          <w:numId w:val="7"/>
-        </w:numPr>
-      </w:pPr>
-      <w:hyperlink r:id="rId34" w:history="1">
+          <w:numId w:val="6"/>
+        </w:numPr>
+      </w:pPr>
+      <w:hyperlink r:id="rId33" w:history="1">
         <w:r>
           <w:rPr>
             <w:rStyle w:val="Hyperlink"/>
@@ -4243,10 +3823,10 @@
         <w:pStyle w:val="ListParagraph"/>
         <w:numPr>
           <w:ilvl w:val="0"/>
-          <w:numId w:val="7"/>
-        </w:numPr>
-      </w:pPr>
-      <w:hyperlink r:id="rId35" w:history="1">
+          <w:numId w:val="6"/>
+        </w:numPr>
+      </w:pPr>
+      <w:hyperlink r:id="rId34" w:history="1">
         <w:r>
           <w:rPr>
             <w:rStyle w:val="Hyperlink"/>
@@ -4269,7 +3849,7 @@
         <w:pStyle w:val="ListParagraph"/>
         <w:numPr>
           <w:ilvl w:val="0"/>
-          <w:numId w:val="8"/>
+          <w:numId w:val="7"/>
         </w:numPr>
       </w:pPr>
       <w:hyperlink r:id="rId3" w:history="1">
@@ -4286,10 +3866,10 @@
         <w:pStyle w:val="ListParagraph"/>
         <w:numPr>
           <w:ilvl w:val="0"/>
-          <w:numId w:val="8"/>
-        </w:numPr>
-      </w:pPr>
-      <w:hyperlink r:id="rId36" w:history="1">
+          <w:numId w:val="7"/>
+        </w:numPr>
+      </w:pPr>
+      <w:hyperlink r:id="rId35" w:history="1">
         <w:r>
           <w:rPr>
             <w:rStyle w:val="Hyperlink"/>
@@ -4303,10 +3883,10 @@
         <w:pStyle w:val="ListParagraph"/>
         <w:numPr>
           <w:ilvl w:val="0"/>
-          <w:numId w:val="8"/>
-        </w:numPr>
-      </w:pPr>
-      <w:hyperlink r:id="rId37" w:history="1">
+          <w:numId w:val="7"/>
+        </w:numPr>
+      </w:pPr>
+      <w:hyperlink r:id="rId36" w:history="1">
         <w:r>
           <w:rPr>
             <w:rStyle w:val="Hyperlink"/>
@@ -4320,10 +3900,10 @@
         <w:pStyle w:val="ListParagraph"/>
         <w:numPr>
           <w:ilvl w:val="0"/>
-          <w:numId w:val="8"/>
-        </w:numPr>
-      </w:pPr>
-      <w:hyperlink r:id="rId38" w:history="1">
+          <w:numId w:val="7"/>
+        </w:numPr>
+      </w:pPr>
+      <w:hyperlink r:id="rId37" w:history="1">
         <w:r>
           <w:rPr>
             <w:rStyle w:val="Hyperlink"/>
@@ -4337,10 +3917,10 @@
         <w:pStyle w:val="ListParagraph"/>
         <w:numPr>
           <w:ilvl w:val="0"/>
-          <w:numId w:val="8"/>
-        </w:numPr>
-      </w:pPr>
-      <w:hyperlink r:id="rId39" w:history="1">
+          <w:numId w:val="7"/>
+        </w:numPr>
+      </w:pPr>
+      <w:hyperlink r:id="rId38" w:history="1">
         <w:r>
           <w:rPr>
             <w:rStyle w:val="Hyperlink"/>
@@ -4363,10 +3943,10 @@
         <w:pStyle w:val="ListParagraph"/>
         <w:numPr>
           <w:ilvl w:val="0"/>
-          <w:numId w:val="9"/>
-        </w:numPr>
-      </w:pPr>
-      <w:hyperlink r:id="rId17" w:history="1">
+          <w:numId w:val="8"/>
+        </w:numPr>
+      </w:pPr>
+      <w:hyperlink r:id="rId13" w:history="1">
         <w:r>
           <w:rPr>
             <w:rStyle w:val="Hyperlink"/>
@@ -4380,10 +3960,10 @@
         <w:pStyle w:val="ListParagraph"/>
         <w:numPr>
           <w:ilvl w:val="0"/>
-          <w:numId w:val="9"/>
-        </w:numPr>
-      </w:pPr>
-      <w:hyperlink r:id="rId40" w:history="1">
+          <w:numId w:val="8"/>
+        </w:numPr>
+      </w:pPr>
+      <w:hyperlink r:id="rId39" w:history="1">
         <w:r>
           <w:rPr>
             <w:rStyle w:val="Hyperlink"/>
@@ -4397,10 +3977,10 @@
         <w:pStyle w:val="ListParagraph"/>
         <w:numPr>
           <w:ilvl w:val="0"/>
-          <w:numId w:val="9"/>
-        </w:numPr>
-      </w:pPr>
-      <w:hyperlink r:id="rId41" w:history="1">
+          <w:numId w:val="8"/>
+        </w:numPr>
+      </w:pPr>
+      <w:hyperlink r:id="rId40" w:history="1">
         <w:r>
           <w:rPr>
             <w:rStyle w:val="Hyperlink"/>
@@ -4414,10 +3994,10 @@
         <w:pStyle w:val="ListParagraph"/>
         <w:numPr>
           <w:ilvl w:val="0"/>
-          <w:numId w:val="9"/>
-        </w:numPr>
-      </w:pPr>
-      <w:hyperlink r:id="rId24" w:history="1">
+          <w:numId w:val="8"/>
+        </w:numPr>
+      </w:pPr>
+      <w:hyperlink r:id="rId22" w:history="1">
         <w:r>
           <w:rPr>
             <w:rStyle w:val="Hyperlink"/>
@@ -4431,10 +4011,10 @@
         <w:pStyle w:val="ListParagraph"/>
         <w:numPr>
           <w:ilvl w:val="0"/>
-          <w:numId w:val="9"/>
-        </w:numPr>
-      </w:pPr>
-      <w:hyperlink r:id="rId23" w:history="1">
+          <w:numId w:val="8"/>
+        </w:numPr>
+      </w:pPr>
+      <w:hyperlink r:id="rId21" w:history="1">
         <w:r>
           <w:rPr>
             <w:rStyle w:val="Hyperlink"/>
@@ -4448,10 +4028,10 @@
         <w:pStyle w:val="ListParagraph"/>
         <w:numPr>
           <w:ilvl w:val="0"/>
-          <w:numId w:val="9"/>
-        </w:numPr>
-      </w:pPr>
-      <w:hyperlink r:id="rId27" w:history="1">
+          <w:numId w:val="8"/>
+        </w:numPr>
+      </w:pPr>
+      <w:hyperlink r:id="rId26" w:history="1">
         <w:r>
           <w:rPr>
             <w:rStyle w:val="Hyperlink"/>
@@ -4465,10 +4045,10 @@
         <w:pStyle w:val="ListParagraph"/>
         <w:numPr>
           <w:ilvl w:val="0"/>
-          <w:numId w:val="9"/>
-        </w:numPr>
-      </w:pPr>
-      <w:hyperlink r:id="rId28" w:history="1">
+          <w:numId w:val="8"/>
+        </w:numPr>
+      </w:pPr>
+      <w:hyperlink r:id="rId27" w:history="1">
         <w:r>
           <w:rPr>
             <w:rStyle w:val="Hyperlink"/>
@@ -4482,10 +4062,10 @@
         <w:pStyle w:val="ListParagraph"/>
         <w:numPr>
           <w:ilvl w:val="0"/>
-          <w:numId w:val="9"/>
-        </w:numPr>
-      </w:pPr>
-      <w:hyperlink r:id="rId42" w:history="1">
+          <w:numId w:val="8"/>
+        </w:numPr>
+      </w:pPr>
+      <w:hyperlink r:id="rId41" w:history="1">
         <w:r>
           <w:rPr>
             <w:rStyle w:val="Hyperlink"/>
@@ -4499,10 +4079,10 @@
         <w:pStyle w:val="ListParagraph"/>
         <w:numPr>
           <w:ilvl w:val="0"/>
-          <w:numId w:val="9"/>
-        </w:numPr>
-      </w:pPr>
-      <w:hyperlink r:id="rId25" w:history="1">
+          <w:numId w:val="8"/>
+        </w:numPr>
+      </w:pPr>
+      <w:hyperlink r:id="rId24" w:history="1">
         <w:r>
           <w:rPr>
             <w:rStyle w:val="Hyperlink"/>
@@ -4516,10 +4096,10 @@
         <w:pStyle w:val="ListParagraph"/>
         <w:numPr>
           <w:ilvl w:val="0"/>
-          <w:numId w:val="9"/>
-        </w:numPr>
-      </w:pPr>
-      <w:hyperlink r:id="rId43" w:history="1">
+          <w:numId w:val="8"/>
+        </w:numPr>
+      </w:pPr>
+      <w:hyperlink r:id="rId42" w:history="1">
         <w:r>
           <w:rPr>
             <w:rStyle w:val="Hyperlink"/>
@@ -4533,10 +4113,10 @@
         <w:pStyle w:val="ListParagraph"/>
         <w:numPr>
           <w:ilvl w:val="0"/>
-          <w:numId w:val="9"/>
-        </w:numPr>
-      </w:pPr>
-      <w:hyperlink r:id="rId44" w:history="1">
+          <w:numId w:val="8"/>
+        </w:numPr>
+      </w:pPr>
+      <w:hyperlink r:id="rId43" w:history="1">
         <w:r>
           <w:rPr>
             <w:rStyle w:val="Hyperlink"/>
@@ -4550,10 +4130,10 @@
         <w:pStyle w:val="ListParagraph"/>
         <w:numPr>
           <w:ilvl w:val="0"/>
-          <w:numId w:val="9"/>
-        </w:numPr>
-      </w:pPr>
-      <w:hyperlink r:id="rId45" w:history="1">
+          <w:numId w:val="8"/>
+        </w:numPr>
+      </w:pPr>
+      <w:hyperlink r:id="rId44" w:history="1">
         <w:r>
           <w:rPr>
             <w:rStyle w:val="Hyperlink"/>
@@ -4567,10 +4147,10 @@
         <w:pStyle w:val="ListParagraph"/>
         <w:numPr>
           <w:ilvl w:val="0"/>
-          <w:numId w:val="9"/>
-        </w:numPr>
-      </w:pPr>
-      <w:hyperlink r:id="rId26" w:history="1">
+          <w:numId w:val="8"/>
+        </w:numPr>
+      </w:pPr>
+      <w:hyperlink r:id="rId25" w:history="1">
         <w:r>
           <w:rPr>
             <w:rStyle w:val="Hyperlink"/>
@@ -4593,10 +4173,10 @@
         <w:pStyle w:val="ListParagraph"/>
         <w:numPr>
           <w:ilvl w:val="0"/>
-          <w:numId w:val="10"/>
-        </w:numPr>
-      </w:pPr>
-      <w:hyperlink r:id="rId46" w:history="1">
+          <w:numId w:val="9"/>
+        </w:numPr>
+      </w:pPr>
+      <w:hyperlink r:id="rId45" w:history="1">
         <w:r>
           <w:rPr>
             <w:rStyle w:val="Hyperlink"/>
@@ -4610,10 +4190,10 @@
         <w:pStyle w:val="ListParagraph"/>
         <w:numPr>
           <w:ilvl w:val="0"/>
-          <w:numId w:val="10"/>
-        </w:numPr>
-      </w:pPr>
-      <w:hyperlink r:id="rId14" w:history="1">
+          <w:numId w:val="9"/>
+        </w:numPr>
+      </w:pPr>
+      <w:hyperlink r:id="rId18" w:history="1">
         <w:r>
           <w:rPr>
             <w:rStyle w:val="Hyperlink"/>
@@ -4627,10 +4207,10 @@
         <w:pStyle w:val="ListParagraph"/>
         <w:numPr>
           <w:ilvl w:val="0"/>
-          <w:numId w:val="10"/>
-        </w:numPr>
-      </w:pPr>
-      <w:hyperlink r:id="rId21" w:history="1">
+          <w:numId w:val="9"/>
+        </w:numPr>
+      </w:pPr>
+      <w:hyperlink r:id="rId17" w:history="1">
         <w:r>
           <w:rPr>
             <w:rStyle w:val="Hyperlink"/>
@@ -4644,10 +4224,10 @@
         <w:pStyle w:val="ListParagraph"/>
         <w:numPr>
           <w:ilvl w:val="0"/>
-          <w:numId w:val="10"/>
-        </w:numPr>
-      </w:pPr>
-      <w:hyperlink r:id="rId22" w:history="1">
+          <w:numId w:val="9"/>
+        </w:numPr>
+      </w:pPr>
+      <w:hyperlink r:id="rId20" w:history="1">
         <w:r>
           <w:rPr>
             <w:rStyle w:val="Hyperlink"/>
@@ -4661,10 +4241,10 @@
         <w:pStyle w:val="ListParagraph"/>
         <w:numPr>
           <w:ilvl w:val="0"/>
-          <w:numId w:val="10"/>
-        </w:numPr>
-      </w:pPr>
-      <w:hyperlink r:id="rId20" w:history="1">
+          <w:numId w:val="9"/>
+        </w:numPr>
+      </w:pPr>
+      <w:hyperlink r:id="rId16" w:history="1">
         <w:r>
           <w:rPr>
             <w:rStyle w:val="Hyperlink"/>
@@ -4678,10 +4258,10 @@
         <w:pStyle w:val="ListParagraph"/>
         <w:numPr>
           <w:ilvl w:val="0"/>
-          <w:numId w:val="10"/>
-        </w:numPr>
-      </w:pPr>
-      <w:hyperlink r:id="rId19" w:history="1">
+          <w:numId w:val="9"/>
+        </w:numPr>
+      </w:pPr>
+      <w:hyperlink r:id="rId15" w:history="1">
         <w:r>
           <w:rPr>
             <w:rStyle w:val="Hyperlink"/>
@@ -4695,10 +4275,10 @@
         <w:pStyle w:val="ListParagraph"/>
         <w:numPr>
           <w:ilvl w:val="0"/>
-          <w:numId w:val="10"/>
-        </w:numPr>
-      </w:pPr>
-      <w:hyperlink r:id="rId13" w:history="1">
+          <w:numId w:val="9"/>
+        </w:numPr>
+      </w:pPr>
+      <w:hyperlink r:id="rId46" w:history="1">
         <w:r>
           <w:rPr>
             <w:rStyle w:val="Hyperlink"/>
@@ -4895,13 +4475,13 @@
     <w:abstractNumId w:val="0"/>
   </w:num>
   <w:num w:numId="4">
-    <w:abstractNumId w:val="0"/>
-  </w:num>
-  <w:num w:numId="5">
     <w:abstractNumId w:val="1"/>
     <w:lvlOverride w:ilvl="0">
       <w:startOverride w:val="1"/>
     </w:lvlOverride>
+  </w:num>
+  <w:num w:numId="5">
+    <w:abstractNumId w:val="0"/>
   </w:num>
   <w:num w:numId="6">
     <w:abstractNumId w:val="0"/>
@@ -4913,9 +4493,6 @@
     <w:abstractNumId w:val="0"/>
   </w:num>
   <w:num w:numId="9">
-    <w:abstractNumId w:val="0"/>
-  </w:num>
-  <w:num w:numId="10">
     <w:abstractNumId w:val="0"/>
   </w:num>
 </w:numbering>

</xml_diff>

<commit_message>
Framework doc: drop the common-risks block in the documents path
Co-Authored-By: Claude Fable 5.1 <noreply@anthropic.com>
Claude-Session: https://claude.ai/code/session_013A7bCLd4PzhQYG95DagcQd
</commit_message>
<xml_diff>
--- a/docs/Semantica_grafos_agentes_banca.docx
+++ b/docs/Semantica_grafos_agentes_banca.docx
@@ -2564,18 +2564,6 @@
       </w:r>
     </w:p>
     <w:p>
-      <w:pPr/>
-      <w:r>
-        <w:rPr>
-          <w:b/>
-        </w:rPr>
-        <w:t xml:space="preserve">Lo que tienen en común y lo que hay que vigilar.</w:t>
-      </w:r>
-      <w:r>
-        <w:t xml:space="preserve"> En los tres casos un modelo produce datos: atributos extraídos, documentos seleccionados, reglas aplicadas. Un dato producido por un modelo puede estar mal, y en banca eso tiene tres consecuencias prácticas. Primera, cada hecho extraído lleva una medida de confianza y la versión del modelo que lo produjo, se valida por muestreo, y el pipeline de extracción entra en el marco de riesgo de modelo como cualquier otro modelo. Segunda, el vínculo entre el documento y el registro estructurado, que el firmante del contrato escaneado sea el titular del core, es también una decisión con margen de error y necesita su propia validación. Tercera, los embeddings y los logs de consulta contienen datos personales aunque la tabla de origen esté enmascarada: el enmascarado se aplica en el momento en que el contexto llega al modelo, no solo en la fuente.</w:t>
-      </w:r>
-    </w:p>
-    <w:p>
       <w:pPr>
         <w:pStyle w:val="Heading3"/>
       </w:pPr>
@@ -2604,7 +2592,7 @@
     <w:p>
       <w:pPr/>
       <w:r>
-        <w:t xml:space="preserve">Dos consecuencias. Todo dato que se extrae de un documento con un modelo es un dato producido por un modelo, y entra en la gestión de riesgo de modelo con confianza, versión y validación por muestreo, como se ha dicho más arriba. Y la extracción se hace una vez y se gobierna, no se repite en cada pregunta: lo que hoy se extrae a demanda en un piloto es mañana un producto de dato más.</w:t>
+        <w:t xml:space="preserve">Dos consecuencias. Todo dato que se extrae de un documento con un modelo es un dato producido por un modelo, y entra en la gestión de riesgo de modelo: cada hecho extraído lleva su grado de confianza y la versión del modelo que lo produjo, y se valida por muestreo. Y la extracción se hace una vez y se gobierna, no se repite en cada pregunta: lo que hoy se extrae a demanda en un piloto es mañana un producto de dato más.</w:t>
       </w:r>
     </w:p>
     <w:p>

</xml_diff>

<commit_message>
Marco: hoja de ruta abierta y riesgos agrupados por importancia
Co-Authored-By: Claude Fable 5.1 <noreply@anthropic.com>
Claude-Session: https://claude.ai/code/session_013A7bCLd4PzhQYG95DagcQd
</commit_message>
<xml_diff>
--- a/docs/Semantica_grafos_agentes_banca.docx
+++ b/docs/Semantica_grafos_agentes_banca.docx
@@ -3254,7 +3254,21 @@
     <w:p>
       <w:pPr/>
       <w:r>
-        <w:t xml:space="preserve">El camino al mundo de Jupy tiene siete riesgos que no se resuelven con tecnología.</w:t>
+        <w:t xml:space="preserve">Los riesgos de este camino no pesan igual. Los primeros tocan cifras que se reportan al supervisor y son los que justifican que la propuesta sea automática y la aprobación humana. Los segundos afectan a si el sistema es explicable y aprende de lo correcto. Los terceros son obligaciones y dependencias que hay que cubrir desde el principio, pero no cuestionan el enfoque.</w:t>
+      </w:r>
+    </w:p>
+    <w:p>
+      <w:pPr>
+        <w:pStyle w:val="Heading3"/>
+      </w:pPr>
+      <w:r>
+        <w:t xml:space="preserve">Lo que puede alterar una cifra regulatoria</w:t>
+      </w:r>
+    </w:p>
+    <w:p>
+      <w:pPr/>
+      <w:r>
+        <w:t xml:space="preserve">Son los tres riesgos que importan de verdad, y los tres se tratan con la misma regla: ningún cambio de definición entra en vigor sin que lo apruebe un propietario de concepto, con fecha de efectividad, versión y análisis de impacto.</w:t>
       </w:r>
     </w:p>
     <w:p>
@@ -3269,10 +3283,10 @@
         <w:rPr>
           <w:b/>
         </w:rPr>
-        <w:t xml:space="preserve">Lo descriptivo no es lo normativo.</w:t>
-      </w:r>
-      <w:r>
-        <w:t xml:space="preserve"> Minar código y logs dice cómo la organización calcula las cosas de hecho, no cómo debe calcularlas. La definición de impago viene del artículo 178 del CRR, no de la consulta más frecuente. Si la implementación mayoritaria es la incorrecta, una ontología que evoluciona por uso consolida el error con autoridad. Por eso la propuesta es automática y la aprobación humana.</w:t>
+        <w:t xml:space="preserve">Un cambio de definición es un cambio en todos los informes aguas abajo.</w:t>
+      </w:r>
+      <w:r>
+        <w:t xml:space="preserve"> Sin fecha de efectividad, versionado y análisis de impacto, una definición que cambia altera el reporting regulatorio del trimestre sin que nadie lo haya decidido.</w:t>
       </w:r>
     </w:p>
     <w:p>
@@ -3287,106 +3301,146 @@
         <w:rPr>
           <w:b/>
         </w:rPr>
+        <w:t xml:space="preserve">Lo que se hace de hecho no es lo que se debe hacer.</w:t>
+      </w:r>
+      <w:r>
+        <w:t xml:space="preserve"> Minar código y logs dice cómo calcula el banco las cosas, no cómo debe calcularlas. La definición de impago viene del artículo 178 del CRR, no de la consulta más frecuente. Si la implementación mayoritaria es la incorrecta, una ontología que evoluciona por uso consolida el error con autoridad.</w:t>
+      </w:r>
+    </w:p>
+    <w:p>
+      <w:pPr>
+        <w:pStyle w:val="ListParagraph"/>
+        <w:numPr>
+          <w:ilvl w:val="0"/>
+          <w:numId w:val="3"/>
+        </w:numPr>
+      </w:pPr>
+      <w:r>
+        <w:rPr>
+          <w:b/>
+        </w:rPr>
+        <w:t xml:space="preserve">Lo que propone un modelo es salida de un modelo.</w:t>
+      </w:r>
+      <w:r>
+        <w:t xml:space="preserve"> Puede inventar relaciones plausibles. Entra en gestión de riesgo de modelo, con validación independiente, igual que un scoring.</w:t>
+      </w:r>
+    </w:p>
+    <w:p>
+      <w:pPr/>
+      <w:r>
+        <w:t xml:space="preserve">La regla solo funciona si el propietario de concepto tiene autoridad real para rechazar un cambio que un área de negocio quiere. Sin esa autoridad la aprobación se convierte en un trámite y la ontología vuelve a divergir, ahora más rápido. Es el límite organizativo del enfoque y pesa más que cualquiera de los técnicos.</w:t>
+      </w:r>
+    </w:p>
+    <w:p>
+      <w:pPr>
+        <w:pStyle w:val="Heading3"/>
+      </w:pPr>
+      <w:r>
+        <w:t xml:space="preserve">Lo que hace al sistema poco explicable o le hace aprender mal</w:t>
+      </w:r>
+    </w:p>
+    <w:p>
+      <w:pPr>
+        <w:pStyle w:val="ListParagraph"/>
+        <w:numPr>
+          <w:ilvl w:val="0"/>
+          <w:numId w:val="4"/>
+        </w:numPr>
+      </w:pPr>
+      <w:r>
+        <w:rPr>
+          <w:b/>
+        </w:rPr>
         <w:t xml:space="preserve">El código guarda la implementación, no el porqué.</w:t>
       </w:r>
       <w:r>
-        <w:t xml:space="preserve"> Un umbral de 90 días aparece en código; la razón está en una circular o un correo. Sin enlazar la regla con su fuente documental la ontología es correcta pero no explicable.</w:t>
-      </w:r>
-    </w:p>
-    <w:p>
-      <w:pPr>
-        <w:pStyle w:val="ListParagraph"/>
-        <w:numPr>
-          <w:ilvl w:val="0"/>
-          <w:numId w:val="3"/>
-        </w:numPr>
-      </w:pPr>
-      <w:r>
-        <w:rPr>
-          <w:b/>
-        </w:rPr>
-        <w:t xml:space="preserve">Un cambio semántico es un cambio en todos los informes aguas abajo.</w:t>
-      </w:r>
-      <w:r>
-        <w:t xml:space="preserve"> Sin fecha de efectividad, análisis de impacto y versionado, un cambio de definición altera el reporting regulatorio del trimestre sin que nadie lo haya decidido.</w:t>
-      </w:r>
-    </w:p>
-    <w:p>
-      <w:pPr>
-        <w:pStyle w:val="ListParagraph"/>
-        <w:numPr>
-          <w:ilvl w:val="0"/>
-          <w:numId w:val="3"/>
-        </w:numPr>
-      </w:pPr>
-      <w:r>
-        <w:rPr>
-          <w:b/>
-        </w:rPr>
-        <w:t xml:space="preserve">La ontología derivada por un modelo es salida de un modelo.</w:t>
-      </w:r>
-      <w:r>
-        <w:t xml:space="preserve"> Puede inventar relaciones plausibles. Entra en gestión de riesgo de modelo, con validación independiente, igual que un scoring.</w:t>
-      </w:r>
-    </w:p>
-    <w:p>
-      <w:pPr>
-        <w:pStyle w:val="ListParagraph"/>
-        <w:numPr>
-          <w:ilvl w:val="0"/>
-          <w:numId w:val="3"/>
-        </w:numPr>
-      </w:pPr>
-      <w:r>
-        <w:rPr>
-          <w:b/>
-        </w:rPr>
-        <w:t xml:space="preserve">Bucle de retroalimentación.</w:t>
-      </w:r>
-      <w:r>
-        <w:t xml:space="preserve"> Si los agentes generan la mayoría de las consultas, el sistema aprende de sí mismo. Hay que distinguir en los logs el uso humano del uso de agentes y ponderar en consecuencia.</w:t>
-      </w:r>
-    </w:p>
-    <w:p>
-      <w:pPr>
-        <w:pStyle w:val="ListParagraph"/>
-        <w:numPr>
-          <w:ilvl w:val="0"/>
-          <w:numId w:val="3"/>
-        </w:numPr>
-      </w:pPr>
-      <w:r>
-        <w:rPr>
-          <w:b/>
-        </w:rPr>
-        <w:t xml:space="preserve">Privacidad en logs y embeddings.</w:t>
-      </w:r>
-      <w:r>
-        <w:t xml:space="preserve"> Los logs de consulta contienen nombres y documentos de identidad; los embeddings pueden reconstruir texto. Ambos son datos personales bajo RGPD y necesitan enmascarado y retención definida.</w:t>
-      </w:r>
-    </w:p>
-    <w:p>
-      <w:pPr>
-        <w:pStyle w:val="ListParagraph"/>
-        <w:numPr>
-          <w:ilvl w:val="0"/>
-          <w:numId w:val="3"/>
-        </w:numPr>
-      </w:pPr>
-      <w:r>
-        <w:rPr>
-          <w:b/>
-        </w:rPr>
-        <w:t xml:space="preserve">Bloqueo de proveedor y límites técnicos.</w:t>
-      </w:r>
-      <w:r>
-        <w:t xml:space="preserve"> Una ontología en formato propietario es un activo cautivo. Un grafo virtual sobre SQL sirve para métricas y joins pero no para análisis de redes. El grafo de contexto no tiene estándar y cada proveedor lo define a su conveniencia.</w:t>
-      </w:r>
-    </w:p>
-    <w:p>
-      <w:pPr/>
-      <w:r>
-        <w:t xml:space="preserve">A estos se añade un límite organizativo: el propietario de concepto solo funciona si tiene autoridad real para rechazar un cambio que un área de negocio quiere. Sin esa autoridad, el ciclo de aprobación se convierte en un trámite y la ontología vuelve a divergir, ahora más rápido.</w:t>
+        <w:t xml:space="preserve"> Un umbral de 90 días aparece en código; la razón está en una circular o en un correo. Sin enlazar cada regla con su fuente documental la ontología es correcta pero no explicable, y el supervisor pregunta por el porqué.</w:t>
+      </w:r>
+    </w:p>
+    <w:p>
+      <w:pPr>
+        <w:pStyle w:val="ListParagraph"/>
+        <w:numPr>
+          <w:ilvl w:val="0"/>
+          <w:numId w:val="4"/>
+        </w:numPr>
+      </w:pPr>
+      <w:r>
+        <w:rPr>
+          <w:b/>
+        </w:rPr>
+        <w:t xml:space="preserve">El sistema puede aprender de sí mismo.</w:t>
+      </w:r>
+      <w:r>
+        <w:t xml:space="preserve"> Si los agentes generan la mayoría de las consultas, los logs reflejan lo que hacen los agentes, no lo que necesita el negocio. Hay que marcar en los logs el uso humano y el uso de agentes y ponderar en consecuencia.</w:t>
+      </w:r>
+    </w:p>
+    <w:p>
+      <w:pPr>
+        <w:pStyle w:val="Heading3"/>
+      </w:pPr>
+      <w:r>
+        <w:t xml:space="preserve">Obligaciones y dependencias que se cubren desde el principio</w:t>
+      </w:r>
+    </w:p>
+    <w:p>
+      <w:pPr/>
+      <w:r>
+        <w:t xml:space="preserve">No cuestionan el enfoque, pero si no se tratan al diseñar aparecen después como bloqueos.</w:t>
+      </w:r>
+    </w:p>
+    <w:p>
+      <w:pPr>
+        <w:pStyle w:val="ListParagraph"/>
+        <w:numPr>
+          <w:ilvl w:val="0"/>
+          <w:numId w:val="5"/>
+        </w:numPr>
+      </w:pPr>
+      <w:r>
+        <w:rPr>
+          <w:b/>
+        </w:rPr>
+        <w:t xml:space="preserve">Datos personales en logs y embeddings.</w:t>
+      </w:r>
+      <w:r>
+        <w:t xml:space="preserve"> Los logs de consulta contienen nombres y documentos de identidad; los embeddings pueden reconstruir texto. Ambos son datos personales bajo el RGPD y necesitan enmascarado y retención definida.</w:t>
+      </w:r>
+    </w:p>
+    <w:p>
+      <w:pPr>
+        <w:pStyle w:val="ListParagraph"/>
+        <w:numPr>
+          <w:ilvl w:val="0"/>
+          <w:numId w:val="5"/>
+        </w:numPr>
+      </w:pPr>
+      <w:r>
+        <w:rPr>
+          <w:b/>
+        </w:rPr>
+        <w:t xml:space="preserve">Dependencia del proveedor.</w:t>
+      </w:r>
+      <w:r>
+        <w:t xml:space="preserve"> Una ontología en formato propietario es un activo cautivo; de ahí la exigencia de formato abierto en la hoja de ruta. El grafo de contexto no tiene estándar y cada proveedor lo define a su conveniencia.</w:t>
+      </w:r>
+    </w:p>
+    <w:p>
+      <w:pPr>
+        <w:pStyle w:val="ListParagraph"/>
+        <w:numPr>
+          <w:ilvl w:val="0"/>
+          <w:numId w:val="5"/>
+        </w:numPr>
+      </w:pPr>
+      <w:r>
+        <w:rPr>
+          <w:b/>
+        </w:rPr>
+        <w:t xml:space="preserve">Límites de cada técnica.</w:t>
+      </w:r>
+      <w:r>
+        <w:t xml:space="preserve"> Un grafo virtual sobre SQL sirve para métricas y uniones entre tablas, pero no para análisis de redes; para eso hace falta un grafo materializado.</w:t>
       </w:r>
     </w:p>
     <w:p>
@@ -3408,25 +3462,25 @@
         <w:pStyle w:val="ListParagraph"/>
         <w:numPr>
           <w:ilvl w:val="0"/>
-          <w:numId w:val="4"/>
-        </w:numPr>
-      </w:pPr>
-      <w:r>
-        <w:rPr>
-          <w:b/>
-        </w:rPr>
-        <w:t xml:space="preserve">Capa semántica, transversal y ahora.</w:t>
-      </w:r>
-      <w:r>
-        <w:t xml:space="preserve"> Extender la etapa 1 (text-to-SQL con el YAML como contexto) a más vistas de Teradata y probar la etapa 2 (text-to-metrics con compilador determinista) sobre ese entorno; diseñar la etapa 3 (fachada multiplataforma y repositorio único) para no rehacer nada. El detalle está en Capa semántica · 0 Concepto y en sus aplicaciones 1 · Teradata y 2 · Elastic.</w:t>
-      </w:r>
-    </w:p>
-    <w:p>
-      <w:pPr>
-        <w:pStyle w:val="ListParagraph"/>
-        <w:numPr>
-          <w:ilvl w:val="0"/>
-          <w:numId w:val="4"/>
+          <w:numId w:val="6"/>
+        </w:numPr>
+      </w:pPr>
+      <w:r>
+        <w:rPr>
+          <w:b/>
+        </w:rPr>
+        <w:t xml:space="preserve">Capa semántica.</w:t>
+      </w:r>
+      <w:r>
+        <w:t xml:space="preserve"> Es la línea que ya está en marcha y la única que avanza en transversal. Las etapas, su orden y lo que se decide en cada una se tratan en Capa semántica · 0 Concepto y en sus aplicaciones por entorno; este documento no fija ritmo ni alcance.</w:t>
+      </w:r>
+    </w:p>
+    <w:p>
+      <w:pPr>
+        <w:pStyle w:val="ListParagraph"/>
+        <w:numPr>
+          <w:ilvl w:val="0"/>
+          <w:numId w:val="6"/>
         </w:numPr>
       </w:pPr>
       <w:r>
@@ -3436,15 +3490,15 @@
         <w:t xml:space="preserve">Definiciones portables.</w:t>
       </w:r>
       <w:r>
-        <w:t xml:space="preserve"> Apache Ossie desde el día 1 con la extensión del banco, y compatibilidad con ese formato exigida en cualquier contrato con proveedores de capas semánticas.</w:t>
-      </w:r>
-    </w:p>
-    <w:p>
-      <w:pPr>
-        <w:pStyle w:val="ListParagraph"/>
-        <w:numPr>
-          <w:ilvl w:val="0"/>
-          <w:numId w:val="4"/>
+        <w:t xml:space="preserve"> Las definiciones de métricas y dimensiones deben estar en un formato abierto que cualquier proveedor pueda leer, para no quedar atados a una herramienta. Qué formato y con qué extensiones es una decisión de la capa semántica.</w:t>
+      </w:r>
+    </w:p>
+    <w:p>
+      <w:pPr>
+        <w:pStyle w:val="ListParagraph"/>
+        <w:numPr>
+          <w:ilvl w:val="0"/>
+          <w:numId w:val="6"/>
         </w:numPr>
       </w:pPr>
       <w:r>
@@ -3454,103 +3508,103 @@
         <w:t xml:space="preserve">La costura.</w:t>
       </w:r>
       <w:r>
-        <w:t xml:space="preserve"> Fijar en el YAML y en el registro de peticiones los campos que alimentarán a los otros componentes: entidades y relaciones de negocio para la ontología; dueño, versión y rutas de unión para el grafo; identificador de correlación y versión del producto en cada petición para el contexto.</w:t>
-      </w:r>
-    </w:p>
-    <w:p>
-      <w:pPr>
-        <w:pStyle w:val="ListParagraph"/>
-        <w:numPr>
-          <w:ilvl w:val="0"/>
-          <w:numId w:val="4"/>
-        </w:numPr>
-      </w:pPr>
-      <w:r>
-        <w:rPr>
-          <w:b/>
-        </w:rPr>
-        <w:t xml:space="preserve">Ontología y grafo por dominio, empezando por uno documental.</w:t>
-      </w:r>
-      <w:r>
-        <w:t xml:space="preserve"> El candidato es la aplicación de demandas judiciales de la iniciativa 2 de Dato como Producto: documentos, no tablas. Modelar solo los conceptos del inventario de BCBS 239 que toque; extraer un tipo de documento con procedencia al fragmento; tratar los pipelines de extracción como modelos bajo gobernanza.</w:t>
-      </w:r>
-    </w:p>
-    <w:p>
-      <w:pPr>
-        <w:pStyle w:val="ListParagraph"/>
-        <w:numPr>
-          <w:ilvl w:val="0"/>
-          <w:numId w:val="4"/>
-        </w:numPr>
-      </w:pPr>
-      <w:r>
-        <w:rPr>
-          <w:b/>
-        </w:rPr>
-        <w:t xml:space="preserve">Grafo de contexto en un proceso con agentes.</w:t>
-      </w:r>
-      <w:r>
-        <w:t xml:space="preserve"> Capturar las trazas de decisión (excepciones, derivaciones a cumplimiento) con los campos del registro de eventos del Reglamento de IA, y probar que un requerimiento del supervisor sobre ese proceso se responde con una consulta. IRRBB, en analítica avanzada, es el otro candidato.</w:t>
-      </w:r>
-    </w:p>
-    <w:p>
-      <w:pPr>
-        <w:pStyle w:val="ListParagraph"/>
-        <w:numPr>
-          <w:ilvl w:val="0"/>
-          <w:numId w:val="4"/>
-        </w:numPr>
-      </w:pPr>
-      <w:r>
-        <w:rPr>
-          <w:b/>
-        </w:rPr>
-        <w:t xml:space="preserve">Compilar, no generar.</w:t>
-      </w:r>
-      <w:r>
-        <w:t xml:space="preserve"> En todo acceso de agentes a datos estructurados el modelo elige piezas aprobadas y un compilador produce la consulta. Prohibir en producción el SQL generado directamente por el modelo para cifras certificadas.</w:t>
-      </w:r>
-    </w:p>
-    <w:p>
-      <w:pPr>
-        <w:pStyle w:val="ListParagraph"/>
-        <w:numPr>
-          <w:ilvl w:val="0"/>
-          <w:numId w:val="4"/>
-        </w:numPr>
-      </w:pPr>
-      <w:r>
-        <w:rPr>
-          <w:b/>
-        </w:rPr>
-        <w:t xml:space="preserve">Banco de pruebas propio</w:t>
-      </w:r>
-      <w:r>
-        <w:t xml:space="preserve"> antes de creer las cifras de ningún proveedor: las mismas preguntas reales con y sin capa semántica, con el juego de pruebas que sale del log, contando aciertos, errores y «no puedo».</w:t>
-      </w:r>
-    </w:p>
-    <w:p>
-      <w:pPr>
-        <w:pStyle w:val="ListParagraph"/>
-        <w:numPr>
-          <w:ilvl w:val="0"/>
-          <w:numId w:val="4"/>
-        </w:numPr>
-      </w:pPr>
-      <w:r>
-        <w:rPr>
-          <w:b/>
-        </w:rPr>
-        <w:t xml:space="preserve">Agentes de lectura en modo solo propuesta</w:t>
-      </w:r>
-      <w:r>
-        <w:t xml:space="preserve"> sobre código, logs y documentos, seis meses midiendo la calidad de las propuestas; abrir la fusión asistida solo cuando el propietario de concepto tenga autoridad demostrada. Es el paso al nivel 4 y el último.</w:t>
-      </w:r>
-    </w:p>
-    <w:p>
-      <w:pPr/>
-      <w:r>
-        <w:t xml:space="preserve">Avanzar en cada línea por separado pero coordinadamente tiene sentido porque cada componente tiene su propio ritmo y su propio dominio de arranque, y lo único que los une es la costura del punto 3.</w:t>
+        <w:t xml:space="preserve"> Decidir pronto qué campos del YAML y del registro de peticiones se guardan pensando en los otros componentes (entidades y relaciones de negocio, dueño y versión, identificador de cada petición), para no rehacer la capa semántica cuando lleguen.</w:t>
+      </w:r>
+    </w:p>
+    <w:p>
+      <w:pPr>
+        <w:pStyle w:val="ListParagraph"/>
+        <w:numPr>
+          <w:ilvl w:val="0"/>
+          <w:numId w:val="6"/>
+        </w:numPr>
+      </w:pPr>
+      <w:r>
+        <w:rPr>
+          <w:b/>
+        </w:rPr>
+        <w:t xml:space="preserve">Ontología y grafo por dominio.</w:t>
+      </w:r>
+      <w:r>
+        <w:t xml:space="preserve"> No se despliegan en transversal: se construyen donde haya un agente que necesite relaciones entre entidades o documentos con procedencia. El primer dominio se elegirá cuando exista ese agente; en Dato como Producto hay candidatos documentales.</w:t>
+      </w:r>
+    </w:p>
+    <w:p>
+      <w:pPr>
+        <w:pStyle w:val="ListParagraph"/>
+        <w:numPr>
+          <w:ilvl w:val="0"/>
+          <w:numId w:val="6"/>
+        </w:numPr>
+      </w:pPr>
+      <w:r>
+        <w:rPr>
+          <w:b/>
+        </w:rPr>
+        <w:t xml:space="preserve">Grafo de contexto.</w:t>
+      </w:r>
+      <w:r>
+        <w:t xml:space="preserve"> Empieza por el registro de peticiones de la vía certificada y crece proceso a proceso con los agentes que se desplieguen. Qué proceso y qué campos se guardan se decide con cada despliegue.</w:t>
+      </w:r>
+    </w:p>
+    <w:p>
+      <w:pPr>
+        <w:pStyle w:val="ListParagraph"/>
+        <w:numPr>
+          <w:ilvl w:val="0"/>
+          <w:numId w:val="6"/>
+        </w:numPr>
+      </w:pPr>
+      <w:r>
+        <w:rPr>
+          <w:b/>
+        </w:rPr>
+        <w:t xml:space="preserve">Cómo acceden los agentes a cifras certificadas.</w:t>
+      </w:r>
+      <w:r>
+        <w:t xml:space="preserve"> La evidencia recogida en la Vía 1 favorece que el modelo elija piezas aprobadas y un compilador produzca la consulta. La posición del banco se fijará con los resultados de las pruebas de concepto.</w:t>
+      </w:r>
+    </w:p>
+    <w:p>
+      <w:pPr>
+        <w:pStyle w:val="ListParagraph"/>
+        <w:numPr>
+          <w:ilvl w:val="0"/>
+          <w:numId w:val="6"/>
+        </w:numPr>
+      </w:pPr>
+      <w:r>
+        <w:rPr>
+          <w:b/>
+        </w:rPr>
+        <w:t xml:space="preserve">Banco de pruebas propio.</w:t>
+      </w:r>
+      <w:r>
+        <w:t xml:space="preserve"> Antes de dar por buenas las cifras de ningún proveedor, las mismas preguntas reales con y sin capa semántica, contando aciertos, errores y «no puedo». El juego de preguntas sale del propio registro.</w:t>
+      </w:r>
+    </w:p>
+    <w:p>
+      <w:pPr>
+        <w:pStyle w:val="ListParagraph"/>
+        <w:numPr>
+          <w:ilvl w:val="0"/>
+          <w:numId w:val="6"/>
+        </w:numPr>
+      </w:pPr>
+      <w:r>
+        <w:rPr>
+          <w:b/>
+        </w:rPr>
+        <w:t xml:space="preserve">Agentes que proponen cambios en el modelo.</w:t>
+      </w:r>
+      <w:r>
+        <w:t xml:space="preserve"> Es el último paso (nivel 4) y queda abierto: primero en modo solo propuesta, midiendo la calidad de lo que proponen. Cuándo y con qué condiciones se abre la fusión asistida no se decide en este documento.</w:t>
+      </w:r>
+    </w:p>
+    <w:p>
+      <w:pPr/>
+      <w:r>
+        <w:t xml:space="preserve">Las líneas avanzan por separado pero coordinadas; lo único que las une es la costura del punto 3. Plazos, candidatos y decisiones concretas quedan para los documentos de cada componente y para los resultados de las pruebas.</w:t>
       </w:r>
     </w:p>
     <w:p>
@@ -3581,7 +3635,7 @@
         <w:pStyle w:val="ListParagraph"/>
         <w:numPr>
           <w:ilvl w:val="0"/>
-          <w:numId w:val="5"/>
+          <w:numId w:val="7"/>
         </w:numPr>
       </w:pPr>
       <w:hyperlink r:id="rId7" w:history="1">
@@ -3598,7 +3652,7 @@
         <w:pStyle w:val="ListParagraph"/>
         <w:numPr>
           <w:ilvl w:val="0"/>
-          <w:numId w:val="5"/>
+          <w:numId w:val="7"/>
         </w:numPr>
       </w:pPr>
       <w:hyperlink r:id="rId8" w:history="1">
@@ -3615,7 +3669,7 @@
         <w:pStyle w:val="ListParagraph"/>
         <w:numPr>
           <w:ilvl w:val="0"/>
-          <w:numId w:val="5"/>
+          <w:numId w:val="7"/>
         </w:numPr>
       </w:pPr>
       <w:hyperlink r:id="rId29" w:history="1">
@@ -3632,7 +3686,7 @@
         <w:pStyle w:val="ListParagraph"/>
         <w:numPr>
           <w:ilvl w:val="0"/>
-          <w:numId w:val="5"/>
+          <w:numId w:val="7"/>
         </w:numPr>
       </w:pPr>
       <w:hyperlink r:id="rId9" w:history="1">
@@ -3649,7 +3703,7 @@
         <w:pStyle w:val="ListParagraph"/>
         <w:numPr>
           <w:ilvl w:val="0"/>
-          <w:numId w:val="5"/>
+          <w:numId w:val="7"/>
         </w:numPr>
       </w:pPr>
       <w:hyperlink r:id="rId10" w:history="1">
@@ -3666,7 +3720,7 @@
         <w:pStyle w:val="ListParagraph"/>
         <w:numPr>
           <w:ilvl w:val="0"/>
-          <w:numId w:val="5"/>
+          <w:numId w:val="7"/>
         </w:numPr>
       </w:pPr>
       <w:hyperlink r:id="rId12" w:history="1">
@@ -3683,7 +3737,7 @@
         <w:pStyle w:val="ListParagraph"/>
         <w:numPr>
           <w:ilvl w:val="0"/>
-          <w:numId w:val="5"/>
+          <w:numId w:val="7"/>
         </w:numPr>
       </w:pPr>
       <w:hyperlink r:id="rId11" w:history="1">
@@ -3709,7 +3763,7 @@
         <w:pStyle w:val="ListParagraph"/>
         <w:numPr>
           <w:ilvl w:val="0"/>
-          <w:numId w:val="6"/>
+          <w:numId w:val="8"/>
         </w:numPr>
       </w:pPr>
       <w:hyperlink r:id="rId30" w:history="1">
@@ -3726,7 +3780,7 @@
         <w:pStyle w:val="ListParagraph"/>
         <w:numPr>
           <w:ilvl w:val="0"/>
-          <w:numId w:val="6"/>
+          <w:numId w:val="8"/>
         </w:numPr>
       </w:pPr>
       <w:hyperlink r:id="rId31" w:history="1">
@@ -3743,7 +3797,7 @@
         <w:pStyle w:val="ListParagraph"/>
         <w:numPr>
           <w:ilvl w:val="0"/>
-          <w:numId w:val="6"/>
+          <w:numId w:val="8"/>
         </w:numPr>
       </w:pPr>
       <w:hyperlink r:id="rId4" w:history="1">
@@ -3760,7 +3814,7 @@
         <w:pStyle w:val="ListParagraph"/>
         <w:numPr>
           <w:ilvl w:val="0"/>
-          <w:numId w:val="6"/>
+          <w:numId w:val="8"/>
         </w:numPr>
       </w:pPr>
       <w:hyperlink r:id="rId5" w:history="1">
@@ -3777,7 +3831,7 @@
         <w:pStyle w:val="ListParagraph"/>
         <w:numPr>
           <w:ilvl w:val="0"/>
-          <w:numId w:val="6"/>
+          <w:numId w:val="8"/>
         </w:numPr>
       </w:pPr>
       <w:hyperlink r:id="rId32" w:history="1">
@@ -3794,7 +3848,7 @@
         <w:pStyle w:val="ListParagraph"/>
         <w:numPr>
           <w:ilvl w:val="0"/>
-          <w:numId w:val="6"/>
+          <w:numId w:val="8"/>
         </w:numPr>
       </w:pPr>
       <w:hyperlink r:id="rId33" w:history="1">
@@ -3811,7 +3865,7 @@
         <w:pStyle w:val="ListParagraph"/>
         <w:numPr>
           <w:ilvl w:val="0"/>
-          <w:numId w:val="6"/>
+          <w:numId w:val="8"/>
         </w:numPr>
       </w:pPr>
       <w:hyperlink r:id="rId34" w:history="1">
@@ -3837,7 +3891,7 @@
         <w:pStyle w:val="ListParagraph"/>
         <w:numPr>
           <w:ilvl w:val="0"/>
-          <w:numId w:val="7"/>
+          <w:numId w:val="9"/>
         </w:numPr>
       </w:pPr>
       <w:hyperlink r:id="rId3" w:history="1">
@@ -3854,7 +3908,7 @@
         <w:pStyle w:val="ListParagraph"/>
         <w:numPr>
           <w:ilvl w:val="0"/>
-          <w:numId w:val="7"/>
+          <w:numId w:val="9"/>
         </w:numPr>
       </w:pPr>
       <w:hyperlink r:id="rId35" w:history="1">
@@ -3871,7 +3925,7 @@
         <w:pStyle w:val="ListParagraph"/>
         <w:numPr>
           <w:ilvl w:val="0"/>
-          <w:numId w:val="7"/>
+          <w:numId w:val="9"/>
         </w:numPr>
       </w:pPr>
       <w:hyperlink r:id="rId36" w:history="1">
@@ -3888,7 +3942,7 @@
         <w:pStyle w:val="ListParagraph"/>
         <w:numPr>
           <w:ilvl w:val="0"/>
-          <w:numId w:val="7"/>
+          <w:numId w:val="9"/>
         </w:numPr>
       </w:pPr>
       <w:hyperlink r:id="rId37" w:history="1">
@@ -3905,7 +3959,7 @@
         <w:pStyle w:val="ListParagraph"/>
         <w:numPr>
           <w:ilvl w:val="0"/>
-          <w:numId w:val="7"/>
+          <w:numId w:val="9"/>
         </w:numPr>
       </w:pPr>
       <w:hyperlink r:id="rId38" w:history="1">
@@ -3931,7 +3985,7 @@
         <w:pStyle w:val="ListParagraph"/>
         <w:numPr>
           <w:ilvl w:val="0"/>
-          <w:numId w:val="8"/>
+          <w:numId w:val="10"/>
         </w:numPr>
       </w:pPr>
       <w:hyperlink r:id="rId13" w:history="1">
@@ -3948,7 +4002,7 @@
         <w:pStyle w:val="ListParagraph"/>
         <w:numPr>
           <w:ilvl w:val="0"/>
-          <w:numId w:val="8"/>
+          <w:numId w:val="10"/>
         </w:numPr>
       </w:pPr>
       <w:hyperlink r:id="rId39" w:history="1">
@@ -3965,7 +4019,7 @@
         <w:pStyle w:val="ListParagraph"/>
         <w:numPr>
           <w:ilvl w:val="0"/>
-          <w:numId w:val="8"/>
+          <w:numId w:val="10"/>
         </w:numPr>
       </w:pPr>
       <w:hyperlink r:id="rId40" w:history="1">
@@ -3982,7 +4036,7 @@
         <w:pStyle w:val="ListParagraph"/>
         <w:numPr>
           <w:ilvl w:val="0"/>
-          <w:numId w:val="8"/>
+          <w:numId w:val="10"/>
         </w:numPr>
       </w:pPr>
       <w:hyperlink r:id="rId22" w:history="1">
@@ -3999,7 +4053,7 @@
         <w:pStyle w:val="ListParagraph"/>
         <w:numPr>
           <w:ilvl w:val="0"/>
-          <w:numId w:val="8"/>
+          <w:numId w:val="10"/>
         </w:numPr>
       </w:pPr>
       <w:hyperlink r:id="rId21" w:history="1">
@@ -4016,7 +4070,7 @@
         <w:pStyle w:val="ListParagraph"/>
         <w:numPr>
           <w:ilvl w:val="0"/>
-          <w:numId w:val="8"/>
+          <w:numId w:val="10"/>
         </w:numPr>
       </w:pPr>
       <w:hyperlink r:id="rId26" w:history="1">
@@ -4033,7 +4087,7 @@
         <w:pStyle w:val="ListParagraph"/>
         <w:numPr>
           <w:ilvl w:val="0"/>
-          <w:numId w:val="8"/>
+          <w:numId w:val="10"/>
         </w:numPr>
       </w:pPr>
       <w:hyperlink r:id="rId27" w:history="1">
@@ -4050,7 +4104,7 @@
         <w:pStyle w:val="ListParagraph"/>
         <w:numPr>
           <w:ilvl w:val="0"/>
-          <w:numId w:val="8"/>
+          <w:numId w:val="10"/>
         </w:numPr>
       </w:pPr>
       <w:hyperlink r:id="rId41" w:history="1">
@@ -4067,7 +4121,7 @@
         <w:pStyle w:val="ListParagraph"/>
         <w:numPr>
           <w:ilvl w:val="0"/>
-          <w:numId w:val="8"/>
+          <w:numId w:val="10"/>
         </w:numPr>
       </w:pPr>
       <w:hyperlink r:id="rId24" w:history="1">
@@ -4084,7 +4138,7 @@
         <w:pStyle w:val="ListParagraph"/>
         <w:numPr>
           <w:ilvl w:val="0"/>
-          <w:numId w:val="8"/>
+          <w:numId w:val="10"/>
         </w:numPr>
       </w:pPr>
       <w:hyperlink r:id="rId42" w:history="1">
@@ -4101,7 +4155,7 @@
         <w:pStyle w:val="ListParagraph"/>
         <w:numPr>
           <w:ilvl w:val="0"/>
-          <w:numId w:val="8"/>
+          <w:numId w:val="10"/>
         </w:numPr>
       </w:pPr>
       <w:hyperlink r:id="rId43" w:history="1">
@@ -4118,7 +4172,7 @@
         <w:pStyle w:val="ListParagraph"/>
         <w:numPr>
           <w:ilvl w:val="0"/>
-          <w:numId w:val="8"/>
+          <w:numId w:val="10"/>
         </w:numPr>
       </w:pPr>
       <w:hyperlink r:id="rId44" w:history="1">
@@ -4135,7 +4189,7 @@
         <w:pStyle w:val="ListParagraph"/>
         <w:numPr>
           <w:ilvl w:val="0"/>
-          <w:numId w:val="8"/>
+          <w:numId w:val="10"/>
         </w:numPr>
       </w:pPr>
       <w:hyperlink r:id="rId25" w:history="1">
@@ -4161,7 +4215,7 @@
         <w:pStyle w:val="ListParagraph"/>
         <w:numPr>
           <w:ilvl w:val="0"/>
-          <w:numId w:val="9"/>
+          <w:numId w:val="11"/>
         </w:numPr>
       </w:pPr>
       <w:hyperlink r:id="rId45" w:history="1">
@@ -4178,7 +4232,7 @@
         <w:pStyle w:val="ListParagraph"/>
         <w:numPr>
           <w:ilvl w:val="0"/>
-          <w:numId w:val="9"/>
+          <w:numId w:val="11"/>
         </w:numPr>
       </w:pPr>
       <w:hyperlink r:id="rId18" w:history="1">
@@ -4195,7 +4249,7 @@
         <w:pStyle w:val="ListParagraph"/>
         <w:numPr>
           <w:ilvl w:val="0"/>
-          <w:numId w:val="9"/>
+          <w:numId w:val="11"/>
         </w:numPr>
       </w:pPr>
       <w:hyperlink r:id="rId17" w:history="1">
@@ -4212,7 +4266,7 @@
         <w:pStyle w:val="ListParagraph"/>
         <w:numPr>
           <w:ilvl w:val="0"/>
-          <w:numId w:val="9"/>
+          <w:numId w:val="11"/>
         </w:numPr>
       </w:pPr>
       <w:hyperlink r:id="rId20" w:history="1">
@@ -4229,7 +4283,7 @@
         <w:pStyle w:val="ListParagraph"/>
         <w:numPr>
           <w:ilvl w:val="0"/>
-          <w:numId w:val="9"/>
+          <w:numId w:val="11"/>
         </w:numPr>
       </w:pPr>
       <w:hyperlink r:id="rId16" w:history="1">
@@ -4246,7 +4300,7 @@
         <w:pStyle w:val="ListParagraph"/>
         <w:numPr>
           <w:ilvl w:val="0"/>
-          <w:numId w:val="9"/>
+          <w:numId w:val="11"/>
         </w:numPr>
       </w:pPr>
       <w:hyperlink r:id="rId15" w:history="1">
@@ -4263,7 +4317,7 @@
         <w:pStyle w:val="ListParagraph"/>
         <w:numPr>
           <w:ilvl w:val="0"/>
-          <w:numId w:val="9"/>
+          <w:numId w:val="11"/>
         </w:numPr>
       </w:pPr>
       <w:hyperlink r:id="rId46" w:history="1">
@@ -4463,16 +4517,16 @@
     <w:abstractNumId w:val="0"/>
   </w:num>
   <w:num w:numId="4">
-    <w:abstractNumId w:val="1"/>
-    <w:lvlOverride w:ilvl="0">
-      <w:startOverride w:val="1"/>
-    </w:lvlOverride>
+    <w:abstractNumId w:val="0"/>
   </w:num>
   <w:num w:numId="5">
     <w:abstractNumId w:val="0"/>
   </w:num>
   <w:num w:numId="6">
-    <w:abstractNumId w:val="0"/>
+    <w:abstractNumId w:val="1"/>
+    <w:lvlOverride w:ilvl="0">
+      <w:startOverride w:val="1"/>
+    </w:lvlOverride>
   </w:num>
   <w:num w:numId="7">
     <w:abstractNumId w:val="0"/>
@@ -4481,6 +4535,12 @@
     <w:abstractNumId w:val="0"/>
   </w:num>
   <w:num w:numId="9">
+    <w:abstractNumId w:val="0"/>
+  </w:num>
+  <w:num w:numId="10">
+    <w:abstractNumId w:val="0"/>
+  </w:num>
+  <w:num w:numId="11">
     <w:abstractNumId w:val="0"/>
   </w:num>
 </w:numbering>

</xml_diff>

<commit_message>
Marco: viñetas de cifras y agente en la Vía 1 con la redacción del autor
Co-Authored-By: Claude Fable 5.1 <noreply@anthropic.com>
Claude-Session: https://claude.ai/code/session_013A7bCLd4PzhQYG95DagcQd
</commit_message>
<xml_diff>
--- a/docs/Semantica_grafos_agentes_banca.docx
+++ b/docs/Semantica_grafos_agentes_banca.docx
@@ -2398,7 +2398,7 @@
         <w:t xml:space="preserve">Para las cifras:</w:t>
       </w:r>
       <w:r>
-        <w:t xml:space="preserve"> el compilador de métricas sobre el almacén. La fiabilidad de una cifra depende de quién escribe la consulta, no de cómo se modelan los datos. Si las métricas se publican en un grafo como consultas almacenadas con parámetros, es el mismo principio con otro motor; por eso Stardog y Timbr siguen entre los candidatos a motor de destino, con los mismos criterios que los demás: que funcione sobre Teradata, que trate bien las fotos y que evite el doble conteo al unir tablas de distinta granularidad.</w:t>
+        <w:t xml:space="preserve"> el compilador de métricas sobre el almacén. La fiabilidad de una cifra depende de quién escribe la consulta, no de cómo se modelan los datos. Si las métricas se publican en un grafo como consultas almacenadas con parámetros, es el mismo principio con otro motor, y se le piden los mismos criterios que a los demás: que trate bien las fotos y que evite el doble conteo al unir tablas de distinta granularidad.</w:t>
       </w:r>
     </w:p>
     <w:p>
@@ -2416,7 +2416,7 @@
         <w:t xml:space="preserve">Para el agente:</w:t>
       </w:r>
       <w:r>
-        <w:t xml:space="preserve"> un grafo con conceptos, productos, métricas, dueños, linaje de Rosetta y rutas de unión entre productos. Se carga en buena parte desde los mismos YAML, así que no hay dos definiciones que mantener. Sirve de respaldo a list_metrics y describe_metric y ayuda a elegir la métrica ante preguntas ambiguas.</w:t>
+        <w:t xml:space="preserve"> un grafo con conceptos, productos, métricas, dueños, linaje y rutas de unión entre productos ayuda. Se carga en buena parte desde los mismos YAML, así que no hay dos definiciones, sino otra manera de exponer la misma información.</w:t>
       </w:r>
     </w:p>
     <w:p>

</xml_diff>

<commit_message>
Marco: el mundo de Yupi (nombre unificado en todo el documento)
Co-Authored-By: Claude Fable 5.1 <noreply@anthropic.com>
Claude-Session: https://claude.ai/code/session_013A7bCLd4PzhQYG95DagcQd
</commit_message>
<xml_diff>
--- a/docs/Semantica_grafos_agentes_banca.docx
+++ b/docs/Semantica_grafos_agentes_banca.docx
@@ -2672,19 +2672,19 @@
         <w:pStyle w:val="Heading2"/>
       </w:pPr>
       <w:r>
-        <w:t xml:space="preserve">La foto final: el mundo de Jupy</w:t>
-      </w:r>
-    </w:p>
-    <w:p>
-      <w:pPr/>
-      <w:r>
-        <w:t xml:space="preserve">El mundo de Jupy es el escenario ideal en el que las cuatro funciones existen, están conectadas y se mantienen solas al ritmo del negocio. No es una predicción sino un punto de referencia: describe la organización a la que lleva aplicar bien los conceptos, para poder medir cuánto falta. Las secciones siguientes bajan de ese ideal a la realidad.</w:t>
-      </w:r>
-    </w:p>
-    <w:p>
-      <w:pPr/>
-      <w:r>
-        <w:t xml:space="preserve">En Dato como Producto este escenario tiene nombre propio. UNICON2 es la plataforma que lee el código y los procesos del banco y convierte el conocimiento implícito en catálogo, diccionario y linaje, y en su hoja de ruta figuran la capa semántica y la ontología corporativa como salidas siguientes. El mundo de Jupy es UNICON2 cerrando el ciclo: no levanta el conocimiento una vez, sino que lo mantiene.</w:t>
+        <w:t xml:space="preserve">La foto final: el mundo de Yupi</w:t>
+      </w:r>
+    </w:p>
+    <w:p>
+      <w:pPr/>
+      <w:r>
+        <w:t xml:space="preserve">El mundo de Yupi es el escenario ideal en el que las cuatro funciones existen, están conectadas y se mantienen solas al ritmo del negocio. No es una predicción sino un punto de referencia: describe la organización a la que lleva aplicar bien los conceptos, para poder medir cuánto falta. Las secciones siguientes bajan de ese ideal a la realidad.</w:t>
+      </w:r>
+    </w:p>
+    <w:p>
+      <w:pPr/>
+      <w:r>
+        <w:t xml:space="preserve">En Dato como Producto este escenario tiene nombre propio. UNICON2 es la plataforma que lee el código y los procesos del banco y convierte el conocimiento implícito en catálogo, diccionario y linaje, y en su hoja de ruta figuran la capa semántica y la ontología corporativa como salidas siguientes. El mundo de Yupi es UNICON2 cerrando el ciclo: no levanta el conocimiento una vez, sino que lo mantiene.</w:t>
       </w:r>
     </w:p>
     <w:p>
@@ -2818,7 +2818,7 @@
     <w:p>
       <w:pPr/>
       <w:r>
-        <w:t xml:space="preserve">Los cuatro componentes tienen grados de desarrollo distintos, y por eso una escala única engaña. La matriz sitúa cada componente por separado; el nivel 4 de cada fila es el mundo de Jupy. La última columna dice dónde está el banco en octubre de 2026.</w:t>
+        <w:t xml:space="preserve">Los cuatro componentes tienen grados de desarrollo distintos, y por eso una escala única engaña. La matriz sitúa cada componente por separado; el nivel 4 de cada fila es el mundo de Yupi. La última columna dice dónde está el banco en octubre de 2026.</w:t>
       </w:r>
     </w:p>
     <w:tbl>

</xml_diff>

<commit_message>
Marco: sección de riesgos y límites reducida a dos párrafos
Co-Authored-By: Claude Fable 5.1 <noreply@anthropic.com>
Claude-Session: https://claude.ai/code/session_013A7bCLd4PzhQYG95DagcQd
</commit_message>
<xml_diff>
--- a/docs/Semantica_grafos_agentes_banca.docx
+++ b/docs/Semantica_grafos_agentes_banca.docx
@@ -3254,21 +3254,27 @@
     <w:p>
       <w:pPr/>
       <w:r>
-        <w:t xml:space="preserve">Los riesgos de este camino no pesan igual. Los primeros tocan cifras que se reportan al supervisor y son los que justifican que la propuesta sea automática y la aprobación humana. Los segundos afectan a si el sistema es explicable y aprende de lo correcto. Los terceros son obligaciones y dependencias que hay que cubrir desde el principio, pero no cuestionan el enfoque.</w:t>
-      </w:r>
-    </w:p>
-    <w:p>
-      <w:pPr>
-        <w:pStyle w:val="Heading3"/>
-      </w:pPr>
-      <w:r>
-        <w:t xml:space="preserve">Lo que puede alterar una cifra regulatoria</w:t>
-      </w:r>
-    </w:p>
-    <w:p>
-      <w:pPr/>
-      <w:r>
-        <w:t xml:space="preserve">Son los tres riesgos que importan de verdad, y los tres se tratan con la misma regla: ningún cambio de definición entra en vigor sin que lo apruebe un propietario de concepto, con fecha de efectividad, versión y análisis de impacto.</w:t>
+        <w:t xml:space="preserve">Los riesgos de este camino no se resuelven con tecnología. Los que hoy se ven son tres: que un cambio de definición altere informes regulatorios sin que nadie lo haya decidido; que lo que el banco hace de hecho se consolide como norma, cuando la norma está en el CRR y no en la consulta más frecuente; y que lo que propone un modelo se tome por bueno sin validación. Los tres se tratan con la misma regla: ningún cambio entra en vigor sin que lo apruebe un propietario de concepto con autoridad real, con fecha de efectividad y versión. A ellos se suman obligaciones conocidas, como los datos personales en logs y embeddings o la dependencia de un formato propietario.</w:t>
+      </w:r>
+    </w:p>
+    <w:p>
+      <w:pPr/>
+      <w:r>
+        <w:t xml:space="preserve">La lista no está cerrada. A medida que se implante cada componente aparecerán riesgos nuevos que habrá que identificar y cubrir, y por eso cada hito de la hoja de ruta debe llevar su propia revisión de riesgos.</w:t>
+      </w:r>
+    </w:p>
+    <w:p>
+      <w:pPr>
+        <w:pStyle w:val="Heading2"/>
+      </w:pPr>
+      <w:r>
+        <w:t xml:space="preserve">Hoja de ruta para una entidad financiera</w:t>
+      </w:r>
+    </w:p>
+    <w:p>
+      <w:pPr/>
+      <w:r>
+        <w:t xml:space="preserve">Dos reglas ordenan el camino. La capa semántica avanza en transversal y ahora, porque el entorno informacional ya está gobernado y los YAML existen: es el componente 1 de Dato como Producto y no espera a los demás. Los otros tres componentes avanzan por dominio de uso, allí donde haya agentes haciendo tareas que exijan relaciones, documentos o precedentes. Las líneas van separadas pero coordinadas por una costura: los campos del YAML y del registro de peticiones que alimentarán a la ontología, al grafo y al contexto se deciden ahora, para que la capa semántica no se rehaga.</w:t>
       </w:r>
     </w:p>
     <w:p>
@@ -3277,192 +3283,6 @@
         <w:numPr>
           <w:ilvl w:val="0"/>
           <w:numId w:val="3"/>
-        </w:numPr>
-      </w:pPr>
-      <w:r>
-        <w:rPr>
-          <w:b/>
-        </w:rPr>
-        <w:t xml:space="preserve">Un cambio de definición es un cambio en todos los informes aguas abajo.</w:t>
-      </w:r>
-      <w:r>
-        <w:t xml:space="preserve"> Sin fecha de efectividad, versionado y análisis de impacto, una definición que cambia altera el reporting regulatorio del trimestre sin que nadie lo haya decidido.</w:t>
-      </w:r>
-    </w:p>
-    <w:p>
-      <w:pPr>
-        <w:pStyle w:val="ListParagraph"/>
-        <w:numPr>
-          <w:ilvl w:val="0"/>
-          <w:numId w:val="3"/>
-        </w:numPr>
-      </w:pPr>
-      <w:r>
-        <w:rPr>
-          <w:b/>
-        </w:rPr>
-        <w:t xml:space="preserve">Lo que se hace de hecho no es lo que se debe hacer.</w:t>
-      </w:r>
-      <w:r>
-        <w:t xml:space="preserve"> Minar código y logs dice cómo calcula el banco las cosas, no cómo debe calcularlas. La definición de impago viene del artículo 178 del CRR, no de la consulta más frecuente. Si la implementación mayoritaria es la incorrecta, una ontología que evoluciona por uso consolida el error con autoridad.</w:t>
-      </w:r>
-    </w:p>
-    <w:p>
-      <w:pPr>
-        <w:pStyle w:val="ListParagraph"/>
-        <w:numPr>
-          <w:ilvl w:val="0"/>
-          <w:numId w:val="3"/>
-        </w:numPr>
-      </w:pPr>
-      <w:r>
-        <w:rPr>
-          <w:b/>
-        </w:rPr>
-        <w:t xml:space="preserve">Lo que propone un modelo es salida de un modelo.</w:t>
-      </w:r>
-      <w:r>
-        <w:t xml:space="preserve"> Puede inventar relaciones plausibles. Entra en gestión de riesgo de modelo, con validación independiente, igual que un scoring.</w:t>
-      </w:r>
-    </w:p>
-    <w:p>
-      <w:pPr/>
-      <w:r>
-        <w:t xml:space="preserve">La regla solo funciona si el propietario de concepto tiene autoridad real para rechazar un cambio que un área de negocio quiere. Sin esa autoridad la aprobación se convierte en un trámite y la ontología vuelve a divergir, ahora más rápido. Es el límite organizativo del enfoque y pesa más que cualquiera de los técnicos.</w:t>
-      </w:r>
-    </w:p>
-    <w:p>
-      <w:pPr>
-        <w:pStyle w:val="Heading3"/>
-      </w:pPr>
-      <w:r>
-        <w:t xml:space="preserve">Lo que hace al sistema poco explicable o le hace aprender mal</w:t>
-      </w:r>
-    </w:p>
-    <w:p>
-      <w:pPr>
-        <w:pStyle w:val="ListParagraph"/>
-        <w:numPr>
-          <w:ilvl w:val="0"/>
-          <w:numId w:val="4"/>
-        </w:numPr>
-      </w:pPr>
-      <w:r>
-        <w:rPr>
-          <w:b/>
-        </w:rPr>
-        <w:t xml:space="preserve">El código guarda la implementación, no el porqué.</w:t>
-      </w:r>
-      <w:r>
-        <w:t xml:space="preserve"> Un umbral de 90 días aparece en código; la razón está en una circular o en un correo. Sin enlazar cada regla con su fuente documental la ontología es correcta pero no explicable, y el supervisor pregunta por el porqué.</w:t>
-      </w:r>
-    </w:p>
-    <w:p>
-      <w:pPr>
-        <w:pStyle w:val="ListParagraph"/>
-        <w:numPr>
-          <w:ilvl w:val="0"/>
-          <w:numId w:val="4"/>
-        </w:numPr>
-      </w:pPr>
-      <w:r>
-        <w:rPr>
-          <w:b/>
-        </w:rPr>
-        <w:t xml:space="preserve">El sistema puede aprender de sí mismo.</w:t>
-      </w:r>
-      <w:r>
-        <w:t xml:space="preserve"> Si los agentes generan la mayoría de las consultas, los logs reflejan lo que hacen los agentes, no lo que necesita el negocio. Hay que marcar en los logs el uso humano y el uso de agentes y ponderar en consecuencia.</w:t>
-      </w:r>
-    </w:p>
-    <w:p>
-      <w:pPr>
-        <w:pStyle w:val="Heading3"/>
-      </w:pPr>
-      <w:r>
-        <w:t xml:space="preserve">Obligaciones y dependencias que se cubren desde el principio</w:t>
-      </w:r>
-    </w:p>
-    <w:p>
-      <w:pPr/>
-      <w:r>
-        <w:t xml:space="preserve">No cuestionan el enfoque, pero si no se tratan al diseñar aparecen después como bloqueos.</w:t>
-      </w:r>
-    </w:p>
-    <w:p>
-      <w:pPr>
-        <w:pStyle w:val="ListParagraph"/>
-        <w:numPr>
-          <w:ilvl w:val="0"/>
-          <w:numId w:val="5"/>
-        </w:numPr>
-      </w:pPr>
-      <w:r>
-        <w:rPr>
-          <w:b/>
-        </w:rPr>
-        <w:t xml:space="preserve">Datos personales en logs y embeddings.</w:t>
-      </w:r>
-      <w:r>
-        <w:t xml:space="preserve"> Los logs de consulta contienen nombres y documentos de identidad; los embeddings pueden reconstruir texto. Ambos son datos personales bajo el RGPD y necesitan enmascarado y retención definida.</w:t>
-      </w:r>
-    </w:p>
-    <w:p>
-      <w:pPr>
-        <w:pStyle w:val="ListParagraph"/>
-        <w:numPr>
-          <w:ilvl w:val="0"/>
-          <w:numId w:val="5"/>
-        </w:numPr>
-      </w:pPr>
-      <w:r>
-        <w:rPr>
-          <w:b/>
-        </w:rPr>
-        <w:t xml:space="preserve">Dependencia del proveedor.</w:t>
-      </w:r>
-      <w:r>
-        <w:t xml:space="preserve"> Una ontología en formato propietario es un activo cautivo; de ahí la exigencia de formato abierto en la hoja de ruta. El grafo de contexto no tiene estándar y cada proveedor lo define a su conveniencia.</w:t>
-      </w:r>
-    </w:p>
-    <w:p>
-      <w:pPr>
-        <w:pStyle w:val="ListParagraph"/>
-        <w:numPr>
-          <w:ilvl w:val="0"/>
-          <w:numId w:val="5"/>
-        </w:numPr>
-      </w:pPr>
-      <w:r>
-        <w:rPr>
-          <w:b/>
-        </w:rPr>
-        <w:t xml:space="preserve">Límites de cada técnica.</w:t>
-      </w:r>
-      <w:r>
-        <w:t xml:space="preserve"> Un grafo virtual sobre SQL sirve para métricas y uniones entre tablas, pero no para análisis de redes; para eso hace falta un grafo materializado.</w:t>
-      </w:r>
-    </w:p>
-    <w:p>
-      <w:pPr>
-        <w:pStyle w:val="Heading2"/>
-      </w:pPr>
-      <w:r>
-        <w:t xml:space="preserve">Hoja de ruta para una entidad financiera</w:t>
-      </w:r>
-    </w:p>
-    <w:p>
-      <w:pPr/>
-      <w:r>
-        <w:t xml:space="preserve">Dos reglas ordenan el camino. La capa semántica avanza en transversal y ahora, porque el entorno informacional ya está gobernado y los YAML existen: es el componente 1 de Dato como Producto y no espera a los demás. Los otros tres componentes avanzan por dominio de uso, allí donde haya agentes haciendo tareas que exijan relaciones, documentos o precedentes. Las líneas van separadas pero coordinadas por una costura: los campos del YAML y del registro de peticiones que alimentarán a la ontología, al grafo y al contexto se deciden ahora, para que la capa semántica no se rehaga.</w:t>
-      </w:r>
-    </w:p>
-    <w:p>
-      <w:pPr>
-        <w:pStyle w:val="ListParagraph"/>
-        <w:numPr>
-          <w:ilvl w:val="0"/>
-          <w:numId w:val="6"/>
         </w:numPr>
       </w:pPr>
       <w:r>
@@ -3480,7 +3300,7 @@
         <w:pStyle w:val="ListParagraph"/>
         <w:numPr>
           <w:ilvl w:val="0"/>
-          <w:numId w:val="6"/>
+          <w:numId w:val="3"/>
         </w:numPr>
       </w:pPr>
       <w:r>
@@ -3498,7 +3318,7 @@
         <w:pStyle w:val="ListParagraph"/>
         <w:numPr>
           <w:ilvl w:val="0"/>
-          <w:numId w:val="6"/>
+          <w:numId w:val="3"/>
         </w:numPr>
       </w:pPr>
       <w:r>
@@ -3516,7 +3336,7 @@
         <w:pStyle w:val="ListParagraph"/>
         <w:numPr>
           <w:ilvl w:val="0"/>
-          <w:numId w:val="6"/>
+          <w:numId w:val="3"/>
         </w:numPr>
       </w:pPr>
       <w:r>
@@ -3534,7 +3354,7 @@
         <w:pStyle w:val="ListParagraph"/>
         <w:numPr>
           <w:ilvl w:val="0"/>
-          <w:numId w:val="6"/>
+          <w:numId w:val="3"/>
         </w:numPr>
       </w:pPr>
       <w:r>
@@ -3552,7 +3372,7 @@
         <w:pStyle w:val="ListParagraph"/>
         <w:numPr>
           <w:ilvl w:val="0"/>
-          <w:numId w:val="6"/>
+          <w:numId w:val="3"/>
         </w:numPr>
       </w:pPr>
       <w:r>
@@ -3570,7 +3390,7 @@
         <w:pStyle w:val="ListParagraph"/>
         <w:numPr>
           <w:ilvl w:val="0"/>
-          <w:numId w:val="6"/>
+          <w:numId w:val="3"/>
         </w:numPr>
       </w:pPr>
       <w:r>
@@ -3588,7 +3408,7 @@
         <w:pStyle w:val="ListParagraph"/>
         <w:numPr>
           <w:ilvl w:val="0"/>
-          <w:numId w:val="6"/>
+          <w:numId w:val="3"/>
         </w:numPr>
       </w:pPr>
       <w:r>
@@ -3635,7 +3455,7 @@
         <w:pStyle w:val="ListParagraph"/>
         <w:numPr>
           <w:ilvl w:val="0"/>
-          <w:numId w:val="7"/>
+          <w:numId w:val="4"/>
         </w:numPr>
       </w:pPr>
       <w:hyperlink r:id="rId7" w:history="1">
@@ -3652,7 +3472,7 @@
         <w:pStyle w:val="ListParagraph"/>
         <w:numPr>
           <w:ilvl w:val="0"/>
-          <w:numId w:val="7"/>
+          <w:numId w:val="4"/>
         </w:numPr>
       </w:pPr>
       <w:hyperlink r:id="rId8" w:history="1">
@@ -3669,7 +3489,7 @@
         <w:pStyle w:val="ListParagraph"/>
         <w:numPr>
           <w:ilvl w:val="0"/>
-          <w:numId w:val="7"/>
+          <w:numId w:val="4"/>
         </w:numPr>
       </w:pPr>
       <w:hyperlink r:id="rId29" w:history="1">
@@ -3686,7 +3506,7 @@
         <w:pStyle w:val="ListParagraph"/>
         <w:numPr>
           <w:ilvl w:val="0"/>
-          <w:numId w:val="7"/>
+          <w:numId w:val="4"/>
         </w:numPr>
       </w:pPr>
       <w:hyperlink r:id="rId9" w:history="1">
@@ -3703,7 +3523,7 @@
         <w:pStyle w:val="ListParagraph"/>
         <w:numPr>
           <w:ilvl w:val="0"/>
-          <w:numId w:val="7"/>
+          <w:numId w:val="4"/>
         </w:numPr>
       </w:pPr>
       <w:hyperlink r:id="rId10" w:history="1">
@@ -3720,7 +3540,7 @@
         <w:pStyle w:val="ListParagraph"/>
         <w:numPr>
           <w:ilvl w:val="0"/>
-          <w:numId w:val="7"/>
+          <w:numId w:val="4"/>
         </w:numPr>
       </w:pPr>
       <w:hyperlink r:id="rId12" w:history="1">
@@ -3737,7 +3557,7 @@
         <w:pStyle w:val="ListParagraph"/>
         <w:numPr>
           <w:ilvl w:val="0"/>
-          <w:numId w:val="7"/>
+          <w:numId w:val="4"/>
         </w:numPr>
       </w:pPr>
       <w:hyperlink r:id="rId11" w:history="1">
@@ -3763,7 +3583,7 @@
         <w:pStyle w:val="ListParagraph"/>
         <w:numPr>
           <w:ilvl w:val="0"/>
-          <w:numId w:val="8"/>
+          <w:numId w:val="5"/>
         </w:numPr>
       </w:pPr>
       <w:hyperlink r:id="rId30" w:history="1">
@@ -3780,7 +3600,7 @@
         <w:pStyle w:val="ListParagraph"/>
         <w:numPr>
           <w:ilvl w:val="0"/>
-          <w:numId w:val="8"/>
+          <w:numId w:val="5"/>
         </w:numPr>
       </w:pPr>
       <w:hyperlink r:id="rId31" w:history="1">
@@ -3797,7 +3617,7 @@
         <w:pStyle w:val="ListParagraph"/>
         <w:numPr>
           <w:ilvl w:val="0"/>
-          <w:numId w:val="8"/>
+          <w:numId w:val="5"/>
         </w:numPr>
       </w:pPr>
       <w:hyperlink r:id="rId4" w:history="1">
@@ -3814,7 +3634,7 @@
         <w:pStyle w:val="ListParagraph"/>
         <w:numPr>
           <w:ilvl w:val="0"/>
-          <w:numId w:val="8"/>
+          <w:numId w:val="5"/>
         </w:numPr>
       </w:pPr>
       <w:hyperlink r:id="rId5" w:history="1">
@@ -3831,7 +3651,7 @@
         <w:pStyle w:val="ListParagraph"/>
         <w:numPr>
           <w:ilvl w:val="0"/>
-          <w:numId w:val="8"/>
+          <w:numId w:val="5"/>
         </w:numPr>
       </w:pPr>
       <w:hyperlink r:id="rId32" w:history="1">
@@ -3848,7 +3668,7 @@
         <w:pStyle w:val="ListParagraph"/>
         <w:numPr>
           <w:ilvl w:val="0"/>
-          <w:numId w:val="8"/>
+          <w:numId w:val="5"/>
         </w:numPr>
       </w:pPr>
       <w:hyperlink r:id="rId33" w:history="1">
@@ -3865,7 +3685,7 @@
         <w:pStyle w:val="ListParagraph"/>
         <w:numPr>
           <w:ilvl w:val="0"/>
-          <w:numId w:val="8"/>
+          <w:numId w:val="5"/>
         </w:numPr>
       </w:pPr>
       <w:hyperlink r:id="rId34" w:history="1">
@@ -3891,7 +3711,7 @@
         <w:pStyle w:val="ListParagraph"/>
         <w:numPr>
           <w:ilvl w:val="0"/>
-          <w:numId w:val="9"/>
+          <w:numId w:val="6"/>
         </w:numPr>
       </w:pPr>
       <w:hyperlink r:id="rId3" w:history="1">
@@ -3908,7 +3728,7 @@
         <w:pStyle w:val="ListParagraph"/>
         <w:numPr>
           <w:ilvl w:val="0"/>
-          <w:numId w:val="9"/>
+          <w:numId w:val="6"/>
         </w:numPr>
       </w:pPr>
       <w:hyperlink r:id="rId35" w:history="1">
@@ -3925,7 +3745,7 @@
         <w:pStyle w:val="ListParagraph"/>
         <w:numPr>
           <w:ilvl w:val="0"/>
-          <w:numId w:val="9"/>
+          <w:numId w:val="6"/>
         </w:numPr>
       </w:pPr>
       <w:hyperlink r:id="rId36" w:history="1">
@@ -3942,7 +3762,7 @@
         <w:pStyle w:val="ListParagraph"/>
         <w:numPr>
           <w:ilvl w:val="0"/>
-          <w:numId w:val="9"/>
+          <w:numId w:val="6"/>
         </w:numPr>
       </w:pPr>
       <w:hyperlink r:id="rId37" w:history="1">
@@ -3959,7 +3779,7 @@
         <w:pStyle w:val="ListParagraph"/>
         <w:numPr>
           <w:ilvl w:val="0"/>
-          <w:numId w:val="9"/>
+          <w:numId w:val="6"/>
         </w:numPr>
       </w:pPr>
       <w:hyperlink r:id="rId38" w:history="1">
@@ -3985,7 +3805,7 @@
         <w:pStyle w:val="ListParagraph"/>
         <w:numPr>
           <w:ilvl w:val="0"/>
-          <w:numId w:val="10"/>
+          <w:numId w:val="7"/>
         </w:numPr>
       </w:pPr>
       <w:hyperlink r:id="rId13" w:history="1">
@@ -4002,7 +3822,7 @@
         <w:pStyle w:val="ListParagraph"/>
         <w:numPr>
           <w:ilvl w:val="0"/>
-          <w:numId w:val="10"/>
+          <w:numId w:val="7"/>
         </w:numPr>
       </w:pPr>
       <w:hyperlink r:id="rId39" w:history="1">
@@ -4019,7 +3839,7 @@
         <w:pStyle w:val="ListParagraph"/>
         <w:numPr>
           <w:ilvl w:val="0"/>
-          <w:numId w:val="10"/>
+          <w:numId w:val="7"/>
         </w:numPr>
       </w:pPr>
       <w:hyperlink r:id="rId40" w:history="1">
@@ -4036,7 +3856,7 @@
         <w:pStyle w:val="ListParagraph"/>
         <w:numPr>
           <w:ilvl w:val="0"/>
-          <w:numId w:val="10"/>
+          <w:numId w:val="7"/>
         </w:numPr>
       </w:pPr>
       <w:hyperlink r:id="rId22" w:history="1">
@@ -4053,7 +3873,7 @@
         <w:pStyle w:val="ListParagraph"/>
         <w:numPr>
           <w:ilvl w:val="0"/>
-          <w:numId w:val="10"/>
+          <w:numId w:val="7"/>
         </w:numPr>
       </w:pPr>
       <w:hyperlink r:id="rId21" w:history="1">
@@ -4070,7 +3890,7 @@
         <w:pStyle w:val="ListParagraph"/>
         <w:numPr>
           <w:ilvl w:val="0"/>
-          <w:numId w:val="10"/>
+          <w:numId w:val="7"/>
         </w:numPr>
       </w:pPr>
       <w:hyperlink r:id="rId26" w:history="1">
@@ -4087,7 +3907,7 @@
         <w:pStyle w:val="ListParagraph"/>
         <w:numPr>
           <w:ilvl w:val="0"/>
-          <w:numId w:val="10"/>
+          <w:numId w:val="7"/>
         </w:numPr>
       </w:pPr>
       <w:hyperlink r:id="rId27" w:history="1">
@@ -4104,7 +3924,7 @@
         <w:pStyle w:val="ListParagraph"/>
         <w:numPr>
           <w:ilvl w:val="0"/>
-          <w:numId w:val="10"/>
+          <w:numId w:val="7"/>
         </w:numPr>
       </w:pPr>
       <w:hyperlink r:id="rId41" w:history="1">
@@ -4121,7 +3941,7 @@
         <w:pStyle w:val="ListParagraph"/>
         <w:numPr>
           <w:ilvl w:val="0"/>
-          <w:numId w:val="10"/>
+          <w:numId w:val="7"/>
         </w:numPr>
       </w:pPr>
       <w:hyperlink r:id="rId24" w:history="1">
@@ -4138,7 +3958,7 @@
         <w:pStyle w:val="ListParagraph"/>
         <w:numPr>
           <w:ilvl w:val="0"/>
-          <w:numId w:val="10"/>
+          <w:numId w:val="7"/>
         </w:numPr>
       </w:pPr>
       <w:hyperlink r:id="rId42" w:history="1">
@@ -4155,7 +3975,7 @@
         <w:pStyle w:val="ListParagraph"/>
         <w:numPr>
           <w:ilvl w:val="0"/>
-          <w:numId w:val="10"/>
+          <w:numId w:val="7"/>
         </w:numPr>
       </w:pPr>
       <w:hyperlink r:id="rId43" w:history="1">
@@ -4172,7 +3992,7 @@
         <w:pStyle w:val="ListParagraph"/>
         <w:numPr>
           <w:ilvl w:val="0"/>
-          <w:numId w:val="10"/>
+          <w:numId w:val="7"/>
         </w:numPr>
       </w:pPr>
       <w:hyperlink r:id="rId44" w:history="1">
@@ -4189,7 +4009,7 @@
         <w:pStyle w:val="ListParagraph"/>
         <w:numPr>
           <w:ilvl w:val="0"/>
-          <w:numId w:val="10"/>
+          <w:numId w:val="7"/>
         </w:numPr>
       </w:pPr>
       <w:hyperlink r:id="rId25" w:history="1">
@@ -4215,7 +4035,7 @@
         <w:pStyle w:val="ListParagraph"/>
         <w:numPr>
           <w:ilvl w:val="0"/>
-          <w:numId w:val="11"/>
+          <w:numId w:val="8"/>
         </w:numPr>
       </w:pPr>
       <w:hyperlink r:id="rId45" w:history="1">
@@ -4232,7 +4052,7 @@
         <w:pStyle w:val="ListParagraph"/>
         <w:numPr>
           <w:ilvl w:val="0"/>
-          <w:numId w:val="11"/>
+          <w:numId w:val="8"/>
         </w:numPr>
       </w:pPr>
       <w:hyperlink r:id="rId18" w:history="1">
@@ -4249,7 +4069,7 @@
         <w:pStyle w:val="ListParagraph"/>
         <w:numPr>
           <w:ilvl w:val="0"/>
-          <w:numId w:val="11"/>
+          <w:numId w:val="8"/>
         </w:numPr>
       </w:pPr>
       <w:hyperlink r:id="rId17" w:history="1">
@@ -4266,7 +4086,7 @@
         <w:pStyle w:val="ListParagraph"/>
         <w:numPr>
           <w:ilvl w:val="0"/>
-          <w:numId w:val="11"/>
+          <w:numId w:val="8"/>
         </w:numPr>
       </w:pPr>
       <w:hyperlink r:id="rId20" w:history="1">
@@ -4283,7 +4103,7 @@
         <w:pStyle w:val="ListParagraph"/>
         <w:numPr>
           <w:ilvl w:val="0"/>
-          <w:numId w:val="11"/>
+          <w:numId w:val="8"/>
         </w:numPr>
       </w:pPr>
       <w:hyperlink r:id="rId16" w:history="1">
@@ -4300,7 +4120,7 @@
         <w:pStyle w:val="ListParagraph"/>
         <w:numPr>
           <w:ilvl w:val="0"/>
-          <w:numId w:val="11"/>
+          <w:numId w:val="8"/>
         </w:numPr>
       </w:pPr>
       <w:hyperlink r:id="rId15" w:history="1">
@@ -4317,7 +4137,7 @@
         <w:pStyle w:val="ListParagraph"/>
         <w:numPr>
           <w:ilvl w:val="0"/>
-          <w:numId w:val="11"/>
+          <w:numId w:val="8"/>
         </w:numPr>
       </w:pPr>
       <w:hyperlink r:id="rId46" w:history="1">
@@ -4514,7 +4334,10 @@
     <w:abstractNumId w:val="0"/>
   </w:num>
   <w:num w:numId="3">
-    <w:abstractNumId w:val="0"/>
+    <w:abstractNumId w:val="1"/>
+    <w:lvlOverride w:ilvl="0">
+      <w:startOverride w:val="1"/>
+    </w:lvlOverride>
   </w:num>
   <w:num w:numId="4">
     <w:abstractNumId w:val="0"/>
@@ -4523,24 +4346,12 @@
     <w:abstractNumId w:val="0"/>
   </w:num>
   <w:num w:numId="6">
-    <w:abstractNumId w:val="1"/>
-    <w:lvlOverride w:ilvl="0">
-      <w:startOverride w:val="1"/>
-    </w:lvlOverride>
+    <w:abstractNumId w:val="0"/>
   </w:num>
   <w:num w:numId="7">
     <w:abstractNumId w:val="0"/>
   </w:num>
   <w:num w:numId="8">
-    <w:abstractNumId w:val="0"/>
-  </w:num>
-  <w:num w:numId="9">
-    <w:abstractNumId w:val="0"/>
-  </w:num>
-  <w:num w:numId="10">
-    <w:abstractNumId w:val="0"/>
-  </w:num>
-  <w:num w:numId="11">
     <w:abstractNumId w:val="0"/>
   </w:num>
 </w:numbering>

</xml_diff>

<commit_message>
Marco: adoptar la v4 del autor, aclarar las tres viñetas de la Vía 1 y desarrollar el grafo de contexto en la hoja de ruta
Co-Authored-By: Claude Fable 5.1 <noreply@anthropic.com>
Claude-Session: https://claude.ai/code/session_013A7bCLd4PzhQYG95DagcQd
</commit_message>
<xml_diff>
--- a/docs/Semantica_grafos_agentes_banca.docx
+++ b/docs/Semantica_grafos_agentes_banca.docx
@@ -913,7 +913,7 @@
     <w:p>
       <w:pPr/>
       <w:r>
-        <w:t xml:space="preserve">Una consecuencia práctica: un banco no parte de cero. El inventario de elementos críticos de datos de BCBS 239, el diccionario de datos y la taxonomía de grupo que pide el BCE son la semilla de la capa semántica, y esa capa lleva dentro una ontología informal, las entidades, relaciones y reglas que declaran sus YAML, que más adelante se puede formalizar si hace falta.</w:t>
+        <w:t xml:space="preserve">Una consecuencia práctica: un banco no parte de cero. El inventario de elementos críticos de datos de BCBS 239, el diccionario de datos y la taxonomía de grupo que pide el BCE son la semilla de la capa semántica, y esa capa lleva dentro una ontología informal, las entidades, relaciones y reglas que declaran sus YAML (como los de la PoC), que más adelante se puede formalizar si hace falta.</w:t>
       </w:r>
     </w:p>
     <w:p>
@@ -989,7 +989,13 @@
     <w:p>
       <w:pPr/>
       <w:r>
-        <w:t xml:space="preserve">Los estudios disponibles miden estas opciones con modelos y bancos de pruebas distintos, así que los porcentajes solo se comparan dentro de cada estudio. En la tabla, «LLM sobre tablas» es la opción a, «contexto semántico» la b, «grafo con ontología» la c y «text-to-metrics» la e. La opción d, el grafo del esquema, no tiene una medición comparable: sus autores publican resultados en los benchmarks académicos BIRD y Spider 2.0, pero no contra las otras opciones sobre las mismas preguntas. Conviene leer la tabla sabiendo quién la firma: casi todos los estudios son de proveedores con producto propio.</w:t>
+        <w:t xml:space="preserve">Los estudios disponibles miden estas opciones con modelos y bancos de pruebas distintos, así que los porcentajes solo se comparan dentro de cada estudio. En la tabla, «LLM sobre tablas» es la opción a, «contexto semántico» la b, «grafo con ontología» la c y «text-to-metrics» la e. La opción d, el grafo del esquema, no tiene una medición comparable: sus autores publican resultados en los benchmarks académicos BIRD y Spider 2.0, pero no contra las otras opciones sobre las mismas preguntas.</w:t>
+      </w:r>
+    </w:p>
+    <w:p>
+      <w:pPr/>
+      <w:r>
+        <w:t xml:space="preserve">Conviene leer la tabla sabiendo quién la firma: casi todos los estudios son de proveedores con producto propio (dbt, Cube, Snowflake, data.world, AtScale) y las muestras son pequeñas; sirven como indicio de dirección, no como cifras para comprometer.</w:t>
       </w:r>
     </w:p>
     <w:tbl>
@@ -1886,19 +1892,49 @@
     <w:p>
       <w:pPr/>
       <w:r>
-        <w:t xml:space="preserve">Lo que se lee en la tabla, estudio por estudio. Primero, dar al LLM definiciones de negocio en lugar de nombres técnicos sube el acierto en todos los casos: de 16,7 % a 54,2 % en data.world con una ontología, y entre 17 y 23 puntos en Cube con un documento de texto de 4 KB. Es el mismo contenido que llevan los YAML de la capa semántica, y el formato, texto, YAML o grafo, importa menos que el contenido. Segundo, mientras el LLM escriba la consulta queda un error que parece acierto: Cube se queda en torno al 68 %, y data.world, aun comprobando cada consulta contra la ontología, deja uno de cada cinco erróneo. Tercero, text-to-metrics llega al 100 % en lo que cubre, por generación determinista y no por perfección del modelo, y lo que no cubre lo convierte en «no puedo»; al ampliar la cobertura con tres tablas preparadas pasa del 72,7 % al 98–100 %. No hay un estudio de 2026 que mida el enfoque de grafo con modelos actuales; sus cifras son de GPT-4.</w:t>
-      </w:r>
-    </w:p>
-    <w:p>
-      <w:pPr/>
-      <w:r>
-        <w:t xml:space="preserve">Para un banco la cifra que importa no es el acierto sino cuántas respuestas son erróneas y parecen buenas. Text-to-metrics elimina dentro de su alcance los errores de aritmética y de SQL, y lo que no puede responder lo convierte en «no puedo». Quedan dos errores que sí pueden parecer buenos: que el LLM elija mal la métrica, el filtro o la fecha, y que la métrica esté mal definida; se atacan con el juego de pruebas y con la firma del dueño. Cautelas: casi todos los estudios los firman proveedores con producto propio (dbt, Cube, Snowflake, data.world, AtScale) y las muestras son pequeñas; sirven como indicio de dirección, no como cifras para comprometer. La medición que conviene presentar es la propia, con las preguntas reales del banco en tres condiciones (SQL sobre tablas, SQL con los YAML como contexto y text-to-metrics), contando por separado aciertos, errores y «no puedo».</w:t>
-      </w:r>
-    </w:p>
-    <w:p>
-      <w:pPr/>
-      <w:r>
-        <w:t xml:space="preserve">Más relevante que las cifras es lo que varios trabajos de 2026 muestran sobre dónde está la fiabilidad. Dos ejemplos. En uno, un modelo pequeño, de siete mil millones de parámetros, al que se le imponen las reglas del negocio acierta más que un modelo cuatro veces mayor sin ellas (</w:t>
+        <w:t xml:space="preserve">Lo que se lee en la tabla, estudio por estudio.</w:t>
+      </w:r>
+    </w:p>
+    <w:p>
+      <w:pPr/>
+      <w:r>
+        <w:t xml:space="preserve">Primero, dar al LLM definiciones de negocio en lugar de nombres técnicos sube el acierto en todos los casos: de 16,7 % a 54,2 % en data.world con una ontología, y entre 17 y 23 puntos en Cube con un documento de texto de 4 KB. Es el mismo contenido que llevan los YAML de la capa semántica, y el formato (texto, YAML o grafo) importa menos que el contenido.</w:t>
+      </w:r>
+    </w:p>
+    <w:p>
+      <w:pPr/>
+      <w:r>
+        <w:t xml:space="preserve">Segundo, mientras el LLM escriba la consulta queda un error que parece acierto: las respuestas parecen plausibles aun siendo erróneas. Cube se queda en torno al 68 %, y data.world, aun comprobando cada consulta contra la ontología, deja uno de cada cinco erróneo.</w:t>
+      </w:r>
+    </w:p>
+    <w:p>
+      <w:pPr/>
+      <w:r>
+        <w:t xml:space="preserve">Tercero, text-to-metrics llega al 100 % en lo que cubre, por generación determinista y no por perfección del modelo, y lo que no cubre lo convierte en «no puedo» en vez de «me lo invento», lo que hace el proceso más seguro y trazable. No hay un estudio de 2026 que mida el enfoque de grafo con modelos actuales; sus cifras son de GPT-4.</w:t>
+      </w:r>
+    </w:p>
+    <w:p>
+      <w:pPr/>
+      <w:r>
+        <w:t xml:space="preserve">Para un banco la cifra que importa no es el acierto sino cuántas respuestas son erróneas y parecen buenas. Text-to-metrics elimina dentro de su alcance los errores de aritmética y de SQL, y lo que no puede responder lo convierte en «no puedo». Quedan dos errores que sí pueden parecer buenos: que el LLM elija mal la métrica, el filtro o la fecha, y que la métrica esté mal definida; se atacan con el juego de pruebas y con la firma del dueño, o incluyendo en la respuesta la explicación de lo calculado.</w:t>
+      </w:r>
+    </w:p>
+    <w:p>
+      <w:pPr/>
+      <w:r>
+        <w:t xml:space="preserve">Más relevante que las cifras es lo que varios trabajos de 2026 muestran sobre dónde está la fiabilidad. Dos ejemplos:</w:t>
+      </w:r>
+    </w:p>
+    <w:p>
+      <w:pPr>
+        <w:pStyle w:val="ListParagraph"/>
+        <w:numPr>
+          <w:ilvl w:val="0"/>
+          <w:numId w:val="2"/>
+        </w:numPr>
+      </w:pPr>
+      <w:r>
+        <w:t xml:space="preserve">En uno, un modelo pequeño, de siete mil millones de parámetros, al que se le imponen las reglas del negocio acierta más que un modelo cuatro veces mayor sin ellas (</w:t>
       </w:r>
       <w:hyperlink r:id="rId21" w:history="1">
         <w:r>
@@ -1909,7 +1945,19 @@
         </w:r>
       </w:hyperlink>
       <w:r>
-        <w:t xml:space="preserve">). En otro, el modelo solo elige entre opciones permitidas y un compilador determinista escribe la consulta (</w:t>
+        <w:t xml:space="preserve">).</w:t>
+      </w:r>
+    </w:p>
+    <w:p>
+      <w:pPr>
+        <w:pStyle w:val="ListParagraph"/>
+        <w:numPr>
+          <w:ilvl w:val="0"/>
+          <w:numId w:val="2"/>
+        </w:numPr>
+      </w:pPr>
+      <w:r>
+        <w:t xml:space="preserve">En otro, el modelo solo elige entre opciones permitidas y un compilador determinista escribe la consulta (</w:t>
       </w:r>
       <w:hyperlink r:id="rId22" w:history="1">
         <w:r>
@@ -1920,7 +1968,13 @@
         </w:r>
       </w:hyperlink>
       <w:r>
-        <w:t xml:space="preserve">). La lectura para el banco es la misma en los dos: la fiabilidad viene de las reglas y del compilador, no del tamaño del modelo, así que la inversión va al YAML y a la vía certificada, no a modelos más grandes. Es exactamente el diseño de text-to-metrics, y para un entorno regulado es el único defendible, porque la consulta que se ejecuta es siempre una que alguien ha aprobado.</w:t>
+        <w:t xml:space="preserve">).</w:t>
+      </w:r>
+    </w:p>
+    <w:p>
+      <w:pPr/>
+      <w:r>
+        <w:t xml:space="preserve">La lectura para el banco es la misma en los dos: la fiabilidad viene de las reglas y del compilador, no del tamaño del modelo, así que la inversión va al YAML y a la vía certificada, no a modelos más grandes. Es exactamente el diseño de text-to-metrics, y para un entorno regulado es el único defendible, porque la consulta que se ejecuta es siempre una que alguien ha aprobado.</w:t>
       </w:r>
     </w:p>
     <w:p>
@@ -1956,7 +2010,7 @@
         <w:t xml:space="preserve">El grafo virtual con ontología (opción c).</w:t>
       </w:r>
       <w:r>
-        <w:t xml:space="preserve"> No mueve los datos: pone delante del LLM los conceptos del negocio con nombre y cómo se relacionan, y traduce la consulta del LLM a SQL para que la ejecute el almacén. Lo hacen Stardog, Timbr y data.world. Qué cambia: el LLM razona con conceptos en lugar de con columnas, y acierta más. Qué no cambia: el LLM sigue escribiendo la consulta, y la comprobación contra la ontología solo revisa su forma, que cada propiedad pertenezca al concepto correcto, no los filtros, las fechas ni las fórmulas. Con la pregunta «morosidad de refinanciados frente a no refinanciados a cierre de agosto» eso se traduce en cuatro fallos silenciosos: los contratos con saldo dudoso nulo desaparecen del cálculo y el denominador se queda corto; si el LLM olvida la fecha, suma todas las fotos, porque la ontología no sabe que un saldo es una foto; si calcula la tasa de otra forma, nadie lo detecta, porque la ontología no contiene la fórmula oficial; y si pide el desglose por oficina, sale una cifra que nadie ha certificado, porque no existe la noción de dimensión permitida. Un grafo virtual solo es determinista si las métricas se publican como consultas almacenadas con parámetros, y entonces es text-to-metrics con otro motor. Además, el equipo tendría que mantener una ontología en RDF y OWL y consultas SPARQL, lenguajes que hoy no usa.</w:t>
+        <w:t xml:space="preserve"> No mueve los datos: pone delante del LLM los conceptos del negocio con nombre y cómo se relacionan, y traduce la consulta del LLM a SQL para que la ejecute el almacén. Lo hacen Stardog, Timbr y data.world. Qué cambia: el LLM razona con conceptos en lugar de con columnas, y acierta más. Qué no cambia: el LLM sigue escribiendo la consulta, y la comprobación contra la ontología solo revisa su forma, que cada propiedad pertenezca al concepto correcto, no los filtros, las fechas ni las fórmulas. Con la pregunta «morosidad de refinanciados frente a no refinanciados a cierre de agosto» eso se traduce en cuatro fallos silenciosos: los contratos con saldo dudoso nulo desaparecen del cálculo y el denominador se queda corto; si el LLM olvida la fecha, suma todas las fotos, porque la ontología no sabe que un saldo es una foto; si calcula la tasa de otra forma, nadie lo detecta, porque la ontología no contiene la fórmula oficial; y si pide el desglose por oficina, sale una cifra que nadie ha certificado, porque no existe la noción de dimensión permitida. Un grafo virtual solo es determinista si las métricas se publican como consultas almacenadas con parámetros, y entonces es text-to-metrics con otro motor.</w:t>
       </w:r>
     </w:p>
     <w:p>
@@ -1974,7 +2028,7 @@
     <w:p>
       <w:pPr/>
       <w:r>
-        <w:t xml:space="preserve">La conclusión de este paso son las dos palancas del diseño. La primera, hacer explícita la semántica, la aportan los YAML y también un grafo, y mejora incluso la vía exploratoria. La segunda, quitarle al LLM la escritura de la consulta, la aporta el compilador y elimina el error residual en la vía certificada. Un grafo aporta la primera palanca, pero no la segunda.</w:t>
+        <w:t xml:space="preserve">La conclusión de este paso son las dos palancas del diseño. La primera, hacer explícita la semántica, la aportan los YAML y también un grafo, como mejora evolutiva. La segunda, quitarle al LLM la escritura de la consulta, la aporta el compilador y elimina el error residual en la vía certificada. Un grafo aporta la primera palanca, pero no la segunda.</w:t>
       </w:r>
     </w:p>
     <w:p>
@@ -2388,53 +2442,53 @@
         <w:pStyle w:val="ListParagraph"/>
         <w:numPr>
           <w:ilvl w:val="0"/>
-          <w:numId w:val="2"/>
+          <w:numId w:val="3"/>
         </w:numPr>
       </w:pPr>
       <w:r>
         <w:rPr>
           <w:b/>
         </w:rPr>
-        <w:t xml:space="preserve">Para las cifras:</w:t>
-      </w:r>
-      <w:r>
-        <w:t xml:space="preserve"> el compilador de métricas sobre el almacén. La fiabilidad de una cifra depende de quién escribe la consulta, no de cómo se modelan los datos. Si las métricas se publican en un grafo como consultas almacenadas con parámetros, es el mismo principio con otro motor, y se le piden los mismos criterios que a los demás: que trate bien las fotos y que evite el doble conteo al unir tablas de distinta granularidad.</w:t>
-      </w:r>
-    </w:p>
-    <w:p>
-      <w:pPr>
-        <w:pStyle w:val="ListParagraph"/>
-        <w:numPr>
-          <w:ilvl w:val="0"/>
-          <w:numId w:val="2"/>
+        <w:t xml:space="preserve">Para las cifras: el compilador de métricas sobre el almacén.</w:t>
+      </w:r>
+      <w:r>
+        <w:t xml:space="preserve"> Una cifra es fiable cuando la consulta que la produce está aprobada, no por lo bien modelados que estén los datos. Por eso, para cifras certificadas, el LLM no escribe la consulta: elige una métrica, un filtro y una fecha de una lista aprobada, y un compilador escribe el SQL que se ejecuta en el almacén. Un grafo puede hacer lo mismo si las métricas se publican en él como consultas almacenadas con parámetros; en ese caso es el mismo principio con otro motor, y se le exige lo mismo que a cualquier otro: que distinga las fotos (los saldos a cada fecha) y que no cuente dos veces al unir tablas de distinta granularidad, como contratos con sus movimientos.</w:t>
+      </w:r>
+    </w:p>
+    <w:p>
+      <w:pPr>
+        <w:pStyle w:val="ListParagraph"/>
+        <w:numPr>
+          <w:ilvl w:val="0"/>
+          <w:numId w:val="3"/>
         </w:numPr>
       </w:pPr>
       <w:r>
         <w:rPr>
           <w:b/>
         </w:rPr>
-        <w:t xml:space="preserve">Para el agente:</w:t>
-      </w:r>
-      <w:r>
-        <w:t xml:space="preserve"> un grafo con conceptos, productos, métricas, dueños, linaje y rutas de unión entre productos ayuda. Se carga en buena parte desde los mismos YAML, así que no hay dos definiciones, sino otra manera de exponer la misma información.</w:t>
-      </w:r>
-    </w:p>
-    <w:p>
-      <w:pPr>
-        <w:pStyle w:val="ListParagraph"/>
-        <w:numPr>
-          <w:ilvl w:val="0"/>
-          <w:numId w:val="2"/>
+        <w:t xml:space="preserve">Para el agente: un grafo como mapa.</w:t>
+      </w:r>
+      <w:r>
+        <w:t xml:space="preserve"> Antes de pedir una cifra, el agente necesita saber qué existe y qué significa: qué productos de datos hay, qué métricas contiene cada uno, quién responde de ellas, de dónde salen y por qué campos se unen unos productos con otros. Hoy esa información está en los YAML y el agente la lee de ahí. Un grafo con conceptos, productos, métricas, dueños, linaje y rutas de unión le da lo mismo de una forma más cómoda de recorrer, y se carga en buena parte desde esos mismos YAML: no hay dos definiciones que mantener, sino otra manera de exponer la misma información.</w:t>
+      </w:r>
+    </w:p>
+    <w:p>
+      <w:pPr>
+        <w:pStyle w:val="ListParagraph"/>
+        <w:numPr>
+          <w:ilvl w:val="0"/>
+          <w:numId w:val="3"/>
         </w:numPr>
       </w:pPr>
       <w:r>
         <w:rPr>
           <w:b/>
         </w:rPr>
-        <w:t xml:space="preserve">Para preguntas de relaciones</w:t>
-      </w:r>
-      <w:r>
-        <w:t xml:space="preserve"> (vinculación, concentración, fraude): un grafo de entidades con un subconjunto de datos, solo cuando haya un caso de uso que lo justifique.</w:t>
+        <w:t xml:space="preserve">Para preguntas de relaciones: un grafo de entidades.</w:t>
+      </w:r>
+      <w:r>
+        <w:t xml:space="preserve"> Son preguntas del tipo quién está vinculado con quién, cuánto riesgo se concentra en un grupo de empresas relacionadas o qué operaciones comparten cuenta, teléfono o dirección. Una capa de métricas no las responde, porque no son sumas sobre tablas sino recorridos entre entidades. Para ellas hace falta cargar en un grafo las entidades y sus relaciones, con un subconjunto de los datos, y solo compensa hacerlo cuando haya un caso de uso concreto que lo pida.</w:t>
       </w:r>
     </w:p>
     <w:p>
@@ -3000,7 +3054,7 @@
           <w:p>
             <w:pPr/>
             <w:r>
-              <w:t xml:space="preserve">Entre 2 y 3: etapa 1 probada en Teradata, YAML industrializados al 80–90 %, etapa 2 en PoC</w:t>
+              <w:t xml:space="preserve">En 2: etapa 1 probada en Teradata, YAML industrializados al 80–90 %, etapas 2 y 3 en PoC</w:t>
             </w:r>
           </w:p>
         </w:tc>
@@ -3274,15 +3328,15 @@
     <w:p>
       <w:pPr/>
       <w:r>
-        <w:t xml:space="preserve">Dos reglas ordenan el camino. La capa semántica avanza en transversal y ahora, porque el entorno informacional ya está gobernado y los YAML existen: es el componente 1 de Dato como Producto y no espera a los demás. Los otros tres componentes avanzan por dominio de uso, allí donde haya agentes haciendo tareas que exijan relaciones, documentos o precedentes. Las líneas van separadas pero coordinadas por una costura: los campos del YAML y del registro de peticiones que alimentarán a la ontología, al grafo y al contexto se deciden ahora, para que la capa semántica no se rehaga.</w:t>
-      </w:r>
-    </w:p>
-    <w:p>
-      <w:pPr>
-        <w:pStyle w:val="ListParagraph"/>
-        <w:numPr>
-          <w:ilvl w:val="0"/>
-          <w:numId w:val="3"/>
+        <w:t xml:space="preserve">Dos reglas ordenan el camino. La capa semántica avanza en transversal y ahora, porque el entorno informacional ya está gobernado y los YAML existen: es el componente 1 de Dato como Producto y no espera a los demás. Los otros tres componentes avanzan por dominio de uso, allí donde haya agentes haciendo tareas que exijan relaciones, documentos o precedentes. Las líneas van separadas pero coordinadas.</w:t>
+      </w:r>
+    </w:p>
+    <w:p>
+      <w:pPr>
+        <w:pStyle w:val="ListParagraph"/>
+        <w:numPr>
+          <w:ilvl w:val="0"/>
+          <w:numId w:val="4"/>
         </w:numPr>
       </w:pPr>
       <w:r>
@@ -3292,15 +3346,15 @@
         <w:t xml:space="preserve">Capa semántica.</w:t>
       </w:r>
       <w:r>
-        <w:t xml:space="preserve"> Es la línea que ya está en marcha y la única que avanza en transversal. Las etapas, su orden y lo que se decide en cada una se tratan en Capa semántica · 0 Concepto y en sus aplicaciones por entorno; este documento no fija ritmo ni alcance.</w:t>
-      </w:r>
-    </w:p>
-    <w:p>
-      <w:pPr>
-        <w:pStyle w:val="ListParagraph"/>
-        <w:numPr>
-          <w:ilvl w:val="0"/>
-          <w:numId w:val="3"/>
+        <w:t xml:space="preserve"> Es la línea que ya está en marcha y avanza en transversal. Las etapas, su orden y lo que se decide en cada una se tratan en Capa semántica · 0 Concepto y en sus aplicaciones por entorno; este documento no fija ritmo ni alcance.</w:t>
+      </w:r>
+    </w:p>
+    <w:p>
+      <w:pPr>
+        <w:pStyle w:val="ListParagraph"/>
+        <w:numPr>
+          <w:ilvl w:val="0"/>
+          <w:numId w:val="4"/>
         </w:numPr>
       </w:pPr>
       <w:r>
@@ -3318,7 +3372,7 @@
         <w:pStyle w:val="ListParagraph"/>
         <w:numPr>
           <w:ilvl w:val="0"/>
-          <w:numId w:val="3"/>
+          <w:numId w:val="4"/>
         </w:numPr>
       </w:pPr>
       <w:r>
@@ -3336,7 +3390,7 @@
         <w:pStyle w:val="ListParagraph"/>
         <w:numPr>
           <w:ilvl w:val="0"/>
-          <w:numId w:val="3"/>
+          <w:numId w:val="4"/>
         </w:numPr>
       </w:pPr>
       <w:r>
@@ -3346,15 +3400,15 @@
         <w:t xml:space="preserve">Ontología y grafo por dominio.</w:t>
       </w:r>
       <w:r>
-        <w:t xml:space="preserve"> No se despliegan en transversal: se construyen donde haya un agente que necesite relaciones entre entidades o documentos con procedencia. El primer dominio se elegirá cuando exista ese agente; en Dato como Producto hay candidatos documentales.</w:t>
-      </w:r>
-    </w:p>
-    <w:p>
-      <w:pPr>
-        <w:pStyle w:val="ListParagraph"/>
-        <w:numPr>
-          <w:ilvl w:val="0"/>
-          <w:numId w:val="3"/>
+        <w:t xml:space="preserve"> No se despliegan en transversal: se construyen donde haya un agente que necesite relaciones entre entidades o documentos con procedencia. En Dato como Producto hay candidatos documentales.</w:t>
+      </w:r>
+    </w:p>
+    <w:p>
+      <w:pPr>
+        <w:pStyle w:val="ListParagraph"/>
+        <w:numPr>
+          <w:ilvl w:val="0"/>
+          <w:numId w:val="4"/>
         </w:numPr>
       </w:pPr>
       <w:r>
@@ -3364,51 +3418,15 @@
         <w:t xml:space="preserve">Grafo de contexto.</w:t>
       </w:r>
       <w:r>
-        <w:t xml:space="preserve"> Empieza por el registro de peticiones de la vía certificada y crece proceso a proceso con los agentes que se desplieguen. Qué proceso y qué campos se guardan se decide con cada despliegue.</w:t>
-      </w:r>
-    </w:p>
-    <w:p>
-      <w:pPr>
-        <w:pStyle w:val="ListParagraph"/>
-        <w:numPr>
-          <w:ilvl w:val="0"/>
-          <w:numId w:val="3"/>
-        </w:numPr>
-      </w:pPr>
-      <w:r>
-        <w:rPr>
-          <w:b/>
-        </w:rPr>
-        <w:t xml:space="preserve">Cómo acceden los agentes a cifras certificadas.</w:t>
-      </w:r>
-      <w:r>
-        <w:t xml:space="preserve"> La evidencia recogida en la Vía 1 favorece que el modelo elija piezas aprobadas y un compilador produzca la consulta. La posición del banco se fijará con los resultados de las pruebas de concepto.</w:t>
-      </w:r>
-    </w:p>
-    <w:p>
-      <w:pPr>
-        <w:pStyle w:val="ListParagraph"/>
-        <w:numPr>
-          <w:ilvl w:val="0"/>
-          <w:numId w:val="3"/>
-        </w:numPr>
-      </w:pPr>
-      <w:r>
-        <w:rPr>
-          <w:b/>
-        </w:rPr>
-        <w:t xml:space="preserve">Banco de pruebas propio.</w:t>
-      </w:r>
-      <w:r>
-        <w:t xml:space="preserve"> Antes de dar por buenas las cifras de ningún proveedor, las mismas preguntas reales con y sin capa semántica, contando aciertos, errores y «no puedo». El juego de preguntas sale del propio registro.</w:t>
-      </w:r>
-    </w:p>
-    <w:p>
-      <w:pPr>
-        <w:pStyle w:val="ListParagraph"/>
-        <w:numPr>
-          <w:ilvl w:val="0"/>
-          <w:numId w:val="3"/>
+        <w:t xml:space="preserve"> Es el registro de las decisiones que toman los agentes, guardado de forma que después se pueda consultar: qué se preguntó, qué datos y qué reglas se usaron, qué se respondió y quién lo validó. No se compra ni se construye de golpe. Empieza por lo que ya existe: el registro de peticiones de la vía certificada, donde cada consulta queda guardada con su pregunta, el SQL generado, la versión del producto de datos, el usuario y la fecha. Cada vez que se despliegue un agente en un proceso de negocio se decide qué decisiones de ese proceso hay que guardar y con qué campos, y se añaden al registro. Así el grafo crece proceso a proceso, y el día que un supervisor pregunte por qué un agente respondió lo que respondió, la respuesta sale de una consulta a ese registro y no de una reconstrucción a mano.</w:t>
+      </w:r>
+    </w:p>
+    <w:p>
+      <w:pPr>
+        <w:pStyle w:val="ListParagraph"/>
+        <w:numPr>
+          <w:ilvl w:val="0"/>
+          <w:numId w:val="4"/>
         </w:numPr>
       </w:pPr>
       <w:r>
@@ -3422,12 +3440,6 @@
       </w:r>
     </w:p>
     <w:p>
-      <w:pPr/>
-      <w:r>
-        <w:t xml:space="preserve">Las líneas avanzan por separado pero coordinadas; lo único que las une es la costura del punto 3. Plazos, candidatos y decisiones concretas quedan para los documentos de cada componente y para los resultados de las pruebas.</w:t>
-      </w:r>
-    </w:p>
-    <w:p>
       <w:pPr>
         <w:pStyle w:val="Heading2"/>
       </w:pPr>
@@ -3455,7 +3467,7 @@
         <w:pStyle w:val="ListParagraph"/>
         <w:numPr>
           <w:ilvl w:val="0"/>
-          <w:numId w:val="4"/>
+          <w:numId w:val="5"/>
         </w:numPr>
       </w:pPr>
       <w:hyperlink r:id="rId7" w:history="1">
@@ -3472,7 +3484,7 @@
         <w:pStyle w:val="ListParagraph"/>
         <w:numPr>
           <w:ilvl w:val="0"/>
-          <w:numId w:val="4"/>
+          <w:numId w:val="5"/>
         </w:numPr>
       </w:pPr>
       <w:hyperlink r:id="rId8" w:history="1">
@@ -3489,7 +3501,7 @@
         <w:pStyle w:val="ListParagraph"/>
         <w:numPr>
           <w:ilvl w:val="0"/>
-          <w:numId w:val="4"/>
+          <w:numId w:val="5"/>
         </w:numPr>
       </w:pPr>
       <w:hyperlink r:id="rId29" w:history="1">
@@ -3506,7 +3518,7 @@
         <w:pStyle w:val="ListParagraph"/>
         <w:numPr>
           <w:ilvl w:val="0"/>
-          <w:numId w:val="4"/>
+          <w:numId w:val="5"/>
         </w:numPr>
       </w:pPr>
       <w:hyperlink r:id="rId9" w:history="1">
@@ -3523,7 +3535,7 @@
         <w:pStyle w:val="ListParagraph"/>
         <w:numPr>
           <w:ilvl w:val="0"/>
-          <w:numId w:val="4"/>
+          <w:numId w:val="5"/>
         </w:numPr>
       </w:pPr>
       <w:hyperlink r:id="rId10" w:history="1">
@@ -3540,7 +3552,7 @@
         <w:pStyle w:val="ListParagraph"/>
         <w:numPr>
           <w:ilvl w:val="0"/>
-          <w:numId w:val="4"/>
+          <w:numId w:val="5"/>
         </w:numPr>
       </w:pPr>
       <w:hyperlink r:id="rId12" w:history="1">
@@ -3557,7 +3569,7 @@
         <w:pStyle w:val="ListParagraph"/>
         <w:numPr>
           <w:ilvl w:val="0"/>
-          <w:numId w:val="4"/>
+          <w:numId w:val="5"/>
         </w:numPr>
       </w:pPr>
       <w:hyperlink r:id="rId11" w:history="1">
@@ -3583,7 +3595,7 @@
         <w:pStyle w:val="ListParagraph"/>
         <w:numPr>
           <w:ilvl w:val="0"/>
-          <w:numId w:val="5"/>
+          <w:numId w:val="6"/>
         </w:numPr>
       </w:pPr>
       <w:hyperlink r:id="rId30" w:history="1">
@@ -3600,7 +3612,7 @@
         <w:pStyle w:val="ListParagraph"/>
         <w:numPr>
           <w:ilvl w:val="0"/>
-          <w:numId w:val="5"/>
+          <w:numId w:val="6"/>
         </w:numPr>
       </w:pPr>
       <w:hyperlink r:id="rId31" w:history="1">
@@ -3617,7 +3629,7 @@
         <w:pStyle w:val="ListParagraph"/>
         <w:numPr>
           <w:ilvl w:val="0"/>
-          <w:numId w:val="5"/>
+          <w:numId w:val="6"/>
         </w:numPr>
       </w:pPr>
       <w:hyperlink r:id="rId4" w:history="1">
@@ -3634,7 +3646,7 @@
         <w:pStyle w:val="ListParagraph"/>
         <w:numPr>
           <w:ilvl w:val="0"/>
-          <w:numId w:val="5"/>
+          <w:numId w:val="6"/>
         </w:numPr>
       </w:pPr>
       <w:hyperlink r:id="rId5" w:history="1">
@@ -3651,7 +3663,7 @@
         <w:pStyle w:val="ListParagraph"/>
         <w:numPr>
           <w:ilvl w:val="0"/>
-          <w:numId w:val="5"/>
+          <w:numId w:val="6"/>
         </w:numPr>
       </w:pPr>
       <w:hyperlink r:id="rId32" w:history="1">
@@ -3668,7 +3680,7 @@
         <w:pStyle w:val="ListParagraph"/>
         <w:numPr>
           <w:ilvl w:val="0"/>
-          <w:numId w:val="5"/>
+          <w:numId w:val="6"/>
         </w:numPr>
       </w:pPr>
       <w:hyperlink r:id="rId33" w:history="1">
@@ -3685,7 +3697,7 @@
         <w:pStyle w:val="ListParagraph"/>
         <w:numPr>
           <w:ilvl w:val="0"/>
-          <w:numId w:val="5"/>
+          <w:numId w:val="6"/>
         </w:numPr>
       </w:pPr>
       <w:hyperlink r:id="rId34" w:history="1">
@@ -3711,7 +3723,7 @@
         <w:pStyle w:val="ListParagraph"/>
         <w:numPr>
           <w:ilvl w:val="0"/>
-          <w:numId w:val="6"/>
+          <w:numId w:val="7"/>
         </w:numPr>
       </w:pPr>
       <w:hyperlink r:id="rId3" w:history="1">
@@ -3728,7 +3740,7 @@
         <w:pStyle w:val="ListParagraph"/>
         <w:numPr>
           <w:ilvl w:val="0"/>
-          <w:numId w:val="6"/>
+          <w:numId w:val="7"/>
         </w:numPr>
       </w:pPr>
       <w:hyperlink r:id="rId35" w:history="1">
@@ -3745,7 +3757,7 @@
         <w:pStyle w:val="ListParagraph"/>
         <w:numPr>
           <w:ilvl w:val="0"/>
-          <w:numId w:val="6"/>
+          <w:numId w:val="7"/>
         </w:numPr>
       </w:pPr>
       <w:hyperlink r:id="rId36" w:history="1">
@@ -3762,7 +3774,7 @@
         <w:pStyle w:val="ListParagraph"/>
         <w:numPr>
           <w:ilvl w:val="0"/>
-          <w:numId w:val="6"/>
+          <w:numId w:val="7"/>
         </w:numPr>
       </w:pPr>
       <w:hyperlink r:id="rId37" w:history="1">
@@ -3779,7 +3791,7 @@
         <w:pStyle w:val="ListParagraph"/>
         <w:numPr>
           <w:ilvl w:val="0"/>
-          <w:numId w:val="6"/>
+          <w:numId w:val="7"/>
         </w:numPr>
       </w:pPr>
       <w:hyperlink r:id="rId38" w:history="1">
@@ -3805,7 +3817,7 @@
         <w:pStyle w:val="ListParagraph"/>
         <w:numPr>
           <w:ilvl w:val="0"/>
-          <w:numId w:val="7"/>
+          <w:numId w:val="8"/>
         </w:numPr>
       </w:pPr>
       <w:hyperlink r:id="rId13" w:history="1">
@@ -3822,7 +3834,7 @@
         <w:pStyle w:val="ListParagraph"/>
         <w:numPr>
           <w:ilvl w:val="0"/>
-          <w:numId w:val="7"/>
+          <w:numId w:val="8"/>
         </w:numPr>
       </w:pPr>
       <w:hyperlink r:id="rId39" w:history="1">
@@ -3839,7 +3851,7 @@
         <w:pStyle w:val="ListParagraph"/>
         <w:numPr>
           <w:ilvl w:val="0"/>
-          <w:numId w:val="7"/>
+          <w:numId w:val="8"/>
         </w:numPr>
       </w:pPr>
       <w:hyperlink r:id="rId40" w:history="1">
@@ -3856,7 +3868,7 @@
         <w:pStyle w:val="ListParagraph"/>
         <w:numPr>
           <w:ilvl w:val="0"/>
-          <w:numId w:val="7"/>
+          <w:numId w:val="8"/>
         </w:numPr>
       </w:pPr>
       <w:hyperlink r:id="rId22" w:history="1">
@@ -3873,7 +3885,7 @@
         <w:pStyle w:val="ListParagraph"/>
         <w:numPr>
           <w:ilvl w:val="0"/>
-          <w:numId w:val="7"/>
+          <w:numId w:val="8"/>
         </w:numPr>
       </w:pPr>
       <w:hyperlink r:id="rId21" w:history="1">
@@ -3890,7 +3902,7 @@
         <w:pStyle w:val="ListParagraph"/>
         <w:numPr>
           <w:ilvl w:val="0"/>
-          <w:numId w:val="7"/>
+          <w:numId w:val="8"/>
         </w:numPr>
       </w:pPr>
       <w:hyperlink r:id="rId26" w:history="1">
@@ -3907,7 +3919,7 @@
         <w:pStyle w:val="ListParagraph"/>
         <w:numPr>
           <w:ilvl w:val="0"/>
-          <w:numId w:val="7"/>
+          <w:numId w:val="8"/>
         </w:numPr>
       </w:pPr>
       <w:hyperlink r:id="rId27" w:history="1">
@@ -3924,7 +3936,7 @@
         <w:pStyle w:val="ListParagraph"/>
         <w:numPr>
           <w:ilvl w:val="0"/>
-          <w:numId w:val="7"/>
+          <w:numId w:val="8"/>
         </w:numPr>
       </w:pPr>
       <w:hyperlink r:id="rId41" w:history="1">
@@ -3941,7 +3953,7 @@
         <w:pStyle w:val="ListParagraph"/>
         <w:numPr>
           <w:ilvl w:val="0"/>
-          <w:numId w:val="7"/>
+          <w:numId w:val="8"/>
         </w:numPr>
       </w:pPr>
       <w:hyperlink r:id="rId24" w:history="1">
@@ -3958,7 +3970,7 @@
         <w:pStyle w:val="ListParagraph"/>
         <w:numPr>
           <w:ilvl w:val="0"/>
-          <w:numId w:val="7"/>
+          <w:numId w:val="8"/>
         </w:numPr>
       </w:pPr>
       <w:hyperlink r:id="rId42" w:history="1">
@@ -3975,7 +3987,7 @@
         <w:pStyle w:val="ListParagraph"/>
         <w:numPr>
           <w:ilvl w:val="0"/>
-          <w:numId w:val="7"/>
+          <w:numId w:val="8"/>
         </w:numPr>
       </w:pPr>
       <w:hyperlink r:id="rId43" w:history="1">
@@ -3992,7 +4004,7 @@
         <w:pStyle w:val="ListParagraph"/>
         <w:numPr>
           <w:ilvl w:val="0"/>
-          <w:numId w:val="7"/>
+          <w:numId w:val="8"/>
         </w:numPr>
       </w:pPr>
       <w:hyperlink r:id="rId44" w:history="1">
@@ -4009,7 +4021,7 @@
         <w:pStyle w:val="ListParagraph"/>
         <w:numPr>
           <w:ilvl w:val="0"/>
-          <w:numId w:val="7"/>
+          <w:numId w:val="8"/>
         </w:numPr>
       </w:pPr>
       <w:hyperlink r:id="rId25" w:history="1">
@@ -4035,7 +4047,7 @@
         <w:pStyle w:val="ListParagraph"/>
         <w:numPr>
           <w:ilvl w:val="0"/>
-          <w:numId w:val="8"/>
+          <w:numId w:val="9"/>
         </w:numPr>
       </w:pPr>
       <w:hyperlink r:id="rId45" w:history="1">
@@ -4052,7 +4064,7 @@
         <w:pStyle w:val="ListParagraph"/>
         <w:numPr>
           <w:ilvl w:val="0"/>
-          <w:numId w:val="8"/>
+          <w:numId w:val="9"/>
         </w:numPr>
       </w:pPr>
       <w:hyperlink r:id="rId18" w:history="1">
@@ -4069,7 +4081,7 @@
         <w:pStyle w:val="ListParagraph"/>
         <w:numPr>
           <w:ilvl w:val="0"/>
-          <w:numId w:val="8"/>
+          <w:numId w:val="9"/>
         </w:numPr>
       </w:pPr>
       <w:hyperlink r:id="rId17" w:history="1">
@@ -4086,7 +4098,7 @@
         <w:pStyle w:val="ListParagraph"/>
         <w:numPr>
           <w:ilvl w:val="0"/>
-          <w:numId w:val="8"/>
+          <w:numId w:val="9"/>
         </w:numPr>
       </w:pPr>
       <w:hyperlink r:id="rId20" w:history="1">
@@ -4103,7 +4115,7 @@
         <w:pStyle w:val="ListParagraph"/>
         <w:numPr>
           <w:ilvl w:val="0"/>
-          <w:numId w:val="8"/>
+          <w:numId w:val="9"/>
         </w:numPr>
       </w:pPr>
       <w:hyperlink r:id="rId16" w:history="1">
@@ -4120,7 +4132,7 @@
         <w:pStyle w:val="ListParagraph"/>
         <w:numPr>
           <w:ilvl w:val="0"/>
-          <w:numId w:val="8"/>
+          <w:numId w:val="9"/>
         </w:numPr>
       </w:pPr>
       <w:hyperlink r:id="rId15" w:history="1">
@@ -4137,7 +4149,7 @@
         <w:pStyle w:val="ListParagraph"/>
         <w:numPr>
           <w:ilvl w:val="0"/>
-          <w:numId w:val="8"/>
+          <w:numId w:val="9"/>
         </w:numPr>
       </w:pPr>
       <w:hyperlink r:id="rId46" w:history="1">
@@ -4334,13 +4346,13 @@
     <w:abstractNumId w:val="0"/>
   </w:num>
   <w:num w:numId="3">
+    <w:abstractNumId w:val="0"/>
+  </w:num>
+  <w:num w:numId="4">
     <w:abstractNumId w:val="1"/>
     <w:lvlOverride w:ilvl="0">
       <w:startOverride w:val="1"/>
     </w:lvlOverride>
-  </w:num>
-  <w:num w:numId="4">
-    <w:abstractNumId w:val="0"/>
   </w:num>
   <w:num w:numId="5">
     <w:abstractNumId w:val="0"/>
@@ -4352,6 +4364,9 @@
     <w:abstractNumId w:val="0"/>
   </w:num>
   <w:num w:numId="8">
+    <w:abstractNumId w:val="0"/>
+  </w:num>
+  <w:num w:numId="9">
     <w:abstractNumId w:val="0"/>
   </w:num>
 </w:numbering>

</xml_diff>